<commit_message>
Sharpen conclusions around coordinate-aware shallow-depth value
</commit_message>
<xml_diff>
--- a/manuscript/submission/sk2bGrow_Microbiome_submission_draft.docx
+++ b/manuscript/submission/sk2bGrow_Microbiome_submission_draft.docx
@@ -15994,7 +15994,23 @@
         <w:pStyle w:val="FirstParagraph"/>
       </w:pPr>
       <w:r>
-        <w:t xml:space="preserve">sk2bGrow makes PTR estimation practical at sequencing depths where current sketch-based coverage gates commonly return no estimate. The controlled benchmark attributes the shallow-depth gain primarily to coordinate-aware V-fitting rather than to landmark determinism: 2bRAD anchors and density-matched FracMinHash landmarks were not significantly different after density matching. The practical contribution of 2bRAD is therefore not universal accuracy superiority, but a wet-lab-realizable landmark panel with cross-enzyme QC strata and fusion redundancy. sk2bGrow estimates remain bounded by slope compression at very low depth, GC/reference-quality limits, and strain-complexity effects. Open implementation, provenance-tracked benchmarks, and explicit negative controls support its use as a shallow-depth growth-inference module that can be combined with longitudinal microbiome and disease-prediction analyses.</w:t>
+        <w:t xml:space="preserve">sk2bGrow shows that PTR estimation remains feasible at shallow sequencing depth when the estimator uses genome coordinates rather than treating landmarks as an unordered set. In the Zheng isolate benchmark, the method returned usable estimates at 1–2× nominal depth, where Pilea’s shipped defaults returned no estimates, while retaining an explicit negative control and uncertainty caveats. The controlled attribution experiment identifies coordinate-aware V-fitting, rather than the choice of landmark source, as the principal driver of this shallow-depth gain: after density matching, 2bRAD anchors and FracMinHash landmarks were not significantly different in the paired bootstrap.</w:t>
+      </w:r>
+    </w:p>
+    <w:p>
+      <w:pPr>
+        <w:pStyle w:val="BodyText"/>
+      </w:pPr>
+      <w:r>
+        <w:t xml:space="preserve">The practical role of 2bRAD is therefore best viewed as enabling a low-cost, coordinate-anchored assay rather than providing universal accuracy superiority over sketch-based profiling. Its fixed, motif-defined loci make the estimator experimentally realizable; multiple enzyme strata provide cross-enzyme QC, fusion redundancy, and a diagnostic that exposed our own double-counting defect; and the exact-deduplication result gives a concrete library-preparation rule. These properties distinguish 2bRAD from a purely computational landmark sample and motivate its use in prospective shallow-depth growth studies.</w:t>
+      </w:r>
+    </w:p>
+    <w:p>
+      <w:pPr>
+        <w:pStyle w:val="BodyText"/>
+      </w:pPr>
+      <w:r>
+        <w:t xml:space="preserve">The benchmark also defines the limits of deployment. Low-coverage estimates have compressed dynamic range, and GC, fragmented references, strain mixtures, absent references, and MAG-scale runtime require explicit safeguards. Current conservative QC therefore trades yield for reliability. Within these limits, sk2bGrow provides a reproducible shallow-depth growth-inference module for longitudinal microbiome studies; in disease cohorts, derived PTR dynamics may complement taxonomic abundance features in conventional prediction models, but this application requires direct validation in oral and gut datasets.</w:t>
       </w:r>
     </w:p>
     <w:bookmarkEnd w:id="69"/>

</xml_diff>

<commit_message>
Discuss ambiguity and add factorial analysis
</commit_message>
<xml_diff>
--- a/manuscript/submission/sk2bGrow_Microbiome_submission_draft.docx
+++ b/manuscript/submission/sk2bGrow_Microbiome_submission_draft.docx
@@ -2,7 +2,7 @@
 <file path=word/document.xml><?xml version="1.0" encoding="utf-8"?>
 <w:document xmlns:w="http://schemas.openxmlformats.org/wordprocessingml/2006/main" xmlns:m="http://schemas.openxmlformats.org/officeDocument/2006/math" xmlns:r="http://schemas.openxmlformats.org/officeDocument/2006/relationships" xmlns:o="urn:schemas-microsoft-com:office:office" xmlns:v="urn:schemas-microsoft-com:vml" xmlns:w10="urn:schemas-microsoft-com:office:word" xmlns:a="http://schemas.openxmlformats.org/drawingml/2006/main" xmlns:pic="http://schemas.openxmlformats.org/drawingml/2006/picture" xmlns:wp="http://schemas.openxmlformats.org/drawingml/2006/wordprocessingDrawing">
   <w:body>
-    <w:bookmarkStart w:id="116" w:name="X35a67ffd771dc0eee37406016d31234a1046d16"/>
+    <w:bookmarkStart w:id="223" w:name="X35a67ffd771dc0eee37406016d31234a1046d16"/>
     <w:p>
       <w:pPr>
         <w:pStyle w:val="Heading1"/>
@@ -11,7 +11,7 @@
         <w:t xml:space="preserve">Coordinate-aware V-fitting enables shallow-depth PTR estimation from 2bRAD anchor panels</w:t>
       </w:r>
     </w:p>
-    <w:bookmarkStart w:id="18" w:name="title-page"/>
+    <w:bookmarkStart w:id="120" w:name="title-page"/>
     <w:p>
       <w:pPr>
         <w:pStyle w:val="Heading2"/>
@@ -132,8 +132,8 @@
         <w:t xml:space="preserve">Review revision 2026-09-18. The primary Zheng grid uses signed fixed-origin fitting and single-pass GC correction; residual two-pass GC correction is diagnostic only.</w:t>
       </w:r>
     </w:p>
-    <w:bookmarkEnd w:id="18"/>
-    <w:bookmarkStart w:id="19" w:name="abstract"/>
+    <w:bookmarkEnd w:id="120"/>
+    <w:bookmarkStart w:id="121" w:name="abstract"/>
     <w:p>
       <w:pPr>
         <w:pStyle w:val="Heading2"/>
@@ -166,8 +166,8 @@
         <w:t xml:space="preserve">growth-rate panel, sk2bGrow returned usable PTR estimates at 1–2× sequencing depth, where Pilea’s shipped defaults return nothing, with r = 0.92 at 1× and 0.96 at 2× against measured growth rates (n = 16). The accuracy comes from the coordinate-aware estimator, not the landmark source — at matched density, the two landmark sources were not significantly different in the paired bootstrap at any depth — while the multi-enzyme panel contributes what a hash sketch cannot: a wet-lab-realizable landmark set and consistency strata whose heterogeneous biases exposed our own counting defect. The estimates are not unbiased — the fitted slope compresses the dynamic range at low coverage, and the mechanism is unresolved. On three fecal metagenomes, sk2bGrow and Pilea agreed (bias +0.22–+0.25 log2; n = 58–78 species×sample pairs per sample). As a process-level finding, exact deduplication of 2bRAD libraries before counting destroys the PTR signal — a PCR copy-number artefact we localize per anchor. sk2bGrow is 89.5–240.8× slower than Pilea at MAG-panel scale; mismatch-1 counting narrows the gap to roughly one order of magnitude (measured end-to-end on all nine samples: 20.5–38.8× faster counting than the mismatch-2 baseline, no genome lost), and a containment pre-screen — measured to clear the absent-reference false-positive floor, and required at database scale where an unrestricted index would emit estimates for absent references — completes the fix.</w:t>
       </w:r>
     </w:p>
-    <w:bookmarkEnd w:id="19"/>
-    <w:bookmarkStart w:id="20" w:name="keywords"/>
+    <w:bookmarkEnd w:id="121"/>
+    <w:bookmarkStart w:id="122" w:name="keywords"/>
     <w:p>
       <w:pPr>
         <w:pStyle w:val="Heading2"/>
@@ -184,8 +184,8 @@
         <w:t xml:space="preserve">peak-to-trough ratio; microbial growth dynamics; 2bRAD; FracMinHash; metagenomics; shallow sequencing</w:t>
       </w:r>
     </w:p>
-    <w:bookmarkEnd w:id="20"/>
-    <w:bookmarkStart w:id="21" w:name="background"/>
+    <w:bookmarkEnd w:id="122"/>
+    <w:bookmarkStart w:id="123" w:name="background"/>
     <w:p>
       <w:pPr>
         <w:pStyle w:val="Heading2"/>
@@ -308,8 +308,8 @@
         <w:t xml:space="preserve">In short, this paper contributes (i) usable PTR estimates at 1–2× sequencing depth, with the low-coverage bias stated rather than hidden; (ii) a controlled 2 × 2 attribution localising the gain in the coordinate-aware estimator rather than in which landmarks are counted — the two landmark sources showed no significant paired-bootstrap difference once density was matched; and (iii) real-metagenome concordance with the incumbent and process-level findings — a deduplication recommendation and a per-anchor capture-efficiency measurement — that others can cite.</w:t>
       </w:r>
     </w:p>
-    <w:bookmarkEnd w:id="21"/>
-    <w:bookmarkStart w:id="49" w:name="methods"/>
+    <w:bookmarkEnd w:id="123"/>
+    <w:bookmarkStart w:id="152" w:name="methods"/>
     <w:p>
       <w:pPr>
         <w:pStyle w:val="Heading2"/>
@@ -334,7 +334,7 @@
       <w:r>
         <w:t xml:space="preserve"> </w:t>
       </w:r>
-      <w:hyperlink r:id="rId22">
+      <w:hyperlink r:id="rId124">
         <w:r>
           <w:rPr>
             <w:rStyle w:val="Hyperlink"/>
@@ -380,7 +380,7 @@
         </w:pict>
       </w:r>
     </w:p>
-    <w:bookmarkStart w:id="30" w:name="the-sk2bgrow-algorithm"/>
+    <w:bookmarkStart w:id="132" w:name="the-sk2bgrow-algorithm"/>
     <w:p>
       <w:pPr>
         <w:pStyle w:val="Heading3"/>
@@ -570,7 +570,7 @@
         <w:t xml:space="preserve">) has six stages.</w:t>
       </w:r>
     </w:p>
-    <w:bookmarkStart w:id="23" w:name="Xd9b3ed4dd252045d3e48557196049c0e39886bf"/>
+    <w:bookmarkStart w:id="125" w:name="Xd9b3ed4dd252045d3e48557196049c0e39886bf"/>
     <w:p>
       <w:pPr>
         <w:pStyle w:val="Heading4"/>
@@ -959,8 +959,8 @@
         <w:t xml:space="preserve">.</w:t>
       </w:r>
     </w:p>
-    <w:bookmarkEnd w:id="23"/>
-    <w:bookmarkStart w:id="24" w:name="read-counting-and-anchor-attribution"/>
+    <w:bookmarkEnd w:id="125"/>
+    <w:bookmarkStart w:id="126" w:name="read-counting-and-anchor-attribution"/>
     <w:p>
       <w:pPr>
         <w:pStyle w:val="Heading4"/>
@@ -1351,8 +1351,8 @@
         <w:t xml:space="preserve">iterations.</w:t>
       </w:r>
     </w:p>
-    <w:bookmarkEnd w:id="24"/>
-    <w:bookmarkStart w:id="25" w:name="windows-and-window-rates"/>
+    <w:bookmarkEnd w:id="126"/>
+    <w:bookmarkStart w:id="127" w:name="windows-and-window-rates"/>
     <w:p>
       <w:pPr>
         <w:pStyle w:val="Heading4"/>
@@ -1654,8 +1654,8 @@
         <w:t xml:space="preserve">~12 spurious log-likelihood units and BIC selects NB everywhere.</w:t>
       </w:r>
     </w:p>
-    <w:bookmarkEnd w:id="25"/>
-    <w:bookmarkStart w:id="26" w:name="gc-bias-correction"/>
+    <w:bookmarkEnd w:id="127"/>
+    <w:bookmarkStart w:id="128" w:name="gc-bias-correction"/>
     <w:p>
       <w:pPr>
         <w:pStyle w:val="Heading4"/>
@@ -1894,8 +1894,8 @@
         <w:t xml:space="preserve">).</w:t>
       </w:r>
     </w:p>
-    <w:bookmarkEnd w:id="26"/>
-    <w:bookmarkStart w:id="27" w:name="origin-placement-and-v-shape-fitting"/>
+    <w:bookmarkEnd w:id="128"/>
+    <w:bookmarkStart w:id="129" w:name="origin-placement-and-v-shape-fitting"/>
     <w:p>
       <w:pPr>
         <w:pStyle w:val="Heading4"/>
@@ -2465,8 +2465,8 @@
         <w:t xml:space="preserve">).</w:t>
       </w:r>
     </w:p>
-    <w:bookmarkEnd w:id="27"/>
-    <w:bookmarkStart w:id="28" w:name="cross-enzyme-fusion-and-quality-control"/>
+    <w:bookmarkEnd w:id="129"/>
+    <w:bookmarkStart w:id="130" w:name="cross-enzyme-fusion-and-quality-control"/>
     <w:p>
       <w:pPr>
         <w:pStyle w:val="Heading4"/>
@@ -2999,8 +2999,8 @@
         <w:t xml:space="preserve">rejection rate — the dependency is reported, not corrected (Discussion).</w:t>
       </w:r>
     </w:p>
-    <w:bookmarkEnd w:id="28"/>
-    <w:bookmarkStart w:id="29" w:name="implementation"/>
+    <w:bookmarkEnd w:id="130"/>
+    <w:bookmarkStart w:id="131" w:name="implementation"/>
     <w:p>
       <w:pPr>
         <w:pStyle w:val="Heading4"/>
@@ -3042,9 +3042,9 @@
         </w:pict>
       </w:r>
     </w:p>
-    <w:bookmarkEnd w:id="29"/>
-    <w:bookmarkEnd w:id="30"/>
-    <w:bookmarkStart w:id="31" w:name="enzyme-panel"/>
+    <w:bookmarkEnd w:id="131"/>
+    <w:bookmarkEnd w:id="132"/>
+    <w:bookmarkStart w:id="133" w:name="enzyme-panel"/>
     <w:p>
       <w:pPr>
         <w:pStyle w:val="Heading3"/>
@@ -3270,8 +3270,8 @@
         </w:pict>
       </w:r>
     </w:p>
-    <w:bookmarkEnd w:id="31"/>
-    <w:bookmarkStart w:id="39" w:name="benchmark-datasets"/>
+    <w:bookmarkEnd w:id="133"/>
+    <w:bookmarkStart w:id="141" w:name="benchmark-datasets"/>
     <w:p>
       <w:pPr>
         <w:pStyle w:val="Heading3"/>
@@ -3280,7 +3280,7 @@
         <w:t xml:space="preserve">3. Benchmark datasets</w:t>
       </w:r>
     </w:p>
-    <w:bookmarkStart w:id="32" w:name="X8558b042e1c4d57d5e6d341f0cb3e7790b4deb2"/>
+    <w:bookmarkStart w:id="134" w:name="X8558b042e1c4d57d5e6d341f0cb3e7790b4deb2"/>
     <w:p>
       <w:pPr>
         <w:pStyle w:val="Heading4"/>
@@ -3854,8 +3854,8 @@
         <w:t xml:space="preserve">establishes behaviour on a metagenome or a fragmented MAG.</w:t>
       </w:r>
     </w:p>
-    <w:bookmarkEnd w:id="32"/>
-    <w:bookmarkStart w:id="33" w:name="multi-strain-simulation"/>
+    <w:bookmarkEnd w:id="134"/>
+    <w:bookmarkStart w:id="135" w:name="multi-strain-simulation"/>
     <w:p>
       <w:pPr>
         <w:pStyle w:val="Heading4"/>
@@ -4134,8 +4134,8 @@
         <w:t xml:space="preserve">).</w:t>
       </w:r>
     </w:p>
-    <w:bookmarkEnd w:id="33"/>
-    <w:bookmarkStart w:id="34" w:name="reference-fragmentation"/>
+    <w:bookmarkEnd w:id="135"/>
+    <w:bookmarkStart w:id="136" w:name="reference-fragmentation"/>
     <w:p>
       <w:pPr>
         <w:pStyle w:val="Heading4"/>
@@ -4590,8 +4590,8 @@
         <w:t xml:space="preserve">scaffolding delivers.</w:t>
       </w:r>
     </w:p>
-    <w:bookmarkEnd w:id="34"/>
-    <w:bookmarkStart w:id="35" w:name="Xb780f84997d33bf0f401691b1288ff1538bcd72"/>
+    <w:bookmarkEnd w:id="136"/>
+    <w:bookmarkStart w:id="137" w:name="Xb780f84997d33bf0f401691b1288ff1538bcd72"/>
     <w:p>
       <w:pPr>
         <w:pStyle w:val="Heading4"/>
@@ -5049,8 +5049,8 @@
         <w:t xml:space="preserve">invariant to affine transformation.</w:t>
       </w:r>
     </w:p>
-    <w:bookmarkEnd w:id="35"/>
-    <w:bookmarkStart w:id="36" w:name="faecal-microbiome-sun-et-al."/>
+    <w:bookmarkEnd w:id="137"/>
+    <w:bookmarkStart w:id="138" w:name="faecal-microbiome-sun-et-al."/>
     <w:p>
       <w:pPr>
         <w:pStyle w:val="Heading4"/>
@@ -5618,8 +5618,8 @@
         <w:t xml:space="preserve">decomposition are defined in §5.</w:t>
       </w:r>
     </w:p>
-    <w:bookmarkEnd w:id="36"/>
-    <w:bookmarkStart w:id="37" w:name="Xbdb57a27110786c0a1921f07c423d99a2d691e0"/>
+    <w:bookmarkEnd w:id="138"/>
+    <w:bookmarkStart w:id="139" w:name="Xbdb57a27110786c0a1921f07c423d99a2d691e0"/>
     <w:p>
       <w:pPr>
         <w:pStyle w:val="Heading4"/>
@@ -6229,8 +6229,8 @@
         <w:t xml:space="preserve">counts, with per-anchor ratios ≈ 1).</w:t>
       </w:r>
     </w:p>
-    <w:bookmarkEnd w:id="37"/>
-    <w:bookmarkStart w:id="38" w:name="gc-spanning-genome-set"/>
+    <w:bookmarkEnd w:id="139"/>
+    <w:bookmarkStart w:id="140" w:name="gc-spanning-genome-set"/>
     <w:p>
       <w:pPr>
         <w:pStyle w:val="Heading4"/>
@@ -6340,9 +6340,9 @@
         </w:pict>
       </w:r>
     </w:p>
-    <w:bookmarkEnd w:id="38"/>
-    <w:bookmarkEnd w:id="39"/>
-    <w:bookmarkStart w:id="40" w:name="comparison-methods"/>
+    <w:bookmarkEnd w:id="140"/>
+    <w:bookmarkEnd w:id="141"/>
+    <w:bookmarkStart w:id="142" w:name="comparison-methods"/>
     <w:p>
       <w:pPr>
         <w:pStyle w:val="Heading3"/>
@@ -7070,8 +7070,8 @@
         </w:pict>
       </w:r>
     </w:p>
-    <w:bookmarkEnd w:id="40"/>
-    <w:bookmarkStart w:id="41" w:name="evaluation-metrics"/>
+    <w:bookmarkEnd w:id="142"/>
+    <w:bookmarkStart w:id="143" w:name="evaluation-metrics"/>
     <w:p>
       <w:pPr>
         <w:pStyle w:val="Heading3"/>
@@ -8473,14 +8473,14 @@
         </w:pict>
       </w:r>
     </w:p>
-    <w:bookmarkEnd w:id="41"/>
-    <w:bookmarkStart w:id="47" w:name="X66cbbd48b880f7e47956f6817f4c559b1a9d916"/>
+    <w:bookmarkEnd w:id="143"/>
+    <w:bookmarkStart w:id="150" w:name="X85a115a26ce12f930c9dac210e8d891ae5a6b7c"/>
     <w:p>
       <w:pPr>
         <w:pStyle w:val="Heading3"/>
       </w:pPr>
       <w:r>
-        <w:t xml:space="preserve">6. Landmark-source and robustness experiments (F1–F5)</w:t>
+        <w:t xml:space="preserve">6. Landmark-source and robustness experiments (F1–F6)</w:t>
       </w:r>
     </w:p>
     <w:p>
@@ -8488,7 +8488,7 @@
         <w:pStyle w:val="FirstParagraph"/>
       </w:pPr>
       <w:r>
-        <w:t xml:space="preserve">All five experiments isolate the</w:t>
+        <w:t xml:space="preserve">All six experiments isolate or decompose the</w:t>
       </w:r>
       <w:r>
         <w:t xml:space="preserve"> </w:t>
@@ -8534,7 +8534,13 @@
         <w:t xml:space="preserve"> </w:t>
       </w:r>
       <w:r>
-        <w:t xml:space="preserve">two sources at GTDB-like scale. Throughout, a matched pair is only ever</w:t>
+        <w:t xml:space="preserve">two sources at GTDB-like scale; F6 is a post-hoc count-level factorial that</w:t>
+      </w:r>
+      <w:r>
+        <w:t xml:space="preserve"> </w:t>
+      </w:r>
+      <w:r>
+        <w:t xml:space="preserve">separates estimator, depth, ambiguity and coordinate placement. Throughout, a matched pair is only ever</w:t>
       </w:r>
       <w:r>
         <w:t xml:space="preserve"> </w:t>
@@ -8591,7 +8597,7 @@
         <w:t xml:space="preserve">symmetric in effect.</w:t>
       </w:r>
     </w:p>
-    <w:bookmarkStart w:id="42" w:name="density-matching-on-the-zheng-grid-f1"/>
+    <w:bookmarkStart w:id="144" w:name="density-matching-on-the-zheng-grid-f1"/>
     <w:p>
       <w:pPr>
         <w:pStyle w:val="Heading4"/>
@@ -8732,8 +8738,8 @@
         <w:t xml:space="preserve">per-window landmark counts and detection fraction; per-cell failure cause.</w:t>
       </w:r>
     </w:p>
-    <w:bookmarkEnd w:id="42"/>
-    <w:bookmarkStart w:id="43" w:name="gc-sweep-f2"/>
+    <w:bookmarkEnd w:id="144"/>
+    <w:bookmarkStart w:id="145" w:name="gc-sweep-f2"/>
     <w:p>
       <w:pPr>
         <w:pStyle w:val="Heading4"/>
@@ -8961,8 +8967,8 @@
         <w:t xml:space="preserve">(landmarks/Mb).</w:t>
       </w:r>
     </w:p>
-    <w:bookmarkEnd w:id="43"/>
-    <w:bookmarkStart w:id="44" w:name="mismatch-tolerance-and-misassignment-f3"/>
+    <w:bookmarkEnd w:id="145"/>
+    <w:bookmarkStart w:id="146" w:name="mismatch-tolerance-and-misassignment-f3"/>
     <w:p>
       <w:pPr>
         <w:pStyle w:val="Heading4"/>
@@ -9267,8 +9273,8 @@
         <w:t xml:space="preserve">).</w:t>
       </w:r>
     </w:p>
-    <w:bookmarkEnd w:id="44"/>
-    <w:bookmarkStart w:id="45" w:name="fragmentation-sketch-f4"/>
+    <w:bookmarkEnd w:id="146"/>
+    <w:bookmarkStart w:id="147" w:name="fragmentation-sketch-f4"/>
     <w:p>
       <w:pPr>
         <w:pStyle w:val="Heading4"/>
@@ -9660,8 +9666,8 @@
         <w:t xml:space="preserve">rate, orientation accuracy and order Spearman; permutation null distributions.</w:t>
       </w:r>
     </w:p>
-    <w:bookmarkEnd w:id="45"/>
-    <w:bookmarkStart w:id="46" w:name="index-cost-at-gtdb-like-scale-f5"/>
+    <w:bookmarkEnd w:id="147"/>
+    <w:bookmarkStart w:id="148" w:name="index-cost-at-gtdb-like-scale-f5"/>
     <w:p>
       <w:pPr>
         <w:pStyle w:val="Heading4"/>
@@ -9963,22 +9969,14 @@
         <w:t xml:space="preserve">matched density.</w:t>
       </w:r>
     </w:p>
-    <w:p>
-      <w:r>
-        <w:pict>
-          <v:rect style="width:0;height:1.5pt" o:hralign="center" o:hrstd="t" o:hr="t"/>
-        </w:pict>
-      </w:r>
-    </w:p>
-    <w:bookmarkEnd w:id="46"/>
-    <w:bookmarkEnd w:id="47"/>
-    <w:bookmarkStart w:id="48" w:name="computational-environment"/>
+    <w:bookmarkEnd w:id="148"/>
+    <w:bookmarkStart w:id="149" w:name="X84bfdf958829166d8b906dacf41027ff82eb47c"/>
     <w:p>
       <w:pPr>
-        <w:pStyle w:val="Heading3"/>
+        <w:pStyle w:val="Heading4"/>
       </w:pPr>
       <w:r>
-        <w:t xml:space="preserve">7. Computational environment</w:t>
+        <w:t xml:space="preserve">6.6 Count-level factorial decomposition of depth and ambiguity (F6, post hoc)</w:t>
       </w:r>
     </w:p>
     <w:p>
@@ -9986,13 +9984,221 @@
         <w:pStyle w:val="FirstParagraph"/>
       </w:pPr>
       <w:r>
-        <w:t xml:space="preserve">Apple M3 Max, 16 cores, 48 GB RAM, macOS 14.7; Rust 1.92.0, Python 3.12.4.</w:t>
-      </w:r>
-      <w:r>
-        <w:t xml:space="preserve"> </w:t>
-      </w:r>
-      <w:r>
-        <w:t xml:space="preserve">The initial benchmark grid was run on a laptop; the final C1 paired-end A/B/E statistics grid, F1–F5 and C5-scale experiments used the internal HPC (SLURM; Intel and AMD partitions). The final primary grid used 8 CPU threads on the AMD partition under sk2bGrow review-final commit</w:t>
+        <w:rPr>
+          <w:b/>
+          <w:bCs/>
+        </w:rPr>
+        <w:t xml:space="preserve">Purpose.</w:t>
+      </w:r>
+      <w:r>
+        <w:t xml:space="preserve"> </w:t>
+      </w:r>
+      <w:r>
+        <w:t xml:space="preserve">Separate four effects that are confounded in an end-to-end</w:t>
+      </w:r>
+      <w:r>
+        <w:t xml:space="preserve"> </w:t>
+      </w:r>
+      <w:r>
+        <w:t xml:space="preserve">comparison — estimator, sequencing depth, multi-strain anchor ambiguity, and</w:t>
+      </w:r>
+      <w:r>
+        <w:t xml:space="preserve"> </w:t>
+      </w:r>
+      <w:r>
+        <w:t xml:space="preserve">landmark-coordinate placement — without changing the read-level benchmark used</w:t>
+      </w:r>
+      <w:r>
+        <w:t xml:space="preserve"> </w:t>
+      </w:r>
+      <w:r>
+        <w:t xml:space="preserve">for the primary attribution analysis.</w:t>
+      </w:r>
+    </w:p>
+    <w:p>
+      <w:pPr>
+        <w:pStyle w:val="BodyText"/>
+      </w:pPr>
+      <w:r>
+        <w:rPr>
+          <w:b/>
+          <w:bCs/>
+        </w:rPr>
+        <w:t xml:space="preserve">Simulator.</w:t>
+      </w:r>
+      <w:r>
+        <w:t xml:space="preserve"> </w:t>
+      </w:r>
+      <w:r>
+        <w:t xml:space="preserve">Each sample is a count-level community on a 3-Mb circular</w:t>
+      </w:r>
+      <w:r>
+        <w:t xml:space="preserve"> </w:t>
+      </w:r>
+      <w:r>
+        <w:t xml:space="preserve">chromosome with 5-kb windows and 5,000 landmarks per genome. True log₂PTR values</w:t>
+      </w:r>
+      <w:r>
+        <w:t xml:space="preserve"> </w:t>
+      </w:r>
+      <w:r>
+        <w:t xml:space="preserve">are drawn independently from U[0, 2], and counts follow the same V-shaped</w:t>
+      </w:r>
+      <w:r>
+        <w:t xml:space="preserve"> </w:t>
+      </w:r>
+      <w:r>
+        <w:t xml:space="preserve">origin-to-terminus model as Pilea’s simulation (origin at 0, terminus at 1.5 Mb).</w:t>
+      </w:r>
+      <w:r>
+        <w:t xml:space="preserve"> </w:t>
+      </w:r>
+      <w:r>
+        <w:t xml:space="preserve">Abundance conditions are even, 10:1 or 100:1 ratios with unit geometric mean; the</w:t>
+      </w:r>
+      <w:r>
+        <w:t xml:space="preserve"> </w:t>
+      </w:r>
+      <w:r>
+        <w:t xml:space="preserve">ratio rank is permuted in every replicate. The grid crosses 4/8/16/32 strains,</w:t>
+      </w:r>
+      <w:r>
+        <w:t xml:space="preserve"> </w:t>
+      </w:r>
+      <w:r>
+        <w:t xml:space="preserve">0.5/1/2/4/8× per-strain depth, 0/5/15 % shared anchors, three abundance ratios,</w:t>
+      </w:r>
+      <w:r>
+        <w:t xml:space="preserve"> </w:t>
+      </w:r>
+      <w:r>
+        <w:t xml:space="preserve">two landmark-coordinate arms and two estimators, with 10 replicates per cell</w:t>
+      </w:r>
+      <w:r>
+        <w:t xml:space="preserve"> </w:t>
+      </w:r>
+      <w:r>
+        <w:t xml:space="preserve">(54,000 strain-level estimates per estimator). The coordinate arm uses regular</w:t>
+      </w:r>
+      <w:r>
+        <w:t xml:space="preserve"> </w:t>
+      </w:r>
+      <w:r>
+        <w:t xml:space="preserve">landmark positions; the sketch arm uses an equal-density random landmark set.</w:t>
+      </w:r>
+    </w:p>
+    <w:p>
+      <w:pPr>
+        <w:pStyle w:val="BodyText"/>
+      </w:pPr>
+      <w:r>
+        <w:rPr>
+          <w:b/>
+          <w:bCs/>
+        </w:rPr>
+        <w:t xml:space="preserve">Ambiguity model.</w:t>
+      </w:r>
+      <w:r>
+        <w:t xml:space="preserve"> </w:t>
+      </w:r>
+      <w:r>
+        <w:t xml:space="preserve">Private anchors are assigned to the strain that generated</w:t>
+      </w:r>
+      <w:r>
+        <w:t xml:space="preserve"> </w:t>
+      </w:r>
+      <w:r>
+        <w:t xml:space="preserve">them. A shared anchor is observable only as a pooled count, which is assigned to</w:t>
+      </w:r>
+      <w:r>
+        <w:t xml:space="preserve"> </w:t>
+      </w:r>
+      <w:r>
+        <w:t xml:space="preserve">one strain with probability proportional to that strain’s latent expected</w:t>
+      </w:r>
+      <w:r>
+        <w:t xml:space="preserve"> </w:t>
+      </w:r>
+      <w:r>
+        <w:t xml:space="preserve">contribution. This is deliberately conservative: it represents one plausible</w:t>
+      </w:r>
+      <w:r>
+        <w:t xml:space="preserve"> </w:t>
+      </w:r>
+      <w:r>
+        <w:t xml:space="preserve">consequence of shared sequence/hash evidence rather than asserting that any</w:t>
+      </w:r>
+      <w:r>
+        <w:t xml:space="preserve"> </w:t>
+      </w:r>
+      <w:r>
+        <w:t xml:space="preserve">particular mapping pipeline makes this exact error. Window rates are normalized</w:t>
+      </w:r>
+      <w:r>
+        <w:t xml:space="preserve"> </w:t>
+      </w:r>
+      <w:r>
+        <w:t xml:space="preserve">by landmark exposure so that the random arm is not penalized merely for unequal</w:t>
+      </w:r>
+      <w:r>
+        <w:t xml:space="preserve"> </w:t>
+      </w:r>
+      <w:r>
+        <w:t xml:space="preserve">anchors per window. Coordinate fits use delta-method standard errors; the same</w:t>
+      </w:r>
+      <w:r>
+        <w:t xml:space="preserve"> </w:t>
+      </w:r>
+      <w:r>
+        <w:t xml:space="preserve">window rates are passed to the sorted-rank estimator.</w:t>
+      </w:r>
+    </w:p>
+    <w:p>
+      <w:pPr>
+        <w:pStyle w:val="BodyText"/>
+      </w:pPr>
+      <w:r>
+        <w:rPr>
+          <w:b/>
+          <w:bCs/>
+        </w:rPr>
+        <w:t xml:space="preserve">Scope and outputs.</w:t>
+      </w:r>
+      <w:r>
+        <w:t xml:space="preserve"> </w:t>
+      </w:r>
+      <w:r>
+        <w:t xml:space="preserve">The simulator does not model sequencing error, GC bias,</w:t>
+      </w:r>
+      <w:r>
+        <w:t xml:space="preserve"> </w:t>
+      </w:r>
+      <w:r>
+        <w:t xml:space="preserve">fragmentation, database screening or Pilea’s shipped gates, and therefore does</w:t>
+      </w:r>
+      <w:r>
+        <w:t xml:space="preserve"> </w:t>
+      </w:r>
+      <w:r>
+        <w:t xml:space="preserve">not replace the Zheng or multi-strain read benchmarks. No FASTQ or per-anchor</w:t>
+      </w:r>
+      <w:r>
+        <w:t xml:space="preserve"> </w:t>
+      </w:r>
+      <w:r>
+        <w:t xml:space="preserve">intermediates were retained; only aggregate tables were written. The complete</w:t>
+      </w:r>
+      <w:r>
+        <w:t xml:space="preserve"> </w:t>
+      </w:r>
+      <w:r>
+        <w:t xml:space="preserve">grid was run as SLURM job 4088324 (24 one-CPU, 2-GiB array tasks; all completed</w:t>
+      </w:r>
+      <w:r>
+        <w:t xml:space="preserve"> </w:t>
+      </w:r>
+      <w:r>
+        <w:t xml:space="preserve">in ≤2 min) under review-final commit</w:t>
       </w:r>
       <w:r>
         <w:t xml:space="preserve"> </w:t>
@@ -10001,44 +10207,28 @@
         <w:rPr>
           <w:rStyle w:val="VerbatimChar"/>
         </w:rPr>
-        <w:t xml:space="preserve">929f4c2</w:t>
-      </w:r>
-      <w:r>
-        <w:t xml:space="preserve"> </w:t>
-      </w:r>
-      <w:r>
-        <w:t xml:space="preserve">(job 4076237). Runs deferred for scale —</w:t>
-      </w:r>
-      <w:r>
-        <w:t xml:space="preserve"> </w:t>
-      </w:r>
-      <w:r>
-        <w:t xml:space="preserve">full-depth</w:t>
-      </w:r>
-      <w:r>
-        <w:t xml:space="preserve"> </w:t>
-      </w:r>
-      <w:r>
-        <w:rPr>
-          <w:i/>
-          <w:iCs/>
-        </w:rPr>
-        <w:t xml:space="preserve">E. coli</w:t>
-      </w:r>
-      <w:r>
-        <w:t xml:space="preserve">, the 45,529-assembly quality sweep, Pilea’s full</w:t>
-      </w:r>
-      <w:r>
-        <w:t xml:space="preserve"> </w:t>
-      </w:r>
-      <w:r>
-        <w:t xml:space="preserve">32-strain/32× grid, and the marine metagenome application — are marked as such</w:t>
-      </w:r>
-      <w:r>
-        <w:t xml:space="preserve"> </w:t>
-      </w:r>
-      <w:r>
-        <w:t xml:space="preserve">where they appear. HPC runs used a SLURM cluster with Lustre storage.</w:t>
+        <w:t xml:space="preserve">d108932</w:t>
+      </w:r>
+      <w:r>
+        <w:t xml:space="preserve">. Per-cell long output, source</w:t>
+      </w:r>
+      <w:r>
+        <w:t xml:space="preserve"> </w:t>
+      </w:r>
+      <w:r>
+        <w:t xml:space="preserve">contrasts, Table 11 and Fig. 9 are in</w:t>
+      </w:r>
+      <w:r>
+        <w:t xml:space="preserve"> </w:t>
+      </w:r>
+      <w:r>
+        <w:rPr>
+          <w:rStyle w:val="VerbatimChar"/>
+        </w:rPr>
+        <w:t xml:space="preserve">factorial_benchmark/</w:t>
+      </w:r>
+      <w:r>
+        <w:t xml:space="preserve">.</w:t>
       </w:r>
     </w:p>
     <w:p>
@@ -10048,24 +10238,15 @@
         </w:pict>
       </w:r>
     </w:p>
-    <w:bookmarkEnd w:id="48"/>
-    <w:bookmarkEnd w:id="49"/>
-    <w:bookmarkStart w:id="67" w:name="results"/>
-    <w:p>
-      <w:pPr>
-        <w:pStyle w:val="Heading2"/>
-      </w:pPr>
-      <w:r>
-        <w:t xml:space="preserve">Results</w:t>
-      </w:r>
-    </w:p>
-    <w:bookmarkStart w:id="50" w:name="sk2bgrow-overview"/>
+    <w:bookmarkEnd w:id="149"/>
+    <w:bookmarkEnd w:id="150"/>
+    <w:bookmarkStart w:id="151" w:name="computational-environment"/>
     <w:p>
       <w:pPr>
         <w:pStyle w:val="Heading3"/>
       </w:pPr>
       <w:r>
-        <w:t xml:space="preserve">1. sk2bGrow overview</w:t>
+        <w:t xml:space="preserve">7. Computational environment</w:t>
       </w:r>
     </w:p>
     <w:p>
@@ -10073,23 +10254,34 @@
         <w:pStyle w:val="FirstParagraph"/>
       </w:pPr>
       <w:r>
-        <w:t xml:space="preserve">sk2bGrow estimates the peak-to-trough ratio of a genome from the replication-associated gradient in read coverage, using landmarks whose coordinates are known before any read is seen. The pipeline (Methods §1) has six stages: an in-silico digest of each reference genome with a panel of 16 Type IIB restriction enzymes produces</w:t>
-      </w:r>
-      <w:r>
-        <w:t xml:space="preserve"> </w:t>
-      </w:r>
-      <w:r>
-        <w:rPr>
-          <w:b/>
-          <w:bCs/>
-        </w:rPr>
-        <w:t xml:space="preserve">anchors</w:t>
-      </w:r>
-      <w:r>
-        <w:t xml:space="preserve"> </w:t>
-      </w:r>
-      <w:r>
-        <w:t xml:space="preserve">— fixed-length tags with genomic coordinates; sample reads are matched to anchors by strand-canonical, mismatch-tolerant counting; anchors shared between reference genomes are apportioned by expectation-maximisation; windows holding a fixed number of anchors are fitted with a zero-truncated Poisson mixture to obtain a window rate with a standard error; a replication origin is placed once per genome from all enzymes pooled; and a piecewise-linear V is fitted to the window log-rates against circular distance from the origin, with per-enzyme estimates fused by inverse-variance weighting and cross-enzyme consistency tested by Cochran’s</w:t>
+        <w:t xml:space="preserve">Apple M3 Max, 16 cores, 48 GB RAM, macOS 14.7; Rust 1.92.0, Python 3.12.4.</w:t>
+      </w:r>
+      <w:r>
+        <w:t xml:space="preserve"> </w:t>
+      </w:r>
+      <w:r>
+        <w:t xml:space="preserve">The initial benchmark grid was run on a laptop; the final C1 paired-end A/B/E statistics grid, F1–F6 and C5-scale experiments used the internal HPC (SLURM; Intel and AMD partitions). The final primary grid used 8 CPU threads on the AMD partition under sk2bGrow review-final commit</w:t>
+      </w:r>
+      <w:r>
+        <w:t xml:space="preserve"> </w:t>
+      </w:r>
+      <w:r>
+        <w:rPr>
+          <w:rStyle w:val="VerbatimChar"/>
+        </w:rPr>
+        <w:t xml:space="preserve">929f4c2</w:t>
+      </w:r>
+      <w:r>
+        <w:t xml:space="preserve"> </w:t>
+      </w:r>
+      <w:r>
+        <w:t xml:space="preserve">(job 4076237). Runs deferred for scale —</w:t>
+      </w:r>
+      <w:r>
+        <w:t xml:space="preserve"> </w:t>
+      </w:r>
+      <w:r>
+        <w:t xml:space="preserve">full-depth</w:t>
       </w:r>
       <w:r>
         <w:t xml:space="preserve"> </w:t>
@@ -10099,42 +10291,49 @@
           <w:i/>
           <w:iCs/>
         </w:rPr>
-        <w:t xml:space="preserve">Q</w:t>
-      </w:r>
-      <w:r>
-        <w:t xml:space="preserve">. Fig. 1a shows the workflow. Fig. 1b shows window rates against genome coordinate for one 2× sample, with the fitted V. Fig. 1c shows the same windows under sorted-rank regression, where a single dropout window moves the estimate from 1.86 to 2.51 — the fragility, in one panel, of an estimator that rides on extreme order statistics. Fig. 1d is a forest plot of the 16 per-enzyme estimates with the fused value and</w:t>
-      </w:r>
-      <w:r>
-        <w:t xml:space="preserve"> </w:t>
-      </w:r>
-      <w:r>
-        <w:rPr>
-          <w:i/>
-          <w:iCs/>
-        </w:rPr>
-        <w:t xml:space="preserve">I</w:t>
-      </w:r>
-      <w:r>
-        <w:t xml:space="preserve">² for the same sample. Panels b–d are real output from one 2× sample; the figure shows the method working on real data, not a cartoon (Fig. 1).</w:t>
+        <w:t xml:space="preserve">E. coli</w:t>
+      </w:r>
+      <w:r>
+        <w:t xml:space="preserve">, the 45,529-assembly quality sweep, Pilea’s full</w:t>
+      </w:r>
+      <w:r>
+        <w:t xml:space="preserve"> </w:t>
+      </w:r>
+      <w:r>
+        <w:t xml:space="preserve">32-strain/32× grid, and the marine metagenome application — are marked as such</w:t>
+      </w:r>
+      <w:r>
+        <w:t xml:space="preserve"> </w:t>
+      </w:r>
+      <w:r>
+        <w:t xml:space="preserve">where they appear. HPC runs used a SLURM cluster with Lustre storage.</w:t>
       </w:r>
     </w:p>
-    <w:bookmarkEnd w:id="50"/>
-    <w:bookmarkStart w:id="54" w:name="accuracy-on-bacterial-isolates"/>
+    <w:p>
+      <w:r>
+        <w:pict>
+          <v:rect style="width:0;height:1.5pt" o:hralign="center" o:hrstd="t" o:hr="t"/>
+        </w:pict>
+      </w:r>
+    </w:p>
+    <w:bookmarkEnd w:id="151"/>
+    <w:bookmarkEnd w:id="152"/>
+    <w:bookmarkStart w:id="171" w:name="results"/>
+    <w:p>
+      <w:pPr>
+        <w:pStyle w:val="Heading2"/>
+      </w:pPr>
+      <w:r>
+        <w:t xml:space="preserve">Results</w:t>
+      </w:r>
+    </w:p>
+    <w:bookmarkStart w:id="153" w:name="sk2bgrow-overview"/>
     <w:p>
       <w:pPr>
         <w:pStyle w:val="Heading3"/>
       </w:pPr>
       <w:r>
-        <w:t xml:space="preserve">2. Accuracy on bacterial isolates</w:t>
-      </w:r>
-    </w:p>
-    <w:bookmarkStart w:id="51" w:name="accuracy-across-the-coverage-titration"/>
-    <w:p>
-      <w:pPr>
-        <w:pStyle w:val="Heading4"/>
-      </w:pPr>
-      <w:r>
-        <w:t xml:space="preserve">2.1 Accuracy across the coverage titration</w:t>
+        <w:t xml:space="preserve">1. sk2bGrow overview</w:t>
       </w:r>
     </w:p>
     <w:p>
@@ -10142,19 +10341,23 @@
         <w:pStyle w:val="FirstParagraph"/>
       </w:pPr>
       <w:r>
-        <w:t xml:space="preserve">Accuracy is usable throughout the 1–2× band on a growth-rate panel where the</w:t>
-      </w:r>
-      <w:r>
-        <w:t xml:space="preserve"> </w:t>
-      </w:r>
-      <w:r>
-        <w:t xml:space="preserve">incumbent’s shipped defaults return nothing at all. We benchmarked sk2bGrow on</w:t>
-      </w:r>
-      <w:r>
-        <w:t xml:space="preserve"> </w:t>
-      </w:r>
-      <w:r>
-        <w:t xml:space="preserve">the Zheng et al. 2020</w:t>
+        <w:t xml:space="preserve">sk2bGrow estimates the peak-to-trough ratio of a genome from the replication-associated gradient in read coverage, using landmarks whose coordinates are known before any read is seen. The pipeline (Methods §1) has six stages: an in-silico digest of each reference genome with a panel of 16 Type IIB restriction enzymes produces</w:t>
+      </w:r>
+      <w:r>
+        <w:t xml:space="preserve"> </w:t>
+      </w:r>
+      <w:r>
+        <w:rPr>
+          <w:b/>
+          <w:bCs/>
+        </w:rPr>
+        <w:t xml:space="preserve">anchors</w:t>
+      </w:r>
+      <w:r>
+        <w:t xml:space="preserve"> </w:t>
+      </w:r>
+      <w:r>
+        <w:t xml:space="preserve">— fixed-length tags with genomic coordinates; sample reads are matched to anchors by strand-canonical, mismatch-tolerant counting; anchors shared between reference genomes are apportioned by expectation-maximisation; windows holding a fixed number of anchors are fitted with a zero-truncated Poisson mixture to obtain a window rate with a standard error; a replication origin is placed once per genome from all enzymes pooled; and a piecewise-linear V is fitted to the window log-rates against circular distance from the origin, with per-enzyme estimates fused by inverse-variance weighting and cross-enzyme consistency tested by Cochran’s</w:t>
       </w:r>
       <w:r>
         <w:t xml:space="preserve"> </w:t>
@@ -10164,155 +10367,42 @@
           <w:i/>
           <w:iCs/>
         </w:rPr>
-        <w:t xml:space="preserve">E. coli</w:t>
-      </w:r>
-      <w:r>
-        <w:t xml:space="preserve"> </w:t>
-      </w:r>
-      <w:r>
-        <w:t xml:space="preserve">K-12 MG1655 panel (PRJNA615952): 16 defined</w:t>
-      </w:r>
-      <w:r>
-        <w:t xml:space="preserve"> </w:t>
-      </w:r>
-      <w:r>
-        <w:t xml:space="preserve">media with independently measured growth rates λ spanning 0.40–1.72 h⁻¹,</w:t>
-      </w:r>
-      <w:r>
-        <w:t xml:space="preserve"> </w:t>
-      </w:r>
-      <w:r>
-        <w:t xml:space="preserve">titrated to nominal 0.5×, 1×, 2×, 5× and 10× depth. The titration is a</w:t>
-      </w:r>
-      <w:r>
-        <w:t xml:space="preserve"> </w:t>
-      </w:r>
-      <w:r>
-        <w:t xml:space="preserve">deliberate deviation from Pilea, which ran full depth only; it is the axis this</w:t>
-      </w:r>
-      <w:r>
-        <w:t xml:space="preserve"> </w:t>
-      </w:r>
-      <w:r>
-        <w:t xml:space="preserve">paper is about, because metagenomic per-strain coverage is typically 1–2×, not</w:t>
-      </w:r>
-      <w:r>
-        <w:t xml:space="preserve"> </w:t>
-      </w:r>
-      <w:r>
-        <w:t xml:space="preserve">isolate depth. sk2bGrow reached r = 0.912 against measured λ at 1× (95%</w:t>
-      </w:r>
-      <w:r>
-        <w:t xml:space="preserve"> </w:t>
-      </w:r>
-      <w:r>
-        <w:t xml:space="preserve">media-bootstrap CI [0.798, 0.970]; n = 16), 0.958 at 2× and 0.971 at 5× —</w:t>
-      </w:r>
-      <w:r>
-        <w:t xml:space="preserve"> </w:t>
-      </w:r>
-      <w:r>
-        <w:t xml:space="preserve">essentially matching Pilea’s published full-depth r of 0.976 from 5× onward;</w:t>
-      </w:r>
-      <w:r>
-        <w:t xml:space="preserve"> </w:t>
-      </w:r>
-      <w:r>
-        <w:t xml:space="preserve">at 0.5× r = 0.923 (CI [0.854, 0.968]). Magnitude was usable but compressed:</w:t>
-      </w:r>
-      <w:r>
-        <w:t xml:space="preserve"> </w:t>
-      </w:r>
-      <w:r>
-        <w:t xml:space="preserve">RMSE 0.374 with fitted slope 0.83 at 1×, degrading to RMSE 0.483 and slope</w:t>
-      </w:r>
-      <w:r>
-        <w:t xml:space="preserve"> </w:t>
-      </w:r>
-      <w:r>
-        <w:t xml:space="preserve">0.59 at 0.5× (Fig. 2a–c; Table 2). The slope in Table 2 regresses the estimated</w:t>
-      </w:r>
-      <w:r>
-        <w:t xml:space="preserve"> </w:t>
-      </w:r>
-      <w:r>
-        <w:t xml:space="preserve">log₂PTR on the measured growth rate; the slopes annotated on the Fig. 2b, c</w:t>
-      </w:r>
-      <w:r>
-        <w:t xml:space="preserve"> </w:t>
-      </w:r>
-      <w:r>
-        <w:t xml:space="preserve">scatter regress the estimate on the predicted value (λC/ln2) — two different</w:t>
-      </w:r>
-      <w:r>
-        <w:t xml:space="preserve"> </w:t>
-      </w:r>
-      <w:r>
-        <w:t xml:space="preserve">regressions of the same points, reported in the direction each comparison</w:t>
-      </w:r>
-      <w:r>
-        <w:t xml:space="preserve"> </w:t>
-      </w:r>
-      <w:r>
-        <w:t xml:space="preserve">requires. Two scope caveats apply here and</w:t>
-      </w:r>
-      <w:r>
-        <w:t xml:space="preserve"> </w:t>
-      </w:r>
-      <w:r>
-        <w:t xml:space="preserve">throughout the isolate benchmark: every real-data result in this section is one</w:t>
-      </w:r>
-      <w:r>
-        <w:t xml:space="preserve"> </w:t>
-      </w:r>
-      <w:r>
-        <w:t xml:space="preserve">strain against a single complete reference, and Pilea at its shipped defaults</w:t>
-      </w:r>
-      <w:r>
-        <w:t xml:space="preserve"> </w:t>
-      </w:r>
-      <w:r>
-        <w:t xml:space="preserve">returned no estimate below 10× at any point in the titration. All primary</w:t>
-      </w:r>
-      <w:r>
-        <w:t xml:space="preserve"> </w:t>
-      </w:r>
-      <w:r>
-        <w:t xml:space="preserve">estimates use the historical single-pass GC correction. A residual second pass</w:t>
-      </w:r>
-      <w:r>
-        <w:t xml:space="preserve"> </w:t>
-      </w:r>
-      <w:r>
-        <w:t xml:space="preserve">was tested and rejected: it lowered anchor-panel accuracy at 0.5× and 1× to</w:t>
-      </w:r>
-      <w:r>
-        <w:t xml:space="preserve"> </w:t>
-      </w:r>
-      <w:r>
-        <w:t xml:space="preserve">r = 0.848 and 0.879, versus 0.923 and 0.912 under the primary correction,</w:t>
-      </w:r>
-      <w:r>
-        <w:t xml:space="preserve"> </w:t>
-      </w:r>
-      <w:r>
-        <w:t xml:space="preserve">consistent with its absorbing part of the position-linked replication gradient</w:t>
-      </w:r>
-      <w:r>
-        <w:t xml:space="preserve"> </w:t>
-      </w:r>
-      <w:r>
-        <w:t xml:space="preserve">(Methods §1.4).</w:t>
+        <w:t xml:space="preserve">Q</w:t>
+      </w:r>
+      <w:r>
+        <w:t xml:space="preserve">. Fig. 1a shows the workflow. Fig. 1b shows window rates against genome coordinate for one 2× sample, with the fitted V. Fig. 1c shows the same windows under sorted-rank regression, where a single dropout window moves the estimate from 1.86 to 2.51 — the fragility, in one panel, of an estimator that rides on extreme order statistics. Fig. 1d is a forest plot of the 16 per-enzyme estimates with the fused value and</w:t>
+      </w:r>
+      <w:r>
+        <w:t xml:space="preserve"> </w:t>
+      </w:r>
+      <w:r>
+        <w:rPr>
+          <w:i/>
+          <w:iCs/>
+        </w:rPr>
+        <w:t xml:space="preserve">I</w:t>
+      </w:r>
+      <w:r>
+        <w:t xml:space="preserve">² for the same sample. Panels b–d are real output from one 2× sample; the figure shows the method working on real data, not a cartoon (Fig. 1).</w:t>
       </w:r>
     </w:p>
-    <w:bookmarkEnd w:id="51"/>
-    <w:bookmarkStart w:id="52" w:name="a-negative-control-that-pilea-excluded"/>
+    <w:bookmarkEnd w:id="153"/>
+    <w:bookmarkStart w:id="157" w:name="accuracy-on-bacterial-isolates"/>
+    <w:p>
+      <w:pPr>
+        <w:pStyle w:val="Heading3"/>
+      </w:pPr>
+      <w:r>
+        <w:t xml:space="preserve">2. Accuracy on bacterial isolates</w:t>
+      </w:r>
+    </w:p>
+    <w:bookmarkStart w:id="154" w:name="accuracy-across-the-coverage-titration"/>
     <w:p>
       <w:pPr>
         <w:pStyle w:val="Heading4"/>
       </w:pPr>
       <w:r>
-        <w:t xml:space="preserve">2.2 A negative control that Pilea excluded</w:t>
+        <w:t xml:space="preserve">2.1 Accuracy across the coverage titration</w:t>
       </w:r>
     </w:p>
     <w:p>
@@ -10320,38 +10410,177 @@
         <w:pStyle w:val="FirstParagraph"/>
       </w:pPr>
       <w:r>
-        <w:t xml:space="preserve">A stationary-phase replication run-out that sorted regression fails badly on was recovered by sk2bGrow. Pilea excluded the run-out samples from its benchmark; we kept one (</w:t>
-      </w:r>
-      <w:r>
-        <w:rPr>
-          <w:rStyle w:val="VerbatimChar"/>
-        </w:rPr>
-        <w:t xml:space="preserve">E.coli_gDNA_RUN_OUT</w:t>
-      </w:r>
-      <w:r>
-        <w:t xml:space="preserve">, CON-C). In a replication run-out, ongoing rounds are allowed to finish while new initiation is blocked, so every chromosome in the population ends fully replicated and log₂PTR must be ≈ 0; a method that reports a large PTR here is reading noise as a gradient. With the shared origin fixed in advance, the V-fit allows small signed estimates rather than censoring noise slopes at zero; its run-out estimates were 0.018–0.238 across the titration, with all 16 enzyme strata contributing at every depth. Sorted-rank</w:t>
-      </w:r>
-      <w:r>
-        <w:t xml:space="preserve"> </w:t>
-      </w:r>
-      <w:r>
-        <w:t xml:space="preserve">regression on the same windows returned 1.80 at 0.5× — seven times any sk2bGrow</w:t>
-      </w:r>
-      <w:r>
-        <w:t xml:space="preserve"> </w:t>
-      </w:r>
-      <w:r>
-        <w:t xml:space="preserve">estimate, and in exactly the direction of reading noise as growth (Fig. 2d).</w:t>
+        <w:t xml:space="preserve">Accuracy is usable throughout the 1–2× band on a growth-rate panel where the</w:t>
+      </w:r>
+      <w:r>
+        <w:t xml:space="preserve"> </w:t>
+      </w:r>
+      <w:r>
+        <w:t xml:space="preserve">incumbent’s shipped defaults return nothing at all. We benchmarked sk2bGrow on</w:t>
+      </w:r>
+      <w:r>
+        <w:t xml:space="preserve"> </w:t>
+      </w:r>
+      <w:r>
+        <w:t xml:space="preserve">the Zheng et al. 2020</w:t>
+      </w:r>
+      <w:r>
+        <w:t xml:space="preserve"> </w:t>
+      </w:r>
+      <w:r>
+        <w:rPr>
+          <w:i/>
+          <w:iCs/>
+        </w:rPr>
+        <w:t xml:space="preserve">E. coli</w:t>
+      </w:r>
+      <w:r>
+        <w:t xml:space="preserve"> </w:t>
+      </w:r>
+      <w:r>
+        <w:t xml:space="preserve">K-12 MG1655 panel (PRJNA615952): 16 defined</w:t>
+      </w:r>
+      <w:r>
+        <w:t xml:space="preserve"> </w:t>
+      </w:r>
+      <w:r>
+        <w:t xml:space="preserve">media with independently measured growth rates λ spanning 0.40–1.72 h⁻¹,</w:t>
+      </w:r>
+      <w:r>
+        <w:t xml:space="preserve"> </w:t>
+      </w:r>
+      <w:r>
+        <w:t xml:space="preserve">titrated to nominal 0.5×, 1×, 2×, 5× and 10× depth. The titration is a</w:t>
+      </w:r>
+      <w:r>
+        <w:t xml:space="preserve"> </w:t>
+      </w:r>
+      <w:r>
+        <w:t xml:space="preserve">deliberate deviation from Pilea, which ran full depth only; it is the axis this</w:t>
+      </w:r>
+      <w:r>
+        <w:t xml:space="preserve"> </w:t>
+      </w:r>
+      <w:r>
+        <w:t xml:space="preserve">paper is about, because metagenomic per-strain coverage is typically 1–2×, not</w:t>
+      </w:r>
+      <w:r>
+        <w:t xml:space="preserve"> </w:t>
+      </w:r>
+      <w:r>
+        <w:t xml:space="preserve">isolate depth. sk2bGrow reached r = 0.912 against measured λ at 1× (95%</w:t>
+      </w:r>
+      <w:r>
+        <w:t xml:space="preserve"> </w:t>
+      </w:r>
+      <w:r>
+        <w:t xml:space="preserve">media-bootstrap CI [0.798, 0.970]; n = 16), 0.958 at 2× and 0.971 at 5× —</w:t>
+      </w:r>
+      <w:r>
+        <w:t xml:space="preserve"> </w:t>
+      </w:r>
+      <w:r>
+        <w:t xml:space="preserve">essentially matching Pilea’s published full-depth r of 0.976 from 5× onward;</w:t>
+      </w:r>
+      <w:r>
+        <w:t xml:space="preserve"> </w:t>
+      </w:r>
+      <w:r>
+        <w:t xml:space="preserve">at 0.5× r = 0.923 (CI [0.854, 0.968]). Magnitude was usable but compressed:</w:t>
+      </w:r>
+      <w:r>
+        <w:t xml:space="preserve"> </w:t>
+      </w:r>
+      <w:r>
+        <w:t xml:space="preserve">RMSE 0.374 with fitted slope 0.83 at 1×, degrading to RMSE 0.483 and slope</w:t>
+      </w:r>
+      <w:r>
+        <w:t xml:space="preserve"> </w:t>
+      </w:r>
+      <w:r>
+        <w:t xml:space="preserve">0.59 at 0.5× (Fig. 2a–c; Table 2). The slope in Table 2 regresses the estimated</w:t>
+      </w:r>
+      <w:r>
+        <w:t xml:space="preserve"> </w:t>
+      </w:r>
+      <w:r>
+        <w:t xml:space="preserve">log₂PTR on the measured growth rate; the slopes annotated on the Fig. 2b, c</w:t>
+      </w:r>
+      <w:r>
+        <w:t xml:space="preserve"> </w:t>
+      </w:r>
+      <w:r>
+        <w:t xml:space="preserve">scatter regress the estimate on the predicted value (λC/ln2) — two different</w:t>
+      </w:r>
+      <w:r>
+        <w:t xml:space="preserve"> </w:t>
+      </w:r>
+      <w:r>
+        <w:t xml:space="preserve">regressions of the same points, reported in the direction each comparison</w:t>
+      </w:r>
+      <w:r>
+        <w:t xml:space="preserve"> </w:t>
+      </w:r>
+      <w:r>
+        <w:t xml:space="preserve">requires. Two scope caveats apply here and</w:t>
+      </w:r>
+      <w:r>
+        <w:t xml:space="preserve"> </w:t>
+      </w:r>
+      <w:r>
+        <w:t xml:space="preserve">throughout the isolate benchmark: every real-data result in this section is one</w:t>
+      </w:r>
+      <w:r>
+        <w:t xml:space="preserve"> </w:t>
+      </w:r>
+      <w:r>
+        <w:t xml:space="preserve">strain against a single complete reference, and Pilea at its shipped defaults</w:t>
+      </w:r>
+      <w:r>
+        <w:t xml:space="preserve"> </w:t>
+      </w:r>
+      <w:r>
+        <w:t xml:space="preserve">returned no estimate below 10× at any point in the titration. All primary</w:t>
+      </w:r>
+      <w:r>
+        <w:t xml:space="preserve"> </w:t>
+      </w:r>
+      <w:r>
+        <w:t xml:space="preserve">estimates use the historical single-pass GC correction. A residual second pass</w:t>
+      </w:r>
+      <w:r>
+        <w:t xml:space="preserve"> </w:t>
+      </w:r>
+      <w:r>
+        <w:t xml:space="preserve">was tested and rejected: it lowered anchor-panel accuracy at 0.5× and 1× to</w:t>
+      </w:r>
+      <w:r>
+        <w:t xml:space="preserve"> </w:t>
+      </w:r>
+      <w:r>
+        <w:t xml:space="preserve">r = 0.848 and 0.879, versus 0.923 and 0.912 under the primary correction,</w:t>
+      </w:r>
+      <w:r>
+        <w:t xml:space="preserve"> </w:t>
+      </w:r>
+      <w:r>
+        <w:t xml:space="preserve">consistent with its absorbing part of the position-linked replication gradient</w:t>
+      </w:r>
+      <w:r>
+        <w:t xml:space="preserve"> </w:t>
+      </w:r>
+      <w:r>
+        <w:t xml:space="preserve">(Methods §1.4).</w:t>
       </w:r>
     </w:p>
-    <w:bookmarkEnd w:id="52"/>
-    <w:bookmarkStart w:id="53" w:name="Xce6b542434ed1814004dfb47fad411b14a7baa6"/>
+    <w:bookmarkEnd w:id="154"/>
+    <w:bookmarkStart w:id="155" w:name="a-negative-control-that-pilea-excluded"/>
     <w:p>
       <w:pPr>
         <w:pStyle w:val="Heading4"/>
       </w:pPr>
       <w:r>
-        <w:t xml:space="preserve">2.3 Which gate suppresses Pilea, and is it right to?</w:t>
+        <w:t xml:space="preserve">2.2 A negative control that Pilea excluded</w:t>
       </w:r>
     </w:p>
     <w:p>
@@ -10359,49 +10588,38 @@
         <w:pStyle w:val="FirstParagraph"/>
       </w:pPr>
       <w:r>
-        <w:t xml:space="preserve">The coverage gate, not the estimator, is what suppresses Pilea below 10× — and the gate is partly right. Re-applying each of Pilea’s default thresholds to its own gates-off output (an exact ablation that requires no extra runs) shows that</w:t>
-      </w:r>
-      <w:r>
-        <w:t xml:space="preserve"> </w:t>
+        <w:t xml:space="preserve">A stationary-phase replication run-out that sorted regression fails badly on was recovered by sk2bGrow. Pilea excluded the run-out samples from its benchmark; we kept one (</w:t>
       </w:r>
       <w:r>
         <w:rPr>
           <w:rStyle w:val="VerbatimChar"/>
         </w:rPr>
-        <w:t xml:space="preserve">--min-cove 5</w:t>
-      </w:r>
-      <w:r>
-        <w:t xml:space="preserve"> </w:t>
-      </w:r>
-      <w:r>
-        <w:t xml:space="preserve">alone accounts for 68 of 68 suppressed</w:t>
-      </w:r>
-      <w:r>
-        <w:t xml:space="preserve"> </w:t>
-      </w:r>
-      <w:r>
-        <w:rPr>
-          <w:i/>
-          <w:iCs/>
-        </w:rPr>
-        <w:t xml:space="preserve">E. coli</w:t>
-      </w:r>
-      <w:r>
-        <w:t xml:space="preserve"> </w:t>
-      </w:r>
-      <w:r>
-        <w:t xml:space="preserve">estimates and 167 of 172 in the multi-strain simulation. Because a 150 bp read yields 120 31-mers, a threshold of 5 on k-mer coverage corresponds to ≈6.25× read coverage (5 × 150/120), so the gate fires at 5× nominal even where the estimator behind it is still informative. At 0.5× the gate is correctly refusing to report: Pilea’s gates-off output there is fully degenerate — measured coverage exactly 1.000 and log₂PTR exactly 0.000 in all 17 samples. Between 1× and 5×, however, the gates-off estimator is informative (r = 0.78, 0.85, 0.99 against λ) and is nevertheless suppressed. The honest claim is therefore not that Pilea is over-conservative, but that its gate is calibrated to the point where the FracMinHash estimator breaks — ≈6.25× read coverage — whereas sk2bGrow’s break point is below 1× (Fig. 2; Table 5).</w:t>
+        <w:t xml:space="preserve">E.coli_gDNA_RUN_OUT</w:t>
+      </w:r>
+      <w:r>
+        <w:t xml:space="preserve">, CON-C). In a replication run-out, ongoing rounds are allowed to finish while new initiation is blocked, so every chromosome in the population ends fully replicated and log₂PTR must be ≈ 0; a method that reports a large PTR here is reading noise as a gradient. With the shared origin fixed in advance, the V-fit allows small signed estimates rather than censoring noise slopes at zero; its run-out estimates were 0.018–0.238 across the titration, with all 16 enzyme strata contributing at every depth. Sorted-rank</w:t>
+      </w:r>
+      <w:r>
+        <w:t xml:space="preserve"> </w:t>
+      </w:r>
+      <w:r>
+        <w:t xml:space="preserve">regression on the same windows returned 1.80 at 0.5× — seven times any sk2bGrow</w:t>
+      </w:r>
+      <w:r>
+        <w:t xml:space="preserve"> </w:t>
+      </w:r>
+      <w:r>
+        <w:t xml:space="preserve">estimate, and in exactly the direction of reading noise as growth (Fig. 2d).</w:t>
       </w:r>
     </w:p>
-    <w:bookmarkEnd w:id="53"/>
-    <w:bookmarkEnd w:id="54"/>
-    <w:bookmarkStart w:id="55" w:name="multi-strain-communities"/>
+    <w:bookmarkEnd w:id="155"/>
+    <w:bookmarkStart w:id="156" w:name="Xce6b542434ed1814004dfb47fad411b14a7baa6"/>
     <w:p>
       <w:pPr>
-        <w:pStyle w:val="Heading3"/>
+        <w:pStyle w:val="Heading4"/>
       </w:pPr>
       <w:r>
-        <w:t xml:space="preserve">3. Multi-strain communities</w:t>
+        <w:t xml:space="preserve">2.3 Which gate suppresses Pilea, and is it right to?</w:t>
       </w:r>
     </w:p>
     <w:p>
@@ -10409,6 +10627,56 @@
         <w:pStyle w:val="FirstParagraph"/>
       </w:pPr>
       <w:r>
+        <w:t xml:space="preserve">The coverage gate, not the estimator, is what suppresses Pilea below 10× — and the gate is partly right. Re-applying each of Pilea’s default thresholds to its own gates-off output (an exact ablation that requires no extra runs) shows that</w:t>
+      </w:r>
+      <w:r>
+        <w:t xml:space="preserve"> </w:t>
+      </w:r>
+      <w:r>
+        <w:rPr>
+          <w:rStyle w:val="VerbatimChar"/>
+        </w:rPr>
+        <w:t xml:space="preserve">--min-cove 5</w:t>
+      </w:r>
+      <w:r>
+        <w:t xml:space="preserve"> </w:t>
+      </w:r>
+      <w:r>
+        <w:t xml:space="preserve">alone accounts for 68 of 68 suppressed</w:t>
+      </w:r>
+      <w:r>
+        <w:t xml:space="preserve"> </w:t>
+      </w:r>
+      <w:r>
+        <w:rPr>
+          <w:i/>
+          <w:iCs/>
+        </w:rPr>
+        <w:t xml:space="preserve">E. coli</w:t>
+      </w:r>
+      <w:r>
+        <w:t xml:space="preserve"> </w:t>
+      </w:r>
+      <w:r>
+        <w:t xml:space="preserve">estimates and 167 of 172 in the multi-strain simulation. Because a 150 bp read yields 120 31-mers, a threshold of 5 on k-mer coverage corresponds to ≈6.25× read coverage (5 × 150/120), so the gate fires at 5× nominal even where the estimator behind it is still informative. At 0.5× the gate is correctly refusing to report: Pilea’s gates-off output there is fully degenerate — measured coverage exactly 1.000 and log₂PTR exactly 0.000 in all 17 samples. Between 1× and 5×, however, the gates-off estimator is informative (r = 0.78, 0.85, 0.99 against λ) and is nevertheless suppressed. The honest claim is therefore not that Pilea is over-conservative, but that its gate is calibrated to the point where the FracMinHash estimator breaks — ≈6.25× read coverage — whereas sk2bGrow’s break point is below 1× (Fig. 2; Table 5).</w:t>
+      </w:r>
+    </w:p>
+    <w:bookmarkEnd w:id="156"/>
+    <w:bookmarkEnd w:id="157"/>
+    <w:bookmarkStart w:id="158" w:name="multi-strain-communities"/>
+    <w:p>
+      <w:pPr>
+        <w:pStyle w:val="Heading3"/>
+      </w:pPr>
+      <w:r>
+        <w:t xml:space="preserve">3. Multi-strain communities</w:t>
+      </w:r>
+    </w:p>
+    <w:p>
+      <w:pPr>
+        <w:pStyle w:val="FirstParagraph"/>
+      </w:pPr>
+      <w:r>
         <w:t xml:space="preserve">sk2bGrow recalled every strain at every cell of a multi-strain community benchmark, at half the RMSE of gates-off Pilea and with bias reduced to negligible. Following Pilea’s Fig. 3 design at a scale a laptop can run, we simulated communities of 4, 8 or 16 strains — 16 complete reference genomes deliberately including</w:t>
       </w:r>
       <w:r>
@@ -10490,8 +10758,8 @@
         <w:t xml:space="preserve">; Methods §6.3). Recall 1.000 therefore still describes an exact-match-favourable grid, but it is no longer supported only by the estimator’s own generative model.</w:t>
       </w:r>
     </w:p>
-    <w:bookmarkEnd w:id="55"/>
-    <w:bookmarkStart w:id="56" w:name="what-do-the-landmarks-contribute"/>
+    <w:bookmarkEnd w:id="158"/>
+    <w:bookmarkStart w:id="160" w:name="what-do-the-landmarks-contribute"/>
     <w:p>
       <w:pPr>
         <w:pStyle w:val="Heading3"/>
@@ -11437,8 +11705,216 @@
         <w:t xml:space="preserve">(Fig. 4)</w:t>
       </w:r>
     </w:p>
-    <w:bookmarkEnd w:id="56"/>
-    <w:bookmarkStart w:id="57" w:name="X5aa37cfb64c4d815f4fee0e74b644b0546e0c08"/>
+    <w:bookmarkStart w:id="159" w:name="Xfc754f5fdbc1a952568615503bb8f3afaadf421"/>
+    <w:p>
+      <w:pPr>
+        <w:pStyle w:val="Heading4"/>
+      </w:pPr>
+      <w:r>
+        <w:t xml:space="preserve">4.1 Count-level factorial analysis: depth and ambiguity are separable</w:t>
+      </w:r>
+    </w:p>
+    <w:p>
+      <w:pPr>
+        <w:pStyle w:val="FirstParagraph"/>
+      </w:pPr>
+      <w:r>
+        <w:t xml:space="preserve">A post-hoc count-level factorial (Methods §6.6) asks whether the shallow-depth</w:t>
+      </w:r>
+      <w:r>
+        <w:t xml:space="preserve"> </w:t>
+      </w:r>
+      <w:r>
+        <w:t xml:space="preserve">mechanism and the multi-strain failure mode can be separated. In the private-</w:t>
+      </w:r>
+      <w:r>
+        <w:t xml:space="preserve"> </w:t>
+      </w:r>
+      <w:r>
+        <w:t xml:space="preserve">anchor control, the coordinate fit was the dominant explanation for accuracy:</w:t>
+      </w:r>
+      <w:r>
+        <w:t xml:space="preserve"> </w:t>
+      </w:r>
+      <w:r>
+        <w:t xml:space="preserve">pooling both landmark arms, its mean RMSE at 0.5× was 0.115 log₂ units, compared</w:t>
+      </w:r>
+      <w:r>
+        <w:t xml:space="preserve"> </w:t>
+      </w:r>
+      <w:r>
+        <w:t xml:space="preserve">with 0.641 for sorted-rank regression, and increasing depth to 8× reduced the</w:t>
+      </w:r>
+      <w:r>
+        <w:t xml:space="preserve"> </w:t>
+      </w:r>
+      <w:r>
+        <w:t xml:space="preserve">coordinate-fit RMSE to 0.018. This is the same direction as the read-level</w:t>
+      </w:r>
+      <w:r>
+        <w:t xml:space="preserve"> </w:t>
+      </w:r>
+      <w:r>
+        <w:t xml:space="preserve">attribution experiment, but under a grid that extends to 32 strains and a</w:t>
+      </w:r>
+      <w:r>
+        <w:t xml:space="preserve"> </w:t>
+      </w:r>
+      <w:r>
+        <w:t xml:space="preserve">100:1 abundance ratio.</w:t>
+      </w:r>
+    </w:p>
+    <w:p>
+      <w:pPr>
+        <w:pStyle w:val="BodyText"/>
+      </w:pPr>
+      <w:r>
+        <w:t xml:space="preserve">Shared evidence changed the problem. With 15 % of anchors shared across strains,</w:t>
+      </w:r>
+      <w:r>
+        <w:t xml:space="preserve"> </w:t>
+      </w:r>
+      <w:r>
+        <w:t xml:space="preserve">coordinate V-fit was already biased by −0.741 log₂ units at 0.5×, and the bias</w:t>
+      </w:r>
+      <w:r>
+        <w:t xml:space="preserve"> </w:t>
+      </w:r>
+      <w:r>
+        <w:t xml:space="preserve">deepened to −1.315 at 8× (RMSE 0.821 and 1.406). Thus increasing depth reduced</w:t>
+      </w:r>
+      <w:r>
+        <w:t xml:space="preserve"> </w:t>
+      </w:r>
+      <w:r>
+        <w:t xml:space="preserve">counting noise in the private-anchor control but did not remove — and in this</w:t>
+      </w:r>
+      <w:r>
+        <w:t xml:space="preserve"> </w:t>
+      </w:r>
+      <w:r>
+        <w:t xml:space="preserve">ambiguity model amplified — assignment error. Abundance imbalance affected the</w:t>
+      </w:r>
+      <w:r>
+        <w:t xml:space="preserve"> </w:t>
+      </w:r>
+      <w:r>
+        <w:t xml:space="preserve">two estimators differently: coordinate V-fit’s mean RMSE rose from 0.504 to 0.593</w:t>
+      </w:r>
+      <w:r>
+        <w:t xml:space="preserve"> </w:t>
+      </w:r>
+      <w:r>
+        <w:t xml:space="preserve">log₂ units from even to 100:1, while sorted-rank regression rose from 0.304 to</w:t>
+      </w:r>
+      <w:r>
+        <w:t xml:space="preserve"> </w:t>
+      </w:r>
+      <w:r>
+        <w:t xml:space="preserve">0.624. The factorial therefore treats depth and ambiguity as distinct axes</w:t>
+      </w:r>
+      <w:r>
+        <w:t xml:space="preserve"> </w:t>
+      </w:r>
+      <w:r>
+        <w:t xml:space="preserve">rather than collapsing both into a generic</w:t>
+      </w:r>
+      <w:r>
+        <w:t xml:space="preserve"> </w:t>
+      </w:r>
+      <w:r>
+        <w:t xml:space="preserve">“multi-strain is harder”</w:t>
+      </w:r>
+      <w:r>
+        <w:t xml:space="preserve"> </w:t>
+      </w:r>
+      <w:r>
+        <w:t xml:space="preserve">statement.</w:t>
+      </w:r>
+    </w:p>
+    <w:p>
+      <w:pPr>
+        <w:pStyle w:val="BodyText"/>
+      </w:pPr>
+      <w:r>
+        <w:t xml:space="preserve">The landmark-placement interaction was conditional on ambiguity. With no shared</w:t>
+      </w:r>
+      <w:r>
+        <w:t xml:space="preserve"> </w:t>
+      </w:r>
+      <w:r>
+        <w:t xml:space="preserve">anchors and equal density, the regular-coordinate and random-coordinate arms were</w:t>
+      </w:r>
+      <w:r>
+        <w:t xml:space="preserve"> </w:t>
+      </w:r>
+      <w:r>
+        <w:t xml:space="preserve">equivalent (paired RMSE differences: +0.002 for coordinate V-fit and −0.014 for</w:t>
+      </w:r>
+      <w:r>
+        <w:t xml:space="preserve"> </w:t>
+      </w:r>
+      <w:r>
+        <w:t xml:space="preserve">sorted rank). At 8× and 15 % shared anchors, however, coordinate V-fit had mean</w:t>
+      </w:r>
+      <w:r>
+        <w:t xml:space="preserve"> </w:t>
+      </w:r>
+      <w:r>
+        <w:t xml:space="preserve">RMSE 0.063 on the regular arm but 2.748 on the random arm, whereas sorted rank</w:t>
+      </w:r>
+      <w:r>
+        <w:t xml:space="preserve"> </w:t>
+      </w:r>
+      <w:r>
+        <w:t xml:space="preserve">was comparatively insensitive (0.278 versus 0.228). We interpret this as a</w:t>
+      </w:r>
+      <w:r>
+        <w:t xml:space="preserve"> </w:t>
+      </w:r>
+      <w:r>
+        <w:t xml:space="preserve">simulator-level warning rather than evidence about Pilea’s production code: the</w:t>
+      </w:r>
+      <w:r>
+        <w:t xml:space="preserve"> </w:t>
+      </w:r>
+      <w:r>
+        <w:t xml:space="preserve">random-coordinate arm is idealized, and the ambiguity assignment is not fitted to</w:t>
+      </w:r>
+      <w:r>
+        <w:t xml:space="preserve"> </w:t>
+      </w:r>
+      <w:r>
+        <w:t xml:space="preserve">a particular mapper. Its value is to show that coordinate methods depend not only</w:t>
+      </w:r>
+      <w:r>
+        <w:t xml:space="preserve"> </w:t>
+      </w:r>
+      <w:r>
+        <w:t xml:space="preserve">on having coordinates, but on the assignability of the underlying landmarks. The</w:t>
+      </w:r>
+      <w:r>
+        <w:t xml:space="preserve"> </w:t>
+      </w:r>
+      <w:r>
+        <w:t xml:space="preserve">complete cell-level results are in Table 11 and Fig. 9.</w:t>
+      </w:r>
+    </w:p>
+    <w:p>
+      <w:pPr>
+        <w:pStyle w:val="BodyText"/>
+      </w:pPr>
+      <w:r>
+        <w:rPr>
+          <w:i/>
+          <w:iCs/>
+        </w:rPr>
+        <w:t xml:space="preserve">(Fig. 9; Table 11)</w:t>
+      </w:r>
+    </w:p>
+    <w:bookmarkEnd w:id="159"/>
+    <w:bookmarkEnd w:id="160"/>
+    <w:bookmarkStart w:id="161" w:name="X5aa37cfb64c4d815f4fee0e74b644b0546e0c08"/>
     <w:p>
       <w:pPr>
         <w:pStyle w:val="Heading3"/>
@@ -12304,8 +12780,8 @@
         <w:t xml:space="preserve">(Fig. 5)</w:t>
       </w:r>
     </w:p>
-    <w:bookmarkEnd w:id="57"/>
-    <w:bookmarkStart w:id="61" w:name="fragmented-references-and-mags"/>
+    <w:bookmarkEnd w:id="161"/>
+    <w:bookmarkStart w:id="165" w:name="fragmented-references-and-mags"/>
     <w:p>
       <w:pPr>
         <w:pStyle w:val="Heading3"/>
@@ -12314,7 +12790,7 @@
         <w:t xml:space="preserve">6. Fragmented references and MAGs</w:t>
       </w:r>
     </w:p>
-    <w:bookmarkStart w:id="58" w:name="X023c9de081127f5a9ee34128d04d5cd51d91210"/>
+    <w:bookmarkStart w:id="162" w:name="X023c9de081127f5a9ee34128d04d5cd51d91210"/>
     <w:p>
       <w:pPr>
         <w:pStyle w:val="Heading4"/>
@@ -13048,8 +13524,8 @@
         </w:tc>
       </w:tr>
     </w:tbl>
-    <w:bookmarkEnd w:id="58"/>
-    <w:bookmarkStart w:id="59" w:name="X6e8375112356a1e59f6c25ab9a7ae77408f4219"/>
+    <w:bookmarkEnd w:id="162"/>
+    <w:bookmarkStart w:id="163" w:name="X6e8375112356a1e59f6c25ab9a7ae77408f4219"/>
     <w:p>
       <w:pPr>
         <w:pStyle w:val="Heading4"/>
@@ -13252,8 +13728,8 @@
         <w:t xml:space="preserve">sketch scaffolding is demonstrated, not shipped (Fig. 6).</w:t>
       </w:r>
     </w:p>
-    <w:bookmarkEnd w:id="59"/>
-    <w:bookmarkStart w:id="60" w:name="X72de53e76597c7041bc0c2cfdd503c5ddd9d60b"/>
+    <w:bookmarkEnd w:id="163"/>
+    <w:bookmarkStart w:id="164" w:name="X72de53e76597c7041bc0c2cfdd503c5ddd9d60b"/>
     <w:p>
       <w:pPr>
         <w:pStyle w:val="Heading4"/>
@@ -13381,9 +13857,9 @@
         <w:t xml:space="preserve">(Fig. 6; Table 8)</w:t>
       </w:r>
     </w:p>
-    <w:bookmarkEnd w:id="60"/>
-    <w:bookmarkEnd w:id="61"/>
-    <w:bookmarkStart w:id="65" w:name="real-metagenomes"/>
+    <w:bookmarkEnd w:id="164"/>
+    <w:bookmarkEnd w:id="165"/>
+    <w:bookmarkStart w:id="169" w:name="real-metagenomes"/>
     <w:p>
       <w:pPr>
         <w:pStyle w:val="Heading3"/>
@@ -13392,7 +13868,7 @@
         <w:t xml:space="preserve">7. Real metagenomes</w:t>
       </w:r>
     </w:p>
-    <w:bookmarkStart w:id="62" w:name="X1ac24289c0a6b34d66188d6319131a2e330c07c"/>
+    <w:bookmarkStart w:id="166" w:name="X1ac24289c0a6b34d66188d6319131a2e330c07c"/>
     <w:p>
       <w:pPr>
         <w:pStyle w:val="Heading4"/>
@@ -13585,8 +14061,8 @@
         <w:t xml:space="preserve">).</w:t>
       </w:r>
     </w:p>
-    <w:bookmarkEnd w:id="62"/>
-    <w:bookmarkStart w:id="63" w:name="Xc081266583f5878e429dba77e287ecfb4e84c13"/>
+    <w:bookmarkEnd w:id="166"/>
+    <w:bookmarkStart w:id="167" w:name="Xc081266583f5878e429dba77e287ecfb4e84c13"/>
     <w:p>
       <w:pPr>
         <w:pStyle w:val="Heading4"/>
@@ -13833,8 +14309,8 @@
         <w:t xml:space="preserve">preparation) (Fig. 7).</w:t>
       </w:r>
     </w:p>
-    <w:bookmarkEnd w:id="63"/>
-    <w:bookmarkStart w:id="64" w:name="X855dfea45c8027e3834f5e0c80b8fc9c7aa81b5"/>
+    <w:bookmarkEnd w:id="167"/>
+    <w:bookmarkStart w:id="168" w:name="X855dfea45c8027e3834f5e0c80b8fc9c7aa81b5"/>
     <w:p>
       <w:pPr>
         <w:pStyle w:val="Heading4"/>
@@ -14263,9 +14739,9 @@
         <w:t xml:space="preserve">(Fig. 8; Table 10)</w:t>
       </w:r>
     </w:p>
-    <w:bookmarkEnd w:id="64"/>
-    <w:bookmarkEnd w:id="65"/>
-    <w:bookmarkStart w:id="66" w:name="computational-efficiency-and-scale"/>
+    <w:bookmarkEnd w:id="168"/>
+    <w:bookmarkEnd w:id="169"/>
+    <w:bookmarkStart w:id="170" w:name="computational-efficiency-and-scale"/>
     <w:p>
       <w:pPr>
         <w:pStyle w:val="Heading3"/>
@@ -14544,9 +15020,9 @@
         <w:t xml:space="preserve">(Fig. 8d)</w:t>
       </w:r>
     </w:p>
-    <w:bookmarkEnd w:id="66"/>
-    <w:bookmarkEnd w:id="67"/>
-    <w:bookmarkStart w:id="68" w:name="discussion"/>
+    <w:bookmarkEnd w:id="170"/>
+    <w:bookmarkEnd w:id="171"/>
+    <w:bookmarkStart w:id="172" w:name="discussion"/>
     <w:p>
       <w:pPr>
         <w:pStyle w:val="Heading2"/>
@@ -14571,6 +15047,210 @@
       </w:r>
       <w:r>
         <w:t xml:space="preserve">The attribution experiment (Results §4) constrains the claim the data support: the coordinate-aware estimator is what carries the low-coverage result, on either landmark source — at 0.5–1× the V-fit beats sorted-rank regression by wide margins on both enzyme anchors and a density-matched FracMinHash sketch. The landmark source itself showed no detectable accuracy difference in this paired analysis: pooling 48 media × subsampling-instance units, anchors and matched-density sketch were not significantly different, including at 0.5×. The estimator × landmark interaction is null at 1× and significantly negative at 2× — there is no evidence the panel amplifies the estimator’s value, and some that the sketch benefits more from it. What the multi-enzyme panel contributes instead is structure a hash sketch cannot provide: a landmark set the 2bRAD protocol physically produces (wet-lab realizable, not only computational); motif strata with heterogeneous biases, so cross-enzyme agreement tests systematic error and not just sampling noise — Cochran’s Q caught this paper’s own double-counting defect; and at very low input, fusion redundancy: a single-stratum sketch that finds no downhill origin has no second stratum to rescue it (F1 harness, single-end), while sixteen strata need only a subset of per-enzyme fits to succeed. The honest one-line version: the estimator buys the low-depth accuracy; the panel buys realizability, heterogeneous QC strata, and fusion redundancy.</w:t>
+      </w:r>
+    </w:p>
+    <w:p>
+      <w:pPr>
+        <w:pStyle w:val="BodyText"/>
+      </w:pPr>
+      <w:r>
+        <w:rPr>
+          <w:b/>
+          <w:bCs/>
+        </w:rPr>
+        <w:t xml:space="preserve">Depth is one axis; assignability is another.</w:t>
+      </w:r>
+      <w:r>
+        <w:t xml:space="preserve"> </w:t>
+      </w:r>
+      <w:r>
+        <w:t xml:space="preserve">The count-level factorial</w:t>
+      </w:r>
+      <w:r>
+        <w:t xml:space="preserve"> </w:t>
+      </w:r>
+      <w:r>
+        <w:t xml:space="preserve">(Results §4.1) sharpens this distinction without changing its conservative</w:t>
+      </w:r>
+      <w:r>
+        <w:t xml:space="preserve"> </w:t>
+      </w:r>
+      <w:r>
+        <w:t xml:space="preserve">framing. In the private-anchor control, coordinate fitting improved steadily</w:t>
+      </w:r>
+      <w:r>
+        <w:t xml:space="preserve"> </w:t>
+      </w:r>
+      <w:r>
+        <w:t xml:space="preserve">with depth, whereas sorted-rank regression remained much less accurate over the</w:t>
+      </w:r>
+      <w:r>
+        <w:t xml:space="preserve"> </w:t>
+      </w:r>
+      <w:r>
+        <w:t xml:space="preserve">whole tested range. When anchors were shared among strains, however, depth no</w:t>
+      </w:r>
+      <w:r>
+        <w:t xml:space="preserve"> </w:t>
+      </w:r>
+      <w:r>
+        <w:t xml:space="preserve">longer behaved as a simple cure: the coordinate fit’s negative bias increased</w:t>
+      </w:r>
+      <w:r>
+        <w:t xml:space="preserve"> </w:t>
+      </w:r>
+      <w:r>
+        <w:t xml:space="preserve">with depth under the shared-anchor assignment model. This explains why a claim</w:t>
+      </w:r>
+      <w:r>
+        <w:t xml:space="preserve"> </w:t>
+      </w:r>
+      <w:r>
+        <w:t xml:space="preserve">that sk2bGrow</w:t>
+      </w:r>
+      <w:r>
+        <w:t xml:space="preserve"> </w:t>
+      </w:r>
+      <w:r>
+        <w:t xml:space="preserve">“wins at low depth”</w:t>
+      </w:r>
+      <w:r>
+        <w:t xml:space="preserve"> </w:t>
+      </w:r>
+      <w:r>
+        <w:t xml:space="preserve">and a concern that multi-species PTR is</w:t>
+      </w:r>
+      <w:r>
+        <w:t xml:space="preserve"> </w:t>
+      </w:r>
+      <w:r>
+        <w:t xml:space="preserve">confounded by shared evidence are not competing statements. The first is about</w:t>
+      </w:r>
+      <w:r>
+        <w:t xml:space="preserve"> </w:t>
+      </w:r>
+      <w:r>
+        <w:t xml:space="preserve">extracting a coordinate gradient from few observations; the second is about</w:t>
+      </w:r>
+      <w:r>
+        <w:t xml:space="preserve"> </w:t>
+      </w:r>
+      <w:r>
+        <w:t xml:space="preserve">whether each observation can be attributed to the correct reference. An</w:t>
+      </w:r>
+      <w:r>
+        <w:t xml:space="preserve"> </w:t>
+      </w:r>
+      <w:r>
+        <w:t xml:space="preserve">end-to-end comparison can therefore be shallow-depth-favourable and still fail</w:t>
+      </w:r>
+      <w:r>
+        <w:t xml:space="preserve"> </w:t>
+      </w:r>
+      <w:r>
+        <w:t xml:space="preserve">or degrade in a dense community. The factorial result does not prove that Pilea’s</w:t>
+      </w:r>
+      <w:r>
+        <w:t xml:space="preserve"> </w:t>
+      </w:r>
+      <w:r>
+        <w:t xml:space="preserve">production pipeline suffers from this exact assignment mechanism, but it makes</w:t>
+      </w:r>
+      <w:r>
+        <w:t xml:space="preserve"> </w:t>
+      </w:r>
+      <w:r>
+        <w:t xml:space="preserve">the mechanism testable and argues for reporting the fraction of shared or</w:t>
+      </w:r>
+      <w:r>
+        <w:t xml:space="preserve"> </w:t>
+      </w:r>
+      <w:r>
+        <w:t xml:space="preserve">ambiguous landmarks alongside depth and recall.</w:t>
+      </w:r>
+    </w:p>
+    <w:p>
+      <w:pPr>
+        <w:pStyle w:val="BodyText"/>
+      </w:pPr>
+      <w:r>
+        <w:rPr>
+          <w:b/>
+          <w:bCs/>
+        </w:rPr>
+        <w:t xml:space="preserve">Ambiguity should become an explicit QC axis, not a post-hoc explanation.</w:t>
+      </w:r>
+      <w:r>
+        <w:t xml:space="preserve"> </w:t>
+      </w:r>
+      <w:r>
+        <w:t xml:space="preserve">The</w:t>
+      </w:r>
+      <w:r>
+        <w:t xml:space="preserve"> </w:t>
+      </w:r>
+      <w:r>
+        <w:t xml:space="preserve">practical implication is not that 2bRAD is universally superior. A coordinate</w:t>
+      </w:r>
+      <w:r>
+        <w:t xml:space="preserve"> </w:t>
+      </w:r>
+      <w:r>
+        <w:t xml:space="preserve">fit is powerful only when coordinate-bearing observations are assignable; a</w:t>
+      </w:r>
+      <w:r>
+        <w:t xml:space="preserve"> </w:t>
+      </w:r>
+      <w:r>
+        <w:t xml:space="preserve">sketch may tolerate some forms of divergence better, as F3 suggests, but can lose</w:t>
+      </w:r>
+      <w:r>
+        <w:t xml:space="preserve"> </w:t>
+      </w:r>
+      <w:r>
+        <w:t xml:space="preserve">the coordinate structure needed for V-fitting. Future implementations should</w:t>
+      </w:r>
+      <w:r>
+        <w:t xml:space="preserve"> </w:t>
+      </w:r>
+      <w:r>
+        <w:t xml:space="preserve">report unique/shared anchor fractions and per-reference unique coverage, compare</w:t>
+      </w:r>
+      <w:r>
+        <w:t xml:space="preserve"> </w:t>
+      </w:r>
+      <w:r>
+        <w:t xml:space="preserve">fits before and after downweighting ambiguous loci, and reserve EM-style</w:t>
+      </w:r>
+      <w:r>
+        <w:t xml:space="preserve"> </w:t>
+      </w:r>
+      <w:r>
+        <w:t xml:space="preserve">assignment for references whose shared-anchor structure has been measured. Until</w:t>
+      </w:r>
+      <w:r>
+        <w:t xml:space="preserve"> </w:t>
+      </w:r>
+      <w:r>
+        <w:t xml:space="preserve">such a read-level experiment is available, the factorial analysis supports a</w:t>
+      </w:r>
+      <w:r>
+        <w:t xml:space="preserve"> </w:t>
+      </w:r>
+      <w:r>
+        <w:t xml:space="preserve">diagnostic distinction — shallow-depth extraction versus multi-reference</w:t>
+      </w:r>
+      <w:r>
+        <w:t xml:space="preserve"> </w:t>
+      </w:r>
+      <w:r>
+        <w:t xml:space="preserve">assignment — but not a general claim that one landmark chemistry outperforms the</w:t>
+      </w:r>
+      <w:r>
+        <w:t xml:space="preserve"> </w:t>
+      </w:r>
+      <w:r>
+        <w:t xml:space="preserve">other.</w:t>
       </w:r>
     </w:p>
     <w:p>
@@ -15979,8 +16659,8 @@
         <w:t xml:space="preserve">have no data in this study and must not be read as null results. The mismatch-tolerance row is asymmetric for a measured reason (F3): the enzyme mode’s exact-first counting rule suppresses the near-neighbor search that becomes the sketch mode’s rescue channel at scale ~100. Sketch-side scaffolding and sketch mismatch tolerance rest on a rule-based port/simulation respectively, not on shipped CLI modes (F3/F4 REVIEW caveats).</w:t>
       </w:r>
     </w:p>
-    <w:bookmarkEnd w:id="68"/>
-    <w:bookmarkStart w:id="69" w:name="conclusions"/>
+    <w:bookmarkEnd w:id="172"/>
+    <w:bookmarkStart w:id="173" w:name="conclusions"/>
     <w:p>
       <w:pPr>
         <w:pStyle w:val="Heading2"/>
@@ -16013,8 +16693,8 @@
         <w:t xml:space="preserve">The benchmark also defines the limits of deployment. Low-coverage estimates have compressed dynamic range, and GC, fragmented references, strain mixtures, absent references, and MAG-scale runtime require explicit safeguards. Current conservative QC therefore trades yield for reliability. Within these limits, sk2bGrow provides a reproducible shallow-depth growth-inference module for longitudinal microbiome studies; in disease cohorts, derived PTR dynamics may complement taxonomic abundance features in conventional prediction models, but this application requires direct validation in oral and gut datasets.</w:t>
       </w:r>
     </w:p>
-    <w:bookmarkEnd w:id="69"/>
-    <w:bookmarkStart w:id="70" w:name="list-of-abbreviations"/>
+    <w:bookmarkEnd w:id="173"/>
+    <w:bookmarkStart w:id="174" w:name="list-of-abbreviations"/>
     <w:p>
       <w:pPr>
         <w:pStyle w:val="Heading2"/>
@@ -16061,8 +16741,8 @@
         <w:t xml:space="preserve">V-fit: coordinate-aware windowed V-shaped regression fit</w:t>
       </w:r>
     </w:p>
-    <w:bookmarkEnd w:id="70"/>
-    <w:bookmarkStart w:id="80" w:name="declarations"/>
+    <w:bookmarkEnd w:id="174"/>
+    <w:bookmarkStart w:id="184" w:name="declarations"/>
     <w:p>
       <w:pPr>
         <w:pStyle w:val="Heading2"/>
@@ -16071,7 +16751,7 @@
         <w:t xml:space="preserve">Declarations</w:t>
       </w:r>
     </w:p>
-    <w:bookmarkStart w:id="71" w:name="Xd182db0490b2de20bd2b4e4cc8698599182035f"/>
+    <w:bookmarkStart w:id="175" w:name="Xd182db0490b2de20bd2b4e4cc8698599182035f"/>
     <w:p>
       <w:pPr>
         <w:pStyle w:val="Heading3"/>
@@ -16088,8 +16768,8 @@
         <w:t xml:space="preserve">Not applicable. This study analysed only publicly available sequencing data.</w:t>
       </w:r>
     </w:p>
-    <w:bookmarkEnd w:id="71"/>
-    <w:bookmarkStart w:id="72" w:name="consent-for-publication"/>
+    <w:bookmarkEnd w:id="175"/>
+    <w:bookmarkStart w:id="176" w:name="consent-for-publication"/>
     <w:p>
       <w:pPr>
         <w:pStyle w:val="Heading3"/>
@@ -16106,8 +16786,8 @@
         <w:t xml:space="preserve">Not applicable.</w:t>
       </w:r>
     </w:p>
-    <w:bookmarkEnd w:id="72"/>
-    <w:bookmarkStart w:id="74" w:name="availability-of-data-and-materials"/>
+    <w:bookmarkEnd w:id="176"/>
+    <w:bookmarkStart w:id="178" w:name="availability-of-data-and-materials"/>
     <w:p>
       <w:pPr>
         <w:pStyle w:val="Heading3"/>
@@ -16126,7 +16806,7 @@
       <w:r>
         <w:t xml:space="preserve"> </w:t>
       </w:r>
-      <w:hyperlink r:id="rId22">
+      <w:hyperlink r:id="rId124">
         <w:r>
           <w:rPr>
             <w:rStyle w:val="Hyperlink"/>
@@ -16146,7 +16826,7 @@
       <w:r>
         <w:t xml:space="preserve"> </w:t>
       </w:r>
-      <w:hyperlink r:id="rId73">
+      <w:hyperlink r:id="rId177">
         <w:r>
           <w:rPr>
             <w:rStyle w:val="Hyperlink"/>
@@ -16173,6 +16853,21 @@
         <w:t xml:space="preserve">data/</w:t>
       </w:r>
       <w:r>
+        <w:t xml:space="preserve"> </w:t>
+      </w:r>
+      <w:r>
+        <w:t xml:space="preserve">and</w:t>
+      </w:r>
+      <w:r>
+        <w:t xml:space="preserve"> </w:t>
+      </w:r>
+      <w:r>
+        <w:rPr>
+          <w:rStyle w:val="VerbatimChar"/>
+        </w:rPr>
+        <w:t xml:space="preserve">factorial_benchmark/factorial_long.tsv</w:t>
+      </w:r>
+      <w:r>
         <w:t xml:space="preserve">;</w:t>
       </w:r>
       <w:r>
@@ -16188,7 +16883,28 @@
         <w:t xml:space="preserve"> </w:t>
       </w:r>
       <w:r>
-        <w:t xml:space="preserve">regenerates all of them with no network access and no recomputation from reads.</w:t>
+        <w:t xml:space="preserve">and</w:t>
+      </w:r>
+      <w:r>
+        <w:t xml:space="preserve"> </w:t>
+      </w:r>
+      <w:r>
+        <w:rPr>
+          <w:rStyle w:val="VerbatimChar"/>
+        </w:rPr>
+        <w:t xml:space="preserve">python3 factorial_benchmark/make_factorial_outputs.py</w:t>
+      </w:r>
+      <w:r>
+        <w:t xml:space="preserve"> </w:t>
+      </w:r>
+      <w:r>
+        <w:t xml:space="preserve">regenerate them with no</w:t>
+      </w:r>
+      <w:r>
+        <w:t xml:space="preserve"> </w:t>
+      </w:r>
+      <w:r>
+        <w:t xml:space="preserve">network access and no recomputation from reads.</w:t>
       </w:r>
       <w:r>
         <w:t xml:space="preserve"> </w:t>
@@ -16252,6 +16968,30 @@
       </w:r>
       <w:r>
         <w:t xml:space="preserve">).</w:t>
+      </w:r>
+      <w:r>
+        <w:t xml:space="preserve"> </w:t>
+      </w:r>
+      <w:r>
+        <w:t xml:space="preserve">Count-level factorial inputs, aggregate tables, simulator and Figure 9 code are</w:t>
+      </w:r>
+      <w:r>
+        <w:t xml:space="preserve"> </w:t>
+      </w:r>
+      <w:r>
+        <w:t xml:space="preserve">in</w:t>
+      </w:r>
+      <w:r>
+        <w:t xml:space="preserve"> </w:t>
+      </w:r>
+      <w:r>
+        <w:rPr>
+          <w:rStyle w:val="VerbatimChar"/>
+        </w:rPr>
+        <w:t xml:space="preserve">factorial_benchmark/</w:t>
+      </w:r>
+      <w:r>
+        <w:t xml:space="preserve">.</w:t>
       </w:r>
       <w:r>
         <w:t xml:space="preserve"> </w:t>
@@ -16282,8 +17022,8 @@
         <w:t xml:space="preserve">study), PRJNA974210 (rotating biological contactor metagenome).</w:t>
       </w:r>
     </w:p>
-    <w:bookmarkEnd w:id="74"/>
-    <w:bookmarkStart w:id="75" w:name="competing-interests"/>
+    <w:bookmarkEnd w:id="178"/>
+    <w:bookmarkStart w:id="179" w:name="competing-interests"/>
     <w:p>
       <w:pPr>
         <w:pStyle w:val="Heading3"/>
@@ -16300,8 +17040,8 @@
         <w:t xml:space="preserve">The authors declare that they have no competing interests.</w:t>
       </w:r>
     </w:p>
-    <w:bookmarkEnd w:id="75"/>
-    <w:bookmarkStart w:id="76" w:name="funding"/>
+    <w:bookmarkEnd w:id="179"/>
+    <w:bookmarkStart w:id="180" w:name="funding"/>
     <w:p>
       <w:pPr>
         <w:pStyle w:val="Heading3"/>
@@ -16318,8 +17058,8 @@
         <w:t xml:space="preserve">[To be completed before submission.]</w:t>
       </w:r>
     </w:p>
-    <w:bookmarkEnd w:id="76"/>
-    <w:bookmarkStart w:id="77" w:name="authors-contributions"/>
+    <w:bookmarkEnd w:id="180"/>
+    <w:bookmarkStart w:id="181" w:name="authors-contributions"/>
     <w:p>
       <w:pPr>
         <w:pStyle w:val="Heading3"/>
@@ -16336,8 +17076,8 @@
         <w:t xml:space="preserve">[To be completed before submission using CRediT taxonomy and the final author initials.]</w:t>
       </w:r>
     </w:p>
-    <w:bookmarkEnd w:id="77"/>
-    <w:bookmarkStart w:id="78" w:name="acknowledgements"/>
+    <w:bookmarkEnd w:id="181"/>
+    <w:bookmarkStart w:id="182" w:name="acknowledgements"/>
     <w:p>
       <w:pPr>
         <w:pStyle w:val="Heading3"/>
@@ -16354,8 +17094,8 @@
         <w:t xml:space="preserve">[To be completed before submission or state “Not applicable.”]</w:t>
       </w:r>
     </w:p>
-    <w:bookmarkEnd w:id="78"/>
-    <w:bookmarkStart w:id="79" w:name="authors-information"/>
+    <w:bookmarkEnd w:id="182"/>
+    <w:bookmarkStart w:id="183" w:name="authors-information"/>
     <w:p>
       <w:pPr>
         <w:pStyle w:val="Heading3"/>
@@ -16372,9 +17112,9 @@
         <w:t xml:space="preserve">Not applicable.</w:t>
       </w:r>
     </w:p>
-    <w:bookmarkEnd w:id="79"/>
-    <w:bookmarkEnd w:id="80"/>
-    <w:bookmarkStart w:id="89" w:name="references"/>
+    <w:bookmarkEnd w:id="183"/>
+    <w:bookmarkEnd w:id="184"/>
+    <w:bookmarkStart w:id="193" w:name="references"/>
     <w:p>
       <w:pPr>
         <w:pStyle w:val="Heading2"/>
@@ -16407,7 +17147,7 @@
       <w:r>
         <w:t xml:space="preserve">. 2015;349(6252):1101–1106. doi:</w:t>
       </w:r>
-      <w:hyperlink r:id="rId81">
+      <w:hyperlink r:id="rId185">
         <w:r>
           <w:rPr>
             <w:rStyle w:val="Hyperlink"/>
@@ -16440,7 +17180,7 @@
       <w:r>
         <w:t xml:space="preserve">. 2016;34(12):1256–1263. doi:</w:t>
       </w:r>
-      <w:hyperlink r:id="rId82">
+      <w:hyperlink r:id="rId186">
         <w:r>
           <w:rPr>
             <w:rStyle w:val="Hyperlink"/>
@@ -16473,7 +17213,7 @@
       <w:r>
         <w:t xml:space="preserve">. 2022;32(3):558–568. doi:</w:t>
       </w:r>
-      <w:hyperlink r:id="rId83">
+      <w:hyperlink r:id="rId187">
         <w:r>
           <w:rPr>
             <w:rStyle w:val="Hyperlink"/>
@@ -16506,7 +17246,7 @@
       <w:r>
         <w:t xml:space="preserve">. 2026;14(1):128. doi:</w:t>
       </w:r>
-      <w:hyperlink r:id="rId84">
+      <w:hyperlink r:id="rId188">
         <w:r>
           <w:rPr>
             <w:rStyle w:val="Hyperlink"/>
@@ -16539,7 +17279,7 @@
       <w:r>
         <w:t xml:space="preserve">. 2012;9(8):808–810. doi:</w:t>
       </w:r>
-      <w:hyperlink r:id="rId85">
+      <w:hyperlink r:id="rId189">
         <w:r>
           <w:rPr>
             <w:rStyle w:val="Hyperlink"/>
@@ -16572,7 +17312,7 @@
       <w:r>
         <w:t xml:space="preserve">. 2020;15(4):e0219882. doi:</w:t>
       </w:r>
-      <w:hyperlink r:id="rId86">
+      <w:hyperlink r:id="rId190">
         <w:r>
           <w:rPr>
             <w:rStyle w:val="Hyperlink"/>
@@ -16605,7 +17345,7 @@
       <w:r>
         <w:t xml:space="preserve">. 2022;23:36. doi:</w:t>
       </w:r>
-      <w:hyperlink r:id="rId87">
+      <w:hyperlink r:id="rId191">
         <w:r>
           <w:rPr>
             <w:rStyle w:val="Hyperlink"/>
@@ -16638,7 +17378,7 @@
       <w:r>
         <w:t xml:space="preserve">. 2022. doi:</w:t>
       </w:r>
-      <w:hyperlink r:id="rId88">
+      <w:hyperlink r:id="rId192">
         <w:r>
           <w:rPr>
             <w:rStyle w:val="Hyperlink"/>
@@ -16647,8 +17387,8 @@
         </w:r>
       </w:hyperlink>
     </w:p>
-    <w:bookmarkEnd w:id="89"/>
-    <w:bookmarkStart w:id="114" w:name="figures"/>
+    <w:bookmarkEnd w:id="193"/>
+    <w:bookmarkStart w:id="221" w:name="figures"/>
     <w:p>
       <w:pPr>
         <w:pStyle w:val="Heading2"/>
@@ -16666,18 +17406,18 @@
           <wp:inline>
             <wp:extent cx="5943600" cy="4067536"/>
             <wp:effectExtent b="0" l="0" r="0" t="0"/>
-            <wp:docPr descr="Fig. 1. Overview and worked example" title="" id="91" name="Picture"/>
+            <wp:docPr descr="Fig. 1. Overview and worked example" title="" id="195" name="Picture"/>
             <a:graphic>
               <a:graphicData uri="http://schemas.openxmlformats.org/drawingml/2006/picture">
                 <pic:pic>
                   <pic:nvPicPr>
-                    <pic:cNvPr descr="../figures/out/fig1_overview.png" id="92" name="Picture"/>
+                    <pic:cNvPr descr="../figures/out/fig1_overview.png" id="196" name="Picture"/>
                     <pic:cNvPicPr>
                       <a:picLocks noChangeArrowheads="1" noChangeAspect="1"/>
                     </pic:cNvPicPr>
                   </pic:nvPicPr>
                   <pic:blipFill>
-                    <a:blip r:embed="rId90"/>
+                    <a:blip r:embed="rId194"/>
                     <a:stretch>
                       <a:fillRect/>
                     </a:stretch>
@@ -16731,18 +17471,18 @@
           <wp:inline>
             <wp:extent cx="5943600" cy="2123380"/>
             <wp:effectExtent b="0" l="0" r="0" t="0"/>
-            <wp:docPr descr="Fig. 2. Zheng isolate benchmark, accuracy versus coverage, and run-out control" title="" id="94" name="Picture"/>
+            <wp:docPr descr="Fig. 2. Zheng isolate benchmark, accuracy versus coverage, and run-out control" title="" id="198" name="Picture"/>
             <a:graphic>
               <a:graphicData uri="http://schemas.openxmlformats.org/drawingml/2006/picture">
                 <pic:pic>
                   <pic:nvPicPr>
-                    <pic:cNvPr descr="../figures/out/fig2_zheng_benchmark.png" id="95" name="Picture"/>
+                    <pic:cNvPr descr="../figures/out/fig2_zheng_benchmark.png" id="199" name="Picture"/>
                     <pic:cNvPicPr>
                       <a:picLocks noChangeArrowheads="1" noChangeAspect="1"/>
                     </pic:cNvPicPr>
                   </pic:nvPicPr>
                   <pic:blipFill>
-                    <a:blip r:embed="rId93"/>
+                    <a:blip r:embed="rId197"/>
                     <a:stretch>
                       <a:fillRect/>
                     </a:stretch>
@@ -16796,18 +17536,18 @@
           <wp:inline>
             <wp:extent cx="5943600" cy="2397967"/>
             <wp:effectExtent b="0" l="0" r="0" t="0"/>
-            <wp:docPr descr="Fig. 3. Multi-strain simulation" title="" id="97" name="Picture"/>
+            <wp:docPr descr="Fig. 3. Multi-strain simulation" title="" id="201" name="Picture"/>
             <a:graphic>
               <a:graphicData uri="http://schemas.openxmlformats.org/drawingml/2006/picture">
                 <pic:pic>
                   <pic:nvPicPr>
-                    <pic:cNvPr descr="../figures/out/fig3_simulation.png" id="98" name="Picture"/>
+                    <pic:cNvPr descr="../figures/out/fig3_simulation.png" id="202" name="Picture"/>
                     <pic:cNvPicPr>
                       <a:picLocks noChangeArrowheads="1" noChangeAspect="1"/>
                     </pic:cNvPicPr>
                   </pic:nvPicPr>
                   <pic:blipFill>
-                    <a:blip r:embed="rId96"/>
+                    <a:blip r:embed="rId200"/>
                     <a:stretch>
                       <a:fillRect/>
                     </a:stretch>
@@ -16861,18 +17601,18 @@
           <wp:inline>
             <wp:extent cx="5943600" cy="2011791"/>
             <wp:effectExtent b="0" l="0" r="0" t="0"/>
-            <wp:docPr descr="Fig. 4. Landmark-source attribution" title="" id="100" name="Picture"/>
+            <wp:docPr descr="Fig. 4. Landmark-source attribution" title="" id="204" name="Picture"/>
             <a:graphic>
               <a:graphicData uri="http://schemas.openxmlformats.org/drawingml/2006/picture">
                 <pic:pic>
                   <pic:nvPicPr>
-                    <pic:cNvPr descr="../figures/out/fig4_attribution.png" id="101" name="Picture"/>
+                    <pic:cNvPr descr="../figures/out/fig4_attribution.png" id="205" name="Picture"/>
                     <pic:cNvPicPr>
                       <a:picLocks noChangeArrowheads="1" noChangeAspect="1"/>
                     </pic:cNvPicPr>
                   </pic:nvPicPr>
                   <pic:blipFill>
-                    <a:blip r:embed="rId99"/>
+                    <a:blip r:embed="rId203"/>
                     <a:stretch>
                       <a:fillRect/>
                     </a:stretch>
@@ -16926,18 +17666,18 @@
           <wp:inline>
             <wp:extent cx="5943600" cy="4181188"/>
             <wp:effectExtent b="0" l="0" r="0" t="0"/>
-            <wp:docPr descr="Fig. 5. Panel-size sweep and GC range" title="" id="103" name="Picture"/>
+            <wp:docPr descr="Fig. 5. Panel-size sweep and GC range" title="" id="207" name="Picture"/>
             <a:graphic>
               <a:graphicData uri="http://schemas.openxmlformats.org/drawingml/2006/picture">
                 <pic:pic>
                   <pic:nvPicPr>
-                    <pic:cNvPr descr="../figures/out/fig5_panel_design.png" id="104" name="Picture"/>
+                    <pic:cNvPr descr="../figures/out/fig5_panel_design.png" id="208" name="Picture"/>
                     <pic:cNvPicPr>
                       <a:picLocks noChangeArrowheads="1" noChangeAspect="1"/>
                     </pic:cNvPicPr>
                   </pic:nvPicPr>
                   <pic:blipFill>
-                    <a:blip r:embed="rId102"/>
+                    <a:blip r:embed="rId206"/>
                     <a:stretch>
                       <a:fillRect/>
                     </a:stretch>
@@ -16991,18 +17731,18 @@
           <wp:inline>
             <wp:extent cx="5943600" cy="4873369"/>
             <wp:effectExtent b="0" l="0" r="0" t="0"/>
-            <wp:docPr descr="Fig. 6. Fragmentation and scaffolding" title="" id="106" name="Picture"/>
+            <wp:docPr descr="Fig. 6. Fragmentation and scaffolding" title="" id="210" name="Picture"/>
             <a:graphic>
               <a:graphicData uri="http://schemas.openxmlformats.org/drawingml/2006/picture">
                 <pic:pic>
                   <pic:nvPicPr>
-                    <pic:cNvPr descr="../figures/out/fig6_fragmentation.png" id="107" name="Picture"/>
+                    <pic:cNvPr descr="../figures/out/fig6_fragmentation.png" id="211" name="Picture"/>
                     <pic:cNvPicPr>
                       <a:picLocks noChangeArrowheads="1" noChangeAspect="1"/>
                     </pic:cNvPicPr>
                   </pic:nvPicPr>
                   <pic:blipFill>
-                    <a:blip r:embed="rId105"/>
+                    <a:blip r:embed="rId209"/>
                     <a:stretch>
                       <a:fillRect/>
                     </a:stretch>
@@ -17056,18 +17796,18 @@
           <wp:inline>
             <wp:extent cx="5943600" cy="2396004"/>
             <wp:effectExtent b="0" l="0" r="0" t="0"/>
-            <wp:docPr descr="Fig. 7. Fecal-cohort concordance" title="" id="109" name="Picture"/>
+            <wp:docPr descr="Fig. 7. Fecal-cohort concordance" title="" id="213" name="Picture"/>
             <a:graphic>
               <a:graphicData uri="http://schemas.openxmlformats.org/drawingml/2006/picture">
                 <pic:pic>
                   <pic:nvPicPr>
-                    <pic:cNvPr descr="../figures/out/fig7_metagenome.png" id="110" name="Picture"/>
+                    <pic:cNvPr descr="../figures/out/fig7_metagenome.png" id="214" name="Picture"/>
                     <pic:cNvPicPr>
                       <a:picLocks noChangeArrowheads="1" noChangeAspect="1"/>
                     </pic:cNvPicPr>
                   </pic:nvPicPr>
                   <pic:blipFill>
-                    <a:blip r:embed="rId108"/>
+                    <a:blip r:embed="rId212"/>
                     <a:stretch>
                       <a:fillRect/>
                     </a:stretch>
@@ -17121,18 +17861,18 @@
           <wp:inline>
             <wp:extent cx="5943600" cy="2642374"/>
             <wp:effectExtent b="0" l="0" r="0" t="0"/>
-            <wp:docPr descr="Fig. 8. MAG-scale QC and cost" title="" id="112" name="Picture"/>
+            <wp:docPr descr="Fig. 8. MAG-scale QC and cost" title="" id="216" name="Picture"/>
             <a:graphic>
               <a:graphicData uri="http://schemas.openxmlformats.org/drawingml/2006/picture">
                 <pic:pic>
                   <pic:nvPicPr>
-                    <pic:cNvPr descr="../figures/out/fig8_mag_qc_cost.png" id="113" name="Picture"/>
+                    <pic:cNvPr descr="../figures/out/fig8_mag_qc_cost.png" id="217" name="Picture"/>
                     <pic:cNvPicPr>
                       <a:picLocks noChangeArrowheads="1" noChangeAspect="1"/>
                     </pic:cNvPicPr>
                   </pic:nvPicPr>
                   <pic:blipFill>
-                    <a:blip r:embed="rId111"/>
+                    <a:blip r:embed="rId215"/>
                     <a:stretch>
                       <a:fillRect/>
                     </a:stretch>
@@ -17179,6 +17919,71 @@
     </w:p>
     <w:p>
       <w:pPr>
+        <w:pStyle w:val="CaptionedFigure"/>
+      </w:pPr>
+      <w:r>
+        <w:drawing>
+          <wp:inline>
+            <wp:extent cx="5943600" cy="1907620"/>
+            <wp:effectExtent b="0" l="0" r="0" t="0"/>
+            <wp:docPr descr="Fig. 9. Count-level factorial decomposition of estimator, depth and shared-anchor ambiguity" title="" id="219" name="Picture"/>
+            <a:graphic>
+              <a:graphicData uri="http://schemas.openxmlformats.org/drawingml/2006/picture">
+                <pic:pic>
+                  <pic:nvPicPr>
+                    <pic:cNvPr descr="../figures/out/fig9_factorial_mechanism.png" id="220" name="Picture"/>
+                    <pic:cNvPicPr>
+                      <a:picLocks noChangeArrowheads="1" noChangeAspect="1"/>
+                    </pic:cNvPicPr>
+                  </pic:nvPicPr>
+                  <pic:blipFill>
+                    <a:blip r:embed="rId218"/>
+                    <a:stretch>
+                      <a:fillRect/>
+                    </a:stretch>
+                  </pic:blipFill>
+                  <pic:spPr bwMode="auto">
+                    <a:xfrm>
+                      <a:off x="0" y="0"/>
+                      <a:ext cx="5943600" cy="1907620"/>
+                    </a:xfrm>
+                    <a:prstGeom prst="rect">
+                      <a:avLst/>
+                    </a:prstGeom>
+                    <a:noFill/>
+                    <a:ln w="9525">
+                      <a:noFill/>
+                      <a:headEnd/>
+                      <a:tailEnd/>
+                    </a:ln>
+                  </pic:spPr>
+                </pic:pic>
+              </a:graphicData>
+            </a:graphic>
+          </wp:inline>
+        </w:drawing>
+      </w:r>
+    </w:p>
+    <w:p>
+      <w:pPr>
+        <w:pStyle w:val="ImageCaption"/>
+      </w:pPr>
+      <w:r>
+        <w:rPr>
+          <w:b/>
+          <w:bCs/>
+        </w:rPr>
+        <w:t xml:space="preserve">Fig. 9.</w:t>
+      </w:r>
+      <w:r>
+        <w:t xml:space="preserve"> </w:t>
+      </w:r>
+      <w:r>
+        <w:t xml:space="preserve">Count-level factorial decomposition of estimator, depth and shared-anchor ambiguity</w:t>
+      </w:r>
+    </w:p>
+    <w:p>
+      <w:pPr>
         <w:pStyle w:val="BodyText"/>
       </w:pPr>
       <w:r>
@@ -17197,8 +18002,8 @@
         <w:t xml:space="preserve">.</w:t>
       </w:r>
     </w:p>
-    <w:bookmarkEnd w:id="114"/>
-    <w:bookmarkStart w:id="115" w:name="tables"/>
+    <w:bookmarkEnd w:id="221"/>
+    <w:bookmarkStart w:id="222" w:name="tables"/>
     <w:p>
       <w:pPr>
         <w:pStyle w:val="Heading2"/>
@@ -39815,8 +40620,1480 @@
         <w:t xml:space="preserve">Agreement coefficients are over species x sample units. In (a) the comparator is Pilea at its shipped gates; the observed ranges span only ~1.4 log2, so the low CCC (0.25-0.37) is dynamic-range deflation, not broken concordance; the gates-off rows (r ~0) are the control showing Pilea’s gate does real work. In (b) exact read-level deduplication before counting flattens the PTR dynamic range (deduped r 0.30-0.60 vs raw 0.45-0.80); the cap-dedup sensitivity sweep found no robust intermediate (cap=2 is best in S07, worst in S06), so the process recommendation is to not exactly dedup 2bRAD libraries before counting; a GLM on deduped counts does not recover the signal (r -0.03-0.41). sigma_eff is within-batch (3 libraries, one study/one centre; cross-lab transfer awaits the Hou cohort) and measured on the single enzyme (BcgI) present in the Sun libraries. In (c) C5 recall/QC rows are labelled by code policy: legacy rows predate signed fixed-origin fitting and the conservative refusal of sorted fallback on fragmented references; refusion rows rerun the retained window rates with current code. The 1.00 recall headline is reported_fraction (no gate), not accuracy.</w:t>
       </w:r>
     </w:p>
-    <w:bookmarkEnd w:id="115"/>
-    <w:bookmarkEnd w:id="116"/>
+    <w:p>
+      <w:pPr>
+        <w:pStyle w:val="BodyText"/>
+      </w:pPr>
+      <w:r>
+        <w:rPr>
+          <w:b/>
+          <w:bCs/>
+        </w:rPr>
+        <w:t xml:space="preserve">Table 11. Count-level factorial decomposition of estimator, depth and shared-anchor ambiguity.</w:t>
+      </w:r>
+    </w:p>
+    <w:p>
+      <w:pPr>
+        <w:pStyle w:val="BodyText"/>
+      </w:pPr>
+      <w:r>
+        <w:t xml:space="preserve">Values are means over 4/8/16/32-strain communities, even/10:1/100:1 abundance ratios and 10 replicates, shown for the regular coordinate arm. The random FracMinHash-like arm and paired source contrasts are in</w:t>
+      </w:r>
+      <w:r>
+        <w:t xml:space="preserve"> </w:t>
+      </w:r>
+      <w:r>
+        <w:rPr>
+          <w:rStyle w:val="VerbatimChar"/>
+        </w:rPr>
+        <w:t xml:space="preserve">factorial_benchmark/factorial_long.tsv</w:t>
+      </w:r>
+      <w:r>
+        <w:t xml:space="preserve"> </w:t>
+      </w:r>
+      <w:r>
+        <w:t xml:space="preserve">and</w:t>
+      </w:r>
+      <w:r>
+        <w:t xml:space="preserve"> </w:t>
+      </w:r>
+      <w:r>
+        <w:rPr>
+          <w:rStyle w:val="VerbatimChar"/>
+        </w:rPr>
+        <w:t xml:space="preserve">factorial_benchmark/factorial_source_contrasts.tsv</w:t>
+      </w:r>
+      <w:r>
+        <w:t xml:space="preserve">. Bias and RMSE are in log2(PTR) units.</w:t>
+      </w:r>
+    </w:p>
+    <w:tbl>
+      <w:tblPr>
+        <w:tblStyle w:val="Table"/>
+        <w:tblW w:type="pct" w:w="5000"/>
+        <w:tblLayout w:type="fixed"/>
+        <w:tblLook w:firstRow="1" w:lastRow="0" w:firstColumn="0" w:lastColumn="0" w:noHBand="0" w:noVBand="0" w:val="0020"/>
+      </w:tblPr>
+      <w:tblGrid>
+        <w:gridCol w:w="1743"/>
+        <w:gridCol w:w="1307"/>
+        <w:gridCol w:w="653"/>
+        <w:gridCol w:w="1453"/>
+        <w:gridCol w:w="1453"/>
+        <w:gridCol w:w="1307"/>
+      </w:tblGrid>
+      <w:tr>
+        <w:trPr>
+          <w:tblHeader w:val="on"/>
+        </w:trPr>
+        <w:tc>
+          <w:tcPr/>
+          <w:p>
+            <w:pPr>
+              <w:pStyle w:val="Compact"/>
+              <w:jc w:val="left"/>
+            </w:pPr>
+            <w:r>
+              <w:t xml:space="preserve">estimator</w:t>
+            </w:r>
+          </w:p>
+        </w:tc>
+        <w:tc>
+          <w:tcPr/>
+          <w:p>
+            <w:pPr>
+              <w:pStyle w:val="Compact"/>
+              <w:jc w:val="left"/>
+            </w:pPr>
+            <w:r>
+              <w:t xml:space="preserve">shared_anchors</w:t>
+            </w:r>
+          </w:p>
+        </w:tc>
+        <w:tc>
+          <w:tcPr/>
+          <w:p>
+            <w:pPr>
+              <w:pStyle w:val="Compact"/>
+              <w:jc w:val="left"/>
+            </w:pPr>
+            <w:r>
+              <w:t xml:space="preserve">depth</w:t>
+            </w:r>
+          </w:p>
+        </w:tc>
+        <w:tc>
+          <w:tcPr/>
+          <w:p>
+            <w:pPr>
+              <w:pStyle w:val="Compact"/>
+              <w:jc w:val="right"/>
+            </w:pPr>
+            <w:r>
+              <w:t xml:space="preserve">Mean bias (log2)</w:t>
+            </w:r>
+          </w:p>
+        </w:tc>
+        <w:tc>
+          <w:tcPr/>
+          <w:p>
+            <w:pPr>
+              <w:pStyle w:val="Compact"/>
+              <w:jc w:val="right"/>
+            </w:pPr>
+            <w:r>
+              <w:t xml:space="preserve">Mean RMSE (log2)</w:t>
+            </w:r>
+          </w:p>
+        </w:tc>
+        <w:tc>
+          <w:tcPr/>
+          <w:p>
+            <w:pPr>
+              <w:pStyle w:val="Compact"/>
+              <w:jc w:val="right"/>
+            </w:pPr>
+            <w:r>
+              <w:t xml:space="preserve">Mean Pearson r</w:t>
+            </w:r>
+          </w:p>
+        </w:tc>
+      </w:tr>
+      <w:tr>
+        <w:tc>
+          <w:tcPr/>
+          <w:p>
+            <w:pPr>
+              <w:pStyle w:val="Compact"/>
+              <w:jc w:val="left"/>
+            </w:pPr>
+            <w:r>
+              <w:t xml:space="preserve">Coordinate V-fit</w:t>
+            </w:r>
+          </w:p>
+        </w:tc>
+        <w:tc>
+          <w:tcPr/>
+          <w:p>
+            <w:pPr>
+              <w:pStyle w:val="Compact"/>
+              <w:jc w:val="left"/>
+            </w:pPr>
+            <w:r>
+              <w:t xml:space="preserve">0%</w:t>
+            </w:r>
+          </w:p>
+        </w:tc>
+        <w:tc>
+          <w:tcPr/>
+          <w:p>
+            <w:pPr>
+              <w:pStyle w:val="Compact"/>
+              <w:jc w:val="left"/>
+            </w:pPr>
+            <w:r>
+              <w:t xml:space="preserve">0.5×</w:t>
+            </w:r>
+          </w:p>
+        </w:tc>
+        <w:tc>
+          <w:tcPr/>
+          <w:p>
+            <w:pPr>
+              <w:pStyle w:val="Compact"/>
+              <w:jc w:val="right"/>
+            </w:pPr>
+            <w:r>
+              <w:t xml:space="preserve">-0.022</w:t>
+            </w:r>
+          </w:p>
+        </w:tc>
+        <w:tc>
+          <w:tcPr/>
+          <w:p>
+            <w:pPr>
+              <w:pStyle w:val="Compact"/>
+              <w:jc w:val="right"/>
+            </w:pPr>
+            <w:r>
+              <w:t xml:space="preserve">0.115</w:t>
+            </w:r>
+          </w:p>
+        </w:tc>
+        <w:tc>
+          <w:tcPr/>
+          <w:p>
+            <w:pPr>
+              <w:pStyle w:val="Compact"/>
+              <w:jc w:val="right"/>
+            </w:pPr>
+            <w:r>
+              <w:t xml:space="preserve">0.973</w:t>
+            </w:r>
+          </w:p>
+        </w:tc>
+      </w:tr>
+      <w:tr>
+        <w:tc>
+          <w:tcPr/>
+          <w:p>
+            <w:pPr>
+              <w:pStyle w:val="Compact"/>
+              <w:jc w:val="left"/>
+            </w:pPr>
+            <w:r>
+              <w:t xml:space="preserve">Coordinate V-fit</w:t>
+            </w:r>
+          </w:p>
+        </w:tc>
+        <w:tc>
+          <w:tcPr/>
+          <w:p>
+            <w:pPr>
+              <w:pStyle w:val="Compact"/>
+              <w:jc w:val="left"/>
+            </w:pPr>
+            <w:r>
+              <w:t xml:space="preserve">0%</w:t>
+            </w:r>
+          </w:p>
+        </w:tc>
+        <w:tc>
+          <w:tcPr/>
+          <w:p>
+            <w:pPr>
+              <w:pStyle w:val="Compact"/>
+              <w:jc w:val="left"/>
+            </w:pPr>
+            <w:r>
+              <w:t xml:space="preserve">1×</w:t>
+            </w:r>
+          </w:p>
+        </w:tc>
+        <w:tc>
+          <w:tcPr/>
+          <w:p>
+            <w:pPr>
+              <w:pStyle w:val="Compact"/>
+              <w:jc w:val="right"/>
+            </w:pPr>
+            <w:r>
+              <w:t xml:space="preserve">-0.014</w:t>
+            </w:r>
+          </w:p>
+        </w:tc>
+        <w:tc>
+          <w:tcPr/>
+          <w:p>
+            <w:pPr>
+              <w:pStyle w:val="Compact"/>
+              <w:jc w:val="right"/>
+            </w:pPr>
+            <w:r>
+              <w:t xml:space="preserve">0.072</w:t>
+            </w:r>
+          </w:p>
+        </w:tc>
+        <w:tc>
+          <w:tcPr/>
+          <w:p>
+            <w:pPr>
+              <w:pStyle w:val="Compact"/>
+              <w:jc w:val="right"/>
+            </w:pPr>
+            <w:r>
+              <w:t xml:space="preserve">0.990</w:t>
+            </w:r>
+          </w:p>
+        </w:tc>
+      </w:tr>
+      <w:tr>
+        <w:tc>
+          <w:tcPr/>
+          <w:p>
+            <w:pPr>
+              <w:pStyle w:val="Compact"/>
+              <w:jc w:val="left"/>
+            </w:pPr>
+            <w:r>
+              <w:t xml:space="preserve">Coordinate V-fit</w:t>
+            </w:r>
+          </w:p>
+        </w:tc>
+        <w:tc>
+          <w:tcPr/>
+          <w:p>
+            <w:pPr>
+              <w:pStyle w:val="Compact"/>
+              <w:jc w:val="left"/>
+            </w:pPr>
+            <w:r>
+              <w:t xml:space="preserve">0%</w:t>
+            </w:r>
+          </w:p>
+        </w:tc>
+        <w:tc>
+          <w:tcPr/>
+          <w:p>
+            <w:pPr>
+              <w:pStyle w:val="Compact"/>
+              <w:jc w:val="left"/>
+            </w:pPr>
+            <w:r>
+              <w:t xml:space="preserve">8×</w:t>
+            </w:r>
+          </w:p>
+        </w:tc>
+        <w:tc>
+          <w:tcPr/>
+          <w:p>
+            <w:pPr>
+              <w:pStyle w:val="Compact"/>
+              <w:jc w:val="right"/>
+            </w:pPr>
+            <w:r>
+              <w:t xml:space="preserve">0.001</w:t>
+            </w:r>
+          </w:p>
+        </w:tc>
+        <w:tc>
+          <w:tcPr/>
+          <w:p>
+            <w:pPr>
+              <w:pStyle w:val="Compact"/>
+              <w:jc w:val="right"/>
+            </w:pPr>
+            <w:r>
+              <w:t xml:space="preserve">0.018</w:t>
+            </w:r>
+          </w:p>
+        </w:tc>
+        <w:tc>
+          <w:tcPr/>
+          <w:p>
+            <w:pPr>
+              <w:pStyle w:val="Compact"/>
+              <w:jc w:val="right"/>
+            </w:pPr>
+            <w:r>
+              <w:t xml:space="preserve">0.999</w:t>
+            </w:r>
+          </w:p>
+        </w:tc>
+      </w:tr>
+      <w:tr>
+        <w:tc>
+          <w:tcPr/>
+          <w:p>
+            <w:pPr>
+              <w:pStyle w:val="Compact"/>
+              <w:jc w:val="left"/>
+            </w:pPr>
+            <w:r>
+              <w:t xml:space="preserve">Coordinate V-fit</w:t>
+            </w:r>
+          </w:p>
+        </w:tc>
+        <w:tc>
+          <w:tcPr/>
+          <w:p>
+            <w:pPr>
+              <w:pStyle w:val="Compact"/>
+              <w:jc w:val="left"/>
+            </w:pPr>
+            <w:r>
+              <w:t xml:space="preserve">5%</w:t>
+            </w:r>
+          </w:p>
+        </w:tc>
+        <w:tc>
+          <w:tcPr/>
+          <w:p>
+            <w:pPr>
+              <w:pStyle w:val="Compact"/>
+              <w:jc w:val="left"/>
+            </w:pPr>
+            <w:r>
+              <w:t xml:space="preserve">0.5×</w:t>
+            </w:r>
+          </w:p>
+        </w:tc>
+        <w:tc>
+          <w:tcPr/>
+          <w:p>
+            <w:pPr>
+              <w:pStyle w:val="Compact"/>
+              <w:jc w:val="right"/>
+            </w:pPr>
+            <w:r>
+              <w:t xml:space="preserve">-0.022</w:t>
+            </w:r>
+          </w:p>
+        </w:tc>
+        <w:tc>
+          <w:tcPr/>
+          <w:p>
+            <w:pPr>
+              <w:pStyle w:val="Compact"/>
+              <w:jc w:val="right"/>
+            </w:pPr>
+            <w:r>
+              <w:t xml:space="preserve">0.110</w:t>
+            </w:r>
+          </w:p>
+        </w:tc>
+        <w:tc>
+          <w:tcPr/>
+          <w:p>
+            <w:pPr>
+              <w:pStyle w:val="Compact"/>
+              <w:jc w:val="right"/>
+            </w:pPr>
+            <w:r>
+              <w:t xml:space="preserve">0.978</w:t>
+            </w:r>
+          </w:p>
+        </w:tc>
+      </w:tr>
+      <w:tr>
+        <w:tc>
+          <w:tcPr/>
+          <w:p>
+            <w:pPr>
+              <w:pStyle w:val="Compact"/>
+              <w:jc w:val="left"/>
+            </w:pPr>
+            <w:r>
+              <w:t xml:space="preserve">Coordinate V-fit</w:t>
+            </w:r>
+          </w:p>
+        </w:tc>
+        <w:tc>
+          <w:tcPr/>
+          <w:p>
+            <w:pPr>
+              <w:pStyle w:val="Compact"/>
+              <w:jc w:val="left"/>
+            </w:pPr>
+            <w:r>
+              <w:t xml:space="preserve">5%</w:t>
+            </w:r>
+          </w:p>
+        </w:tc>
+        <w:tc>
+          <w:tcPr/>
+          <w:p>
+            <w:pPr>
+              <w:pStyle w:val="Compact"/>
+              <w:jc w:val="left"/>
+            </w:pPr>
+            <w:r>
+              <w:t xml:space="preserve">1×</w:t>
+            </w:r>
+          </w:p>
+        </w:tc>
+        <w:tc>
+          <w:tcPr/>
+          <w:p>
+            <w:pPr>
+              <w:pStyle w:val="Compact"/>
+              <w:jc w:val="right"/>
+            </w:pPr>
+            <w:r>
+              <w:t xml:space="preserve">-0.012</w:t>
+            </w:r>
+          </w:p>
+        </w:tc>
+        <w:tc>
+          <w:tcPr/>
+          <w:p>
+            <w:pPr>
+              <w:pStyle w:val="Compact"/>
+              <w:jc w:val="right"/>
+            </w:pPr>
+            <w:r>
+              <w:t xml:space="preserve">0.080</w:t>
+            </w:r>
+          </w:p>
+        </w:tc>
+        <w:tc>
+          <w:tcPr/>
+          <w:p>
+            <w:pPr>
+              <w:pStyle w:val="Compact"/>
+              <w:jc w:val="right"/>
+            </w:pPr>
+            <w:r>
+              <w:t xml:space="preserve">0.989</w:t>
+            </w:r>
+          </w:p>
+        </w:tc>
+      </w:tr>
+      <w:tr>
+        <w:tc>
+          <w:tcPr/>
+          <w:p>
+            <w:pPr>
+              <w:pStyle w:val="Compact"/>
+              <w:jc w:val="left"/>
+            </w:pPr>
+            <w:r>
+              <w:t xml:space="preserve">Coordinate V-fit</w:t>
+            </w:r>
+          </w:p>
+        </w:tc>
+        <w:tc>
+          <w:tcPr/>
+          <w:p>
+            <w:pPr>
+              <w:pStyle w:val="Compact"/>
+              <w:jc w:val="left"/>
+            </w:pPr>
+            <w:r>
+              <w:t xml:space="preserve">5%</w:t>
+            </w:r>
+          </w:p>
+        </w:tc>
+        <w:tc>
+          <w:tcPr/>
+          <w:p>
+            <w:pPr>
+              <w:pStyle w:val="Compact"/>
+              <w:jc w:val="left"/>
+            </w:pPr>
+            <w:r>
+              <w:t xml:space="preserve">8×</w:t>
+            </w:r>
+          </w:p>
+        </w:tc>
+        <w:tc>
+          <w:tcPr/>
+          <w:p>
+            <w:pPr>
+              <w:pStyle w:val="Compact"/>
+              <w:jc w:val="right"/>
+            </w:pPr>
+            <w:r>
+              <w:t xml:space="preserve">-0.000</w:t>
+            </w:r>
+          </w:p>
+        </w:tc>
+        <w:tc>
+          <w:tcPr/>
+          <w:p>
+            <w:pPr>
+              <w:pStyle w:val="Compact"/>
+              <w:jc w:val="right"/>
+            </w:pPr>
+            <w:r>
+              <w:t xml:space="preserve">0.039</w:t>
+            </w:r>
+          </w:p>
+        </w:tc>
+        <w:tc>
+          <w:tcPr/>
+          <w:p>
+            <w:pPr>
+              <w:pStyle w:val="Compact"/>
+              <w:jc w:val="right"/>
+            </w:pPr>
+            <w:r>
+              <w:t xml:space="preserve">0.998</w:t>
+            </w:r>
+          </w:p>
+        </w:tc>
+      </w:tr>
+      <w:tr>
+        <w:tc>
+          <w:tcPr/>
+          <w:p>
+            <w:pPr>
+              <w:pStyle w:val="Compact"/>
+              <w:jc w:val="left"/>
+            </w:pPr>
+            <w:r>
+              <w:t xml:space="preserve">Coordinate V-fit</w:t>
+            </w:r>
+          </w:p>
+        </w:tc>
+        <w:tc>
+          <w:tcPr/>
+          <w:p>
+            <w:pPr>
+              <w:pStyle w:val="Compact"/>
+              <w:jc w:val="left"/>
+            </w:pPr>
+            <w:r>
+              <w:t xml:space="preserve">15%</w:t>
+            </w:r>
+          </w:p>
+        </w:tc>
+        <w:tc>
+          <w:tcPr/>
+          <w:p>
+            <w:pPr>
+              <w:pStyle w:val="Compact"/>
+              <w:jc w:val="left"/>
+            </w:pPr>
+            <w:r>
+              <w:t xml:space="preserve">0.5×</w:t>
+            </w:r>
+          </w:p>
+        </w:tc>
+        <w:tc>
+          <w:tcPr/>
+          <w:p>
+            <w:pPr>
+              <w:pStyle w:val="Compact"/>
+              <w:jc w:val="right"/>
+            </w:pPr>
+            <w:r>
+              <w:t xml:space="preserve">-0.022</w:t>
+            </w:r>
+          </w:p>
+        </w:tc>
+        <w:tc>
+          <w:tcPr/>
+          <w:p>
+            <w:pPr>
+              <w:pStyle w:val="Compact"/>
+              <w:jc w:val="right"/>
+            </w:pPr>
+            <w:r>
+              <w:t xml:space="preserve">0.133</w:t>
+            </w:r>
+          </w:p>
+        </w:tc>
+        <w:tc>
+          <w:tcPr/>
+          <w:p>
+            <w:pPr>
+              <w:pStyle w:val="Compact"/>
+              <w:jc w:val="right"/>
+            </w:pPr>
+            <w:r>
+              <w:t xml:space="preserve">0.971</w:t>
+            </w:r>
+          </w:p>
+        </w:tc>
+      </w:tr>
+      <w:tr>
+        <w:tc>
+          <w:tcPr/>
+          <w:p>
+            <w:pPr>
+              <w:pStyle w:val="Compact"/>
+              <w:jc w:val="left"/>
+            </w:pPr>
+            <w:r>
+              <w:t xml:space="preserve">Coordinate V-fit</w:t>
+            </w:r>
+          </w:p>
+        </w:tc>
+        <w:tc>
+          <w:tcPr/>
+          <w:p>
+            <w:pPr>
+              <w:pStyle w:val="Compact"/>
+              <w:jc w:val="left"/>
+            </w:pPr>
+            <w:r>
+              <w:t xml:space="preserve">15%</w:t>
+            </w:r>
+          </w:p>
+        </w:tc>
+        <w:tc>
+          <w:tcPr/>
+          <w:p>
+            <w:pPr>
+              <w:pStyle w:val="Compact"/>
+              <w:jc w:val="left"/>
+            </w:pPr>
+            <w:r>
+              <w:t xml:space="preserve">1×</w:t>
+            </w:r>
+          </w:p>
+        </w:tc>
+        <w:tc>
+          <w:tcPr/>
+          <w:p>
+            <w:pPr>
+              <w:pStyle w:val="Compact"/>
+              <w:jc w:val="right"/>
+            </w:pPr>
+            <w:r>
+              <w:t xml:space="preserve">-0.012</w:t>
+            </w:r>
+          </w:p>
+        </w:tc>
+        <w:tc>
+          <w:tcPr/>
+          <w:p>
+            <w:pPr>
+              <w:pStyle w:val="Compact"/>
+              <w:jc w:val="right"/>
+            </w:pPr>
+            <w:r>
+              <w:t xml:space="preserve">0.100</w:t>
+            </w:r>
+          </w:p>
+        </w:tc>
+        <w:tc>
+          <w:tcPr/>
+          <w:p>
+            <w:pPr>
+              <w:pStyle w:val="Compact"/>
+              <w:jc w:val="right"/>
+            </w:pPr>
+            <w:r>
+              <w:t xml:space="preserve">0.983</w:t>
+            </w:r>
+          </w:p>
+        </w:tc>
+      </w:tr>
+      <w:tr>
+        <w:tc>
+          <w:tcPr/>
+          <w:p>
+            <w:pPr>
+              <w:pStyle w:val="Compact"/>
+              <w:jc w:val="left"/>
+            </w:pPr>
+            <w:r>
+              <w:t xml:space="preserve">Coordinate V-fit</w:t>
+            </w:r>
+          </w:p>
+        </w:tc>
+        <w:tc>
+          <w:tcPr/>
+          <w:p>
+            <w:pPr>
+              <w:pStyle w:val="Compact"/>
+              <w:jc w:val="left"/>
+            </w:pPr>
+            <w:r>
+              <w:t xml:space="preserve">15%</w:t>
+            </w:r>
+          </w:p>
+        </w:tc>
+        <w:tc>
+          <w:tcPr/>
+          <w:p>
+            <w:pPr>
+              <w:pStyle w:val="Compact"/>
+              <w:jc w:val="left"/>
+            </w:pPr>
+            <w:r>
+              <w:t xml:space="preserve">8×</w:t>
+            </w:r>
+          </w:p>
+        </w:tc>
+        <w:tc>
+          <w:tcPr/>
+          <w:p>
+            <w:pPr>
+              <w:pStyle w:val="Compact"/>
+              <w:jc w:val="right"/>
+            </w:pPr>
+            <w:r>
+              <w:t xml:space="preserve">-0.001</w:t>
+            </w:r>
+          </w:p>
+        </w:tc>
+        <w:tc>
+          <w:tcPr/>
+          <w:p>
+            <w:pPr>
+              <w:pStyle w:val="Compact"/>
+              <w:jc w:val="right"/>
+            </w:pPr>
+            <w:r>
+              <w:t xml:space="preserve">0.063</w:t>
+            </w:r>
+          </w:p>
+        </w:tc>
+        <w:tc>
+          <w:tcPr/>
+          <w:p>
+            <w:pPr>
+              <w:pStyle w:val="Compact"/>
+              <w:jc w:val="right"/>
+            </w:pPr>
+            <w:r>
+              <w:t xml:space="preserve">0.994</w:t>
+            </w:r>
+          </w:p>
+        </w:tc>
+      </w:tr>
+      <w:tr>
+        <w:tc>
+          <w:tcPr/>
+          <w:p>
+            <w:pPr>
+              <w:pStyle w:val="Compact"/>
+              <w:jc w:val="left"/>
+            </w:pPr>
+            <w:r>
+              <w:t xml:space="preserve">Sorted-rank regression</w:t>
+            </w:r>
+          </w:p>
+        </w:tc>
+        <w:tc>
+          <w:tcPr/>
+          <w:p>
+            <w:pPr>
+              <w:pStyle w:val="Compact"/>
+              <w:jc w:val="left"/>
+            </w:pPr>
+            <w:r>
+              <w:t xml:space="preserve">0%</w:t>
+            </w:r>
+          </w:p>
+        </w:tc>
+        <w:tc>
+          <w:tcPr/>
+          <w:p>
+            <w:pPr>
+              <w:pStyle w:val="Compact"/>
+              <w:jc w:val="left"/>
+            </w:pPr>
+            <w:r>
+              <w:t xml:space="preserve">0.5×</w:t>
+            </w:r>
+          </w:p>
+        </w:tc>
+        <w:tc>
+          <w:tcPr/>
+          <w:p>
+            <w:pPr>
+              <w:pStyle w:val="Compact"/>
+              <w:jc w:val="right"/>
+            </w:pPr>
+            <w:r>
+              <w:t xml:space="preserve">0.464</w:t>
+            </w:r>
+          </w:p>
+        </w:tc>
+        <w:tc>
+          <w:tcPr/>
+          <w:p>
+            <w:pPr>
+              <w:pStyle w:val="Compact"/>
+              <w:jc w:val="right"/>
+            </w:pPr>
+            <w:r>
+              <w:t xml:space="preserve">0.635</w:t>
+            </w:r>
+          </w:p>
+        </w:tc>
+        <w:tc>
+          <w:tcPr/>
+          <w:p>
+            <w:pPr>
+              <w:pStyle w:val="Compact"/>
+              <w:jc w:val="right"/>
+            </w:pPr>
+            <w:r>
+              <w:t xml:space="preserve">0.737</w:t>
+            </w:r>
+          </w:p>
+        </w:tc>
+      </w:tr>
+      <w:tr>
+        <w:tc>
+          <w:tcPr/>
+          <w:p>
+            <w:pPr>
+              <w:pStyle w:val="Compact"/>
+              <w:jc w:val="left"/>
+            </w:pPr>
+            <w:r>
+              <w:t xml:space="preserve">Sorted-rank regression</w:t>
+            </w:r>
+          </w:p>
+        </w:tc>
+        <w:tc>
+          <w:tcPr/>
+          <w:p>
+            <w:pPr>
+              <w:pStyle w:val="Compact"/>
+              <w:jc w:val="left"/>
+            </w:pPr>
+            <w:r>
+              <w:t xml:space="preserve">0%</w:t>
+            </w:r>
+          </w:p>
+        </w:tc>
+        <w:tc>
+          <w:tcPr/>
+          <w:p>
+            <w:pPr>
+              <w:pStyle w:val="Compact"/>
+              <w:jc w:val="left"/>
+            </w:pPr>
+            <w:r>
+              <w:t xml:space="preserve">1×</w:t>
+            </w:r>
+          </w:p>
+        </w:tc>
+        <w:tc>
+          <w:tcPr/>
+          <w:p>
+            <w:pPr>
+              <w:pStyle w:val="Compact"/>
+              <w:jc w:val="right"/>
+            </w:pPr>
+            <w:r>
+              <w:t xml:space="preserve">0.319</w:t>
+            </w:r>
+          </w:p>
+        </w:tc>
+        <w:tc>
+          <w:tcPr/>
+          <w:p>
+            <w:pPr>
+              <w:pStyle w:val="Compact"/>
+              <w:jc w:val="right"/>
+            </w:pPr>
+            <w:r>
+              <w:t xml:space="preserve">0.504</w:t>
+            </w:r>
+          </w:p>
+        </w:tc>
+        <w:tc>
+          <w:tcPr/>
+          <w:p>
+            <w:pPr>
+              <w:pStyle w:val="Compact"/>
+              <w:jc w:val="right"/>
+            </w:pPr>
+            <w:r>
+              <w:t xml:space="preserve">0.824</w:t>
+            </w:r>
+          </w:p>
+        </w:tc>
+      </w:tr>
+      <w:tr>
+        <w:tc>
+          <w:tcPr/>
+          <w:p>
+            <w:pPr>
+              <w:pStyle w:val="Compact"/>
+              <w:jc w:val="left"/>
+            </w:pPr>
+            <w:r>
+              <w:t xml:space="preserve">Sorted-rank regression</w:t>
+            </w:r>
+          </w:p>
+        </w:tc>
+        <w:tc>
+          <w:tcPr/>
+          <w:p>
+            <w:pPr>
+              <w:pStyle w:val="Compact"/>
+              <w:jc w:val="left"/>
+            </w:pPr>
+            <w:r>
+              <w:t xml:space="preserve">0%</w:t>
+            </w:r>
+          </w:p>
+        </w:tc>
+        <w:tc>
+          <w:tcPr/>
+          <w:p>
+            <w:pPr>
+              <w:pStyle w:val="Compact"/>
+              <w:jc w:val="left"/>
+            </w:pPr>
+            <w:r>
+              <w:t xml:space="preserve">8×</w:t>
+            </w:r>
+          </w:p>
+        </w:tc>
+        <w:tc>
+          <w:tcPr/>
+          <w:p>
+            <w:pPr>
+              <w:pStyle w:val="Compact"/>
+              <w:jc w:val="right"/>
+            </w:pPr>
+            <w:r>
+              <w:t xml:space="preserve">0.052</w:t>
+            </w:r>
+          </w:p>
+        </w:tc>
+        <w:tc>
+          <w:tcPr/>
+          <w:p>
+            <w:pPr>
+              <w:pStyle w:val="Compact"/>
+              <w:jc w:val="right"/>
+            </w:pPr>
+            <w:r>
+              <w:t xml:space="preserve">0.119</w:t>
+            </w:r>
+          </w:p>
+        </w:tc>
+        <w:tc>
+          <w:tcPr/>
+          <w:p>
+            <w:pPr>
+              <w:pStyle w:val="Compact"/>
+              <w:jc w:val="right"/>
+            </w:pPr>
+            <w:r>
+              <w:t xml:space="preserve">0.978</w:t>
+            </w:r>
+          </w:p>
+        </w:tc>
+      </w:tr>
+      <w:tr>
+        <w:tc>
+          <w:tcPr/>
+          <w:p>
+            <w:pPr>
+              <w:pStyle w:val="Compact"/>
+              <w:jc w:val="left"/>
+            </w:pPr>
+            <w:r>
+              <w:t xml:space="preserve">Sorted-rank regression</w:t>
+            </w:r>
+          </w:p>
+        </w:tc>
+        <w:tc>
+          <w:tcPr/>
+          <w:p>
+            <w:pPr>
+              <w:pStyle w:val="Compact"/>
+              <w:jc w:val="left"/>
+            </w:pPr>
+            <w:r>
+              <w:t xml:space="preserve">5%</w:t>
+            </w:r>
+          </w:p>
+        </w:tc>
+        <w:tc>
+          <w:tcPr/>
+          <w:p>
+            <w:pPr>
+              <w:pStyle w:val="Compact"/>
+              <w:jc w:val="left"/>
+            </w:pPr>
+            <w:r>
+              <w:t xml:space="preserve">0.5×</w:t>
+            </w:r>
+          </w:p>
+        </w:tc>
+        <w:tc>
+          <w:tcPr/>
+          <w:p>
+            <w:pPr>
+              <w:pStyle w:val="Compact"/>
+              <w:jc w:val="right"/>
+            </w:pPr>
+            <w:r>
+              <w:t xml:space="preserve">0.571</w:t>
+            </w:r>
+          </w:p>
+        </w:tc>
+        <w:tc>
+          <w:tcPr/>
+          <w:p>
+            <w:pPr>
+              <w:pStyle w:val="Compact"/>
+              <w:jc w:val="right"/>
+            </w:pPr>
+            <w:r>
+              <w:t xml:space="preserve">0.727</w:t>
+            </w:r>
+          </w:p>
+        </w:tc>
+        <w:tc>
+          <w:tcPr/>
+          <w:p>
+            <w:pPr>
+              <w:pStyle w:val="Compact"/>
+              <w:jc w:val="right"/>
+            </w:pPr>
+            <w:r>
+              <w:t xml:space="preserve">0.714</w:t>
+            </w:r>
+          </w:p>
+        </w:tc>
+      </w:tr>
+      <w:tr>
+        <w:tc>
+          <w:tcPr/>
+          <w:p>
+            <w:pPr>
+              <w:pStyle w:val="Compact"/>
+              <w:jc w:val="left"/>
+            </w:pPr>
+            <w:r>
+              <w:t xml:space="preserve">Sorted-rank regression</w:t>
+            </w:r>
+          </w:p>
+        </w:tc>
+        <w:tc>
+          <w:tcPr/>
+          <w:p>
+            <w:pPr>
+              <w:pStyle w:val="Compact"/>
+              <w:jc w:val="left"/>
+            </w:pPr>
+            <w:r>
+              <w:t xml:space="preserve">5%</w:t>
+            </w:r>
+          </w:p>
+        </w:tc>
+        <w:tc>
+          <w:tcPr/>
+          <w:p>
+            <w:pPr>
+              <w:pStyle w:val="Compact"/>
+              <w:jc w:val="left"/>
+            </w:pPr>
+            <w:r>
+              <w:t xml:space="preserve">1×</w:t>
+            </w:r>
+          </w:p>
+        </w:tc>
+        <w:tc>
+          <w:tcPr/>
+          <w:p>
+            <w:pPr>
+              <w:pStyle w:val="Compact"/>
+              <w:jc w:val="right"/>
+            </w:pPr>
+            <w:r>
+              <w:t xml:space="preserve">0.400</w:t>
+            </w:r>
+          </w:p>
+        </w:tc>
+        <w:tc>
+          <w:tcPr/>
+          <w:p>
+            <w:pPr>
+              <w:pStyle w:val="Compact"/>
+              <w:jc w:val="right"/>
+            </w:pPr>
+            <w:r>
+              <w:t xml:space="preserve">0.574</w:t>
+            </w:r>
+          </w:p>
+        </w:tc>
+        <w:tc>
+          <w:tcPr/>
+          <w:p>
+            <w:pPr>
+              <w:pStyle w:val="Compact"/>
+              <w:jc w:val="right"/>
+            </w:pPr>
+            <w:r>
+              <w:t xml:space="preserve">0.778</w:t>
+            </w:r>
+          </w:p>
+        </w:tc>
+      </w:tr>
+      <w:tr>
+        <w:tc>
+          <w:tcPr/>
+          <w:p>
+            <w:pPr>
+              <w:pStyle w:val="Compact"/>
+              <w:jc w:val="left"/>
+            </w:pPr>
+            <w:r>
+              <w:t xml:space="preserve">Sorted-rank regression</w:t>
+            </w:r>
+          </w:p>
+        </w:tc>
+        <w:tc>
+          <w:tcPr/>
+          <w:p>
+            <w:pPr>
+              <w:pStyle w:val="Compact"/>
+              <w:jc w:val="left"/>
+            </w:pPr>
+            <w:r>
+              <w:t xml:space="preserve">5%</w:t>
+            </w:r>
+          </w:p>
+        </w:tc>
+        <w:tc>
+          <w:tcPr/>
+          <w:p>
+            <w:pPr>
+              <w:pStyle w:val="Compact"/>
+              <w:jc w:val="left"/>
+            </w:pPr>
+            <w:r>
+              <w:t xml:space="preserve">8×</w:t>
+            </w:r>
+          </w:p>
+        </w:tc>
+        <w:tc>
+          <w:tcPr/>
+          <w:p>
+            <w:pPr>
+              <w:pStyle w:val="Compact"/>
+              <w:jc w:val="right"/>
+            </w:pPr>
+            <w:r>
+              <w:t xml:space="preserve">0.132</w:t>
+            </w:r>
+          </w:p>
+        </w:tc>
+        <w:tc>
+          <w:tcPr/>
+          <w:p>
+            <w:pPr>
+              <w:pStyle w:val="Compact"/>
+              <w:jc w:val="right"/>
+            </w:pPr>
+            <w:r>
+              <w:t xml:space="preserve">0.196</w:t>
+            </w:r>
+          </w:p>
+        </w:tc>
+        <w:tc>
+          <w:tcPr/>
+          <w:p>
+            <w:pPr>
+              <w:pStyle w:val="Compact"/>
+              <w:jc w:val="right"/>
+            </w:pPr>
+            <w:r>
+              <w:t xml:space="preserve">0.962</w:t>
+            </w:r>
+          </w:p>
+        </w:tc>
+      </w:tr>
+      <w:tr>
+        <w:tc>
+          <w:tcPr/>
+          <w:p>
+            <w:pPr>
+              <w:pStyle w:val="Compact"/>
+              <w:jc w:val="left"/>
+            </w:pPr>
+            <w:r>
+              <w:t xml:space="preserve">Sorted-rank regression</w:t>
+            </w:r>
+          </w:p>
+        </w:tc>
+        <w:tc>
+          <w:tcPr/>
+          <w:p>
+            <w:pPr>
+              <w:pStyle w:val="Compact"/>
+              <w:jc w:val="left"/>
+            </w:pPr>
+            <w:r>
+              <w:t xml:space="preserve">15%</w:t>
+            </w:r>
+          </w:p>
+        </w:tc>
+        <w:tc>
+          <w:tcPr/>
+          <w:p>
+            <w:pPr>
+              <w:pStyle w:val="Compact"/>
+              <w:jc w:val="left"/>
+            </w:pPr>
+            <w:r>
+              <w:t xml:space="preserve">0.5×</w:t>
+            </w:r>
+          </w:p>
+        </w:tc>
+        <w:tc>
+          <w:tcPr/>
+          <w:p>
+            <w:pPr>
+              <w:pStyle w:val="Compact"/>
+              <w:jc w:val="right"/>
+            </w:pPr>
+            <w:r>
+              <w:t xml:space="preserve">0.709</w:t>
+            </w:r>
+          </w:p>
+        </w:tc>
+        <w:tc>
+          <w:tcPr/>
+          <w:p>
+            <w:pPr>
+              <w:pStyle w:val="Compact"/>
+              <w:jc w:val="right"/>
+            </w:pPr>
+            <w:r>
+              <w:t xml:space="preserve">0.833</w:t>
+            </w:r>
+          </w:p>
+        </w:tc>
+        <w:tc>
+          <w:tcPr/>
+          <w:p>
+            <w:pPr>
+              <w:pStyle w:val="Compact"/>
+              <w:jc w:val="right"/>
+            </w:pPr>
+            <w:r>
+              <w:t xml:space="preserve">0.729</w:t>
+            </w:r>
+          </w:p>
+        </w:tc>
+      </w:tr>
+      <w:tr>
+        <w:tc>
+          <w:tcPr/>
+          <w:p>
+            <w:pPr>
+              <w:pStyle w:val="Compact"/>
+              <w:jc w:val="left"/>
+            </w:pPr>
+            <w:r>
+              <w:t xml:space="preserve">Sorted-rank regression</w:t>
+            </w:r>
+          </w:p>
+        </w:tc>
+        <w:tc>
+          <w:tcPr/>
+          <w:p>
+            <w:pPr>
+              <w:pStyle w:val="Compact"/>
+              <w:jc w:val="left"/>
+            </w:pPr>
+            <w:r>
+              <w:t xml:space="preserve">15%</w:t>
+            </w:r>
+          </w:p>
+        </w:tc>
+        <w:tc>
+          <w:tcPr/>
+          <w:p>
+            <w:pPr>
+              <w:pStyle w:val="Compact"/>
+              <w:jc w:val="left"/>
+            </w:pPr>
+            <w:r>
+              <w:t xml:space="preserve">1×</w:t>
+            </w:r>
+          </w:p>
+        </w:tc>
+        <w:tc>
+          <w:tcPr/>
+          <w:p>
+            <w:pPr>
+              <w:pStyle w:val="Compact"/>
+              <w:jc w:val="right"/>
+            </w:pPr>
+            <w:r>
+              <w:t xml:space="preserve">0.540</w:t>
+            </w:r>
+          </w:p>
+        </w:tc>
+        <w:tc>
+          <w:tcPr/>
+          <w:p>
+            <w:pPr>
+              <w:pStyle w:val="Compact"/>
+              <w:jc w:val="right"/>
+            </w:pPr>
+            <w:r>
+              <w:t xml:space="preserve">0.671</w:t>
+            </w:r>
+          </w:p>
+        </w:tc>
+        <w:tc>
+          <w:tcPr/>
+          <w:p>
+            <w:pPr>
+              <w:pStyle w:val="Compact"/>
+              <w:jc w:val="right"/>
+            </w:pPr>
+            <w:r>
+              <w:t xml:space="preserve">0.803</w:t>
+            </w:r>
+          </w:p>
+        </w:tc>
+      </w:tr>
+      <w:tr>
+        <w:tc>
+          <w:tcPr/>
+          <w:p>
+            <w:pPr>
+              <w:pStyle w:val="Compact"/>
+              <w:jc w:val="left"/>
+            </w:pPr>
+            <w:r>
+              <w:t xml:space="preserve">Sorted-rank regression</w:t>
+            </w:r>
+          </w:p>
+        </w:tc>
+        <w:tc>
+          <w:tcPr/>
+          <w:p>
+            <w:pPr>
+              <w:pStyle w:val="Compact"/>
+              <w:jc w:val="left"/>
+            </w:pPr>
+            <w:r>
+              <w:t xml:space="preserve">15%</w:t>
+            </w:r>
+          </w:p>
+        </w:tc>
+        <w:tc>
+          <w:tcPr/>
+          <w:p>
+            <w:pPr>
+              <w:pStyle w:val="Compact"/>
+              <w:jc w:val="left"/>
+            </w:pPr>
+            <w:r>
+              <w:t xml:space="preserve">8×</w:t>
+            </w:r>
+          </w:p>
+        </w:tc>
+        <w:tc>
+          <w:tcPr/>
+          <w:p>
+            <w:pPr>
+              <w:pStyle w:val="Compact"/>
+              <w:jc w:val="right"/>
+            </w:pPr>
+            <w:r>
+              <w:t xml:space="preserve">0.234</w:t>
+            </w:r>
+          </w:p>
+        </w:tc>
+        <w:tc>
+          <w:tcPr/>
+          <w:p>
+            <w:pPr>
+              <w:pStyle w:val="Compact"/>
+              <w:jc w:val="right"/>
+            </w:pPr>
+            <w:r>
+              <w:t xml:space="preserve">0.278</w:t>
+            </w:r>
+          </w:p>
+        </w:tc>
+        <w:tc>
+          <w:tcPr/>
+          <w:p>
+            <w:pPr>
+              <w:pStyle w:val="Compact"/>
+              <w:jc w:val="right"/>
+            </w:pPr>
+            <w:r>
+              <w:t xml:space="preserve">0.962</w:t>
+            </w:r>
+          </w:p>
+        </w:tc>
+      </w:tr>
+    </w:tbl>
+    <w:bookmarkEnd w:id="222"/>
+    <w:bookmarkEnd w:id="223"/>
     <w:sectPr>
       <w:footerReference r:id="rId9" w:type="default"/>
       <w:footnotePr>
@@ -40903,7 +43180,7 @@
       <w:color w:themeColor="accent1" w:themeShade="BF" w:val="365F91"/>
     </w:rPr>
   </w:style>
-  <w:style w:type="paragraph" w:customStyle="1" w:styleId="SourceCode">
+  <w:style w:customStyle="1" w:styleId="SourceCode" w:type="paragraph">
     <w:name w:val="Source Code"/>
     <w:basedOn w:val="Normal"/>
     <w:link w:val="VerbatimChar"/>
@@ -40911,7 +43188,7 @@
       <w:wordWrap w:val="off"/>
     </w:pPr>
   </w:style>
-  <w:style w:type="character" w:customStyle="1" w:styleId="KeywordTok">
+  <w:style w:customStyle="1" w:styleId="KeywordTok" w:type="character">
     <w:name w:val="KeywordTok"/>
     <w:basedOn w:val="VerbatimChar"/>
     <w:rPr>
@@ -40919,77 +43196,77 @@
       <w:color w:val="007020"/>
     </w:rPr>
   </w:style>
-  <w:style w:type="character" w:customStyle="1" w:styleId="DataTypeTok">
+  <w:style w:customStyle="1" w:styleId="DataTypeTok" w:type="character">
     <w:name w:val="DataTypeTok"/>
     <w:basedOn w:val="VerbatimChar"/>
     <w:rPr>
       <w:color w:val="902000"/>
     </w:rPr>
   </w:style>
-  <w:style w:type="character" w:customStyle="1" w:styleId="DecValTok">
+  <w:style w:customStyle="1" w:styleId="DecValTok" w:type="character">
     <w:name w:val="DecValTok"/>
     <w:basedOn w:val="VerbatimChar"/>
     <w:rPr>
       <w:color w:val="40a070"/>
     </w:rPr>
   </w:style>
-  <w:style w:type="character" w:customStyle="1" w:styleId="BaseNTok">
+  <w:style w:customStyle="1" w:styleId="BaseNTok" w:type="character">
     <w:name w:val="BaseNTok"/>
     <w:basedOn w:val="VerbatimChar"/>
     <w:rPr>
       <w:color w:val="40a070"/>
     </w:rPr>
   </w:style>
-  <w:style w:type="character" w:customStyle="1" w:styleId="FloatTok">
+  <w:style w:customStyle="1" w:styleId="FloatTok" w:type="character">
     <w:name w:val="FloatTok"/>
     <w:basedOn w:val="VerbatimChar"/>
     <w:rPr>
       <w:color w:val="40a070"/>
     </w:rPr>
   </w:style>
-  <w:style w:type="character" w:customStyle="1" w:styleId="ConstantTok">
+  <w:style w:customStyle="1" w:styleId="ConstantTok" w:type="character">
     <w:name w:val="ConstantTok"/>
     <w:basedOn w:val="VerbatimChar"/>
     <w:rPr>
       <w:color w:val="880000"/>
     </w:rPr>
   </w:style>
-  <w:style w:type="character" w:customStyle="1" w:styleId="CharTok">
+  <w:style w:customStyle="1" w:styleId="CharTok" w:type="character">
     <w:name w:val="CharTok"/>
     <w:basedOn w:val="VerbatimChar"/>
     <w:rPr>
       <w:color w:val="4070a0"/>
     </w:rPr>
   </w:style>
-  <w:style w:type="character" w:customStyle="1" w:styleId="SpecialCharTok">
+  <w:style w:customStyle="1" w:styleId="SpecialCharTok" w:type="character">
     <w:name w:val="SpecialCharTok"/>
     <w:basedOn w:val="VerbatimChar"/>
     <w:rPr>
       <w:color w:val="4070a0"/>
     </w:rPr>
   </w:style>
-  <w:style w:type="character" w:customStyle="1" w:styleId="StringTok">
+  <w:style w:customStyle="1" w:styleId="StringTok" w:type="character">
     <w:name w:val="StringTok"/>
     <w:basedOn w:val="VerbatimChar"/>
     <w:rPr>
       <w:color w:val="4070a0"/>
     </w:rPr>
   </w:style>
-  <w:style w:type="character" w:customStyle="1" w:styleId="VerbatimStringTok">
+  <w:style w:customStyle="1" w:styleId="VerbatimStringTok" w:type="character">
     <w:name w:val="VerbatimStringTok"/>
     <w:basedOn w:val="VerbatimChar"/>
     <w:rPr>
       <w:color w:val="4070a0"/>
     </w:rPr>
   </w:style>
-  <w:style w:type="character" w:customStyle="1" w:styleId="SpecialStringTok">
+  <w:style w:customStyle="1" w:styleId="SpecialStringTok" w:type="character">
     <w:name w:val="SpecialStringTok"/>
     <w:basedOn w:val="VerbatimChar"/>
     <w:rPr>
       <w:color w:val="bb6688"/>
     </w:rPr>
   </w:style>
-  <w:style w:type="character" w:customStyle="1" w:styleId="ImportTok">
+  <w:style w:customStyle="1" w:styleId="ImportTok" w:type="character">
     <w:name w:val="ImportTok"/>
     <w:basedOn w:val="VerbatimChar"/>
     <w:rPr>
@@ -40997,7 +43274,7 @@
       <w:color w:val="008000"/>
     </w:rPr>
   </w:style>
-  <w:style w:type="character" w:customStyle="1" w:styleId="CommentTok">
+  <w:style w:customStyle="1" w:styleId="CommentTok" w:type="character">
     <w:name w:val="CommentTok"/>
     <w:basedOn w:val="VerbatimChar"/>
     <w:rPr>
@@ -41005,7 +43282,7 @@
       <w:color w:val="60a0b0"/>
     </w:rPr>
   </w:style>
-  <w:style w:type="character" w:customStyle="1" w:styleId="DocumentationTok">
+  <w:style w:customStyle="1" w:styleId="DocumentationTok" w:type="character">
     <w:name w:val="DocumentationTok"/>
     <w:basedOn w:val="VerbatimChar"/>
     <w:rPr>
@@ -41013,7 +43290,7 @@
       <w:color w:val="ba2121"/>
     </w:rPr>
   </w:style>
-  <w:style w:type="character" w:customStyle="1" w:styleId="AnnotationTok">
+  <w:style w:customStyle="1" w:styleId="AnnotationTok" w:type="character">
     <w:name w:val="AnnotationTok"/>
     <w:basedOn w:val="VerbatimChar"/>
     <w:rPr>
@@ -41022,7 +43299,7 @@
       <w:color w:val="60a0b0"/>
     </w:rPr>
   </w:style>
-  <w:style w:type="character" w:customStyle="1" w:styleId="CommentVarTok">
+  <w:style w:customStyle="1" w:styleId="CommentVarTok" w:type="character">
     <w:name w:val="CommentVarTok"/>
     <w:basedOn w:val="VerbatimChar"/>
     <w:rPr>
@@ -41031,28 +43308,28 @@
       <w:color w:val="60a0b0"/>
     </w:rPr>
   </w:style>
-  <w:style w:type="character" w:customStyle="1" w:styleId="OtherTok">
+  <w:style w:customStyle="1" w:styleId="OtherTok" w:type="character">
     <w:name w:val="OtherTok"/>
     <w:basedOn w:val="VerbatimChar"/>
     <w:rPr>
       <w:color w:val="007020"/>
     </w:rPr>
   </w:style>
-  <w:style w:type="character" w:customStyle="1" w:styleId="FunctionTok">
+  <w:style w:customStyle="1" w:styleId="FunctionTok" w:type="character">
     <w:name w:val="FunctionTok"/>
     <w:basedOn w:val="VerbatimChar"/>
     <w:rPr>
       <w:color w:val="06287e"/>
     </w:rPr>
   </w:style>
-  <w:style w:type="character" w:customStyle="1" w:styleId="VariableTok">
+  <w:style w:customStyle="1" w:styleId="VariableTok" w:type="character">
     <w:name w:val="VariableTok"/>
     <w:basedOn w:val="VerbatimChar"/>
     <w:rPr>
       <w:color w:val="19177c"/>
     </w:rPr>
   </w:style>
-  <w:style w:type="character" w:customStyle="1" w:styleId="ControlFlowTok">
+  <w:style w:customStyle="1" w:styleId="ControlFlowTok" w:type="character">
     <w:name w:val="ControlFlowTok"/>
     <w:basedOn w:val="VerbatimChar"/>
     <w:rPr>
@@ -41060,45 +43337,45 @@
       <w:color w:val="007020"/>
     </w:rPr>
   </w:style>
-  <w:style w:type="character" w:customStyle="1" w:styleId="OperatorTok">
+  <w:style w:customStyle="1" w:styleId="OperatorTok" w:type="character">
     <w:name w:val="OperatorTok"/>
     <w:basedOn w:val="VerbatimChar"/>
     <w:rPr>
       <w:color w:val="666666"/>
     </w:rPr>
   </w:style>
-  <w:style w:type="character" w:customStyle="1" w:styleId="BuiltInTok">
+  <w:style w:customStyle="1" w:styleId="BuiltInTok" w:type="character">
     <w:name w:val="BuiltInTok"/>
     <w:basedOn w:val="VerbatimChar"/>
     <w:rPr>
       <w:color w:val="008000"/>
     </w:rPr>
   </w:style>
-  <w:style w:type="character" w:customStyle="1" w:styleId="ExtensionTok">
+  <w:style w:customStyle="1" w:styleId="ExtensionTok" w:type="character">
     <w:name w:val="ExtensionTok"/>
     <w:basedOn w:val="VerbatimChar"/>
     <w:rPr/>
   </w:style>
-  <w:style w:type="character" w:customStyle="1" w:styleId="PreprocessorTok">
+  <w:style w:customStyle="1" w:styleId="PreprocessorTok" w:type="character">
     <w:name w:val="PreprocessorTok"/>
     <w:basedOn w:val="VerbatimChar"/>
     <w:rPr>
       <w:color w:val="bc7a00"/>
     </w:rPr>
   </w:style>
-  <w:style w:type="character" w:customStyle="1" w:styleId="AttributeTok">
+  <w:style w:customStyle="1" w:styleId="AttributeTok" w:type="character">
     <w:name w:val="AttributeTok"/>
     <w:basedOn w:val="VerbatimChar"/>
     <w:rPr>
       <w:color w:val="7d9029"/>
     </w:rPr>
   </w:style>
-  <w:style w:type="character" w:customStyle="1" w:styleId="RegionMarkerTok">
+  <w:style w:customStyle="1" w:styleId="RegionMarkerTok" w:type="character">
     <w:name w:val="RegionMarkerTok"/>
     <w:basedOn w:val="VerbatimChar"/>
     <w:rPr/>
   </w:style>
-  <w:style w:type="character" w:customStyle="1" w:styleId="InformationTok">
+  <w:style w:customStyle="1" w:styleId="InformationTok" w:type="character">
     <w:name w:val="InformationTok"/>
     <w:basedOn w:val="VerbatimChar"/>
     <w:rPr>
@@ -41107,7 +43384,7 @@
       <w:color w:val="60a0b0"/>
     </w:rPr>
   </w:style>
-  <w:style w:type="character" w:customStyle="1" w:styleId="WarningTok">
+  <w:style w:customStyle="1" w:styleId="WarningTok" w:type="character">
     <w:name w:val="WarningTok"/>
     <w:basedOn w:val="VerbatimChar"/>
     <w:rPr>
@@ -41116,7 +43393,7 @@
       <w:color w:val="60a0b0"/>
     </w:rPr>
   </w:style>
-  <w:style w:type="character" w:customStyle="1" w:styleId="AlertTok">
+  <w:style w:customStyle="1" w:styleId="AlertTok" w:type="character">
     <w:name w:val="AlertTok"/>
     <w:basedOn w:val="VerbatimChar"/>
     <w:rPr>
@@ -41124,7 +43401,7 @@
       <w:color w:val="ff0000"/>
     </w:rPr>
   </w:style>
-  <w:style w:type="character" w:customStyle="1" w:styleId="ErrorTok">
+  <w:style w:customStyle="1" w:styleId="ErrorTok" w:type="character">
     <w:name w:val="ErrorTok"/>
     <w:basedOn w:val="VerbatimChar"/>
     <w:rPr>
@@ -41132,7 +43409,7 @@
       <w:color w:val="ff0000"/>
     </w:rPr>
   </w:style>
-  <w:style w:type="character" w:customStyle="1" w:styleId="NormalTok">
+  <w:style w:customStyle="1" w:styleId="NormalTok" w:type="character">
     <w:name w:val="NormalTok"/>
     <w:basedOn w:val="VerbatimChar"/>
     <w:rPr/>

</xml_diff>

<commit_message>
Reorder figures around attribution storyline
</commit_message>
<xml_diff>
--- a/manuscript/submission/sk2bGrow_Microbiome_submission_draft.docx
+++ b/manuscript/submission/sk2bGrow_Microbiome_submission_draft.docx
@@ -2,7 +2,7 @@
 <file path=word/document.xml><?xml version="1.0" encoding="utf-8"?>
 <w:document xmlns:w="http://schemas.openxmlformats.org/wordprocessingml/2006/main" xmlns:m="http://schemas.openxmlformats.org/officeDocument/2006/math" xmlns:r="http://schemas.openxmlformats.org/officeDocument/2006/relationships" xmlns:o="urn:schemas-microsoft-com:office:office" xmlns:v="urn:schemas-microsoft-com:vml" xmlns:w10="urn:schemas-microsoft-com:office:word" xmlns:a="http://schemas.openxmlformats.org/drawingml/2006/main" xmlns:pic="http://schemas.openxmlformats.org/drawingml/2006/picture" xmlns:wp="http://schemas.openxmlformats.org/drawingml/2006/wordprocessingDrawing">
   <w:body>
-    <w:bookmarkStart w:id="223" w:name="X35a67ffd771dc0eee37406016d31234a1046d16"/>
+    <w:bookmarkStart w:id="437" w:name="X35a67ffd771dc0eee37406016d31234a1046d16"/>
     <w:p>
       <w:pPr>
         <w:pStyle w:val="Heading1"/>
@@ -11,7 +11,7 @@
         <w:t xml:space="preserve">Coordinate-aware V-fitting enables shallow-depth PTR estimation from 2bRAD anchor panels</w:t>
       </w:r>
     </w:p>
-    <w:bookmarkStart w:id="120" w:name="title-page"/>
+    <w:bookmarkStart w:id="334" w:name="title-page"/>
     <w:p>
       <w:pPr>
         <w:pStyle w:val="Heading2"/>
@@ -132,8 +132,8 @@
         <w:t xml:space="preserve">Review revision 2026-09-18. The primary Zheng grid uses signed fixed-origin fitting and single-pass GC correction; residual two-pass GC correction is diagnostic only.</w:t>
       </w:r>
     </w:p>
-    <w:bookmarkEnd w:id="120"/>
-    <w:bookmarkStart w:id="121" w:name="abstract"/>
+    <w:bookmarkEnd w:id="334"/>
+    <w:bookmarkStart w:id="335" w:name="abstract"/>
     <w:p>
       <w:pPr>
         <w:pStyle w:val="Heading2"/>
@@ -166,8 +166,8 @@
         <w:t xml:space="preserve">growth-rate panel, sk2bGrow returned usable PTR estimates at 1–2× sequencing depth, where Pilea’s shipped defaults return nothing, with r = 0.92 at 1× and 0.96 at 2× against measured growth rates (n = 16). The accuracy comes from the coordinate-aware estimator, not the landmark source — at matched density, the two landmark sources were not significantly different in the paired bootstrap at any depth — while the multi-enzyme panel contributes what a hash sketch cannot: a wet-lab-realizable landmark set and consistency strata whose heterogeneous biases exposed our own counting defect. The estimates are not unbiased — the fitted slope compresses the dynamic range at low coverage, and the mechanism is unresolved. On three fecal metagenomes, sk2bGrow and Pilea agreed (bias +0.22–+0.25 log2; n = 58–78 species×sample pairs per sample). As a process-level finding, exact deduplication of 2bRAD libraries before counting destroys the PTR signal — a PCR copy-number artefact we localize per anchor. sk2bGrow is 89.5–240.8× slower than Pilea at MAG-panel scale; mismatch-1 counting narrows the gap to roughly one order of magnitude (measured end-to-end on all nine samples: 20.5–38.8× faster counting than the mismatch-2 baseline, no genome lost), and a containment pre-screen — measured to clear the absent-reference false-positive floor, and required at database scale where an unrestricted index would emit estimates for absent references — completes the fix.</w:t>
       </w:r>
     </w:p>
-    <w:bookmarkEnd w:id="121"/>
-    <w:bookmarkStart w:id="122" w:name="keywords"/>
+    <w:bookmarkEnd w:id="335"/>
+    <w:bookmarkStart w:id="336" w:name="keywords"/>
     <w:p>
       <w:pPr>
         <w:pStyle w:val="Heading2"/>
@@ -184,8 +184,8 @@
         <w:t xml:space="preserve">peak-to-trough ratio; microbial growth dynamics; 2bRAD; FracMinHash; metagenomics; shallow sequencing</w:t>
       </w:r>
     </w:p>
-    <w:bookmarkEnd w:id="122"/>
-    <w:bookmarkStart w:id="123" w:name="background"/>
+    <w:bookmarkEnd w:id="336"/>
+    <w:bookmarkStart w:id="337" w:name="background"/>
     <w:p>
       <w:pPr>
         <w:pStyle w:val="Heading2"/>
@@ -308,8 +308,8 @@
         <w:t xml:space="preserve">In short, this paper contributes (i) usable PTR estimates at 1–2× sequencing depth, with the low-coverage bias stated rather than hidden; (ii) a controlled 2 × 2 attribution localising the gain in the coordinate-aware estimator rather than in which landmarks are counted — the two landmark sources showed no significant paired-bootstrap difference once density was matched; and (iii) real-metagenome concordance with the incumbent and process-level findings — a deduplication recommendation and a per-anchor capture-efficiency measurement — that others can cite.</w:t>
       </w:r>
     </w:p>
-    <w:bookmarkEnd w:id="123"/>
-    <w:bookmarkStart w:id="152" w:name="methods"/>
+    <w:bookmarkEnd w:id="337"/>
+    <w:bookmarkStart w:id="366" w:name="methods"/>
     <w:p>
       <w:pPr>
         <w:pStyle w:val="Heading2"/>
@@ -334,7 +334,7 @@
       <w:r>
         <w:t xml:space="preserve"> </w:t>
       </w:r>
-      <w:hyperlink r:id="rId124">
+      <w:hyperlink r:id="rId338">
         <w:r>
           <w:rPr>
             <w:rStyle w:val="Hyperlink"/>
@@ -380,7 +380,7 @@
         </w:pict>
       </w:r>
     </w:p>
-    <w:bookmarkStart w:id="132" w:name="the-sk2bgrow-algorithm"/>
+    <w:bookmarkStart w:id="346" w:name="the-sk2bgrow-algorithm"/>
     <w:p>
       <w:pPr>
         <w:pStyle w:val="Heading3"/>
@@ -570,7 +570,7 @@
         <w:t xml:space="preserve">) has six stages.</w:t>
       </w:r>
     </w:p>
-    <w:bookmarkStart w:id="125" w:name="Xd9b3ed4dd252045d3e48557196049c0e39886bf"/>
+    <w:bookmarkStart w:id="339" w:name="Xd9b3ed4dd252045d3e48557196049c0e39886bf"/>
     <w:p>
       <w:pPr>
         <w:pStyle w:val="Heading4"/>
@@ -959,8 +959,8 @@
         <w:t xml:space="preserve">.</w:t>
       </w:r>
     </w:p>
-    <w:bookmarkEnd w:id="125"/>
-    <w:bookmarkStart w:id="126" w:name="read-counting-and-anchor-attribution"/>
+    <w:bookmarkEnd w:id="339"/>
+    <w:bookmarkStart w:id="340" w:name="read-counting-and-anchor-attribution"/>
     <w:p>
       <w:pPr>
         <w:pStyle w:val="Heading4"/>
@@ -1351,8 +1351,8 @@
         <w:t xml:space="preserve">iterations.</w:t>
       </w:r>
     </w:p>
-    <w:bookmarkEnd w:id="126"/>
-    <w:bookmarkStart w:id="127" w:name="windows-and-window-rates"/>
+    <w:bookmarkEnd w:id="340"/>
+    <w:bookmarkStart w:id="341" w:name="windows-and-window-rates"/>
     <w:p>
       <w:pPr>
         <w:pStyle w:val="Heading4"/>
@@ -1654,8 +1654,8 @@
         <w:t xml:space="preserve">~12 spurious log-likelihood units and BIC selects NB everywhere.</w:t>
       </w:r>
     </w:p>
-    <w:bookmarkEnd w:id="127"/>
-    <w:bookmarkStart w:id="128" w:name="gc-bias-correction"/>
+    <w:bookmarkEnd w:id="341"/>
+    <w:bookmarkStart w:id="342" w:name="gc-bias-correction"/>
     <w:p>
       <w:pPr>
         <w:pStyle w:val="Heading4"/>
@@ -1894,8 +1894,8 @@
         <w:t xml:space="preserve">).</w:t>
       </w:r>
     </w:p>
-    <w:bookmarkEnd w:id="128"/>
-    <w:bookmarkStart w:id="129" w:name="origin-placement-and-v-shape-fitting"/>
+    <w:bookmarkEnd w:id="342"/>
+    <w:bookmarkStart w:id="343" w:name="origin-placement-and-v-shape-fitting"/>
     <w:p>
       <w:pPr>
         <w:pStyle w:val="Heading4"/>
@@ -2465,8 +2465,8 @@
         <w:t xml:space="preserve">).</w:t>
       </w:r>
     </w:p>
-    <w:bookmarkEnd w:id="129"/>
-    <w:bookmarkStart w:id="130" w:name="cross-enzyme-fusion-and-quality-control"/>
+    <w:bookmarkEnd w:id="343"/>
+    <w:bookmarkStart w:id="344" w:name="cross-enzyme-fusion-and-quality-control"/>
     <w:p>
       <w:pPr>
         <w:pStyle w:val="Heading4"/>
@@ -2999,8 +2999,8 @@
         <w:t xml:space="preserve">rejection rate — the dependency is reported, not corrected (Discussion).</w:t>
       </w:r>
     </w:p>
-    <w:bookmarkEnd w:id="130"/>
-    <w:bookmarkStart w:id="131" w:name="implementation"/>
+    <w:bookmarkEnd w:id="344"/>
+    <w:bookmarkStart w:id="345" w:name="implementation"/>
     <w:p>
       <w:pPr>
         <w:pStyle w:val="Heading4"/>
@@ -3042,9 +3042,9 @@
         </w:pict>
       </w:r>
     </w:p>
-    <w:bookmarkEnd w:id="131"/>
-    <w:bookmarkEnd w:id="132"/>
-    <w:bookmarkStart w:id="133" w:name="enzyme-panel"/>
+    <w:bookmarkEnd w:id="345"/>
+    <w:bookmarkEnd w:id="346"/>
+    <w:bookmarkStart w:id="347" w:name="enzyme-panel"/>
     <w:p>
       <w:pPr>
         <w:pStyle w:val="Heading3"/>
@@ -3270,8 +3270,8 @@
         </w:pict>
       </w:r>
     </w:p>
-    <w:bookmarkEnd w:id="133"/>
-    <w:bookmarkStart w:id="141" w:name="benchmark-datasets"/>
+    <w:bookmarkEnd w:id="347"/>
+    <w:bookmarkStart w:id="355" w:name="benchmark-datasets"/>
     <w:p>
       <w:pPr>
         <w:pStyle w:val="Heading3"/>
@@ -3280,7 +3280,7 @@
         <w:t xml:space="preserve">3. Benchmark datasets</w:t>
       </w:r>
     </w:p>
-    <w:bookmarkStart w:id="134" w:name="X8558b042e1c4d57d5e6d341f0cb3e7790b4deb2"/>
+    <w:bookmarkStart w:id="348" w:name="X8558b042e1c4d57d5e6d341f0cb3e7790b4deb2"/>
     <w:p>
       <w:pPr>
         <w:pStyle w:val="Heading4"/>
@@ -3854,8 +3854,8 @@
         <w:t xml:space="preserve">establishes behaviour on a metagenome or a fragmented MAG.</w:t>
       </w:r>
     </w:p>
-    <w:bookmarkEnd w:id="134"/>
-    <w:bookmarkStart w:id="135" w:name="multi-strain-simulation"/>
+    <w:bookmarkEnd w:id="348"/>
+    <w:bookmarkStart w:id="349" w:name="multi-strain-simulation"/>
     <w:p>
       <w:pPr>
         <w:pStyle w:val="Heading4"/>
@@ -4134,8 +4134,8 @@
         <w:t xml:space="preserve">).</w:t>
       </w:r>
     </w:p>
-    <w:bookmarkEnd w:id="135"/>
-    <w:bookmarkStart w:id="136" w:name="reference-fragmentation"/>
+    <w:bookmarkEnd w:id="349"/>
+    <w:bookmarkStart w:id="350" w:name="reference-fragmentation"/>
     <w:p>
       <w:pPr>
         <w:pStyle w:val="Heading4"/>
@@ -4590,8 +4590,8 @@
         <w:t xml:space="preserve">scaffolding delivers.</w:t>
       </w:r>
     </w:p>
-    <w:bookmarkEnd w:id="136"/>
-    <w:bookmarkStart w:id="137" w:name="Xb780f84997d33bf0f401691b1288ff1538bcd72"/>
+    <w:bookmarkEnd w:id="350"/>
+    <w:bookmarkStart w:id="351" w:name="Xb780f84997d33bf0f401691b1288ff1538bcd72"/>
     <w:p>
       <w:pPr>
         <w:pStyle w:val="Heading4"/>
@@ -5049,8 +5049,8 @@
         <w:t xml:space="preserve">invariant to affine transformation.</w:t>
       </w:r>
     </w:p>
-    <w:bookmarkEnd w:id="137"/>
-    <w:bookmarkStart w:id="138" w:name="faecal-microbiome-sun-et-al."/>
+    <w:bookmarkEnd w:id="351"/>
+    <w:bookmarkStart w:id="352" w:name="faecal-microbiome-sun-et-al."/>
     <w:p>
       <w:pPr>
         <w:pStyle w:val="Heading4"/>
@@ -5618,8 +5618,8 @@
         <w:t xml:space="preserve">decomposition are defined in §5.</w:t>
       </w:r>
     </w:p>
-    <w:bookmarkEnd w:id="138"/>
-    <w:bookmarkStart w:id="139" w:name="Xbdb57a27110786c0a1921f07c423d99a2d691e0"/>
+    <w:bookmarkEnd w:id="352"/>
+    <w:bookmarkStart w:id="353" w:name="Xbdb57a27110786c0a1921f07c423d99a2d691e0"/>
     <w:p>
       <w:pPr>
         <w:pStyle w:val="Heading4"/>
@@ -6229,8 +6229,8 @@
         <w:t xml:space="preserve">counts, with per-anchor ratios ≈ 1).</w:t>
       </w:r>
     </w:p>
-    <w:bookmarkEnd w:id="139"/>
-    <w:bookmarkStart w:id="140" w:name="gc-spanning-genome-set"/>
+    <w:bookmarkEnd w:id="353"/>
+    <w:bookmarkStart w:id="354" w:name="gc-spanning-genome-set"/>
     <w:p>
       <w:pPr>
         <w:pStyle w:val="Heading4"/>
@@ -6340,9 +6340,9 @@
         </w:pict>
       </w:r>
     </w:p>
-    <w:bookmarkEnd w:id="140"/>
-    <w:bookmarkEnd w:id="141"/>
-    <w:bookmarkStart w:id="142" w:name="comparison-methods"/>
+    <w:bookmarkEnd w:id="354"/>
+    <w:bookmarkEnd w:id="355"/>
+    <w:bookmarkStart w:id="356" w:name="comparison-methods"/>
     <w:p>
       <w:pPr>
         <w:pStyle w:val="Heading3"/>
@@ -7070,8 +7070,8 @@
         </w:pict>
       </w:r>
     </w:p>
-    <w:bookmarkEnd w:id="142"/>
-    <w:bookmarkStart w:id="143" w:name="evaluation-metrics"/>
+    <w:bookmarkEnd w:id="356"/>
+    <w:bookmarkStart w:id="357" w:name="evaluation-metrics"/>
     <w:p>
       <w:pPr>
         <w:pStyle w:val="Heading3"/>
@@ -8473,8 +8473,8 @@
         </w:pict>
       </w:r>
     </w:p>
-    <w:bookmarkEnd w:id="143"/>
-    <w:bookmarkStart w:id="150" w:name="X85a115a26ce12f930c9dac210e8d891ae5a6b7c"/>
+    <w:bookmarkEnd w:id="357"/>
+    <w:bookmarkStart w:id="364" w:name="X85a115a26ce12f930c9dac210e8d891ae5a6b7c"/>
     <w:p>
       <w:pPr>
         <w:pStyle w:val="Heading3"/>
@@ -8597,7 +8597,7 @@
         <w:t xml:space="preserve">symmetric in effect.</w:t>
       </w:r>
     </w:p>
-    <w:bookmarkStart w:id="144" w:name="density-matching-on-the-zheng-grid-f1"/>
+    <w:bookmarkStart w:id="358" w:name="density-matching-on-the-zheng-grid-f1"/>
     <w:p>
       <w:pPr>
         <w:pStyle w:val="Heading4"/>
@@ -8738,8 +8738,8 @@
         <w:t xml:space="preserve">per-window landmark counts and detection fraction; per-cell failure cause.</w:t>
       </w:r>
     </w:p>
-    <w:bookmarkEnd w:id="144"/>
-    <w:bookmarkStart w:id="145" w:name="gc-sweep-f2"/>
+    <w:bookmarkEnd w:id="358"/>
+    <w:bookmarkStart w:id="359" w:name="gc-sweep-f2"/>
     <w:p>
       <w:pPr>
         <w:pStyle w:val="Heading4"/>
@@ -8967,8 +8967,8 @@
         <w:t xml:space="preserve">(landmarks/Mb).</w:t>
       </w:r>
     </w:p>
-    <w:bookmarkEnd w:id="145"/>
-    <w:bookmarkStart w:id="146" w:name="mismatch-tolerance-and-misassignment-f3"/>
+    <w:bookmarkEnd w:id="359"/>
+    <w:bookmarkStart w:id="360" w:name="mismatch-tolerance-and-misassignment-f3"/>
     <w:p>
       <w:pPr>
         <w:pStyle w:val="Heading4"/>
@@ -9273,8 +9273,8 @@
         <w:t xml:space="preserve">).</w:t>
       </w:r>
     </w:p>
-    <w:bookmarkEnd w:id="146"/>
-    <w:bookmarkStart w:id="147" w:name="fragmentation-sketch-f4"/>
+    <w:bookmarkEnd w:id="360"/>
+    <w:bookmarkStart w:id="361" w:name="fragmentation-sketch-f4"/>
     <w:p>
       <w:pPr>
         <w:pStyle w:val="Heading4"/>
@@ -9666,8 +9666,8 @@
         <w:t xml:space="preserve">rate, orientation accuracy and order Spearman; permutation null distributions.</w:t>
       </w:r>
     </w:p>
-    <w:bookmarkEnd w:id="147"/>
-    <w:bookmarkStart w:id="148" w:name="index-cost-at-gtdb-like-scale-f5"/>
+    <w:bookmarkEnd w:id="361"/>
+    <w:bookmarkStart w:id="362" w:name="index-cost-at-gtdb-like-scale-f5"/>
     <w:p>
       <w:pPr>
         <w:pStyle w:val="Heading4"/>
@@ -9969,8 +9969,8 @@
         <w:t xml:space="preserve">matched density.</w:t>
       </w:r>
     </w:p>
-    <w:bookmarkEnd w:id="148"/>
-    <w:bookmarkStart w:id="149" w:name="X84bfdf958829166d8b906dacf41027ff82eb47c"/>
+    <w:bookmarkEnd w:id="362"/>
+    <w:bookmarkStart w:id="363" w:name="X84bfdf958829166d8b906dacf41027ff82eb47c"/>
     <w:p>
       <w:pPr>
         <w:pStyle w:val="Heading4"/>
@@ -10216,7 +10216,7 @@
         <w:t xml:space="preserve"> </w:t>
       </w:r>
       <w:r>
-        <w:t xml:space="preserve">contrasts, Table 11 and Fig. 9 are in</w:t>
+        <w:t xml:space="preserve">contrasts, Table 11 and Fig. 5 are in</w:t>
       </w:r>
       <w:r>
         <w:t xml:space="preserve"> </w:t>
@@ -10238,9 +10238,9 @@
         </w:pict>
       </w:r>
     </w:p>
-    <w:bookmarkEnd w:id="149"/>
-    <w:bookmarkEnd w:id="150"/>
-    <w:bookmarkStart w:id="151" w:name="computational-environment"/>
+    <w:bookmarkEnd w:id="363"/>
+    <w:bookmarkEnd w:id="364"/>
+    <w:bookmarkStart w:id="365" w:name="computational-environment"/>
     <w:p>
       <w:pPr>
         <w:pStyle w:val="Heading3"/>
@@ -10316,9 +10316,9 @@
         </w:pict>
       </w:r>
     </w:p>
-    <w:bookmarkEnd w:id="151"/>
-    <w:bookmarkEnd w:id="152"/>
-    <w:bookmarkStart w:id="171" w:name="results"/>
+    <w:bookmarkEnd w:id="365"/>
+    <w:bookmarkEnd w:id="366"/>
+    <w:bookmarkStart w:id="385" w:name="results"/>
     <w:p>
       <w:pPr>
         <w:pStyle w:val="Heading2"/>
@@ -10327,7 +10327,7 @@
         <w:t xml:space="preserve">Results</w:t>
       </w:r>
     </w:p>
-    <w:bookmarkStart w:id="153" w:name="sk2bgrow-overview"/>
+    <w:bookmarkStart w:id="367" w:name="sk2bgrow-overview"/>
     <w:p>
       <w:pPr>
         <w:pStyle w:val="Heading3"/>
@@ -10386,8 +10386,8 @@
         <w:t xml:space="preserve">² for the same sample. Panels b–d are real output from one 2× sample; the figure shows the method working on real data, not a cartoon (Fig. 1).</w:t>
       </w:r>
     </w:p>
-    <w:bookmarkEnd w:id="153"/>
-    <w:bookmarkStart w:id="157" w:name="accuracy-on-bacterial-isolates"/>
+    <w:bookmarkEnd w:id="367"/>
+    <w:bookmarkStart w:id="371" w:name="accuracy-on-bacterial-isolates"/>
     <w:p>
       <w:pPr>
         <w:pStyle w:val="Heading3"/>
@@ -10396,7 +10396,7 @@
         <w:t xml:space="preserve">2. Accuracy on bacterial isolates</w:t>
       </w:r>
     </w:p>
-    <w:bookmarkStart w:id="154" w:name="accuracy-across-the-coverage-titration"/>
+    <w:bookmarkStart w:id="368" w:name="accuracy-across-the-coverage-titration"/>
     <w:p>
       <w:pPr>
         <w:pStyle w:val="Heading4"/>
@@ -10573,8 +10573,8 @@
         <w:t xml:space="preserve">(Methods §1.4).</w:t>
       </w:r>
     </w:p>
-    <w:bookmarkEnd w:id="154"/>
-    <w:bookmarkStart w:id="155" w:name="a-negative-control-that-pilea-excluded"/>
+    <w:bookmarkEnd w:id="368"/>
+    <w:bookmarkStart w:id="369" w:name="a-negative-control-that-pilea-excluded"/>
     <w:p>
       <w:pPr>
         <w:pStyle w:val="Heading4"/>
@@ -10612,8 +10612,8 @@
         <w:t xml:space="preserve">estimate, and in exactly the direction of reading noise as growth (Fig. 2d).</w:t>
       </w:r>
     </w:p>
-    <w:bookmarkEnd w:id="155"/>
-    <w:bookmarkStart w:id="156" w:name="Xce6b542434ed1814004dfb47fad411b14a7baa6"/>
+    <w:bookmarkEnd w:id="369"/>
+    <w:bookmarkStart w:id="370" w:name="Xce6b542434ed1814004dfb47fad411b14a7baa6"/>
     <w:p>
       <w:pPr>
         <w:pStyle w:val="Heading4"/>
@@ -10661,9 +10661,9 @@
         <w:t xml:space="preserve">estimates and 167 of 172 in the multi-strain simulation. Because a 150 bp read yields 120 31-mers, a threshold of 5 on k-mer coverage corresponds to ≈6.25× read coverage (5 × 150/120), so the gate fires at 5× nominal even where the estimator behind it is still informative. At 0.5× the gate is correctly refusing to report: Pilea’s gates-off output there is fully degenerate — measured coverage exactly 1.000 and log₂PTR exactly 0.000 in all 17 samples. Between 1× and 5×, however, the gates-off estimator is informative (r = 0.78, 0.85, 0.99 against λ) and is nevertheless suppressed. The honest claim is therefore not that Pilea is over-conservative, but that its gate is calibrated to the point where the FracMinHash estimator breaks — ≈6.25× read coverage — whereas sk2bGrow’s break point is below 1× (Fig. 2; Table 5).</w:t>
       </w:r>
     </w:p>
-    <w:bookmarkEnd w:id="156"/>
-    <w:bookmarkEnd w:id="157"/>
-    <w:bookmarkStart w:id="158" w:name="multi-strain-communities"/>
+    <w:bookmarkEnd w:id="370"/>
+    <w:bookmarkEnd w:id="371"/>
+    <w:bookmarkStart w:id="372" w:name="multi-strain-communities"/>
     <w:p>
       <w:pPr>
         <w:pStyle w:val="Heading3"/>
@@ -10758,8 +10758,8 @@
         <w:t xml:space="preserve">; Methods §6.3). Recall 1.000 therefore still describes an exact-match-favourable grid, but it is no longer supported only by the estimator’s own generative model.</w:t>
       </w:r>
     </w:p>
-    <w:bookmarkEnd w:id="158"/>
-    <w:bookmarkStart w:id="160" w:name="what-do-the-landmarks-contribute"/>
+    <w:bookmarkEnd w:id="372"/>
+    <w:bookmarkStart w:id="374" w:name="what-do-the-landmarks-contribute"/>
     <w:p>
       <w:pPr>
         <w:pStyle w:val="Heading3"/>
@@ -11705,7 +11705,7 @@
         <w:t xml:space="preserve">(Fig. 4)</w:t>
       </w:r>
     </w:p>
-    <w:bookmarkStart w:id="159" w:name="Xfc754f5fdbc1a952568615503bb8f3afaadf421"/>
+    <w:bookmarkStart w:id="373" w:name="Xfc754f5fdbc1a952568615503bb8f3afaadf421"/>
     <w:p>
       <w:pPr>
         <w:pStyle w:val="Heading4"/>
@@ -11897,7 +11897,7 @@
         <w:t xml:space="preserve"> </w:t>
       </w:r>
       <w:r>
-        <w:t xml:space="preserve">complete cell-level results are in Table 11 and Fig. 9.</w:t>
+        <w:t xml:space="preserve">complete cell-level results are in Table 11 and Fig. 5.</w:t>
       </w:r>
     </w:p>
     <w:p>
@@ -11909,12 +11909,12 @@
           <w:i/>
           <w:iCs/>
         </w:rPr>
-        <w:t xml:space="preserve">(Fig. 9; Table 11)</w:t>
+        <w:t xml:space="preserve">(Fig. 5; Table 11)</w:t>
       </w:r>
     </w:p>
-    <w:bookmarkEnd w:id="159"/>
-    <w:bookmarkEnd w:id="160"/>
-    <w:bookmarkStart w:id="161" w:name="X5aa37cfb64c4d815f4fee0e74b644b0546e0c08"/>
+    <w:bookmarkEnd w:id="373"/>
+    <w:bookmarkEnd w:id="374"/>
+    <w:bookmarkStart w:id="375" w:name="X5aa37cfb64c4d815f4fee0e74b644b0546e0c08"/>
     <w:p>
       <w:pPr>
         <w:pStyle w:val="Heading3"/>
@@ -12777,11 +12777,11 @@
           <w:i/>
           <w:iCs/>
         </w:rPr>
-        <w:t xml:space="preserve">(Fig. 5)</w:t>
+        <w:t xml:space="preserve">(Fig. 6)</w:t>
       </w:r>
     </w:p>
-    <w:bookmarkEnd w:id="161"/>
-    <w:bookmarkStart w:id="165" w:name="fragmented-references-and-mags"/>
+    <w:bookmarkEnd w:id="375"/>
+    <w:bookmarkStart w:id="379" w:name="fragmented-references-and-mags"/>
     <w:p>
       <w:pPr>
         <w:pStyle w:val="Heading3"/>
@@ -12790,7 +12790,7 @@
         <w:t xml:space="preserve">6. Fragmented references and MAGs</w:t>
       </w:r>
     </w:p>
-    <w:bookmarkStart w:id="162" w:name="X023c9de081127f5a9ee34128d04d5cd51d91210"/>
+    <w:bookmarkStart w:id="376" w:name="X023c9de081127f5a9ee34128d04d5cd51d91210"/>
     <w:p>
       <w:pPr>
         <w:pStyle w:val="Heading4"/>
@@ -12991,7 +12991,7 @@
         <w:t xml:space="preserve"> </w:t>
       </w:r>
       <w:r>
-        <w:t xml:space="preserve">(Fig. 6).</w:t>
+        <w:t xml:space="preserve">(Fig. 7).</w:t>
       </w:r>
     </w:p>
     <w:p>
@@ -13524,8 +13524,8 @@
         </w:tc>
       </w:tr>
     </w:tbl>
-    <w:bookmarkEnd w:id="162"/>
-    <w:bookmarkStart w:id="163" w:name="X6e8375112356a1e59f6c25ab9a7ae77408f4219"/>
+    <w:bookmarkEnd w:id="376"/>
+    <w:bookmarkStart w:id="377" w:name="X6e8375112356a1e59f6c25ab9a7ae77408f4219"/>
     <w:p>
       <w:pPr>
         <w:pStyle w:val="Heading4"/>
@@ -13725,11 +13725,11 @@
         <w:t xml:space="preserve"> </w:t>
       </w:r>
       <w:r>
-        <w:t xml:space="preserve">sketch scaffolding is demonstrated, not shipped (Fig. 6).</w:t>
+        <w:t xml:space="preserve">sketch scaffolding is demonstrated, not shipped (Fig. 7).</w:t>
       </w:r>
     </w:p>
-    <w:bookmarkEnd w:id="163"/>
-    <w:bookmarkStart w:id="164" w:name="X72de53e76597c7041bc0c2cfdd503c5ddd9d60b"/>
+    <w:bookmarkEnd w:id="377"/>
+    <w:bookmarkStart w:id="378" w:name="X72de53e76597c7041bc0c2cfdd503c5ddd9d60b"/>
     <w:p>
       <w:pPr>
         <w:pStyle w:val="Heading4"/>
@@ -13854,12 +13854,12 @@
           <w:i/>
           <w:iCs/>
         </w:rPr>
-        <w:t xml:space="preserve">(Fig. 6; Table 8)</w:t>
+        <w:t xml:space="preserve">(Fig. 7; Table 8)</w:t>
       </w:r>
     </w:p>
-    <w:bookmarkEnd w:id="164"/>
-    <w:bookmarkEnd w:id="165"/>
-    <w:bookmarkStart w:id="169" w:name="real-metagenomes"/>
+    <w:bookmarkEnd w:id="378"/>
+    <w:bookmarkEnd w:id="379"/>
+    <w:bookmarkStart w:id="383" w:name="real-metagenomes"/>
     <w:p>
       <w:pPr>
         <w:pStyle w:val="Heading3"/>
@@ -13868,7 +13868,7 @@
         <w:t xml:space="preserve">7. Real metagenomes</w:t>
       </w:r>
     </w:p>
-    <w:bookmarkStart w:id="166" w:name="X1ac24289c0a6b34d66188d6319131a2e330c07c"/>
+    <w:bookmarkStart w:id="380" w:name="X1ac24289c0a6b34d66188d6319131a2e330c07c"/>
     <w:p>
       <w:pPr>
         <w:pStyle w:val="Heading4"/>
@@ -14046,7 +14046,7 @@
         <w:t xml:space="preserve"> </w:t>
       </w:r>
       <w:r>
-        <w:t xml:space="preserve">demonstration (Fig. 7; Table 10;</w:t>
+        <w:t xml:space="preserve">demonstration (Fig. 8; Table 10;</w:t>
       </w:r>
       <w:r>
         <w:t xml:space="preserve"> </w:t>
@@ -14061,8 +14061,8 @@
         <w:t xml:space="preserve">).</w:t>
       </w:r>
     </w:p>
-    <w:bookmarkEnd w:id="166"/>
-    <w:bookmarkStart w:id="167" w:name="Xc081266583f5878e429dba77e287ecfb4e84c13"/>
+    <w:bookmarkEnd w:id="380"/>
+    <w:bookmarkStart w:id="381" w:name="Xc081266583f5878e429dba77e287ecfb4e84c13"/>
     <w:p>
       <w:pPr>
         <w:pStyle w:val="Heading4"/>
@@ -14306,11 +14306,11 @@
         <w:t xml:space="preserve"> </w:t>
       </w:r>
       <w:r>
-        <w:t xml:space="preserve">preparation) (Fig. 7).</w:t>
+        <w:t xml:space="preserve">preparation) (Fig. 8).</w:t>
       </w:r>
     </w:p>
-    <w:bookmarkEnd w:id="167"/>
-    <w:bookmarkStart w:id="168" w:name="X855dfea45c8027e3834f5e0c80b8fc9c7aa81b5"/>
+    <w:bookmarkEnd w:id="381"/>
+    <w:bookmarkStart w:id="382" w:name="X855dfea45c8027e3834f5e0c80b8fc9c7aa81b5"/>
     <w:p>
       <w:pPr>
         <w:pStyle w:val="Heading4"/>
@@ -14736,12 +14736,12 @@
           <w:i/>
           <w:iCs/>
         </w:rPr>
-        <w:t xml:space="preserve">(Fig. 8; Table 10)</w:t>
+        <w:t xml:space="preserve">(Fig. 9; Table 10)</w:t>
       </w:r>
     </w:p>
-    <w:bookmarkEnd w:id="168"/>
-    <w:bookmarkEnd w:id="169"/>
-    <w:bookmarkStart w:id="170" w:name="computational-efficiency-and-scale"/>
+    <w:bookmarkEnd w:id="382"/>
+    <w:bookmarkEnd w:id="383"/>
+    <w:bookmarkStart w:id="384" w:name="computational-efficiency-and-scale"/>
     <w:p>
       <w:pPr>
         <w:pStyle w:val="Heading3"/>
@@ -15017,12 +15017,12 @@
           <w:i/>
           <w:iCs/>
         </w:rPr>
-        <w:t xml:space="preserve">(Fig. 8d)</w:t>
+        <w:t xml:space="preserve">(Fig. 9d)</w:t>
       </w:r>
     </w:p>
-    <w:bookmarkEnd w:id="170"/>
-    <w:bookmarkEnd w:id="171"/>
-    <w:bookmarkStart w:id="172" w:name="discussion"/>
+    <w:bookmarkEnd w:id="384"/>
+    <w:bookmarkEnd w:id="385"/>
+    <w:bookmarkStart w:id="386" w:name="discussion"/>
     <w:p>
       <w:pPr>
         <w:pStyle w:val="Heading2"/>
@@ -15655,7 +15655,7 @@
         <w:t xml:space="preserve"> </w:t>
       </w:r>
       <w:r>
-        <w:t xml:space="preserve">A wrong reference → the estimate is emitted and wrong (C5). A destroyed coordinate → degradation is smooth, monotone, detectable from scaffold length, and repairable by scaffolding (Fig. 6). FracMinHash’s analogous failure — dilution by an unreferenced strain — is silent and has no coordinate to inspect. We do not overclaim here: this is a difference in the</w:t>
+        <w:t xml:space="preserve">A wrong reference → the estimate is emitted and wrong (C5). A destroyed coordinate → degradation is smooth, monotone, detectable from scaffold length, and repairable by scaffolding (Fig. 7). FracMinHash’s analogous failure — dilution by an unreferenced strain — is silent and has no coordinate to inspect. We do not overclaim here: this is a difference in the</w:t>
       </w:r>
       <w:r>
         <w:t xml:space="preserve"> </w:t>
@@ -16333,7 +16333,7 @@
               <w:jc w:val="left"/>
             </w:pPr>
             <w:r>
-              <w:t xml:space="preserve">Fig 6; F4: collapse identical across landmark types (slope 0.26-0.38, RMSE x40, winner’s-curse residue)</w:t>
+              <w:t xml:space="preserve">Fig 7; F4: collapse identical across landmark types (slope 0.26-0.38, RMSE x40, winner’s-curse residue)</w:t>
             </w:r>
           </w:p>
         </w:tc>
@@ -16659,8 +16659,8 @@
         <w:t xml:space="preserve">have no data in this study and must not be read as null results. The mismatch-tolerance row is asymmetric for a measured reason (F3): the enzyme mode’s exact-first counting rule suppresses the near-neighbor search that becomes the sketch mode’s rescue channel at scale ~100. Sketch-side scaffolding and sketch mismatch tolerance rest on a rule-based port/simulation respectively, not on shipped CLI modes (F3/F4 REVIEW caveats).</w:t>
       </w:r>
     </w:p>
-    <w:bookmarkEnd w:id="172"/>
-    <w:bookmarkStart w:id="173" w:name="conclusions"/>
+    <w:bookmarkEnd w:id="386"/>
+    <w:bookmarkStart w:id="387" w:name="conclusions"/>
     <w:p>
       <w:pPr>
         <w:pStyle w:val="Heading2"/>
@@ -16693,8 +16693,8 @@
         <w:t xml:space="preserve">The benchmark also defines the limits of deployment. Low-coverage estimates have compressed dynamic range, and GC, fragmented references, strain mixtures, absent references, and MAG-scale runtime require explicit safeguards. Current conservative QC therefore trades yield for reliability. Within these limits, sk2bGrow provides a reproducible shallow-depth growth-inference module for longitudinal microbiome studies; in disease cohorts, derived PTR dynamics may complement taxonomic abundance features in conventional prediction models, but this application requires direct validation in oral and gut datasets.</w:t>
       </w:r>
     </w:p>
-    <w:bookmarkEnd w:id="173"/>
-    <w:bookmarkStart w:id="174" w:name="list-of-abbreviations"/>
+    <w:bookmarkEnd w:id="387"/>
+    <w:bookmarkStart w:id="388" w:name="list-of-abbreviations"/>
     <w:p>
       <w:pPr>
         <w:pStyle w:val="Heading2"/>
@@ -16741,8 +16741,8 @@
         <w:t xml:space="preserve">V-fit: coordinate-aware windowed V-shaped regression fit</w:t>
       </w:r>
     </w:p>
-    <w:bookmarkEnd w:id="174"/>
-    <w:bookmarkStart w:id="184" w:name="declarations"/>
+    <w:bookmarkEnd w:id="388"/>
+    <w:bookmarkStart w:id="398" w:name="declarations"/>
     <w:p>
       <w:pPr>
         <w:pStyle w:val="Heading2"/>
@@ -16751,7 +16751,7 @@
         <w:t xml:space="preserve">Declarations</w:t>
       </w:r>
     </w:p>
-    <w:bookmarkStart w:id="175" w:name="Xd182db0490b2de20bd2b4e4cc8698599182035f"/>
+    <w:bookmarkStart w:id="389" w:name="Xd182db0490b2de20bd2b4e4cc8698599182035f"/>
     <w:p>
       <w:pPr>
         <w:pStyle w:val="Heading3"/>
@@ -16768,8 +16768,8 @@
         <w:t xml:space="preserve">Not applicable. This study analysed only publicly available sequencing data.</w:t>
       </w:r>
     </w:p>
-    <w:bookmarkEnd w:id="175"/>
-    <w:bookmarkStart w:id="176" w:name="consent-for-publication"/>
+    <w:bookmarkEnd w:id="389"/>
+    <w:bookmarkStart w:id="390" w:name="consent-for-publication"/>
     <w:p>
       <w:pPr>
         <w:pStyle w:val="Heading3"/>
@@ -16786,8 +16786,8 @@
         <w:t xml:space="preserve">Not applicable.</w:t>
       </w:r>
     </w:p>
-    <w:bookmarkEnd w:id="176"/>
-    <w:bookmarkStart w:id="178" w:name="availability-of-data-and-materials"/>
+    <w:bookmarkEnd w:id="390"/>
+    <w:bookmarkStart w:id="392" w:name="availability-of-data-and-materials"/>
     <w:p>
       <w:pPr>
         <w:pStyle w:val="Heading3"/>
@@ -16806,7 +16806,7 @@
       <w:r>
         <w:t xml:space="preserve"> </w:t>
       </w:r>
-      <w:hyperlink r:id="rId124">
+      <w:hyperlink r:id="rId338">
         <w:r>
           <w:rPr>
             <w:rStyle w:val="Hyperlink"/>
@@ -16826,7 +16826,7 @@
       <w:r>
         <w:t xml:space="preserve"> </w:t>
       </w:r>
-      <w:hyperlink r:id="rId177">
+      <w:hyperlink r:id="rId391">
         <w:r>
           <w:rPr>
             <w:rStyle w:val="Hyperlink"/>
@@ -16973,7 +16973,7 @@
         <w:t xml:space="preserve"> </w:t>
       </w:r>
       <w:r>
-        <w:t xml:space="preserve">Count-level factorial inputs, aggregate tables, simulator and Figure 9 code are</w:t>
+        <w:t xml:space="preserve">Count-level factorial inputs, aggregate tables, simulator and Figure 5 code are</w:t>
       </w:r>
       <w:r>
         <w:t xml:space="preserve"> </w:t>
@@ -17022,8 +17022,8 @@
         <w:t xml:space="preserve">study), PRJNA974210 (rotating biological contactor metagenome).</w:t>
       </w:r>
     </w:p>
-    <w:bookmarkEnd w:id="178"/>
-    <w:bookmarkStart w:id="179" w:name="competing-interests"/>
+    <w:bookmarkEnd w:id="392"/>
+    <w:bookmarkStart w:id="393" w:name="competing-interests"/>
     <w:p>
       <w:pPr>
         <w:pStyle w:val="Heading3"/>
@@ -17040,8 +17040,8 @@
         <w:t xml:space="preserve">The authors declare that they have no competing interests.</w:t>
       </w:r>
     </w:p>
-    <w:bookmarkEnd w:id="179"/>
-    <w:bookmarkStart w:id="180" w:name="funding"/>
+    <w:bookmarkEnd w:id="393"/>
+    <w:bookmarkStart w:id="394" w:name="funding"/>
     <w:p>
       <w:pPr>
         <w:pStyle w:val="Heading3"/>
@@ -17058,8 +17058,8 @@
         <w:t xml:space="preserve">[To be completed before submission.]</w:t>
       </w:r>
     </w:p>
-    <w:bookmarkEnd w:id="180"/>
-    <w:bookmarkStart w:id="181" w:name="authors-contributions"/>
+    <w:bookmarkEnd w:id="394"/>
+    <w:bookmarkStart w:id="395" w:name="authors-contributions"/>
     <w:p>
       <w:pPr>
         <w:pStyle w:val="Heading3"/>
@@ -17076,8 +17076,8 @@
         <w:t xml:space="preserve">[To be completed before submission using CRediT taxonomy and the final author initials.]</w:t>
       </w:r>
     </w:p>
-    <w:bookmarkEnd w:id="181"/>
-    <w:bookmarkStart w:id="182" w:name="acknowledgements"/>
+    <w:bookmarkEnd w:id="395"/>
+    <w:bookmarkStart w:id="396" w:name="acknowledgements"/>
     <w:p>
       <w:pPr>
         <w:pStyle w:val="Heading3"/>
@@ -17094,8 +17094,8 @@
         <w:t xml:space="preserve">[To be completed before submission or state “Not applicable.”]</w:t>
       </w:r>
     </w:p>
-    <w:bookmarkEnd w:id="182"/>
-    <w:bookmarkStart w:id="183" w:name="authors-information"/>
+    <w:bookmarkEnd w:id="396"/>
+    <w:bookmarkStart w:id="397" w:name="authors-information"/>
     <w:p>
       <w:pPr>
         <w:pStyle w:val="Heading3"/>
@@ -17112,9 +17112,9 @@
         <w:t xml:space="preserve">Not applicable.</w:t>
       </w:r>
     </w:p>
-    <w:bookmarkEnd w:id="183"/>
-    <w:bookmarkEnd w:id="184"/>
-    <w:bookmarkStart w:id="193" w:name="references"/>
+    <w:bookmarkEnd w:id="397"/>
+    <w:bookmarkEnd w:id="398"/>
+    <w:bookmarkStart w:id="407" w:name="references"/>
     <w:p>
       <w:pPr>
         <w:pStyle w:val="Heading2"/>
@@ -17147,7 +17147,7 @@
       <w:r>
         <w:t xml:space="preserve">. 2015;349(6252):1101–1106. doi:</w:t>
       </w:r>
-      <w:hyperlink r:id="rId185">
+      <w:hyperlink r:id="rId399">
         <w:r>
           <w:rPr>
             <w:rStyle w:val="Hyperlink"/>
@@ -17180,7 +17180,7 @@
       <w:r>
         <w:t xml:space="preserve">. 2016;34(12):1256–1263. doi:</w:t>
       </w:r>
-      <w:hyperlink r:id="rId186">
+      <w:hyperlink r:id="rId400">
         <w:r>
           <w:rPr>
             <w:rStyle w:val="Hyperlink"/>
@@ -17213,7 +17213,7 @@
       <w:r>
         <w:t xml:space="preserve">. 2022;32(3):558–568. doi:</w:t>
       </w:r>
-      <w:hyperlink r:id="rId187">
+      <w:hyperlink r:id="rId401">
         <w:r>
           <w:rPr>
             <w:rStyle w:val="Hyperlink"/>
@@ -17246,7 +17246,7 @@
       <w:r>
         <w:t xml:space="preserve">. 2026;14(1):128. doi:</w:t>
       </w:r>
-      <w:hyperlink r:id="rId188">
+      <w:hyperlink r:id="rId402">
         <w:r>
           <w:rPr>
             <w:rStyle w:val="Hyperlink"/>
@@ -17279,7 +17279,7 @@
       <w:r>
         <w:t xml:space="preserve">. 2012;9(8):808–810. doi:</w:t>
       </w:r>
-      <w:hyperlink r:id="rId189">
+      <w:hyperlink r:id="rId403">
         <w:r>
           <w:rPr>
             <w:rStyle w:val="Hyperlink"/>
@@ -17312,7 +17312,7 @@
       <w:r>
         <w:t xml:space="preserve">. 2020;15(4):e0219882. doi:</w:t>
       </w:r>
-      <w:hyperlink r:id="rId190">
+      <w:hyperlink r:id="rId404">
         <w:r>
           <w:rPr>
             <w:rStyle w:val="Hyperlink"/>
@@ -17345,7 +17345,7 @@
       <w:r>
         <w:t xml:space="preserve">. 2022;23:36. doi:</w:t>
       </w:r>
-      <w:hyperlink r:id="rId191">
+      <w:hyperlink r:id="rId405">
         <w:r>
           <w:rPr>
             <w:rStyle w:val="Hyperlink"/>
@@ -17378,7 +17378,7 @@
       <w:r>
         <w:t xml:space="preserve">. 2022. doi:</w:t>
       </w:r>
-      <w:hyperlink r:id="rId192">
+      <w:hyperlink r:id="rId406">
         <w:r>
           <w:rPr>
             <w:rStyle w:val="Hyperlink"/>
@@ -17387,8 +17387,8 @@
         </w:r>
       </w:hyperlink>
     </w:p>
-    <w:bookmarkEnd w:id="193"/>
-    <w:bookmarkStart w:id="221" w:name="figures"/>
+    <w:bookmarkEnd w:id="407"/>
+    <w:bookmarkStart w:id="435" w:name="figures"/>
     <w:p>
       <w:pPr>
         <w:pStyle w:val="Heading2"/>
@@ -17406,18 +17406,18 @@
           <wp:inline>
             <wp:extent cx="5943600" cy="4067536"/>
             <wp:effectExtent b="0" l="0" r="0" t="0"/>
-            <wp:docPr descr="Fig. 1. Overview and worked example" title="" id="195" name="Picture"/>
+            <wp:docPr descr="Fig. 1. Overview and worked example" title="" id="409" name="Picture"/>
             <a:graphic>
               <a:graphicData uri="http://schemas.openxmlformats.org/drawingml/2006/picture">
                 <pic:pic>
                   <pic:nvPicPr>
-                    <pic:cNvPr descr="../figures/out/fig1_overview.png" id="196" name="Picture"/>
+                    <pic:cNvPr descr="../figures/out/fig1_overview.png" id="410" name="Picture"/>
                     <pic:cNvPicPr>
                       <a:picLocks noChangeArrowheads="1" noChangeAspect="1"/>
                     </pic:cNvPicPr>
                   </pic:nvPicPr>
                   <pic:blipFill>
-                    <a:blip r:embed="rId194"/>
+                    <a:blip r:embed="rId408"/>
                     <a:stretch>
                       <a:fillRect/>
                     </a:stretch>
@@ -17471,18 +17471,18 @@
           <wp:inline>
             <wp:extent cx="5943600" cy="2123380"/>
             <wp:effectExtent b="0" l="0" r="0" t="0"/>
-            <wp:docPr descr="Fig. 2. Zheng isolate benchmark, accuracy versus coverage, and run-out control" title="" id="198" name="Picture"/>
+            <wp:docPr descr="Fig. 2. Zheng isolate benchmark, accuracy versus coverage, and run-out control" title="" id="412" name="Picture"/>
             <a:graphic>
               <a:graphicData uri="http://schemas.openxmlformats.org/drawingml/2006/picture">
                 <pic:pic>
                   <pic:nvPicPr>
-                    <pic:cNvPr descr="../figures/out/fig2_zheng_benchmark.png" id="199" name="Picture"/>
+                    <pic:cNvPr descr="../figures/out/fig2_zheng_benchmark.png" id="413" name="Picture"/>
                     <pic:cNvPicPr>
                       <a:picLocks noChangeArrowheads="1" noChangeAspect="1"/>
                     </pic:cNvPicPr>
                   </pic:nvPicPr>
                   <pic:blipFill>
-                    <a:blip r:embed="rId197"/>
+                    <a:blip r:embed="rId411"/>
                     <a:stretch>
                       <a:fillRect/>
                     </a:stretch>
@@ -17536,18 +17536,18 @@
           <wp:inline>
             <wp:extent cx="5943600" cy="2397967"/>
             <wp:effectExtent b="0" l="0" r="0" t="0"/>
-            <wp:docPr descr="Fig. 3. Multi-strain simulation" title="" id="201" name="Picture"/>
+            <wp:docPr descr="Fig. 3. Multi-strain simulation" title="" id="415" name="Picture"/>
             <a:graphic>
               <a:graphicData uri="http://schemas.openxmlformats.org/drawingml/2006/picture">
                 <pic:pic>
                   <pic:nvPicPr>
-                    <pic:cNvPr descr="../figures/out/fig3_simulation.png" id="202" name="Picture"/>
+                    <pic:cNvPr descr="../figures/out/fig3_simulation.png" id="416" name="Picture"/>
                     <pic:cNvPicPr>
                       <a:picLocks noChangeArrowheads="1" noChangeAspect="1"/>
                     </pic:cNvPicPr>
                   </pic:nvPicPr>
                   <pic:blipFill>
-                    <a:blip r:embed="rId200"/>
+                    <a:blip r:embed="rId414"/>
                     <a:stretch>
                       <a:fillRect/>
                     </a:stretch>
@@ -17601,18 +17601,18 @@
           <wp:inline>
             <wp:extent cx="5943600" cy="2011791"/>
             <wp:effectExtent b="0" l="0" r="0" t="0"/>
-            <wp:docPr descr="Fig. 4. Landmark-source attribution" title="" id="204" name="Picture"/>
+            <wp:docPr descr="Fig. 4. Landmark-source attribution" title="" id="418" name="Picture"/>
             <a:graphic>
               <a:graphicData uri="http://schemas.openxmlformats.org/drawingml/2006/picture">
                 <pic:pic>
                   <pic:nvPicPr>
-                    <pic:cNvPr descr="../figures/out/fig4_attribution.png" id="205" name="Picture"/>
+                    <pic:cNvPr descr="../figures/out/fig4_attribution.png" id="419" name="Picture"/>
                     <pic:cNvPicPr>
                       <a:picLocks noChangeArrowheads="1" noChangeAspect="1"/>
                     </pic:cNvPicPr>
                   </pic:nvPicPr>
                   <pic:blipFill>
-                    <a:blip r:embed="rId203"/>
+                    <a:blip r:embed="rId417"/>
                     <a:stretch>
                       <a:fillRect/>
                     </a:stretch>
@@ -17664,20 +17664,85 @@
       <w:r>
         <w:drawing>
           <wp:inline>
-            <wp:extent cx="5943600" cy="4181188"/>
+            <wp:extent cx="5943600" cy="1907620"/>
             <wp:effectExtent b="0" l="0" r="0" t="0"/>
-            <wp:docPr descr="Fig. 5. Panel-size sweep and GC range" title="" id="207" name="Picture"/>
+            <wp:docPr descr="Fig. 5. Count-level factorial decomposition of estimator, depth and shared-anchor ambiguity" title="" id="421" name="Picture"/>
             <a:graphic>
               <a:graphicData uri="http://schemas.openxmlformats.org/drawingml/2006/picture">
                 <pic:pic>
                   <pic:nvPicPr>
-                    <pic:cNvPr descr="../figures/out/fig5_panel_design.png" id="208" name="Picture"/>
+                    <pic:cNvPr descr="../figures/out/fig5_factorial_mechanism.png" id="422" name="Picture"/>
                     <pic:cNvPicPr>
                       <a:picLocks noChangeArrowheads="1" noChangeAspect="1"/>
                     </pic:cNvPicPr>
                   </pic:nvPicPr>
                   <pic:blipFill>
-                    <a:blip r:embed="rId206"/>
+                    <a:blip r:embed="rId420"/>
+                    <a:stretch>
+                      <a:fillRect/>
+                    </a:stretch>
+                  </pic:blipFill>
+                  <pic:spPr bwMode="auto">
+                    <a:xfrm>
+                      <a:off x="0" y="0"/>
+                      <a:ext cx="5943600" cy="1907620"/>
+                    </a:xfrm>
+                    <a:prstGeom prst="rect">
+                      <a:avLst/>
+                    </a:prstGeom>
+                    <a:noFill/>
+                    <a:ln w="9525">
+                      <a:noFill/>
+                      <a:headEnd/>
+                      <a:tailEnd/>
+                    </a:ln>
+                  </pic:spPr>
+                </pic:pic>
+              </a:graphicData>
+            </a:graphic>
+          </wp:inline>
+        </w:drawing>
+      </w:r>
+    </w:p>
+    <w:p>
+      <w:pPr>
+        <w:pStyle w:val="ImageCaption"/>
+      </w:pPr>
+      <w:r>
+        <w:rPr>
+          <w:b/>
+          <w:bCs/>
+        </w:rPr>
+        <w:t xml:space="preserve">Fig. 5.</w:t>
+      </w:r>
+      <w:r>
+        <w:t xml:space="preserve"> </w:t>
+      </w:r>
+      <w:r>
+        <w:t xml:space="preserve">Count-level factorial decomposition of estimator, depth and shared-anchor ambiguity</w:t>
+      </w:r>
+    </w:p>
+    <w:p>
+      <w:pPr>
+        <w:pStyle w:val="CaptionedFigure"/>
+      </w:pPr>
+      <w:r>
+        <w:drawing>
+          <wp:inline>
+            <wp:extent cx="5943600" cy="4181188"/>
+            <wp:effectExtent b="0" l="0" r="0" t="0"/>
+            <wp:docPr descr="Fig. 6. Panel-size sweep and GC range" title="" id="424" name="Picture"/>
+            <a:graphic>
+              <a:graphicData uri="http://schemas.openxmlformats.org/drawingml/2006/picture">
+                <pic:pic>
+                  <pic:nvPicPr>
+                    <pic:cNvPr descr="../figures/out/fig6_panel_design.png" id="425" name="Picture"/>
+                    <pic:cNvPicPr>
+                      <a:picLocks noChangeArrowheads="1" noChangeAspect="1"/>
+                    </pic:cNvPicPr>
+                  </pic:nvPicPr>
+                  <pic:blipFill>
+                    <a:blip r:embed="rId423"/>
                     <a:stretch>
                       <a:fillRect/>
                     </a:stretch>
@@ -17713,7 +17778,7 @@
           <w:b/>
           <w:bCs/>
         </w:rPr>
-        <w:t xml:space="preserve">Fig. 5.</w:t>
+        <w:t xml:space="preserve">Fig. 6.</w:t>
       </w:r>
       <w:r>
         <w:t xml:space="preserve"> </w:t>
@@ -17731,18 +17796,18 @@
           <wp:inline>
             <wp:extent cx="5943600" cy="4873369"/>
             <wp:effectExtent b="0" l="0" r="0" t="0"/>
-            <wp:docPr descr="Fig. 6. Fragmentation and scaffolding" title="" id="210" name="Picture"/>
+            <wp:docPr descr="Fig. 7. Fragmentation and scaffolding" title="" id="427" name="Picture"/>
             <a:graphic>
               <a:graphicData uri="http://schemas.openxmlformats.org/drawingml/2006/picture">
                 <pic:pic>
                   <pic:nvPicPr>
-                    <pic:cNvPr descr="../figures/out/fig6_fragmentation.png" id="211" name="Picture"/>
+                    <pic:cNvPr descr="../figures/out/fig7_fragmentation.png" id="428" name="Picture"/>
                     <pic:cNvPicPr>
                       <a:picLocks noChangeArrowheads="1" noChangeAspect="1"/>
                     </pic:cNvPicPr>
                   </pic:nvPicPr>
                   <pic:blipFill>
-                    <a:blip r:embed="rId209"/>
+                    <a:blip r:embed="rId426"/>
                     <a:stretch>
                       <a:fillRect/>
                     </a:stretch>
@@ -17778,7 +17843,7 @@
           <w:b/>
           <w:bCs/>
         </w:rPr>
-        <w:t xml:space="preserve">Fig. 6.</w:t>
+        <w:t xml:space="preserve">Fig. 7.</w:t>
       </w:r>
       <w:r>
         <w:t xml:space="preserve"> </w:t>
@@ -17796,18 +17861,18 @@
           <wp:inline>
             <wp:extent cx="5943600" cy="2396004"/>
             <wp:effectExtent b="0" l="0" r="0" t="0"/>
-            <wp:docPr descr="Fig. 7. Fecal-cohort concordance" title="" id="213" name="Picture"/>
+            <wp:docPr descr="Fig. 8. Fecal-cohort concordance" title="" id="430" name="Picture"/>
             <a:graphic>
               <a:graphicData uri="http://schemas.openxmlformats.org/drawingml/2006/picture">
                 <pic:pic>
                   <pic:nvPicPr>
-                    <pic:cNvPr descr="../figures/out/fig7_metagenome.png" id="214" name="Picture"/>
+                    <pic:cNvPr descr="../figures/out/fig8_metagenome.png" id="431" name="Picture"/>
                     <pic:cNvPicPr>
                       <a:picLocks noChangeArrowheads="1" noChangeAspect="1"/>
                     </pic:cNvPicPr>
                   </pic:nvPicPr>
                   <pic:blipFill>
-                    <a:blip r:embed="rId212"/>
+                    <a:blip r:embed="rId429"/>
                     <a:stretch>
                       <a:fillRect/>
                     </a:stretch>
@@ -17843,7 +17908,7 @@
           <w:b/>
           <w:bCs/>
         </w:rPr>
-        <w:t xml:space="preserve">Fig. 7.</w:t>
+        <w:t xml:space="preserve">Fig. 8.</w:t>
       </w:r>
       <w:r>
         <w:t xml:space="preserve"> </w:t>
@@ -17861,18 +17926,18 @@
           <wp:inline>
             <wp:extent cx="5943600" cy="2642374"/>
             <wp:effectExtent b="0" l="0" r="0" t="0"/>
-            <wp:docPr descr="Fig. 8. MAG-scale QC and cost" title="" id="216" name="Picture"/>
+            <wp:docPr descr="Fig. 9. MAG-scale QC and cost" title="" id="433" name="Picture"/>
             <a:graphic>
               <a:graphicData uri="http://schemas.openxmlformats.org/drawingml/2006/picture">
                 <pic:pic>
                   <pic:nvPicPr>
-                    <pic:cNvPr descr="../figures/out/fig8_mag_qc_cost.png" id="217" name="Picture"/>
+                    <pic:cNvPr descr="../figures/out/fig9_mag_qc_cost.png" id="434" name="Picture"/>
                     <pic:cNvPicPr>
                       <a:picLocks noChangeArrowheads="1" noChangeAspect="1"/>
                     </pic:cNvPicPr>
                   </pic:nvPicPr>
                   <pic:blipFill>
-                    <a:blip r:embed="rId215"/>
+                    <a:blip r:embed="rId432"/>
                     <a:stretch>
                       <a:fillRect/>
                     </a:stretch>
@@ -17908,7 +17973,7 @@
           <w:b/>
           <w:bCs/>
         </w:rPr>
-        <w:t xml:space="preserve">Fig. 8.</w:t>
+        <w:t xml:space="preserve">Fig. 9.</w:t>
       </w:r>
       <w:r>
         <w:t xml:space="preserve"> </w:t>
@@ -17917,93 +17982,8 @@
         <w:t xml:space="preserve">MAG-scale QC and cost</w:t>
       </w:r>
     </w:p>
-    <w:p>
-      <w:pPr>
-        <w:pStyle w:val="CaptionedFigure"/>
-      </w:pPr>
-      <w:r>
-        <w:drawing>
-          <wp:inline>
-            <wp:extent cx="5943600" cy="1907620"/>
-            <wp:effectExtent b="0" l="0" r="0" t="0"/>
-            <wp:docPr descr="Fig. 9. Count-level factorial decomposition of estimator, depth and shared-anchor ambiguity" title="" id="219" name="Picture"/>
-            <a:graphic>
-              <a:graphicData uri="http://schemas.openxmlformats.org/drawingml/2006/picture">
-                <pic:pic>
-                  <pic:nvPicPr>
-                    <pic:cNvPr descr="../figures/out/fig9_factorial_mechanism.png" id="220" name="Picture"/>
-                    <pic:cNvPicPr>
-                      <a:picLocks noChangeArrowheads="1" noChangeAspect="1"/>
-                    </pic:cNvPicPr>
-                  </pic:nvPicPr>
-                  <pic:blipFill>
-                    <a:blip r:embed="rId218"/>
-                    <a:stretch>
-                      <a:fillRect/>
-                    </a:stretch>
-                  </pic:blipFill>
-                  <pic:spPr bwMode="auto">
-                    <a:xfrm>
-                      <a:off x="0" y="0"/>
-                      <a:ext cx="5943600" cy="1907620"/>
-                    </a:xfrm>
-                    <a:prstGeom prst="rect">
-                      <a:avLst/>
-                    </a:prstGeom>
-                    <a:noFill/>
-                    <a:ln w="9525">
-                      <a:noFill/>
-                      <a:headEnd/>
-                      <a:tailEnd/>
-                    </a:ln>
-                  </pic:spPr>
-                </pic:pic>
-              </a:graphicData>
-            </a:graphic>
-          </wp:inline>
-        </w:drawing>
-      </w:r>
-    </w:p>
-    <w:p>
-      <w:pPr>
-        <w:pStyle w:val="ImageCaption"/>
-      </w:pPr>
-      <w:r>
-        <w:rPr>
-          <w:b/>
-          <w:bCs/>
-        </w:rPr>
-        <w:t xml:space="preserve">Fig. 9.</w:t>
-      </w:r>
-      <w:r>
-        <w:t xml:space="preserve"> </w:t>
-      </w:r>
-      <w:r>
-        <w:t xml:space="preserve">Count-level factorial decomposition of estimator, depth and shared-anchor ambiguity</w:t>
-      </w:r>
-    </w:p>
-    <w:p>
-      <w:pPr>
-        <w:pStyle w:val="BodyText"/>
-      </w:pPr>
-      <w:r>
-        <w:t xml:space="preserve">Source PDFs and reproducible figure code are in</w:t>
-      </w:r>
-      <w:r>
-        <w:t xml:space="preserve"> </w:t>
-      </w:r>
-      <w:r>
-        <w:rPr>
-          <w:rStyle w:val="VerbatimChar"/>
-        </w:rPr>
-        <w:t xml:space="preserve">figures/</w:t>
-      </w:r>
-      <w:r>
-        <w:t xml:space="preserve">.</w:t>
-      </w:r>
-    </w:p>
-    <w:bookmarkEnd w:id="221"/>
-    <w:bookmarkStart w:id="222" w:name="tables"/>
+    <w:bookmarkEnd w:id="435"/>
+    <w:bookmarkStart w:id="436" w:name="tables"/>
     <w:p>
       <w:pPr>
         <w:pStyle w:val="Heading2"/>
@@ -37748,7 +37728,7 @@
               <w:jc w:val="left"/>
             </w:pPr>
             <w:r>
-              <w:t xml:space="preserve">Fig 6; F4: collapse identical across landmark types (slope 0.26-0.38, RMSE x40, winner’s-curse residue)</w:t>
+              <w:t xml:space="preserve">Fig 7; F4: collapse identical across landmark types (slope 0.26-0.38, RMSE x40, winner’s-curse residue)</w:t>
             </w:r>
           </w:p>
         </w:tc>
@@ -42092,8 +42072,8 @@
         </w:tc>
       </w:tr>
     </w:tbl>
-    <w:bookmarkEnd w:id="222"/>
-    <w:bookmarkEnd w:id="223"/>
+    <w:bookmarkEnd w:id="436"/>
+    <w:bookmarkEnd w:id="437"/>
     <w:sectPr>
       <w:footerReference r:id="rId9" w:type="default"/>
       <w:footnotePr>

</xml_diff>

<commit_message>
Refresh manuscript with latest factorial analysis
</commit_message>
<xml_diff>
--- a/manuscript/submission/sk2bGrow_Microbiome_submission_draft.docx
+++ b/manuscript/submission/sk2bGrow_Microbiome_submission_draft.docx
@@ -2,7 +2,7 @@
 <file path=word/document.xml><?xml version="1.0" encoding="utf-8"?>
 <w:document xmlns:w="http://schemas.openxmlformats.org/wordprocessingml/2006/main" xmlns:m="http://schemas.openxmlformats.org/officeDocument/2006/math" xmlns:r="http://schemas.openxmlformats.org/officeDocument/2006/relationships" xmlns:o="urn:schemas-microsoft-com:office:office" xmlns:v="urn:schemas-microsoft-com:vml" xmlns:w10="urn:schemas-microsoft-com:office:word" xmlns:a="http://schemas.openxmlformats.org/drawingml/2006/main" xmlns:pic="http://schemas.openxmlformats.org/drawingml/2006/picture" xmlns:wp="http://schemas.openxmlformats.org/drawingml/2006/wordprocessingDrawing">
   <w:body>
-    <w:bookmarkStart w:id="437" w:name="X35a67ffd771dc0eee37406016d31234a1046d16"/>
+    <w:bookmarkStart w:id="544" w:name="X35a67ffd771dc0eee37406016d31234a1046d16"/>
     <w:p>
       <w:pPr>
         <w:pStyle w:val="Heading1"/>
@@ -11,7 +11,7 @@
         <w:t xml:space="preserve">Coordinate-aware V-fitting enables shallow-depth PTR estimation from 2bRAD anchor panels</w:t>
       </w:r>
     </w:p>
-    <w:bookmarkStart w:id="334" w:name="title-page"/>
+    <w:bookmarkStart w:id="441" w:name="title-page"/>
     <w:p>
       <w:pPr>
         <w:pStyle w:val="Heading2"/>
@@ -132,8 +132,8 @@
         <w:t xml:space="preserve">Review revision 2026-09-18. The primary Zheng grid uses signed fixed-origin fitting and single-pass GC correction; residual two-pass GC correction is diagnostic only.</w:t>
       </w:r>
     </w:p>
-    <w:bookmarkEnd w:id="334"/>
-    <w:bookmarkStart w:id="335" w:name="abstract"/>
+    <w:bookmarkEnd w:id="441"/>
+    <w:bookmarkStart w:id="442" w:name="abstract"/>
     <w:p>
       <w:pPr>
         <w:pStyle w:val="Heading2"/>
@@ -163,11 +163,11 @@
         <w:t xml:space="preserve"> </w:t>
       </w:r>
       <w:r>
-        <w:t xml:space="preserve">growth-rate panel, sk2bGrow returned usable PTR estimates at 1–2× sequencing depth, where Pilea’s shipped defaults return nothing, with r = 0.92 at 1× and 0.96 at 2× against measured growth rates (n = 16). The accuracy comes from the coordinate-aware estimator, not the landmark source — at matched density, the two landmark sources were not significantly different in the paired bootstrap at any depth — while the multi-enzyme panel contributes what a hash sketch cannot: a wet-lab-realizable landmark set and consistency strata whose heterogeneous biases exposed our own counting defect. The estimates are not unbiased — the fitted slope compresses the dynamic range at low coverage, and the mechanism is unresolved. On three fecal metagenomes, sk2bGrow and Pilea agreed (bias +0.22–+0.25 log2; n = 58–78 species×sample pairs per sample). As a process-level finding, exact deduplication of 2bRAD libraries before counting destroys the PTR signal — a PCR copy-number artefact we localize per anchor. sk2bGrow is 89.5–240.8× slower than Pilea at MAG-panel scale; mismatch-1 counting narrows the gap to roughly one order of magnitude (measured end-to-end on all nine samples: 20.5–38.8× faster counting than the mismatch-2 baseline, no genome lost), and a containment pre-screen — measured to clear the absent-reference false-positive floor, and required at database scale where an unrestricted index would emit estimates for absent references — completes the fix.</w:t>
+        <w:t xml:space="preserve">growth-rate panel, sk2bGrow returned usable PTR estimates at 1–2× sequencing depth, where Pilea’s shipped defaults return nothing, with r = 0.92 at 1× and 0.96 at 2× against measured growth rates (n = 16). The accuracy comes from the coordinate-aware estimator, not the landmark source — at matched density, the two landmark sources were not significantly different in the paired bootstrap at any depth — while the multi-enzyme panel contributes what a hash sketch cannot: a wet-lab-realizable landmark set and consistency strata whose heterogeneous biases exposed our own counting defect. A post-hoc count-level factorial further separates shallow-depth extraction from multi-reference assignment: coordinate fitting was accurate for private anchors, whereas shared-anchor ambiguity introduced a depth-amplified negative bias. The estimates are not unbiased — the fitted slope compresses the dynamic range at low coverage, and the compression mechanism remains unresolved. On three fecal metagenomes, sk2bGrow and Pilea agreed (bias +0.22–+0.25 log2; n = 58–78 species×sample pairs per sample). As a process-level finding, exact deduplication of 2bRAD libraries before counting destroys the PTR signal — a PCR copy-number artefact we localize per anchor. sk2bGrow is 89.5–240.8× slower than Pilea at MAG-panel scale; mismatch-1 counting narrows the gap to roughly one order of magnitude (measured end-to-end on all nine samples: 20.5–38.8× faster counting than the mismatch-2 baseline, no genome lost), and a containment pre-screen — measured to clear the absent-reference false-positive floor, and required at database scale where an unrestricted index would emit estimates for absent references — completes the fix.</w:t>
       </w:r>
     </w:p>
-    <w:bookmarkEnd w:id="335"/>
-    <w:bookmarkStart w:id="336" w:name="keywords"/>
+    <w:bookmarkEnd w:id="442"/>
+    <w:bookmarkStart w:id="443" w:name="keywords"/>
     <w:p>
       <w:pPr>
         <w:pStyle w:val="Heading2"/>
@@ -184,8 +184,8 @@
         <w:t xml:space="preserve">peak-to-trough ratio; microbial growth dynamics; 2bRAD; FracMinHash; metagenomics; shallow sequencing</w:t>
       </w:r>
     </w:p>
-    <w:bookmarkEnd w:id="336"/>
-    <w:bookmarkStart w:id="337" w:name="background"/>
+    <w:bookmarkEnd w:id="443"/>
+    <w:bookmarkStart w:id="444" w:name="background"/>
     <w:p>
       <w:pPr>
         <w:pStyle w:val="Heading2"/>
@@ -308,8 +308,8 @@
         <w:t xml:space="preserve">In short, this paper contributes (i) usable PTR estimates at 1–2× sequencing depth, with the low-coverage bias stated rather than hidden; (ii) a controlled 2 × 2 attribution localising the gain in the coordinate-aware estimator rather than in which landmarks are counted — the two landmark sources showed no significant paired-bootstrap difference once density was matched; and (iii) real-metagenome concordance with the incumbent and process-level findings — a deduplication recommendation and a per-anchor capture-efficiency measurement — that others can cite.</w:t>
       </w:r>
     </w:p>
-    <w:bookmarkEnd w:id="337"/>
-    <w:bookmarkStart w:id="366" w:name="methods"/>
+    <w:bookmarkEnd w:id="444"/>
+    <w:bookmarkStart w:id="473" w:name="methods"/>
     <w:p>
       <w:pPr>
         <w:pStyle w:val="Heading2"/>
@@ -334,7 +334,7 @@
       <w:r>
         <w:t xml:space="preserve"> </w:t>
       </w:r>
-      <w:hyperlink r:id="rId338">
+      <w:hyperlink r:id="rId445">
         <w:r>
           <w:rPr>
             <w:rStyle w:val="Hyperlink"/>
@@ -380,7 +380,7 @@
         </w:pict>
       </w:r>
     </w:p>
-    <w:bookmarkStart w:id="346" w:name="the-sk2bgrow-algorithm"/>
+    <w:bookmarkStart w:id="453" w:name="the-sk2bgrow-algorithm"/>
     <w:p>
       <w:pPr>
         <w:pStyle w:val="Heading3"/>
@@ -570,7 +570,7 @@
         <w:t xml:space="preserve">) has six stages.</w:t>
       </w:r>
     </w:p>
-    <w:bookmarkStart w:id="339" w:name="Xd9b3ed4dd252045d3e48557196049c0e39886bf"/>
+    <w:bookmarkStart w:id="446" w:name="Xd9b3ed4dd252045d3e48557196049c0e39886bf"/>
     <w:p>
       <w:pPr>
         <w:pStyle w:val="Heading4"/>
@@ -959,8 +959,8 @@
         <w:t xml:space="preserve">.</w:t>
       </w:r>
     </w:p>
-    <w:bookmarkEnd w:id="339"/>
-    <w:bookmarkStart w:id="340" w:name="read-counting-and-anchor-attribution"/>
+    <w:bookmarkEnd w:id="446"/>
+    <w:bookmarkStart w:id="447" w:name="read-counting-and-anchor-attribution"/>
     <w:p>
       <w:pPr>
         <w:pStyle w:val="Heading4"/>
@@ -1351,8 +1351,8 @@
         <w:t xml:space="preserve">iterations.</w:t>
       </w:r>
     </w:p>
-    <w:bookmarkEnd w:id="340"/>
-    <w:bookmarkStart w:id="341" w:name="windows-and-window-rates"/>
+    <w:bookmarkEnd w:id="447"/>
+    <w:bookmarkStart w:id="448" w:name="windows-and-window-rates"/>
     <w:p>
       <w:pPr>
         <w:pStyle w:val="Heading4"/>
@@ -1654,8 +1654,8 @@
         <w:t xml:space="preserve">~12 spurious log-likelihood units and BIC selects NB everywhere.</w:t>
       </w:r>
     </w:p>
-    <w:bookmarkEnd w:id="341"/>
-    <w:bookmarkStart w:id="342" w:name="gc-bias-correction"/>
+    <w:bookmarkEnd w:id="448"/>
+    <w:bookmarkStart w:id="449" w:name="gc-bias-correction"/>
     <w:p>
       <w:pPr>
         <w:pStyle w:val="Heading4"/>
@@ -1894,8 +1894,8 @@
         <w:t xml:space="preserve">).</w:t>
       </w:r>
     </w:p>
-    <w:bookmarkEnd w:id="342"/>
-    <w:bookmarkStart w:id="343" w:name="origin-placement-and-v-shape-fitting"/>
+    <w:bookmarkEnd w:id="449"/>
+    <w:bookmarkStart w:id="450" w:name="origin-placement-and-v-shape-fitting"/>
     <w:p>
       <w:pPr>
         <w:pStyle w:val="Heading4"/>
@@ -2465,8 +2465,8 @@
         <w:t xml:space="preserve">).</w:t>
       </w:r>
     </w:p>
-    <w:bookmarkEnd w:id="343"/>
-    <w:bookmarkStart w:id="344" w:name="cross-enzyme-fusion-and-quality-control"/>
+    <w:bookmarkEnd w:id="450"/>
+    <w:bookmarkStart w:id="451" w:name="cross-enzyme-fusion-and-quality-control"/>
     <w:p>
       <w:pPr>
         <w:pStyle w:val="Heading4"/>
@@ -2999,8 +2999,8 @@
         <w:t xml:space="preserve">rejection rate — the dependency is reported, not corrected (Discussion).</w:t>
       </w:r>
     </w:p>
-    <w:bookmarkEnd w:id="344"/>
-    <w:bookmarkStart w:id="345" w:name="implementation"/>
+    <w:bookmarkEnd w:id="451"/>
+    <w:bookmarkStart w:id="452" w:name="implementation"/>
     <w:p>
       <w:pPr>
         <w:pStyle w:val="Heading4"/>
@@ -3042,9 +3042,9 @@
         </w:pict>
       </w:r>
     </w:p>
-    <w:bookmarkEnd w:id="345"/>
-    <w:bookmarkEnd w:id="346"/>
-    <w:bookmarkStart w:id="347" w:name="enzyme-panel"/>
+    <w:bookmarkEnd w:id="452"/>
+    <w:bookmarkEnd w:id="453"/>
+    <w:bookmarkStart w:id="454" w:name="enzyme-panel"/>
     <w:p>
       <w:pPr>
         <w:pStyle w:val="Heading3"/>
@@ -3270,8 +3270,8 @@
         </w:pict>
       </w:r>
     </w:p>
-    <w:bookmarkEnd w:id="347"/>
-    <w:bookmarkStart w:id="355" w:name="benchmark-datasets"/>
+    <w:bookmarkEnd w:id="454"/>
+    <w:bookmarkStart w:id="462" w:name="benchmark-datasets"/>
     <w:p>
       <w:pPr>
         <w:pStyle w:val="Heading3"/>
@@ -3280,7 +3280,7 @@
         <w:t xml:space="preserve">3. Benchmark datasets</w:t>
       </w:r>
     </w:p>
-    <w:bookmarkStart w:id="348" w:name="X8558b042e1c4d57d5e6d341f0cb3e7790b4deb2"/>
+    <w:bookmarkStart w:id="455" w:name="X8558b042e1c4d57d5e6d341f0cb3e7790b4deb2"/>
     <w:p>
       <w:pPr>
         <w:pStyle w:val="Heading4"/>
@@ -3854,8 +3854,8 @@
         <w:t xml:space="preserve">establishes behaviour on a metagenome or a fragmented MAG.</w:t>
       </w:r>
     </w:p>
-    <w:bookmarkEnd w:id="348"/>
-    <w:bookmarkStart w:id="349" w:name="multi-strain-simulation"/>
+    <w:bookmarkEnd w:id="455"/>
+    <w:bookmarkStart w:id="456" w:name="multi-strain-simulation"/>
     <w:p>
       <w:pPr>
         <w:pStyle w:val="Heading4"/>
@@ -4134,8 +4134,8 @@
         <w:t xml:space="preserve">).</w:t>
       </w:r>
     </w:p>
-    <w:bookmarkEnd w:id="349"/>
-    <w:bookmarkStart w:id="350" w:name="reference-fragmentation"/>
+    <w:bookmarkEnd w:id="456"/>
+    <w:bookmarkStart w:id="457" w:name="reference-fragmentation"/>
     <w:p>
       <w:pPr>
         <w:pStyle w:val="Heading4"/>
@@ -4590,8 +4590,8 @@
         <w:t xml:space="preserve">scaffolding delivers.</w:t>
       </w:r>
     </w:p>
-    <w:bookmarkEnd w:id="350"/>
-    <w:bookmarkStart w:id="351" w:name="Xb780f84997d33bf0f401691b1288ff1538bcd72"/>
+    <w:bookmarkEnd w:id="457"/>
+    <w:bookmarkStart w:id="458" w:name="Xb780f84997d33bf0f401691b1288ff1538bcd72"/>
     <w:p>
       <w:pPr>
         <w:pStyle w:val="Heading4"/>
@@ -5049,8 +5049,8 @@
         <w:t xml:space="preserve">invariant to affine transformation.</w:t>
       </w:r>
     </w:p>
-    <w:bookmarkEnd w:id="351"/>
-    <w:bookmarkStart w:id="352" w:name="faecal-microbiome-sun-et-al."/>
+    <w:bookmarkEnd w:id="458"/>
+    <w:bookmarkStart w:id="459" w:name="faecal-microbiome-sun-et-al."/>
     <w:p>
       <w:pPr>
         <w:pStyle w:val="Heading4"/>
@@ -5618,8 +5618,8 @@
         <w:t xml:space="preserve">decomposition are defined in §5.</w:t>
       </w:r>
     </w:p>
-    <w:bookmarkEnd w:id="352"/>
-    <w:bookmarkStart w:id="353" w:name="Xbdb57a27110786c0a1921f07c423d99a2d691e0"/>
+    <w:bookmarkEnd w:id="459"/>
+    <w:bookmarkStart w:id="460" w:name="Xbdb57a27110786c0a1921f07c423d99a2d691e0"/>
     <w:p>
       <w:pPr>
         <w:pStyle w:val="Heading4"/>
@@ -6229,8 +6229,8 @@
         <w:t xml:space="preserve">counts, with per-anchor ratios ≈ 1).</w:t>
       </w:r>
     </w:p>
-    <w:bookmarkEnd w:id="353"/>
-    <w:bookmarkStart w:id="354" w:name="gc-spanning-genome-set"/>
+    <w:bookmarkEnd w:id="460"/>
+    <w:bookmarkStart w:id="461" w:name="gc-spanning-genome-set"/>
     <w:p>
       <w:pPr>
         <w:pStyle w:val="Heading4"/>
@@ -6340,9 +6340,9 @@
         </w:pict>
       </w:r>
     </w:p>
-    <w:bookmarkEnd w:id="354"/>
-    <w:bookmarkEnd w:id="355"/>
-    <w:bookmarkStart w:id="356" w:name="comparison-methods"/>
+    <w:bookmarkEnd w:id="461"/>
+    <w:bookmarkEnd w:id="462"/>
+    <w:bookmarkStart w:id="463" w:name="comparison-methods"/>
     <w:p>
       <w:pPr>
         <w:pStyle w:val="Heading3"/>
@@ -7070,8 +7070,8 @@
         </w:pict>
       </w:r>
     </w:p>
-    <w:bookmarkEnd w:id="356"/>
-    <w:bookmarkStart w:id="357" w:name="evaluation-metrics"/>
+    <w:bookmarkEnd w:id="463"/>
+    <w:bookmarkStart w:id="464" w:name="evaluation-metrics"/>
     <w:p>
       <w:pPr>
         <w:pStyle w:val="Heading3"/>
@@ -8473,8 +8473,8 @@
         </w:pict>
       </w:r>
     </w:p>
-    <w:bookmarkEnd w:id="357"/>
-    <w:bookmarkStart w:id="364" w:name="X85a115a26ce12f930c9dac210e8d891ae5a6b7c"/>
+    <w:bookmarkEnd w:id="464"/>
+    <w:bookmarkStart w:id="471" w:name="X85a115a26ce12f930c9dac210e8d891ae5a6b7c"/>
     <w:p>
       <w:pPr>
         <w:pStyle w:val="Heading3"/>
@@ -8597,7 +8597,7 @@
         <w:t xml:space="preserve">symmetric in effect.</w:t>
       </w:r>
     </w:p>
-    <w:bookmarkStart w:id="358" w:name="density-matching-on-the-zheng-grid-f1"/>
+    <w:bookmarkStart w:id="465" w:name="density-matching-on-the-zheng-grid-f1"/>
     <w:p>
       <w:pPr>
         <w:pStyle w:val="Heading4"/>
@@ -8738,8 +8738,8 @@
         <w:t xml:space="preserve">per-window landmark counts and detection fraction; per-cell failure cause.</w:t>
       </w:r>
     </w:p>
-    <w:bookmarkEnd w:id="358"/>
-    <w:bookmarkStart w:id="359" w:name="gc-sweep-f2"/>
+    <w:bookmarkEnd w:id="465"/>
+    <w:bookmarkStart w:id="466" w:name="gc-sweep-f2"/>
     <w:p>
       <w:pPr>
         <w:pStyle w:val="Heading4"/>
@@ -8967,8 +8967,8 @@
         <w:t xml:space="preserve">(landmarks/Mb).</w:t>
       </w:r>
     </w:p>
-    <w:bookmarkEnd w:id="359"/>
-    <w:bookmarkStart w:id="360" w:name="mismatch-tolerance-and-misassignment-f3"/>
+    <w:bookmarkEnd w:id="466"/>
+    <w:bookmarkStart w:id="467" w:name="mismatch-tolerance-and-misassignment-f3"/>
     <w:p>
       <w:pPr>
         <w:pStyle w:val="Heading4"/>
@@ -9273,8 +9273,8 @@
         <w:t xml:space="preserve">).</w:t>
       </w:r>
     </w:p>
-    <w:bookmarkEnd w:id="360"/>
-    <w:bookmarkStart w:id="361" w:name="fragmentation-sketch-f4"/>
+    <w:bookmarkEnd w:id="467"/>
+    <w:bookmarkStart w:id="468" w:name="fragmentation-sketch-f4"/>
     <w:p>
       <w:pPr>
         <w:pStyle w:val="Heading4"/>
@@ -9666,8 +9666,8 @@
         <w:t xml:space="preserve">rate, orientation accuracy and order Spearman; permutation null distributions.</w:t>
       </w:r>
     </w:p>
-    <w:bookmarkEnd w:id="361"/>
-    <w:bookmarkStart w:id="362" w:name="index-cost-at-gtdb-like-scale-f5"/>
+    <w:bookmarkEnd w:id="468"/>
+    <w:bookmarkStart w:id="469" w:name="index-cost-at-gtdb-like-scale-f5"/>
     <w:p>
       <w:pPr>
         <w:pStyle w:val="Heading4"/>
@@ -9969,8 +9969,8 @@
         <w:t xml:space="preserve">matched density.</w:t>
       </w:r>
     </w:p>
-    <w:bookmarkEnd w:id="362"/>
-    <w:bookmarkStart w:id="363" w:name="X84bfdf958829166d8b906dacf41027ff82eb47c"/>
+    <w:bookmarkEnd w:id="469"/>
+    <w:bookmarkStart w:id="470" w:name="X84bfdf958829166d8b906dacf41027ff82eb47c"/>
     <w:p>
       <w:pPr>
         <w:pStyle w:val="Heading4"/>
@@ -10238,9 +10238,9 @@
         </w:pict>
       </w:r>
     </w:p>
-    <w:bookmarkEnd w:id="363"/>
-    <w:bookmarkEnd w:id="364"/>
-    <w:bookmarkStart w:id="365" w:name="computational-environment"/>
+    <w:bookmarkEnd w:id="470"/>
+    <w:bookmarkEnd w:id="471"/>
+    <w:bookmarkStart w:id="472" w:name="computational-environment"/>
     <w:p>
       <w:pPr>
         <w:pStyle w:val="Heading3"/>
@@ -10316,9 +10316,9 @@
         </w:pict>
       </w:r>
     </w:p>
-    <w:bookmarkEnd w:id="365"/>
-    <w:bookmarkEnd w:id="366"/>
-    <w:bookmarkStart w:id="385" w:name="results"/>
+    <w:bookmarkEnd w:id="472"/>
+    <w:bookmarkEnd w:id="473"/>
+    <w:bookmarkStart w:id="492" w:name="results"/>
     <w:p>
       <w:pPr>
         <w:pStyle w:val="Heading2"/>
@@ -10327,7 +10327,7 @@
         <w:t xml:space="preserve">Results</w:t>
       </w:r>
     </w:p>
-    <w:bookmarkStart w:id="367" w:name="sk2bgrow-overview"/>
+    <w:bookmarkStart w:id="474" w:name="sk2bgrow-overview"/>
     <w:p>
       <w:pPr>
         <w:pStyle w:val="Heading3"/>
@@ -10386,8 +10386,8 @@
         <w:t xml:space="preserve">² for the same sample. Panels b–d are real output from one 2× sample; the figure shows the method working on real data, not a cartoon (Fig. 1).</w:t>
       </w:r>
     </w:p>
-    <w:bookmarkEnd w:id="367"/>
-    <w:bookmarkStart w:id="371" w:name="accuracy-on-bacterial-isolates"/>
+    <w:bookmarkEnd w:id="474"/>
+    <w:bookmarkStart w:id="478" w:name="accuracy-on-bacterial-isolates"/>
     <w:p>
       <w:pPr>
         <w:pStyle w:val="Heading3"/>
@@ -10396,7 +10396,7 @@
         <w:t xml:space="preserve">2. Accuracy on bacterial isolates</w:t>
       </w:r>
     </w:p>
-    <w:bookmarkStart w:id="368" w:name="accuracy-across-the-coverage-titration"/>
+    <w:bookmarkStart w:id="475" w:name="accuracy-across-the-coverage-titration"/>
     <w:p>
       <w:pPr>
         <w:pStyle w:val="Heading4"/>
@@ -10573,8 +10573,8 @@
         <w:t xml:space="preserve">(Methods §1.4).</w:t>
       </w:r>
     </w:p>
-    <w:bookmarkEnd w:id="368"/>
-    <w:bookmarkStart w:id="369" w:name="a-negative-control-that-pilea-excluded"/>
+    <w:bookmarkEnd w:id="475"/>
+    <w:bookmarkStart w:id="476" w:name="a-negative-control-that-pilea-excluded"/>
     <w:p>
       <w:pPr>
         <w:pStyle w:val="Heading4"/>
@@ -10612,8 +10612,8 @@
         <w:t xml:space="preserve">estimate, and in exactly the direction of reading noise as growth (Fig. 2d).</w:t>
       </w:r>
     </w:p>
-    <w:bookmarkEnd w:id="369"/>
-    <w:bookmarkStart w:id="370" w:name="Xce6b542434ed1814004dfb47fad411b14a7baa6"/>
+    <w:bookmarkEnd w:id="476"/>
+    <w:bookmarkStart w:id="477" w:name="Xce6b542434ed1814004dfb47fad411b14a7baa6"/>
     <w:p>
       <w:pPr>
         <w:pStyle w:val="Heading4"/>
@@ -10661,9 +10661,9 @@
         <w:t xml:space="preserve">estimates and 167 of 172 in the multi-strain simulation. Because a 150 bp read yields 120 31-mers, a threshold of 5 on k-mer coverage corresponds to ≈6.25× read coverage (5 × 150/120), so the gate fires at 5× nominal even where the estimator behind it is still informative. At 0.5× the gate is correctly refusing to report: Pilea’s gates-off output there is fully degenerate — measured coverage exactly 1.000 and log₂PTR exactly 0.000 in all 17 samples. Between 1× and 5×, however, the gates-off estimator is informative (r = 0.78, 0.85, 0.99 against λ) and is nevertheless suppressed. The honest claim is therefore not that Pilea is over-conservative, but that its gate is calibrated to the point where the FracMinHash estimator breaks — ≈6.25× read coverage — whereas sk2bGrow’s break point is below 1× (Fig. 2; Table 5).</w:t>
       </w:r>
     </w:p>
-    <w:bookmarkEnd w:id="370"/>
-    <w:bookmarkEnd w:id="371"/>
-    <w:bookmarkStart w:id="372" w:name="multi-strain-communities"/>
+    <w:bookmarkEnd w:id="477"/>
+    <w:bookmarkEnd w:id="478"/>
+    <w:bookmarkStart w:id="479" w:name="multi-strain-communities"/>
     <w:p>
       <w:pPr>
         <w:pStyle w:val="Heading3"/>
@@ -10758,8 +10758,8 @@
         <w:t xml:space="preserve">; Methods §6.3). Recall 1.000 therefore still describes an exact-match-favourable grid, but it is no longer supported only by the estimator’s own generative model.</w:t>
       </w:r>
     </w:p>
-    <w:bookmarkEnd w:id="372"/>
-    <w:bookmarkStart w:id="374" w:name="what-do-the-landmarks-contribute"/>
+    <w:bookmarkEnd w:id="479"/>
+    <w:bookmarkStart w:id="481" w:name="what-do-the-landmarks-contribute"/>
     <w:p>
       <w:pPr>
         <w:pStyle w:val="Heading3"/>
@@ -11705,7 +11705,7 @@
         <w:t xml:space="preserve">(Fig. 4)</w:t>
       </w:r>
     </w:p>
-    <w:bookmarkStart w:id="373" w:name="Xfc754f5fdbc1a952568615503bb8f3afaadf421"/>
+    <w:bookmarkStart w:id="480" w:name="Xfc754f5fdbc1a952568615503bb8f3afaadf421"/>
     <w:p>
       <w:pPr>
         <w:pStyle w:val="Heading4"/>
@@ -11912,9 +11912,9 @@
         <w:t xml:space="preserve">(Fig. 5; Table 11)</w:t>
       </w:r>
     </w:p>
-    <w:bookmarkEnd w:id="373"/>
-    <w:bookmarkEnd w:id="374"/>
-    <w:bookmarkStart w:id="375" w:name="X5aa37cfb64c4d815f4fee0e74b644b0546e0c08"/>
+    <w:bookmarkEnd w:id="480"/>
+    <w:bookmarkEnd w:id="481"/>
+    <w:bookmarkStart w:id="482" w:name="X5aa37cfb64c4d815f4fee0e74b644b0546e0c08"/>
     <w:p>
       <w:pPr>
         <w:pStyle w:val="Heading3"/>
@@ -12780,8 +12780,8 @@
         <w:t xml:space="preserve">(Fig. 6)</w:t>
       </w:r>
     </w:p>
-    <w:bookmarkEnd w:id="375"/>
-    <w:bookmarkStart w:id="379" w:name="fragmented-references-and-mags"/>
+    <w:bookmarkEnd w:id="482"/>
+    <w:bookmarkStart w:id="486" w:name="fragmented-references-and-mags"/>
     <w:p>
       <w:pPr>
         <w:pStyle w:val="Heading3"/>
@@ -12790,7 +12790,7 @@
         <w:t xml:space="preserve">6. Fragmented references and MAGs</w:t>
       </w:r>
     </w:p>
-    <w:bookmarkStart w:id="376" w:name="X023c9de081127f5a9ee34128d04d5cd51d91210"/>
+    <w:bookmarkStart w:id="483" w:name="X023c9de081127f5a9ee34128d04d5cd51d91210"/>
     <w:p>
       <w:pPr>
         <w:pStyle w:val="Heading4"/>
@@ -13524,8 +13524,8 @@
         </w:tc>
       </w:tr>
     </w:tbl>
-    <w:bookmarkEnd w:id="376"/>
-    <w:bookmarkStart w:id="377" w:name="X6e8375112356a1e59f6c25ab9a7ae77408f4219"/>
+    <w:bookmarkEnd w:id="483"/>
+    <w:bookmarkStart w:id="484" w:name="X6e8375112356a1e59f6c25ab9a7ae77408f4219"/>
     <w:p>
       <w:pPr>
         <w:pStyle w:val="Heading4"/>
@@ -13728,8 +13728,8 @@
         <w:t xml:space="preserve">sketch scaffolding is demonstrated, not shipped (Fig. 7).</w:t>
       </w:r>
     </w:p>
-    <w:bookmarkEnd w:id="377"/>
-    <w:bookmarkStart w:id="378" w:name="X72de53e76597c7041bc0c2cfdd503c5ddd9d60b"/>
+    <w:bookmarkEnd w:id="484"/>
+    <w:bookmarkStart w:id="485" w:name="X72de53e76597c7041bc0c2cfdd503c5ddd9d60b"/>
     <w:p>
       <w:pPr>
         <w:pStyle w:val="Heading4"/>
@@ -13857,9 +13857,9 @@
         <w:t xml:space="preserve">(Fig. 7; Table 8)</w:t>
       </w:r>
     </w:p>
-    <w:bookmarkEnd w:id="378"/>
-    <w:bookmarkEnd w:id="379"/>
-    <w:bookmarkStart w:id="383" w:name="real-metagenomes"/>
+    <w:bookmarkEnd w:id="485"/>
+    <w:bookmarkEnd w:id="486"/>
+    <w:bookmarkStart w:id="490" w:name="real-metagenomes"/>
     <w:p>
       <w:pPr>
         <w:pStyle w:val="Heading3"/>
@@ -13868,7 +13868,7 @@
         <w:t xml:space="preserve">7. Real metagenomes</w:t>
       </w:r>
     </w:p>
-    <w:bookmarkStart w:id="380" w:name="X1ac24289c0a6b34d66188d6319131a2e330c07c"/>
+    <w:bookmarkStart w:id="487" w:name="X1ac24289c0a6b34d66188d6319131a2e330c07c"/>
     <w:p>
       <w:pPr>
         <w:pStyle w:val="Heading4"/>
@@ -14061,8 +14061,8 @@
         <w:t xml:space="preserve">).</w:t>
       </w:r>
     </w:p>
-    <w:bookmarkEnd w:id="380"/>
-    <w:bookmarkStart w:id="381" w:name="Xc081266583f5878e429dba77e287ecfb4e84c13"/>
+    <w:bookmarkEnd w:id="487"/>
+    <w:bookmarkStart w:id="488" w:name="Xc081266583f5878e429dba77e287ecfb4e84c13"/>
     <w:p>
       <w:pPr>
         <w:pStyle w:val="Heading4"/>
@@ -14309,8 +14309,8 @@
         <w:t xml:space="preserve">preparation) (Fig. 8).</w:t>
       </w:r>
     </w:p>
-    <w:bookmarkEnd w:id="381"/>
-    <w:bookmarkStart w:id="382" w:name="X855dfea45c8027e3834f5e0c80b8fc9c7aa81b5"/>
+    <w:bookmarkEnd w:id="488"/>
+    <w:bookmarkStart w:id="489" w:name="X855dfea45c8027e3834f5e0c80b8fc9c7aa81b5"/>
     <w:p>
       <w:pPr>
         <w:pStyle w:val="Heading4"/>
@@ -14739,9 +14739,9 @@
         <w:t xml:space="preserve">(Fig. 9; Table 10)</w:t>
       </w:r>
     </w:p>
-    <w:bookmarkEnd w:id="382"/>
-    <w:bookmarkEnd w:id="383"/>
-    <w:bookmarkStart w:id="384" w:name="computational-efficiency-and-scale"/>
+    <w:bookmarkEnd w:id="489"/>
+    <w:bookmarkEnd w:id="490"/>
+    <w:bookmarkStart w:id="491" w:name="computational-efficiency-and-scale"/>
     <w:p>
       <w:pPr>
         <w:pStyle w:val="Heading3"/>
@@ -15020,9 +15020,9 @@
         <w:t xml:space="preserve">(Fig. 9d)</w:t>
       </w:r>
     </w:p>
-    <w:bookmarkEnd w:id="384"/>
-    <w:bookmarkEnd w:id="385"/>
-    <w:bookmarkStart w:id="386" w:name="discussion"/>
+    <w:bookmarkEnd w:id="491"/>
+    <w:bookmarkEnd w:id="492"/>
+    <w:bookmarkStart w:id="493" w:name="discussion"/>
     <w:p>
       <w:pPr>
         <w:pStyle w:val="Heading2"/>
@@ -16659,8 +16659,8 @@
         <w:t xml:space="preserve">have no data in this study and must not be read as null results. The mismatch-tolerance row is asymmetric for a measured reason (F3): the enzyme mode’s exact-first counting rule suppresses the near-neighbor search that becomes the sketch mode’s rescue channel at scale ~100. Sketch-side scaffolding and sketch mismatch tolerance rest on a rule-based port/simulation respectively, not on shipped CLI modes (F3/F4 REVIEW caveats).</w:t>
       </w:r>
     </w:p>
-    <w:bookmarkEnd w:id="386"/>
-    <w:bookmarkStart w:id="387" w:name="conclusions"/>
+    <w:bookmarkEnd w:id="493"/>
+    <w:bookmarkStart w:id="494" w:name="conclusions"/>
     <w:p>
       <w:pPr>
         <w:pStyle w:val="Heading2"/>
@@ -16693,8 +16693,16 @@
         <w:t xml:space="preserve">The benchmark also defines the limits of deployment. Low-coverage estimates have compressed dynamic range, and GC, fragmented references, strain mixtures, absent references, and MAG-scale runtime require explicit safeguards. Current conservative QC therefore trades yield for reliability. Within these limits, sk2bGrow provides a reproducible shallow-depth growth-inference module for longitudinal microbiome studies; in disease cohorts, derived PTR dynamics may complement taxonomic abundance features in conventional prediction models, but this application requires direct validation in oral and gut datasets.</w:t>
       </w:r>
     </w:p>
-    <w:bookmarkEnd w:id="387"/>
-    <w:bookmarkStart w:id="388" w:name="list-of-abbreviations"/>
+    <w:p>
+      <w:pPr>
+        <w:pStyle w:val="BodyText"/>
+      </w:pPr>
+      <w:r>
+        <w:t xml:space="preserve">The count-level factorial adds one further deployment principle: sequencing depth cannot repair ambiguous landmark assignment. Multi-strain applications should therefore report shared-anchor fractions and per-reference unique coverage alongside depth and recall, and should treat coordinate fitting, assignment of shared evidence, and computational cost as separately auditable steps rather than collapsing them into a single end-to-end accuracy number.</w:t>
+      </w:r>
+    </w:p>
+    <w:bookmarkEnd w:id="494"/>
+    <w:bookmarkStart w:id="495" w:name="list-of-abbreviations"/>
     <w:p>
       <w:pPr>
         <w:pStyle w:val="Heading2"/>
@@ -16741,8 +16749,8 @@
         <w:t xml:space="preserve">V-fit: coordinate-aware windowed V-shaped regression fit</w:t>
       </w:r>
     </w:p>
-    <w:bookmarkEnd w:id="388"/>
-    <w:bookmarkStart w:id="398" w:name="declarations"/>
+    <w:bookmarkEnd w:id="495"/>
+    <w:bookmarkStart w:id="505" w:name="declarations"/>
     <w:p>
       <w:pPr>
         <w:pStyle w:val="Heading2"/>
@@ -16751,7 +16759,7 @@
         <w:t xml:space="preserve">Declarations</w:t>
       </w:r>
     </w:p>
-    <w:bookmarkStart w:id="389" w:name="Xd182db0490b2de20bd2b4e4cc8698599182035f"/>
+    <w:bookmarkStart w:id="496" w:name="Xd182db0490b2de20bd2b4e4cc8698599182035f"/>
     <w:p>
       <w:pPr>
         <w:pStyle w:val="Heading3"/>
@@ -16768,8 +16776,8 @@
         <w:t xml:space="preserve">Not applicable. This study analysed only publicly available sequencing data.</w:t>
       </w:r>
     </w:p>
-    <w:bookmarkEnd w:id="389"/>
-    <w:bookmarkStart w:id="390" w:name="consent-for-publication"/>
+    <w:bookmarkEnd w:id="496"/>
+    <w:bookmarkStart w:id="497" w:name="consent-for-publication"/>
     <w:p>
       <w:pPr>
         <w:pStyle w:val="Heading3"/>
@@ -16786,8 +16794,8 @@
         <w:t xml:space="preserve">Not applicable.</w:t>
       </w:r>
     </w:p>
-    <w:bookmarkEnd w:id="390"/>
-    <w:bookmarkStart w:id="392" w:name="availability-of-data-and-materials"/>
+    <w:bookmarkEnd w:id="497"/>
+    <w:bookmarkStart w:id="499" w:name="availability-of-data-and-materials"/>
     <w:p>
       <w:pPr>
         <w:pStyle w:val="Heading3"/>
@@ -16806,7 +16814,7 @@
       <w:r>
         <w:t xml:space="preserve"> </w:t>
       </w:r>
-      <w:hyperlink r:id="rId338">
+      <w:hyperlink r:id="rId445">
         <w:r>
           <w:rPr>
             <w:rStyle w:val="Hyperlink"/>
@@ -16826,7 +16834,7 @@
       <w:r>
         <w:t xml:space="preserve"> </w:t>
       </w:r>
-      <w:hyperlink r:id="rId391">
+      <w:hyperlink r:id="rId498">
         <w:r>
           <w:rPr>
             <w:rStyle w:val="Hyperlink"/>
@@ -17022,8 +17030,8 @@
         <w:t xml:space="preserve">study), PRJNA974210 (rotating biological contactor metagenome).</w:t>
       </w:r>
     </w:p>
-    <w:bookmarkEnd w:id="392"/>
-    <w:bookmarkStart w:id="393" w:name="competing-interests"/>
+    <w:bookmarkEnd w:id="499"/>
+    <w:bookmarkStart w:id="500" w:name="competing-interests"/>
     <w:p>
       <w:pPr>
         <w:pStyle w:val="Heading3"/>
@@ -17040,8 +17048,8 @@
         <w:t xml:space="preserve">The authors declare that they have no competing interests.</w:t>
       </w:r>
     </w:p>
-    <w:bookmarkEnd w:id="393"/>
-    <w:bookmarkStart w:id="394" w:name="funding"/>
+    <w:bookmarkEnd w:id="500"/>
+    <w:bookmarkStart w:id="501" w:name="funding"/>
     <w:p>
       <w:pPr>
         <w:pStyle w:val="Heading3"/>
@@ -17058,8 +17066,8 @@
         <w:t xml:space="preserve">[To be completed before submission.]</w:t>
       </w:r>
     </w:p>
-    <w:bookmarkEnd w:id="394"/>
-    <w:bookmarkStart w:id="395" w:name="authors-contributions"/>
+    <w:bookmarkEnd w:id="501"/>
+    <w:bookmarkStart w:id="502" w:name="authors-contributions"/>
     <w:p>
       <w:pPr>
         <w:pStyle w:val="Heading3"/>
@@ -17076,8 +17084,8 @@
         <w:t xml:space="preserve">[To be completed before submission using CRediT taxonomy and the final author initials.]</w:t>
       </w:r>
     </w:p>
-    <w:bookmarkEnd w:id="395"/>
-    <w:bookmarkStart w:id="396" w:name="acknowledgements"/>
+    <w:bookmarkEnd w:id="502"/>
+    <w:bookmarkStart w:id="503" w:name="acknowledgements"/>
     <w:p>
       <w:pPr>
         <w:pStyle w:val="Heading3"/>
@@ -17094,8 +17102,8 @@
         <w:t xml:space="preserve">[To be completed before submission or state “Not applicable.”]</w:t>
       </w:r>
     </w:p>
-    <w:bookmarkEnd w:id="396"/>
-    <w:bookmarkStart w:id="397" w:name="authors-information"/>
+    <w:bookmarkEnd w:id="503"/>
+    <w:bookmarkStart w:id="504" w:name="authors-information"/>
     <w:p>
       <w:pPr>
         <w:pStyle w:val="Heading3"/>
@@ -17112,9 +17120,9 @@
         <w:t xml:space="preserve">Not applicable.</w:t>
       </w:r>
     </w:p>
-    <w:bookmarkEnd w:id="397"/>
-    <w:bookmarkEnd w:id="398"/>
-    <w:bookmarkStart w:id="407" w:name="references"/>
+    <w:bookmarkEnd w:id="504"/>
+    <w:bookmarkEnd w:id="505"/>
+    <w:bookmarkStart w:id="514" w:name="references"/>
     <w:p>
       <w:pPr>
         <w:pStyle w:val="Heading2"/>
@@ -17147,7 +17155,7 @@
       <w:r>
         <w:t xml:space="preserve">. 2015;349(6252):1101–1106. doi:</w:t>
       </w:r>
-      <w:hyperlink r:id="rId399">
+      <w:hyperlink r:id="rId506">
         <w:r>
           <w:rPr>
             <w:rStyle w:val="Hyperlink"/>
@@ -17180,7 +17188,7 @@
       <w:r>
         <w:t xml:space="preserve">. 2016;34(12):1256–1263. doi:</w:t>
       </w:r>
-      <w:hyperlink r:id="rId400">
+      <w:hyperlink r:id="rId507">
         <w:r>
           <w:rPr>
             <w:rStyle w:val="Hyperlink"/>
@@ -17213,7 +17221,7 @@
       <w:r>
         <w:t xml:space="preserve">. 2022;32(3):558–568. doi:</w:t>
       </w:r>
-      <w:hyperlink r:id="rId401">
+      <w:hyperlink r:id="rId508">
         <w:r>
           <w:rPr>
             <w:rStyle w:val="Hyperlink"/>
@@ -17246,7 +17254,7 @@
       <w:r>
         <w:t xml:space="preserve">. 2026;14(1):128. doi:</w:t>
       </w:r>
-      <w:hyperlink r:id="rId402">
+      <w:hyperlink r:id="rId509">
         <w:r>
           <w:rPr>
             <w:rStyle w:val="Hyperlink"/>
@@ -17279,7 +17287,7 @@
       <w:r>
         <w:t xml:space="preserve">. 2012;9(8):808–810. doi:</w:t>
       </w:r>
-      <w:hyperlink r:id="rId403">
+      <w:hyperlink r:id="rId510">
         <w:r>
           <w:rPr>
             <w:rStyle w:val="Hyperlink"/>
@@ -17312,7 +17320,7 @@
       <w:r>
         <w:t xml:space="preserve">. 2020;15(4):e0219882. doi:</w:t>
       </w:r>
-      <w:hyperlink r:id="rId404">
+      <w:hyperlink r:id="rId511">
         <w:r>
           <w:rPr>
             <w:rStyle w:val="Hyperlink"/>
@@ -17345,7 +17353,7 @@
       <w:r>
         <w:t xml:space="preserve">. 2022;23:36. doi:</w:t>
       </w:r>
-      <w:hyperlink r:id="rId405">
+      <w:hyperlink r:id="rId512">
         <w:r>
           <w:rPr>
             <w:rStyle w:val="Hyperlink"/>
@@ -17378,7 +17386,7 @@
       <w:r>
         <w:t xml:space="preserve">. 2022. doi:</w:t>
       </w:r>
-      <w:hyperlink r:id="rId406">
+      <w:hyperlink r:id="rId513">
         <w:r>
           <w:rPr>
             <w:rStyle w:val="Hyperlink"/>
@@ -17387,8 +17395,8 @@
         </w:r>
       </w:hyperlink>
     </w:p>
-    <w:bookmarkEnd w:id="407"/>
-    <w:bookmarkStart w:id="435" w:name="figures"/>
+    <w:bookmarkEnd w:id="514"/>
+    <w:bookmarkStart w:id="542" w:name="figures"/>
     <w:p>
       <w:pPr>
         <w:pStyle w:val="Heading2"/>
@@ -17406,18 +17414,18 @@
           <wp:inline>
             <wp:extent cx="5943600" cy="4067536"/>
             <wp:effectExtent b="0" l="0" r="0" t="0"/>
-            <wp:docPr descr="Fig. 1. Overview and worked example" title="" id="409" name="Picture"/>
+            <wp:docPr descr="Fig. 1. Overview and worked example" title="" id="516" name="Picture"/>
             <a:graphic>
               <a:graphicData uri="http://schemas.openxmlformats.org/drawingml/2006/picture">
                 <pic:pic>
                   <pic:nvPicPr>
-                    <pic:cNvPr descr="../figures/out/fig1_overview.png" id="410" name="Picture"/>
+                    <pic:cNvPr descr="../figures/out/fig1_overview.png" id="517" name="Picture"/>
                     <pic:cNvPicPr>
                       <a:picLocks noChangeArrowheads="1" noChangeAspect="1"/>
                     </pic:cNvPicPr>
                   </pic:nvPicPr>
                   <pic:blipFill>
-                    <a:blip r:embed="rId408"/>
+                    <a:blip r:embed="rId515"/>
                     <a:stretch>
                       <a:fillRect/>
                     </a:stretch>
@@ -17471,18 +17479,18 @@
           <wp:inline>
             <wp:extent cx="5943600" cy="2123380"/>
             <wp:effectExtent b="0" l="0" r="0" t="0"/>
-            <wp:docPr descr="Fig. 2. Zheng isolate benchmark, accuracy versus coverage, and run-out control" title="" id="412" name="Picture"/>
+            <wp:docPr descr="Fig. 2. Zheng isolate benchmark, accuracy versus coverage, and run-out control" title="" id="519" name="Picture"/>
             <a:graphic>
               <a:graphicData uri="http://schemas.openxmlformats.org/drawingml/2006/picture">
                 <pic:pic>
                   <pic:nvPicPr>
-                    <pic:cNvPr descr="../figures/out/fig2_zheng_benchmark.png" id="413" name="Picture"/>
+                    <pic:cNvPr descr="../figures/out/fig2_zheng_benchmark.png" id="520" name="Picture"/>
                     <pic:cNvPicPr>
                       <a:picLocks noChangeArrowheads="1" noChangeAspect="1"/>
                     </pic:cNvPicPr>
                   </pic:nvPicPr>
                   <pic:blipFill>
-                    <a:blip r:embed="rId411"/>
+                    <a:blip r:embed="rId518"/>
                     <a:stretch>
                       <a:fillRect/>
                     </a:stretch>
@@ -17536,18 +17544,18 @@
           <wp:inline>
             <wp:extent cx="5943600" cy="2397967"/>
             <wp:effectExtent b="0" l="0" r="0" t="0"/>
-            <wp:docPr descr="Fig. 3. Multi-strain simulation" title="" id="415" name="Picture"/>
+            <wp:docPr descr="Fig. 3. Multi-strain simulation" title="" id="522" name="Picture"/>
             <a:graphic>
               <a:graphicData uri="http://schemas.openxmlformats.org/drawingml/2006/picture">
                 <pic:pic>
                   <pic:nvPicPr>
-                    <pic:cNvPr descr="../figures/out/fig3_simulation.png" id="416" name="Picture"/>
+                    <pic:cNvPr descr="../figures/out/fig3_simulation.png" id="523" name="Picture"/>
                     <pic:cNvPicPr>
                       <a:picLocks noChangeArrowheads="1" noChangeAspect="1"/>
                     </pic:cNvPicPr>
                   </pic:nvPicPr>
                   <pic:blipFill>
-                    <a:blip r:embed="rId414"/>
+                    <a:blip r:embed="rId521"/>
                     <a:stretch>
                       <a:fillRect/>
                     </a:stretch>
@@ -17601,18 +17609,18 @@
           <wp:inline>
             <wp:extent cx="5943600" cy="2011791"/>
             <wp:effectExtent b="0" l="0" r="0" t="0"/>
-            <wp:docPr descr="Fig. 4. Landmark-source attribution" title="" id="418" name="Picture"/>
+            <wp:docPr descr="Fig. 4. Landmark-source attribution" title="" id="525" name="Picture"/>
             <a:graphic>
               <a:graphicData uri="http://schemas.openxmlformats.org/drawingml/2006/picture">
                 <pic:pic>
                   <pic:nvPicPr>
-                    <pic:cNvPr descr="../figures/out/fig4_attribution.png" id="419" name="Picture"/>
+                    <pic:cNvPr descr="../figures/out/fig4_attribution.png" id="526" name="Picture"/>
                     <pic:cNvPicPr>
                       <a:picLocks noChangeArrowheads="1" noChangeAspect="1"/>
                     </pic:cNvPicPr>
                   </pic:nvPicPr>
                   <pic:blipFill>
-                    <a:blip r:embed="rId417"/>
+                    <a:blip r:embed="rId524"/>
                     <a:stretch>
                       <a:fillRect/>
                     </a:stretch>
@@ -17666,18 +17674,18 @@
           <wp:inline>
             <wp:extent cx="5943600" cy="1907620"/>
             <wp:effectExtent b="0" l="0" r="0" t="0"/>
-            <wp:docPr descr="Fig. 5. Count-level factorial decomposition of estimator, depth and shared-anchor ambiguity" title="" id="421" name="Picture"/>
+            <wp:docPr descr="Fig. 5. Count-level factorial decomposition of estimator, depth and shared-anchor ambiguity" title="" id="528" name="Picture"/>
             <a:graphic>
               <a:graphicData uri="http://schemas.openxmlformats.org/drawingml/2006/picture">
                 <pic:pic>
                   <pic:nvPicPr>
-                    <pic:cNvPr descr="../figures/out/fig5_factorial_mechanism.png" id="422" name="Picture"/>
+                    <pic:cNvPr descr="../figures/out/fig5_factorial_mechanism.png" id="529" name="Picture"/>
                     <pic:cNvPicPr>
                       <a:picLocks noChangeArrowheads="1" noChangeAspect="1"/>
                     </pic:cNvPicPr>
                   </pic:nvPicPr>
                   <pic:blipFill>
-                    <a:blip r:embed="rId420"/>
+                    <a:blip r:embed="rId527"/>
                     <a:stretch>
                       <a:fillRect/>
                     </a:stretch>
@@ -17731,18 +17739,18 @@
           <wp:inline>
             <wp:extent cx="5943600" cy="4181188"/>
             <wp:effectExtent b="0" l="0" r="0" t="0"/>
-            <wp:docPr descr="Fig. 6. Panel-size sweep and GC range" title="" id="424" name="Picture"/>
+            <wp:docPr descr="Fig. 6. Panel-size sweep and GC range" title="" id="531" name="Picture"/>
             <a:graphic>
               <a:graphicData uri="http://schemas.openxmlformats.org/drawingml/2006/picture">
                 <pic:pic>
                   <pic:nvPicPr>
-                    <pic:cNvPr descr="../figures/out/fig6_panel_design.png" id="425" name="Picture"/>
+                    <pic:cNvPr descr="../figures/out/fig6_panel_design.png" id="532" name="Picture"/>
                     <pic:cNvPicPr>
                       <a:picLocks noChangeArrowheads="1" noChangeAspect="1"/>
                     </pic:cNvPicPr>
                   </pic:nvPicPr>
                   <pic:blipFill>
-                    <a:blip r:embed="rId423"/>
+                    <a:blip r:embed="rId530"/>
                     <a:stretch>
                       <a:fillRect/>
                     </a:stretch>
@@ -17796,18 +17804,18 @@
           <wp:inline>
             <wp:extent cx="5943600" cy="4873369"/>
             <wp:effectExtent b="0" l="0" r="0" t="0"/>
-            <wp:docPr descr="Fig. 7. Fragmentation and scaffolding" title="" id="427" name="Picture"/>
+            <wp:docPr descr="Fig. 7. Fragmentation and scaffolding" title="" id="534" name="Picture"/>
             <a:graphic>
               <a:graphicData uri="http://schemas.openxmlformats.org/drawingml/2006/picture">
                 <pic:pic>
                   <pic:nvPicPr>
-                    <pic:cNvPr descr="../figures/out/fig7_fragmentation.png" id="428" name="Picture"/>
+                    <pic:cNvPr descr="../figures/out/fig7_fragmentation.png" id="535" name="Picture"/>
                     <pic:cNvPicPr>
                       <a:picLocks noChangeArrowheads="1" noChangeAspect="1"/>
                     </pic:cNvPicPr>
                   </pic:nvPicPr>
                   <pic:blipFill>
-                    <a:blip r:embed="rId426"/>
+                    <a:blip r:embed="rId533"/>
                     <a:stretch>
                       <a:fillRect/>
                     </a:stretch>
@@ -17861,18 +17869,18 @@
           <wp:inline>
             <wp:extent cx="5943600" cy="2396004"/>
             <wp:effectExtent b="0" l="0" r="0" t="0"/>
-            <wp:docPr descr="Fig. 8. Fecal-cohort concordance" title="" id="430" name="Picture"/>
+            <wp:docPr descr="Fig. 8. Fecal-cohort concordance" title="" id="537" name="Picture"/>
             <a:graphic>
               <a:graphicData uri="http://schemas.openxmlformats.org/drawingml/2006/picture">
                 <pic:pic>
                   <pic:nvPicPr>
-                    <pic:cNvPr descr="../figures/out/fig8_metagenome.png" id="431" name="Picture"/>
+                    <pic:cNvPr descr="../figures/out/fig8_metagenome.png" id="538" name="Picture"/>
                     <pic:cNvPicPr>
                       <a:picLocks noChangeArrowheads="1" noChangeAspect="1"/>
                     </pic:cNvPicPr>
                   </pic:nvPicPr>
                   <pic:blipFill>
-                    <a:blip r:embed="rId429"/>
+                    <a:blip r:embed="rId536"/>
                     <a:stretch>
                       <a:fillRect/>
                     </a:stretch>
@@ -17926,18 +17934,18 @@
           <wp:inline>
             <wp:extent cx="5943600" cy="2642374"/>
             <wp:effectExtent b="0" l="0" r="0" t="0"/>
-            <wp:docPr descr="Fig. 9. MAG-scale QC and cost" title="" id="433" name="Picture"/>
+            <wp:docPr descr="Fig. 9. MAG-scale QC and cost" title="" id="540" name="Picture"/>
             <a:graphic>
               <a:graphicData uri="http://schemas.openxmlformats.org/drawingml/2006/picture">
                 <pic:pic>
                   <pic:nvPicPr>
-                    <pic:cNvPr descr="../figures/out/fig9_mag_qc_cost.png" id="434" name="Picture"/>
+                    <pic:cNvPr descr="../figures/out/fig9_mag_qc_cost.png" id="541" name="Picture"/>
                     <pic:cNvPicPr>
                       <a:picLocks noChangeArrowheads="1" noChangeAspect="1"/>
                     </pic:cNvPicPr>
                   </pic:nvPicPr>
                   <pic:blipFill>
-                    <a:blip r:embed="rId432"/>
+                    <a:blip r:embed="rId539"/>
                     <a:stretch>
                       <a:fillRect/>
                     </a:stretch>
@@ -17982,8 +17990,8 @@
         <w:t xml:space="preserve">MAG-scale QC and cost</w:t>
       </w:r>
     </w:p>
-    <w:bookmarkEnd w:id="435"/>
-    <w:bookmarkStart w:id="436" w:name="tables"/>
+    <w:bookmarkEnd w:id="542"/>
+    <w:bookmarkStart w:id="543" w:name="tables"/>
     <w:p>
       <w:pPr>
         <w:pStyle w:val="Heading2"/>
@@ -41154,7 +41162,7 @@
               <w:jc w:val="right"/>
             </w:pPr>
             <w:r>
-              <w:t xml:space="preserve">-0.000</w:t>
+              <w:t xml:space="preserve">0.000</w:t>
             </w:r>
           </w:p>
         </w:tc>
@@ -42072,8 +42080,8 @@
         </w:tc>
       </w:tr>
     </w:tbl>
-    <w:bookmarkEnd w:id="436"/>
-    <w:bookmarkEnd w:id="437"/>
+    <w:bookmarkEnd w:id="543"/>
+    <w:bookmarkEnd w:id="544"/>
     <w:sectPr>
       <w:footerReference r:id="rId9" w:type="default"/>
       <w:footnotePr>

</xml_diff>

<commit_message>
Benchmark C5 fast mode with k8 and mismatch 1
</commit_message>
<xml_diff>
--- a/manuscript/submission/sk2bGrow_Microbiome_submission_draft.docx
+++ b/manuscript/submission/sk2bGrow_Microbiome_submission_draft.docx
@@ -2,7 +2,7 @@
 <file path=word/document.xml><?xml version="1.0" encoding="utf-8"?>
 <w:document xmlns:w="http://schemas.openxmlformats.org/wordprocessingml/2006/main" xmlns:m="http://schemas.openxmlformats.org/officeDocument/2006/math" xmlns:r="http://schemas.openxmlformats.org/officeDocument/2006/relationships" xmlns:o="urn:schemas-microsoft-com:office:office" xmlns:v="urn:schemas-microsoft-com:vml" xmlns:w10="urn:schemas-microsoft-com:office:word" xmlns:a="http://schemas.openxmlformats.org/drawingml/2006/main" xmlns:pic="http://schemas.openxmlformats.org/drawingml/2006/picture" xmlns:wp="http://schemas.openxmlformats.org/drawingml/2006/wordprocessingDrawing">
   <w:body>
-    <w:bookmarkStart w:id="544" w:name="X35a67ffd771dc0eee37406016d31234a1046d16"/>
+    <w:bookmarkStart w:id="651" w:name="X35a67ffd771dc0eee37406016d31234a1046d16"/>
     <w:p>
       <w:pPr>
         <w:pStyle w:val="Heading1"/>
@@ -11,7 +11,7 @@
         <w:t xml:space="preserve">Coordinate-aware V-fitting enables shallow-depth PTR estimation from 2bRAD anchor panels</w:t>
       </w:r>
     </w:p>
-    <w:bookmarkStart w:id="441" w:name="title-page"/>
+    <w:bookmarkStart w:id="548" w:name="title-page"/>
     <w:p>
       <w:pPr>
         <w:pStyle w:val="Heading2"/>
@@ -132,8 +132,8 @@
         <w:t xml:space="preserve">Review revision 2026-09-18. The primary Zheng grid uses signed fixed-origin fitting and single-pass GC correction; residual two-pass GC correction is diagnostic only.</w:t>
       </w:r>
     </w:p>
-    <w:bookmarkEnd w:id="441"/>
-    <w:bookmarkStart w:id="442" w:name="abstract"/>
+    <w:bookmarkEnd w:id="548"/>
+    <w:bookmarkStart w:id="549" w:name="abstract"/>
     <w:p>
       <w:pPr>
         <w:pStyle w:val="Heading2"/>
@@ -166,8 +166,8 @@
         <w:t xml:space="preserve">growth-rate panel, sk2bGrow returned usable PTR estimates at 1–2× sequencing depth, where Pilea’s shipped defaults return nothing, with r = 0.92 at 1× and 0.96 at 2× against measured growth rates (n = 16). The accuracy comes from the coordinate-aware estimator, not the landmark source — at matched density, the two landmark sources were not significantly different in the paired bootstrap at any depth — while the multi-enzyme panel contributes what a hash sketch cannot: a wet-lab-realizable landmark set and consistency strata whose heterogeneous biases exposed our own counting defect. A post-hoc count-level factorial further separates shallow-depth extraction from multi-reference assignment: coordinate fitting was accurate for private anchors, whereas shared-anchor ambiguity introduced a depth-amplified negative bias. The estimates are not unbiased — the fitted slope compresses the dynamic range at low coverage, and the compression mechanism remains unresolved. On three fecal metagenomes, sk2bGrow and Pilea agreed (bias +0.22–+0.25 log2; n = 58–78 species×sample pairs per sample). As a process-level finding, exact deduplication of 2bRAD libraries before counting destroys the PTR signal — a PCR copy-number artefact we localize per anchor. sk2bGrow is 89.5–240.8× slower than Pilea at MAG-panel scale; mismatch-1 counting narrows the gap to roughly one order of magnitude (measured end-to-end on all nine samples: 20.5–38.8× faster counting than the mismatch-2 baseline, no genome lost), and a containment pre-screen — measured to clear the absent-reference false-positive floor, and required at database scale where an unrestricted index would emit estimates for absent references — completes the fix.</w:t>
       </w:r>
     </w:p>
-    <w:bookmarkEnd w:id="442"/>
-    <w:bookmarkStart w:id="443" w:name="keywords"/>
+    <w:bookmarkEnd w:id="549"/>
+    <w:bookmarkStart w:id="550" w:name="keywords"/>
     <w:p>
       <w:pPr>
         <w:pStyle w:val="Heading2"/>
@@ -184,8 +184,8 @@
         <w:t xml:space="preserve">peak-to-trough ratio; microbial growth dynamics; 2bRAD; FracMinHash; metagenomics; shallow sequencing</w:t>
       </w:r>
     </w:p>
-    <w:bookmarkEnd w:id="443"/>
-    <w:bookmarkStart w:id="444" w:name="background"/>
+    <w:bookmarkEnd w:id="550"/>
+    <w:bookmarkStart w:id="551" w:name="background"/>
     <w:p>
       <w:pPr>
         <w:pStyle w:val="Heading2"/>
@@ -308,8 +308,8 @@
         <w:t xml:space="preserve">In short, this paper contributes (i) usable PTR estimates at 1–2× sequencing depth, with the low-coverage bias stated rather than hidden; (ii) a controlled 2 × 2 attribution localising the gain in the coordinate-aware estimator rather than in which landmarks are counted — the two landmark sources showed no significant paired-bootstrap difference once density was matched; and (iii) real-metagenome concordance with the incumbent and process-level findings — a deduplication recommendation and a per-anchor capture-efficiency measurement — that others can cite.</w:t>
       </w:r>
     </w:p>
-    <w:bookmarkEnd w:id="444"/>
-    <w:bookmarkStart w:id="473" w:name="methods"/>
+    <w:bookmarkEnd w:id="551"/>
+    <w:bookmarkStart w:id="580" w:name="methods"/>
     <w:p>
       <w:pPr>
         <w:pStyle w:val="Heading2"/>
@@ -334,7 +334,7 @@
       <w:r>
         <w:t xml:space="preserve"> </w:t>
       </w:r>
-      <w:hyperlink r:id="rId445">
+      <w:hyperlink r:id="rId552">
         <w:r>
           <w:rPr>
             <w:rStyle w:val="Hyperlink"/>
@@ -380,7 +380,7 @@
         </w:pict>
       </w:r>
     </w:p>
-    <w:bookmarkStart w:id="453" w:name="the-sk2bgrow-algorithm"/>
+    <w:bookmarkStart w:id="560" w:name="the-sk2bgrow-algorithm"/>
     <w:p>
       <w:pPr>
         <w:pStyle w:val="Heading3"/>
@@ -570,7 +570,7 @@
         <w:t xml:space="preserve">) has six stages.</w:t>
       </w:r>
     </w:p>
-    <w:bookmarkStart w:id="446" w:name="Xd9b3ed4dd252045d3e48557196049c0e39886bf"/>
+    <w:bookmarkStart w:id="553" w:name="Xd9b3ed4dd252045d3e48557196049c0e39886bf"/>
     <w:p>
       <w:pPr>
         <w:pStyle w:val="Heading4"/>
@@ -959,8 +959,8 @@
         <w:t xml:space="preserve">.</w:t>
       </w:r>
     </w:p>
-    <w:bookmarkEnd w:id="446"/>
-    <w:bookmarkStart w:id="447" w:name="read-counting-and-anchor-attribution"/>
+    <w:bookmarkEnd w:id="553"/>
+    <w:bookmarkStart w:id="554" w:name="read-counting-and-anchor-attribution"/>
     <w:p>
       <w:pPr>
         <w:pStyle w:val="Heading4"/>
@@ -1351,8 +1351,8 @@
         <w:t xml:space="preserve">iterations.</w:t>
       </w:r>
     </w:p>
-    <w:bookmarkEnd w:id="447"/>
-    <w:bookmarkStart w:id="448" w:name="windows-and-window-rates"/>
+    <w:bookmarkEnd w:id="554"/>
+    <w:bookmarkStart w:id="555" w:name="windows-and-window-rates"/>
     <w:p>
       <w:pPr>
         <w:pStyle w:val="Heading4"/>
@@ -1654,8 +1654,8 @@
         <w:t xml:space="preserve">~12 spurious log-likelihood units and BIC selects NB everywhere.</w:t>
       </w:r>
     </w:p>
-    <w:bookmarkEnd w:id="448"/>
-    <w:bookmarkStart w:id="449" w:name="gc-bias-correction"/>
+    <w:bookmarkEnd w:id="555"/>
+    <w:bookmarkStart w:id="556" w:name="gc-bias-correction"/>
     <w:p>
       <w:pPr>
         <w:pStyle w:val="Heading4"/>
@@ -1894,8 +1894,8 @@
         <w:t xml:space="preserve">).</w:t>
       </w:r>
     </w:p>
-    <w:bookmarkEnd w:id="449"/>
-    <w:bookmarkStart w:id="450" w:name="origin-placement-and-v-shape-fitting"/>
+    <w:bookmarkEnd w:id="556"/>
+    <w:bookmarkStart w:id="557" w:name="origin-placement-and-v-shape-fitting"/>
     <w:p>
       <w:pPr>
         <w:pStyle w:val="Heading4"/>
@@ -2465,8 +2465,8 @@
         <w:t xml:space="preserve">).</w:t>
       </w:r>
     </w:p>
-    <w:bookmarkEnd w:id="450"/>
-    <w:bookmarkStart w:id="451" w:name="cross-enzyme-fusion-and-quality-control"/>
+    <w:bookmarkEnd w:id="557"/>
+    <w:bookmarkStart w:id="558" w:name="cross-enzyme-fusion-and-quality-control"/>
     <w:p>
       <w:pPr>
         <w:pStyle w:val="Heading4"/>
@@ -2999,8 +2999,8 @@
         <w:t xml:space="preserve">rejection rate — the dependency is reported, not corrected (Discussion).</w:t>
       </w:r>
     </w:p>
-    <w:bookmarkEnd w:id="451"/>
-    <w:bookmarkStart w:id="452" w:name="implementation"/>
+    <w:bookmarkEnd w:id="558"/>
+    <w:bookmarkStart w:id="559" w:name="implementation"/>
     <w:p>
       <w:pPr>
         <w:pStyle w:val="Heading4"/>
@@ -3042,9 +3042,9 @@
         </w:pict>
       </w:r>
     </w:p>
-    <w:bookmarkEnd w:id="452"/>
-    <w:bookmarkEnd w:id="453"/>
-    <w:bookmarkStart w:id="454" w:name="enzyme-panel"/>
+    <w:bookmarkEnd w:id="559"/>
+    <w:bookmarkEnd w:id="560"/>
+    <w:bookmarkStart w:id="561" w:name="enzyme-panel"/>
     <w:p>
       <w:pPr>
         <w:pStyle w:val="Heading3"/>
@@ -3270,8 +3270,8 @@
         </w:pict>
       </w:r>
     </w:p>
-    <w:bookmarkEnd w:id="454"/>
-    <w:bookmarkStart w:id="462" w:name="benchmark-datasets"/>
+    <w:bookmarkEnd w:id="561"/>
+    <w:bookmarkStart w:id="569" w:name="benchmark-datasets"/>
     <w:p>
       <w:pPr>
         <w:pStyle w:val="Heading3"/>
@@ -3280,7 +3280,7 @@
         <w:t xml:space="preserve">3. Benchmark datasets</w:t>
       </w:r>
     </w:p>
-    <w:bookmarkStart w:id="455" w:name="X8558b042e1c4d57d5e6d341f0cb3e7790b4deb2"/>
+    <w:bookmarkStart w:id="562" w:name="X8558b042e1c4d57d5e6d341f0cb3e7790b4deb2"/>
     <w:p>
       <w:pPr>
         <w:pStyle w:val="Heading4"/>
@@ -3854,8 +3854,8 @@
         <w:t xml:space="preserve">establishes behaviour on a metagenome or a fragmented MAG.</w:t>
       </w:r>
     </w:p>
-    <w:bookmarkEnd w:id="455"/>
-    <w:bookmarkStart w:id="456" w:name="multi-strain-simulation"/>
+    <w:bookmarkEnd w:id="562"/>
+    <w:bookmarkStart w:id="563" w:name="multi-strain-simulation"/>
     <w:p>
       <w:pPr>
         <w:pStyle w:val="Heading4"/>
@@ -4134,8 +4134,8 @@
         <w:t xml:space="preserve">).</w:t>
       </w:r>
     </w:p>
-    <w:bookmarkEnd w:id="456"/>
-    <w:bookmarkStart w:id="457" w:name="reference-fragmentation"/>
+    <w:bookmarkEnd w:id="563"/>
+    <w:bookmarkStart w:id="564" w:name="reference-fragmentation"/>
     <w:p>
       <w:pPr>
         <w:pStyle w:val="Heading4"/>
@@ -4590,8 +4590,8 @@
         <w:t xml:space="preserve">scaffolding delivers.</w:t>
       </w:r>
     </w:p>
-    <w:bookmarkEnd w:id="457"/>
-    <w:bookmarkStart w:id="458" w:name="Xb780f84997d33bf0f401691b1288ff1538bcd72"/>
+    <w:bookmarkEnd w:id="564"/>
+    <w:bookmarkStart w:id="565" w:name="Xb780f84997d33bf0f401691b1288ff1538bcd72"/>
     <w:p>
       <w:pPr>
         <w:pStyle w:val="Heading4"/>
@@ -5049,8 +5049,8 @@
         <w:t xml:space="preserve">invariant to affine transformation.</w:t>
       </w:r>
     </w:p>
-    <w:bookmarkEnd w:id="458"/>
-    <w:bookmarkStart w:id="459" w:name="faecal-microbiome-sun-et-al."/>
+    <w:bookmarkEnd w:id="565"/>
+    <w:bookmarkStart w:id="566" w:name="faecal-microbiome-sun-et-al."/>
     <w:p>
       <w:pPr>
         <w:pStyle w:val="Heading4"/>
@@ -5618,8 +5618,8 @@
         <w:t xml:space="preserve">decomposition are defined in §5.</w:t>
       </w:r>
     </w:p>
-    <w:bookmarkEnd w:id="459"/>
-    <w:bookmarkStart w:id="460" w:name="Xbdb57a27110786c0a1921f07c423d99a2d691e0"/>
+    <w:bookmarkEnd w:id="566"/>
+    <w:bookmarkStart w:id="567" w:name="Xbdb57a27110786c0a1921f07c423d99a2d691e0"/>
     <w:p>
       <w:pPr>
         <w:pStyle w:val="Heading4"/>
@@ -6229,8 +6229,8 @@
         <w:t xml:space="preserve">counts, with per-anchor ratios ≈ 1).</w:t>
       </w:r>
     </w:p>
-    <w:bookmarkEnd w:id="460"/>
-    <w:bookmarkStart w:id="461" w:name="gc-spanning-genome-set"/>
+    <w:bookmarkEnd w:id="567"/>
+    <w:bookmarkStart w:id="568" w:name="gc-spanning-genome-set"/>
     <w:p>
       <w:pPr>
         <w:pStyle w:val="Heading4"/>
@@ -6340,9 +6340,9 @@
         </w:pict>
       </w:r>
     </w:p>
-    <w:bookmarkEnd w:id="461"/>
-    <w:bookmarkEnd w:id="462"/>
-    <w:bookmarkStart w:id="463" w:name="comparison-methods"/>
+    <w:bookmarkEnd w:id="568"/>
+    <w:bookmarkEnd w:id="569"/>
+    <w:bookmarkStart w:id="570" w:name="comparison-methods"/>
     <w:p>
       <w:pPr>
         <w:pStyle w:val="Heading3"/>
@@ -7070,8 +7070,8 @@
         </w:pict>
       </w:r>
     </w:p>
-    <w:bookmarkEnd w:id="463"/>
-    <w:bookmarkStart w:id="464" w:name="evaluation-metrics"/>
+    <w:bookmarkEnd w:id="570"/>
+    <w:bookmarkStart w:id="571" w:name="evaluation-metrics"/>
     <w:p>
       <w:pPr>
         <w:pStyle w:val="Heading3"/>
@@ -8473,8 +8473,8 @@
         </w:pict>
       </w:r>
     </w:p>
-    <w:bookmarkEnd w:id="464"/>
-    <w:bookmarkStart w:id="471" w:name="X85a115a26ce12f930c9dac210e8d891ae5a6b7c"/>
+    <w:bookmarkEnd w:id="571"/>
+    <w:bookmarkStart w:id="578" w:name="X85a115a26ce12f930c9dac210e8d891ae5a6b7c"/>
     <w:p>
       <w:pPr>
         <w:pStyle w:val="Heading3"/>
@@ -8597,7 +8597,7 @@
         <w:t xml:space="preserve">symmetric in effect.</w:t>
       </w:r>
     </w:p>
-    <w:bookmarkStart w:id="465" w:name="density-matching-on-the-zheng-grid-f1"/>
+    <w:bookmarkStart w:id="572" w:name="density-matching-on-the-zheng-grid-f1"/>
     <w:p>
       <w:pPr>
         <w:pStyle w:val="Heading4"/>
@@ -8738,8 +8738,8 @@
         <w:t xml:space="preserve">per-window landmark counts and detection fraction; per-cell failure cause.</w:t>
       </w:r>
     </w:p>
-    <w:bookmarkEnd w:id="465"/>
-    <w:bookmarkStart w:id="466" w:name="gc-sweep-f2"/>
+    <w:bookmarkEnd w:id="572"/>
+    <w:bookmarkStart w:id="573" w:name="gc-sweep-f2"/>
     <w:p>
       <w:pPr>
         <w:pStyle w:val="Heading4"/>
@@ -8967,8 +8967,8 @@
         <w:t xml:space="preserve">(landmarks/Mb).</w:t>
       </w:r>
     </w:p>
-    <w:bookmarkEnd w:id="466"/>
-    <w:bookmarkStart w:id="467" w:name="mismatch-tolerance-and-misassignment-f3"/>
+    <w:bookmarkEnd w:id="573"/>
+    <w:bookmarkStart w:id="574" w:name="mismatch-tolerance-and-misassignment-f3"/>
     <w:p>
       <w:pPr>
         <w:pStyle w:val="Heading4"/>
@@ -9273,8 +9273,8 @@
         <w:t xml:space="preserve">).</w:t>
       </w:r>
     </w:p>
-    <w:bookmarkEnd w:id="467"/>
-    <w:bookmarkStart w:id="468" w:name="fragmentation-sketch-f4"/>
+    <w:bookmarkEnd w:id="574"/>
+    <w:bookmarkStart w:id="575" w:name="fragmentation-sketch-f4"/>
     <w:p>
       <w:pPr>
         <w:pStyle w:val="Heading4"/>
@@ -9666,8 +9666,8 @@
         <w:t xml:space="preserve">rate, orientation accuracy and order Spearman; permutation null distributions.</w:t>
       </w:r>
     </w:p>
-    <w:bookmarkEnd w:id="468"/>
-    <w:bookmarkStart w:id="469" w:name="index-cost-at-gtdb-like-scale-f5"/>
+    <w:bookmarkEnd w:id="575"/>
+    <w:bookmarkStart w:id="576" w:name="index-cost-at-gtdb-like-scale-f5"/>
     <w:p>
       <w:pPr>
         <w:pStyle w:val="Heading4"/>
@@ -9969,8 +9969,8 @@
         <w:t xml:space="preserve">matched density.</w:t>
       </w:r>
     </w:p>
-    <w:bookmarkEnd w:id="469"/>
-    <w:bookmarkStart w:id="470" w:name="X84bfdf958829166d8b906dacf41027ff82eb47c"/>
+    <w:bookmarkEnd w:id="576"/>
+    <w:bookmarkStart w:id="577" w:name="X84bfdf958829166d8b906dacf41027ff82eb47c"/>
     <w:p>
       <w:pPr>
         <w:pStyle w:val="Heading4"/>
@@ -10238,9 +10238,9 @@
         </w:pict>
       </w:r>
     </w:p>
-    <w:bookmarkEnd w:id="470"/>
-    <w:bookmarkEnd w:id="471"/>
-    <w:bookmarkStart w:id="472" w:name="computational-environment"/>
+    <w:bookmarkEnd w:id="577"/>
+    <w:bookmarkEnd w:id="578"/>
+    <w:bookmarkStart w:id="579" w:name="computational-environment"/>
     <w:p>
       <w:pPr>
         <w:pStyle w:val="Heading3"/>
@@ -10275,7 +10275,22 @@
         <w:t xml:space="preserve"> </w:t>
       </w:r>
       <w:r>
-        <w:t xml:space="preserve">(job 4076237). Runs deferred for scale —</w:t>
+        <w:t xml:space="preserve">(job 4076237). The post-hoc C5 fast-mode benchmark used 8 CPU threads under review-final commit</w:t>
+      </w:r>
+      <w:r>
+        <w:t xml:space="preserve"> </w:t>
+      </w:r>
+      <w:r>
+        <w:rPr>
+          <w:rStyle w:val="VerbatimChar"/>
+        </w:rPr>
+        <w:t xml:space="preserve">d108932</w:t>
+      </w:r>
+      <w:r>
+        <w:t xml:space="preserve"> </w:t>
+      </w:r>
+      <w:r>
+        <w:t xml:space="preserve">(job 4095386). Runs deferred for scale —</w:t>
       </w:r>
       <w:r>
         <w:t xml:space="preserve"> </w:t>
@@ -10316,9 +10331,9 @@
         </w:pict>
       </w:r>
     </w:p>
-    <w:bookmarkEnd w:id="472"/>
-    <w:bookmarkEnd w:id="473"/>
-    <w:bookmarkStart w:id="492" w:name="results"/>
+    <w:bookmarkEnd w:id="579"/>
+    <w:bookmarkEnd w:id="580"/>
+    <w:bookmarkStart w:id="599" w:name="results"/>
     <w:p>
       <w:pPr>
         <w:pStyle w:val="Heading2"/>
@@ -10327,7 +10342,7 @@
         <w:t xml:space="preserve">Results</w:t>
       </w:r>
     </w:p>
-    <w:bookmarkStart w:id="474" w:name="sk2bgrow-overview"/>
+    <w:bookmarkStart w:id="581" w:name="sk2bgrow-overview"/>
     <w:p>
       <w:pPr>
         <w:pStyle w:val="Heading3"/>
@@ -10386,8 +10401,8 @@
         <w:t xml:space="preserve">² for the same sample. Panels b–d are real output from one 2× sample; the figure shows the method working on real data, not a cartoon (Fig. 1).</w:t>
       </w:r>
     </w:p>
-    <w:bookmarkEnd w:id="474"/>
-    <w:bookmarkStart w:id="478" w:name="accuracy-on-bacterial-isolates"/>
+    <w:bookmarkEnd w:id="581"/>
+    <w:bookmarkStart w:id="585" w:name="accuracy-on-bacterial-isolates"/>
     <w:p>
       <w:pPr>
         <w:pStyle w:val="Heading3"/>
@@ -10396,7 +10411,7 @@
         <w:t xml:space="preserve">2. Accuracy on bacterial isolates</w:t>
       </w:r>
     </w:p>
-    <w:bookmarkStart w:id="475" w:name="accuracy-across-the-coverage-titration"/>
+    <w:bookmarkStart w:id="582" w:name="accuracy-across-the-coverage-titration"/>
     <w:p>
       <w:pPr>
         <w:pStyle w:val="Heading4"/>
@@ -10573,8 +10588,8 @@
         <w:t xml:space="preserve">(Methods §1.4).</w:t>
       </w:r>
     </w:p>
-    <w:bookmarkEnd w:id="475"/>
-    <w:bookmarkStart w:id="476" w:name="a-negative-control-that-pilea-excluded"/>
+    <w:bookmarkEnd w:id="582"/>
+    <w:bookmarkStart w:id="583" w:name="a-negative-control-that-pilea-excluded"/>
     <w:p>
       <w:pPr>
         <w:pStyle w:val="Heading4"/>
@@ -10612,8 +10627,8 @@
         <w:t xml:space="preserve">estimate, and in exactly the direction of reading noise as growth (Fig. 2d).</w:t>
       </w:r>
     </w:p>
-    <w:bookmarkEnd w:id="476"/>
-    <w:bookmarkStart w:id="477" w:name="Xce6b542434ed1814004dfb47fad411b14a7baa6"/>
+    <w:bookmarkEnd w:id="583"/>
+    <w:bookmarkStart w:id="584" w:name="Xce6b542434ed1814004dfb47fad411b14a7baa6"/>
     <w:p>
       <w:pPr>
         <w:pStyle w:val="Heading4"/>
@@ -10661,9 +10676,9 @@
         <w:t xml:space="preserve">estimates and 167 of 172 in the multi-strain simulation. Because a 150 bp read yields 120 31-mers, a threshold of 5 on k-mer coverage corresponds to ≈6.25× read coverage (5 × 150/120), so the gate fires at 5× nominal even where the estimator behind it is still informative. At 0.5× the gate is correctly refusing to report: Pilea’s gates-off output there is fully degenerate — measured coverage exactly 1.000 and log₂PTR exactly 0.000 in all 17 samples. Between 1× and 5×, however, the gates-off estimator is informative (r = 0.78, 0.85, 0.99 against λ) and is nevertheless suppressed. The honest claim is therefore not that Pilea is over-conservative, but that its gate is calibrated to the point where the FracMinHash estimator breaks — ≈6.25× read coverage — whereas sk2bGrow’s break point is below 1× (Fig. 2; Table 5).</w:t>
       </w:r>
     </w:p>
-    <w:bookmarkEnd w:id="477"/>
-    <w:bookmarkEnd w:id="478"/>
-    <w:bookmarkStart w:id="479" w:name="multi-strain-communities"/>
+    <w:bookmarkEnd w:id="584"/>
+    <w:bookmarkEnd w:id="585"/>
+    <w:bookmarkStart w:id="586" w:name="multi-strain-communities"/>
     <w:p>
       <w:pPr>
         <w:pStyle w:val="Heading3"/>
@@ -10758,8 +10773,8 @@
         <w:t xml:space="preserve">; Methods §6.3). Recall 1.000 therefore still describes an exact-match-favourable grid, but it is no longer supported only by the estimator’s own generative model.</w:t>
       </w:r>
     </w:p>
-    <w:bookmarkEnd w:id="479"/>
-    <w:bookmarkStart w:id="481" w:name="what-do-the-landmarks-contribute"/>
+    <w:bookmarkEnd w:id="586"/>
+    <w:bookmarkStart w:id="588" w:name="what-do-the-landmarks-contribute"/>
     <w:p>
       <w:pPr>
         <w:pStyle w:val="Heading3"/>
@@ -11705,7 +11720,7 @@
         <w:t xml:space="preserve">(Fig. 4)</w:t>
       </w:r>
     </w:p>
-    <w:bookmarkStart w:id="480" w:name="Xfc754f5fdbc1a952568615503bb8f3afaadf421"/>
+    <w:bookmarkStart w:id="587" w:name="Xfc754f5fdbc1a952568615503bb8f3afaadf421"/>
     <w:p>
       <w:pPr>
         <w:pStyle w:val="Heading4"/>
@@ -11912,9 +11927,9 @@
         <w:t xml:space="preserve">(Fig. 5; Table 11)</w:t>
       </w:r>
     </w:p>
-    <w:bookmarkEnd w:id="480"/>
-    <w:bookmarkEnd w:id="481"/>
-    <w:bookmarkStart w:id="482" w:name="X5aa37cfb64c4d815f4fee0e74b644b0546e0c08"/>
+    <w:bookmarkEnd w:id="587"/>
+    <w:bookmarkEnd w:id="588"/>
+    <w:bookmarkStart w:id="589" w:name="X5aa37cfb64c4d815f4fee0e74b644b0546e0c08"/>
     <w:p>
       <w:pPr>
         <w:pStyle w:val="Heading3"/>
@@ -12780,8 +12795,8 @@
         <w:t xml:space="preserve">(Fig. 6)</w:t>
       </w:r>
     </w:p>
-    <w:bookmarkEnd w:id="482"/>
-    <w:bookmarkStart w:id="486" w:name="fragmented-references-and-mags"/>
+    <w:bookmarkEnd w:id="589"/>
+    <w:bookmarkStart w:id="593" w:name="fragmented-references-and-mags"/>
     <w:p>
       <w:pPr>
         <w:pStyle w:val="Heading3"/>
@@ -12790,7 +12805,7 @@
         <w:t xml:space="preserve">6. Fragmented references and MAGs</w:t>
       </w:r>
     </w:p>
-    <w:bookmarkStart w:id="483" w:name="X023c9de081127f5a9ee34128d04d5cd51d91210"/>
+    <w:bookmarkStart w:id="590" w:name="X023c9de081127f5a9ee34128d04d5cd51d91210"/>
     <w:p>
       <w:pPr>
         <w:pStyle w:val="Heading4"/>
@@ -13524,8 +13539,8 @@
         </w:tc>
       </w:tr>
     </w:tbl>
-    <w:bookmarkEnd w:id="483"/>
-    <w:bookmarkStart w:id="484" w:name="X6e8375112356a1e59f6c25ab9a7ae77408f4219"/>
+    <w:bookmarkEnd w:id="590"/>
+    <w:bookmarkStart w:id="591" w:name="X6e8375112356a1e59f6c25ab9a7ae77408f4219"/>
     <w:p>
       <w:pPr>
         <w:pStyle w:val="Heading4"/>
@@ -13728,8 +13743,8 @@
         <w:t xml:space="preserve">sketch scaffolding is demonstrated, not shipped (Fig. 7).</w:t>
       </w:r>
     </w:p>
-    <w:bookmarkEnd w:id="484"/>
-    <w:bookmarkStart w:id="485" w:name="X72de53e76597c7041bc0c2cfdd503c5ddd9d60b"/>
+    <w:bookmarkEnd w:id="591"/>
+    <w:bookmarkStart w:id="592" w:name="X72de53e76597c7041bc0c2cfdd503c5ddd9d60b"/>
     <w:p>
       <w:pPr>
         <w:pStyle w:val="Heading4"/>
@@ -13857,9 +13872,9 @@
         <w:t xml:space="preserve">(Fig. 7; Table 8)</w:t>
       </w:r>
     </w:p>
-    <w:bookmarkEnd w:id="485"/>
-    <w:bookmarkEnd w:id="486"/>
-    <w:bookmarkStart w:id="490" w:name="real-metagenomes"/>
+    <w:bookmarkEnd w:id="592"/>
+    <w:bookmarkEnd w:id="593"/>
+    <w:bookmarkStart w:id="597" w:name="real-metagenomes"/>
     <w:p>
       <w:pPr>
         <w:pStyle w:val="Heading3"/>
@@ -13868,7 +13883,7 @@
         <w:t xml:space="preserve">7. Real metagenomes</w:t>
       </w:r>
     </w:p>
-    <w:bookmarkStart w:id="487" w:name="X1ac24289c0a6b34d66188d6319131a2e330c07c"/>
+    <w:bookmarkStart w:id="594" w:name="X1ac24289c0a6b34d66188d6319131a2e330c07c"/>
     <w:p>
       <w:pPr>
         <w:pStyle w:val="Heading4"/>
@@ -14061,8 +14076,8 @@
         <w:t xml:space="preserve">).</w:t>
       </w:r>
     </w:p>
-    <w:bookmarkEnd w:id="487"/>
-    <w:bookmarkStart w:id="488" w:name="Xc081266583f5878e429dba77e287ecfb4e84c13"/>
+    <w:bookmarkEnd w:id="594"/>
+    <w:bookmarkStart w:id="595" w:name="Xc081266583f5878e429dba77e287ecfb4e84c13"/>
     <w:p>
       <w:pPr>
         <w:pStyle w:val="Heading4"/>
@@ -14309,8 +14324,8 @@
         <w:t xml:space="preserve">preparation) (Fig. 8).</w:t>
       </w:r>
     </w:p>
-    <w:bookmarkEnd w:id="488"/>
-    <w:bookmarkStart w:id="489" w:name="X855dfea45c8027e3834f5e0c80b8fc9c7aa81b5"/>
+    <w:bookmarkEnd w:id="595"/>
+    <w:bookmarkStart w:id="596" w:name="X855dfea45c8027e3834f5e0c80b8fc9c7aa81b5"/>
     <w:p>
       <w:pPr>
         <w:pStyle w:val="Heading4"/>
@@ -14732,6 +14747,108 @@
         <w:pStyle w:val="BodyText"/>
       </w:pPr>
       <w:r>
+        <w:t xml:space="preserve">To test these levers together, one full-depth C5 sample (SRR28338156;</w:t>
+      </w:r>
+      <w:r>
+        <w:t xml:space="preserve"> </w:t>
+      </w:r>
+      <w:r>
+        <w:t xml:space="preserve">67,423,986 reads) was rerun with the top-8 enzyme panel and mismatch 1 under the</w:t>
+      </w:r>
+      <w:r>
+        <w:t xml:space="preserve"> </w:t>
+      </w:r>
+      <w:r>
+        <w:t xml:space="preserve">current fragmented-reference policy. Combined with the smaller anchor set,</w:t>
+      </w:r>
+      <w:r>
+        <w:t xml:space="preserve"> </w:t>
+      </w:r>
+      <w:r>
+        <w:t xml:space="preserve">mismatch 1 reduced sk2bGrow wall time from 21.17 h to 1.26 h (</w:t>
+      </w:r>
+      <w:r>
+        <w:rPr>
+          <w:b/>
+          <w:bCs/>
+        </w:rPr>
+        <w:t xml:space="preserve">16.75×</w:t>
+      </w:r>
+      <w:r>
+        <w:t xml:space="preserve">) at 8</w:t>
+      </w:r>
+      <w:r>
+        <w:t xml:space="preserve"> </w:t>
+      </w:r>
+      <w:r>
+        <w:t xml:space="preserve">threads and lowered peak RSS from 15.37 GB to 10.38 GB. It remained 13.25×</w:t>
+      </w:r>
+      <w:r>
+        <w:t xml:space="preserve"> </w:t>
+      </w:r>
+      <w:r>
+        <w:t xml:space="preserve">slower than Pilea defaults on the same sample. Under the same conservative QC</w:t>
+      </w:r>
+      <w:r>
+        <w:t xml:space="preserve"> </w:t>
+      </w:r>
+      <w:r>
+        <w:t xml:space="preserve">policy, both arms returned eight finite PTRs; current k16/mismatch-2 passed four</w:t>
+      </w:r>
+      <w:r>
+        <w:t xml:space="preserve"> </w:t>
+      </w:r>
+      <w:r>
+        <w:t xml:space="preserve">genomes and fast k8/mismatch-1 passed three, with all three fast calls also</w:t>
+      </w:r>
+      <w:r>
+        <w:t xml:space="preserve"> </w:t>
+      </w:r>
+      <w:r>
+        <w:t xml:space="preserve">passing in the current arm. Their median absolute log₂PTR difference was</w:t>
+      </w:r>
+      <w:r>
+        <w:t xml:space="preserve"> </w:t>
+      </w:r>
+      <w:r>
+        <w:t xml:space="preserve">0.0194. On a matched 1M-pair subset, the k8 panel retained 76.6% of assigned</w:t>
+      </w:r>
+      <w:r>
+        <w:t xml:space="preserve"> </w:t>
+      </w:r>
+      <w:r>
+        <w:t xml:space="preserve">anchor mass, with no detectable genome lost and log₁₀ count-total correlation</w:t>
+      </w:r>
+      <w:r>
+        <w:t xml:space="preserve"> </w:t>
+      </w:r>
+      <w:r>
+        <w:t xml:space="preserve">0.997. This is a one-sample deployment benchmark rather than a new primary grid,</w:t>
+      </w:r>
+      <w:r>
+        <w:t xml:space="preserve"> </w:t>
+      </w:r>
+      <w:r>
+        <w:t xml:space="preserve">but it supports k8/mismatch-1 as the default starting point for shotgun</w:t>
+      </w:r>
+      <w:r>
+        <w:t xml:space="preserve"> </w:t>
+      </w:r>
+      <w:r>
+        <w:t xml:space="preserve">MAG-scale runs. Real 2bRAD libraries should still use mismatch 0 unless a new</w:t>
+      </w:r>
+      <w:r>
+        <w:t xml:space="preserve"> </w:t>
+      </w:r>
+      <w:r>
+        <w:t xml:space="preserve">mismatch sensitivity analysis is performed on route-B reads.</w:t>
+      </w:r>
+    </w:p>
+    <w:p>
+      <w:pPr>
+        <w:pStyle w:val="BodyText"/>
+      </w:pPr>
+      <w:r>
         <w:rPr>
           <w:i/>
           <w:iCs/>
@@ -14739,9 +14856,9 @@
         <w:t xml:space="preserve">(Fig. 9; Table 10)</w:t>
       </w:r>
     </w:p>
-    <w:bookmarkEnd w:id="489"/>
-    <w:bookmarkEnd w:id="490"/>
-    <w:bookmarkStart w:id="491" w:name="computational-efficiency-and-scale"/>
+    <w:bookmarkEnd w:id="596"/>
+    <w:bookmarkEnd w:id="597"/>
+    <w:bookmarkStart w:id="598" w:name="computational-efficiency-and-scale"/>
     <w:p>
       <w:pPr>
         <w:pStyle w:val="Heading3"/>
@@ -15020,9 +15137,9 @@
         <w:t xml:space="preserve">(Fig. 9d)</w:t>
       </w:r>
     </w:p>
-    <w:bookmarkEnd w:id="491"/>
-    <w:bookmarkEnd w:id="492"/>
-    <w:bookmarkStart w:id="493" w:name="discussion"/>
+    <w:bookmarkEnd w:id="598"/>
+    <w:bookmarkEnd w:id="599"/>
+    <w:bookmarkStart w:id="600" w:name="discussion"/>
     <w:p>
       <w:pPr>
         <w:pStyle w:val="Heading2"/>
@@ -16659,8 +16776,8 @@
         <w:t xml:space="preserve">have no data in this study and must not be read as null results. The mismatch-tolerance row is asymmetric for a measured reason (F3): the enzyme mode’s exact-first counting rule suppresses the near-neighbor search that becomes the sketch mode’s rescue channel at scale ~100. Sketch-side scaffolding and sketch mismatch tolerance rest on a rule-based port/simulation respectively, not on shipped CLI modes (F3/F4 REVIEW caveats).</w:t>
       </w:r>
     </w:p>
-    <w:bookmarkEnd w:id="493"/>
-    <w:bookmarkStart w:id="494" w:name="conclusions"/>
+    <w:bookmarkEnd w:id="600"/>
+    <w:bookmarkStart w:id="601" w:name="conclusions"/>
     <w:p>
       <w:pPr>
         <w:pStyle w:val="Heading2"/>
@@ -16701,8 +16818,8 @@
         <w:t xml:space="preserve">The count-level factorial adds one further deployment principle: sequencing depth cannot repair ambiguous landmark assignment. Multi-strain applications should therefore report shared-anchor fractions and per-reference unique coverage alongside depth and recall, and should treat coordinate fitting, assignment of shared evidence, and computational cost as separately auditable steps rather than collapsing them into a single end-to-end accuracy number.</w:t>
       </w:r>
     </w:p>
-    <w:bookmarkEnd w:id="494"/>
-    <w:bookmarkStart w:id="495" w:name="list-of-abbreviations"/>
+    <w:bookmarkEnd w:id="601"/>
+    <w:bookmarkStart w:id="602" w:name="list-of-abbreviations"/>
     <w:p>
       <w:pPr>
         <w:pStyle w:val="Heading2"/>
@@ -16749,8 +16866,8 @@
         <w:t xml:space="preserve">V-fit: coordinate-aware windowed V-shaped regression fit</w:t>
       </w:r>
     </w:p>
-    <w:bookmarkEnd w:id="495"/>
-    <w:bookmarkStart w:id="505" w:name="declarations"/>
+    <w:bookmarkEnd w:id="602"/>
+    <w:bookmarkStart w:id="612" w:name="declarations"/>
     <w:p>
       <w:pPr>
         <w:pStyle w:val="Heading2"/>
@@ -16759,7 +16876,7 @@
         <w:t xml:space="preserve">Declarations</w:t>
       </w:r>
     </w:p>
-    <w:bookmarkStart w:id="496" w:name="Xd182db0490b2de20bd2b4e4cc8698599182035f"/>
+    <w:bookmarkStart w:id="603" w:name="Xd182db0490b2de20bd2b4e4cc8698599182035f"/>
     <w:p>
       <w:pPr>
         <w:pStyle w:val="Heading3"/>
@@ -16776,8 +16893,8 @@
         <w:t xml:space="preserve">Not applicable. This study analysed only publicly available sequencing data.</w:t>
       </w:r>
     </w:p>
-    <w:bookmarkEnd w:id="496"/>
-    <w:bookmarkStart w:id="497" w:name="consent-for-publication"/>
+    <w:bookmarkEnd w:id="603"/>
+    <w:bookmarkStart w:id="604" w:name="consent-for-publication"/>
     <w:p>
       <w:pPr>
         <w:pStyle w:val="Heading3"/>
@@ -16794,8 +16911,8 @@
         <w:t xml:space="preserve">Not applicable.</w:t>
       </w:r>
     </w:p>
-    <w:bookmarkEnd w:id="497"/>
-    <w:bookmarkStart w:id="499" w:name="availability-of-data-and-materials"/>
+    <w:bookmarkEnd w:id="604"/>
+    <w:bookmarkStart w:id="606" w:name="availability-of-data-and-materials"/>
     <w:p>
       <w:pPr>
         <w:pStyle w:val="Heading3"/>
@@ -16814,7 +16931,7 @@
       <w:r>
         <w:t xml:space="preserve"> </w:t>
       </w:r>
-      <w:hyperlink r:id="rId445">
+      <w:hyperlink r:id="rId552">
         <w:r>
           <w:rPr>
             <w:rStyle w:val="Hyperlink"/>
@@ -16834,7 +16951,7 @@
       <w:r>
         <w:t xml:space="preserve"> </w:t>
       </w:r>
-      <w:hyperlink r:id="rId498">
+      <w:hyperlink r:id="rId605">
         <w:r>
           <w:rPr>
             <w:rStyle w:val="Hyperlink"/>
@@ -17005,6 +17122,30 @@
         <w:t xml:space="preserve"> </w:t>
       </w:r>
       <w:r>
+        <w:t xml:space="preserve">C5 fast-mode benchmark summaries and the per-genome output for sample</w:t>
+      </w:r>
+      <w:r>
+        <w:t xml:space="preserve"> </w:t>
+      </w:r>
+      <w:r>
+        <w:t xml:space="preserve">SRR28338156 are in</w:t>
+      </w:r>
+      <w:r>
+        <w:t xml:space="preserve"> </w:t>
+      </w:r>
+      <w:r>
+        <w:rPr>
+          <w:rStyle w:val="VerbatimChar"/>
+        </w:rPr>
+        <w:t xml:space="preserve">data/c5_fast_bench/</w:t>
+      </w:r>
+      <w:r>
+        <w:t xml:space="preserve">.</w:t>
+      </w:r>
+      <w:r>
+        <w:t xml:space="preserve"> </w:t>
+      </w:r>
+      <w:r>
         <w:t xml:space="preserve">Sequencing data: PRJNA615952 (Zheng</w:t>
       </w:r>
       <w:r>
@@ -17030,8 +17171,8 @@
         <w:t xml:space="preserve">study), PRJNA974210 (rotating biological contactor metagenome).</w:t>
       </w:r>
     </w:p>
-    <w:bookmarkEnd w:id="499"/>
-    <w:bookmarkStart w:id="500" w:name="competing-interests"/>
+    <w:bookmarkEnd w:id="606"/>
+    <w:bookmarkStart w:id="607" w:name="competing-interests"/>
     <w:p>
       <w:pPr>
         <w:pStyle w:val="Heading3"/>
@@ -17048,8 +17189,8 @@
         <w:t xml:space="preserve">The authors declare that they have no competing interests.</w:t>
       </w:r>
     </w:p>
-    <w:bookmarkEnd w:id="500"/>
-    <w:bookmarkStart w:id="501" w:name="funding"/>
+    <w:bookmarkEnd w:id="607"/>
+    <w:bookmarkStart w:id="608" w:name="funding"/>
     <w:p>
       <w:pPr>
         <w:pStyle w:val="Heading3"/>
@@ -17066,8 +17207,8 @@
         <w:t xml:space="preserve">[To be completed before submission.]</w:t>
       </w:r>
     </w:p>
-    <w:bookmarkEnd w:id="501"/>
-    <w:bookmarkStart w:id="502" w:name="authors-contributions"/>
+    <w:bookmarkEnd w:id="608"/>
+    <w:bookmarkStart w:id="609" w:name="authors-contributions"/>
     <w:p>
       <w:pPr>
         <w:pStyle w:val="Heading3"/>
@@ -17084,8 +17225,8 @@
         <w:t xml:space="preserve">[To be completed before submission using CRediT taxonomy and the final author initials.]</w:t>
       </w:r>
     </w:p>
-    <w:bookmarkEnd w:id="502"/>
-    <w:bookmarkStart w:id="503" w:name="acknowledgements"/>
+    <w:bookmarkEnd w:id="609"/>
+    <w:bookmarkStart w:id="610" w:name="acknowledgements"/>
     <w:p>
       <w:pPr>
         <w:pStyle w:val="Heading3"/>
@@ -17102,8 +17243,8 @@
         <w:t xml:space="preserve">[To be completed before submission or state “Not applicable.”]</w:t>
       </w:r>
     </w:p>
-    <w:bookmarkEnd w:id="503"/>
-    <w:bookmarkStart w:id="504" w:name="authors-information"/>
+    <w:bookmarkEnd w:id="610"/>
+    <w:bookmarkStart w:id="611" w:name="authors-information"/>
     <w:p>
       <w:pPr>
         <w:pStyle w:val="Heading3"/>
@@ -17120,9 +17261,9 @@
         <w:t xml:space="preserve">Not applicable.</w:t>
       </w:r>
     </w:p>
-    <w:bookmarkEnd w:id="504"/>
-    <w:bookmarkEnd w:id="505"/>
-    <w:bookmarkStart w:id="514" w:name="references"/>
+    <w:bookmarkEnd w:id="611"/>
+    <w:bookmarkEnd w:id="612"/>
+    <w:bookmarkStart w:id="621" w:name="references"/>
     <w:p>
       <w:pPr>
         <w:pStyle w:val="Heading2"/>
@@ -17155,7 +17296,7 @@
       <w:r>
         <w:t xml:space="preserve">. 2015;349(6252):1101–1106. doi:</w:t>
       </w:r>
-      <w:hyperlink r:id="rId506">
+      <w:hyperlink r:id="rId613">
         <w:r>
           <w:rPr>
             <w:rStyle w:val="Hyperlink"/>
@@ -17188,7 +17329,7 @@
       <w:r>
         <w:t xml:space="preserve">. 2016;34(12):1256–1263. doi:</w:t>
       </w:r>
-      <w:hyperlink r:id="rId507">
+      <w:hyperlink r:id="rId614">
         <w:r>
           <w:rPr>
             <w:rStyle w:val="Hyperlink"/>
@@ -17221,7 +17362,7 @@
       <w:r>
         <w:t xml:space="preserve">. 2022;32(3):558–568. doi:</w:t>
       </w:r>
-      <w:hyperlink r:id="rId508">
+      <w:hyperlink r:id="rId615">
         <w:r>
           <w:rPr>
             <w:rStyle w:val="Hyperlink"/>
@@ -17254,7 +17395,7 @@
       <w:r>
         <w:t xml:space="preserve">. 2026;14(1):128. doi:</w:t>
       </w:r>
-      <w:hyperlink r:id="rId509">
+      <w:hyperlink r:id="rId616">
         <w:r>
           <w:rPr>
             <w:rStyle w:val="Hyperlink"/>
@@ -17287,7 +17428,7 @@
       <w:r>
         <w:t xml:space="preserve">. 2012;9(8):808–810. doi:</w:t>
       </w:r>
-      <w:hyperlink r:id="rId510">
+      <w:hyperlink r:id="rId617">
         <w:r>
           <w:rPr>
             <w:rStyle w:val="Hyperlink"/>
@@ -17320,7 +17461,7 @@
       <w:r>
         <w:t xml:space="preserve">. 2020;15(4):e0219882. doi:</w:t>
       </w:r>
-      <w:hyperlink r:id="rId511">
+      <w:hyperlink r:id="rId618">
         <w:r>
           <w:rPr>
             <w:rStyle w:val="Hyperlink"/>
@@ -17353,7 +17494,7 @@
       <w:r>
         <w:t xml:space="preserve">. 2022;23:36. doi:</w:t>
       </w:r>
-      <w:hyperlink r:id="rId512">
+      <w:hyperlink r:id="rId619">
         <w:r>
           <w:rPr>
             <w:rStyle w:val="Hyperlink"/>
@@ -17386,7 +17527,7 @@
       <w:r>
         <w:t xml:space="preserve">. 2022. doi:</w:t>
       </w:r>
-      <w:hyperlink r:id="rId513">
+      <w:hyperlink r:id="rId620">
         <w:r>
           <w:rPr>
             <w:rStyle w:val="Hyperlink"/>
@@ -17395,8 +17536,8 @@
         </w:r>
       </w:hyperlink>
     </w:p>
-    <w:bookmarkEnd w:id="514"/>
-    <w:bookmarkStart w:id="542" w:name="figures"/>
+    <w:bookmarkEnd w:id="621"/>
+    <w:bookmarkStart w:id="649" w:name="figures"/>
     <w:p>
       <w:pPr>
         <w:pStyle w:val="Heading2"/>
@@ -17414,18 +17555,18 @@
           <wp:inline>
             <wp:extent cx="5943600" cy="4067536"/>
             <wp:effectExtent b="0" l="0" r="0" t="0"/>
-            <wp:docPr descr="Fig. 1. Overview and worked example" title="" id="516" name="Picture"/>
+            <wp:docPr descr="Fig. 1. Overview and worked example" title="" id="623" name="Picture"/>
             <a:graphic>
               <a:graphicData uri="http://schemas.openxmlformats.org/drawingml/2006/picture">
                 <pic:pic>
                   <pic:nvPicPr>
-                    <pic:cNvPr descr="../figures/out/fig1_overview.png" id="517" name="Picture"/>
+                    <pic:cNvPr descr="../figures/out/fig1_overview.png" id="624" name="Picture"/>
                     <pic:cNvPicPr>
                       <a:picLocks noChangeArrowheads="1" noChangeAspect="1"/>
                     </pic:cNvPicPr>
                   </pic:nvPicPr>
                   <pic:blipFill>
-                    <a:blip r:embed="rId515"/>
+                    <a:blip r:embed="rId622"/>
                     <a:stretch>
                       <a:fillRect/>
                     </a:stretch>
@@ -17479,18 +17620,18 @@
           <wp:inline>
             <wp:extent cx="5943600" cy="2123380"/>
             <wp:effectExtent b="0" l="0" r="0" t="0"/>
-            <wp:docPr descr="Fig. 2. Zheng isolate benchmark, accuracy versus coverage, and run-out control" title="" id="519" name="Picture"/>
+            <wp:docPr descr="Fig. 2. Zheng isolate benchmark, accuracy versus coverage, and run-out control" title="" id="626" name="Picture"/>
             <a:graphic>
               <a:graphicData uri="http://schemas.openxmlformats.org/drawingml/2006/picture">
                 <pic:pic>
                   <pic:nvPicPr>
-                    <pic:cNvPr descr="../figures/out/fig2_zheng_benchmark.png" id="520" name="Picture"/>
+                    <pic:cNvPr descr="../figures/out/fig2_zheng_benchmark.png" id="627" name="Picture"/>
                     <pic:cNvPicPr>
                       <a:picLocks noChangeArrowheads="1" noChangeAspect="1"/>
                     </pic:cNvPicPr>
                   </pic:nvPicPr>
                   <pic:blipFill>
-                    <a:blip r:embed="rId518"/>
+                    <a:blip r:embed="rId625"/>
                     <a:stretch>
                       <a:fillRect/>
                     </a:stretch>
@@ -17544,18 +17685,18 @@
           <wp:inline>
             <wp:extent cx="5943600" cy="2397967"/>
             <wp:effectExtent b="0" l="0" r="0" t="0"/>
-            <wp:docPr descr="Fig. 3. Multi-strain simulation" title="" id="522" name="Picture"/>
+            <wp:docPr descr="Fig. 3. Multi-strain simulation" title="" id="629" name="Picture"/>
             <a:graphic>
               <a:graphicData uri="http://schemas.openxmlformats.org/drawingml/2006/picture">
                 <pic:pic>
                   <pic:nvPicPr>
-                    <pic:cNvPr descr="../figures/out/fig3_simulation.png" id="523" name="Picture"/>
+                    <pic:cNvPr descr="../figures/out/fig3_simulation.png" id="630" name="Picture"/>
                     <pic:cNvPicPr>
                       <a:picLocks noChangeArrowheads="1" noChangeAspect="1"/>
                     </pic:cNvPicPr>
                   </pic:nvPicPr>
                   <pic:blipFill>
-                    <a:blip r:embed="rId521"/>
+                    <a:blip r:embed="rId628"/>
                     <a:stretch>
                       <a:fillRect/>
                     </a:stretch>
@@ -17609,18 +17750,18 @@
           <wp:inline>
             <wp:extent cx="5943600" cy="2011791"/>
             <wp:effectExtent b="0" l="0" r="0" t="0"/>
-            <wp:docPr descr="Fig. 4. Landmark-source attribution" title="" id="525" name="Picture"/>
+            <wp:docPr descr="Fig. 4. Landmark-source attribution" title="" id="632" name="Picture"/>
             <a:graphic>
               <a:graphicData uri="http://schemas.openxmlformats.org/drawingml/2006/picture">
                 <pic:pic>
                   <pic:nvPicPr>
-                    <pic:cNvPr descr="../figures/out/fig4_attribution.png" id="526" name="Picture"/>
+                    <pic:cNvPr descr="../figures/out/fig4_attribution.png" id="633" name="Picture"/>
                     <pic:cNvPicPr>
                       <a:picLocks noChangeArrowheads="1" noChangeAspect="1"/>
                     </pic:cNvPicPr>
                   </pic:nvPicPr>
                   <pic:blipFill>
-                    <a:blip r:embed="rId524"/>
+                    <a:blip r:embed="rId631"/>
                     <a:stretch>
                       <a:fillRect/>
                     </a:stretch>
@@ -17674,18 +17815,18 @@
           <wp:inline>
             <wp:extent cx="5943600" cy="1907620"/>
             <wp:effectExtent b="0" l="0" r="0" t="0"/>
-            <wp:docPr descr="Fig. 5. Count-level factorial decomposition of estimator, depth and shared-anchor ambiguity" title="" id="528" name="Picture"/>
+            <wp:docPr descr="Fig. 5. Count-level factorial decomposition of estimator, depth and shared-anchor ambiguity" title="" id="635" name="Picture"/>
             <a:graphic>
               <a:graphicData uri="http://schemas.openxmlformats.org/drawingml/2006/picture">
                 <pic:pic>
                   <pic:nvPicPr>
-                    <pic:cNvPr descr="../figures/out/fig5_factorial_mechanism.png" id="529" name="Picture"/>
+                    <pic:cNvPr descr="../figures/out/fig5_factorial_mechanism.png" id="636" name="Picture"/>
                     <pic:cNvPicPr>
                       <a:picLocks noChangeArrowheads="1" noChangeAspect="1"/>
                     </pic:cNvPicPr>
                   </pic:nvPicPr>
                   <pic:blipFill>
-                    <a:blip r:embed="rId527"/>
+                    <a:blip r:embed="rId634"/>
                     <a:stretch>
                       <a:fillRect/>
                     </a:stretch>
@@ -17739,18 +17880,18 @@
           <wp:inline>
             <wp:extent cx="5943600" cy="4181188"/>
             <wp:effectExtent b="0" l="0" r="0" t="0"/>
-            <wp:docPr descr="Fig. 6. Panel-size sweep and GC range" title="" id="531" name="Picture"/>
+            <wp:docPr descr="Fig. 6. Panel-size sweep and GC range" title="" id="638" name="Picture"/>
             <a:graphic>
               <a:graphicData uri="http://schemas.openxmlformats.org/drawingml/2006/picture">
                 <pic:pic>
                   <pic:nvPicPr>
-                    <pic:cNvPr descr="../figures/out/fig6_panel_design.png" id="532" name="Picture"/>
+                    <pic:cNvPr descr="../figures/out/fig6_panel_design.png" id="639" name="Picture"/>
                     <pic:cNvPicPr>
                       <a:picLocks noChangeArrowheads="1" noChangeAspect="1"/>
                     </pic:cNvPicPr>
                   </pic:nvPicPr>
                   <pic:blipFill>
-                    <a:blip r:embed="rId530"/>
+                    <a:blip r:embed="rId637"/>
                     <a:stretch>
                       <a:fillRect/>
                     </a:stretch>
@@ -17804,18 +17945,18 @@
           <wp:inline>
             <wp:extent cx="5943600" cy="4873369"/>
             <wp:effectExtent b="0" l="0" r="0" t="0"/>
-            <wp:docPr descr="Fig. 7. Fragmentation and scaffolding" title="" id="534" name="Picture"/>
+            <wp:docPr descr="Fig. 7. Fragmentation and scaffolding" title="" id="641" name="Picture"/>
             <a:graphic>
               <a:graphicData uri="http://schemas.openxmlformats.org/drawingml/2006/picture">
                 <pic:pic>
                   <pic:nvPicPr>
-                    <pic:cNvPr descr="../figures/out/fig7_fragmentation.png" id="535" name="Picture"/>
+                    <pic:cNvPr descr="../figures/out/fig7_fragmentation.png" id="642" name="Picture"/>
                     <pic:cNvPicPr>
                       <a:picLocks noChangeArrowheads="1" noChangeAspect="1"/>
                     </pic:cNvPicPr>
                   </pic:nvPicPr>
                   <pic:blipFill>
-                    <a:blip r:embed="rId533"/>
+                    <a:blip r:embed="rId640"/>
                     <a:stretch>
                       <a:fillRect/>
                     </a:stretch>
@@ -17869,18 +18010,18 @@
           <wp:inline>
             <wp:extent cx="5943600" cy="2396004"/>
             <wp:effectExtent b="0" l="0" r="0" t="0"/>
-            <wp:docPr descr="Fig. 8. Fecal-cohort concordance" title="" id="537" name="Picture"/>
+            <wp:docPr descr="Fig. 8. Fecal-cohort concordance" title="" id="644" name="Picture"/>
             <a:graphic>
               <a:graphicData uri="http://schemas.openxmlformats.org/drawingml/2006/picture">
                 <pic:pic>
                   <pic:nvPicPr>
-                    <pic:cNvPr descr="../figures/out/fig8_metagenome.png" id="538" name="Picture"/>
+                    <pic:cNvPr descr="../figures/out/fig8_metagenome.png" id="645" name="Picture"/>
                     <pic:cNvPicPr>
                       <a:picLocks noChangeArrowheads="1" noChangeAspect="1"/>
                     </pic:cNvPicPr>
                   </pic:nvPicPr>
                   <pic:blipFill>
-                    <a:blip r:embed="rId536"/>
+                    <a:blip r:embed="rId643"/>
                     <a:stretch>
                       <a:fillRect/>
                     </a:stretch>
@@ -17934,18 +18075,18 @@
           <wp:inline>
             <wp:extent cx="5943600" cy="2642374"/>
             <wp:effectExtent b="0" l="0" r="0" t="0"/>
-            <wp:docPr descr="Fig. 9. MAG-scale QC and cost" title="" id="540" name="Picture"/>
+            <wp:docPr descr="Fig. 9. MAG-scale QC and cost" title="" id="647" name="Picture"/>
             <a:graphic>
               <a:graphicData uri="http://schemas.openxmlformats.org/drawingml/2006/picture">
                 <pic:pic>
                   <pic:nvPicPr>
-                    <pic:cNvPr descr="../figures/out/fig9_mag_qc_cost.png" id="541" name="Picture"/>
+                    <pic:cNvPr descr="../figures/out/fig9_mag_qc_cost.png" id="648" name="Picture"/>
                     <pic:cNvPicPr>
                       <a:picLocks noChangeArrowheads="1" noChangeAspect="1"/>
                     </pic:cNvPicPr>
                   </pic:nvPicPr>
                   <pic:blipFill>
-                    <a:blip r:embed="rId539"/>
+                    <a:blip r:embed="rId646"/>
                     <a:stretch>
                       <a:fillRect/>
                     </a:stretch>
@@ -17990,8 +18131,8 @@
         <w:t xml:space="preserve">MAG-scale QC and cost</w:t>
       </w:r>
     </w:p>
-    <w:bookmarkEnd w:id="542"/>
-    <w:bookmarkStart w:id="543" w:name="tables"/>
+    <w:bookmarkEnd w:id="649"/>
+    <w:bookmarkStart w:id="650" w:name="tables"/>
     <w:p>
       <w:pPr>
         <w:pStyle w:val="Heading2"/>
@@ -42080,8 +42221,922 @@
         </w:tc>
       </w:tr>
     </w:tbl>
-    <w:bookmarkEnd w:id="543"/>
-    <w:bookmarkEnd w:id="544"/>
+    <w:p>
+      <w:pPr>
+        <w:pStyle w:val="BodyText"/>
+      </w:pPr>
+      <w:r>
+        <w:rPr>
+          <w:b/>
+          <w:bCs/>
+        </w:rPr>
+        <w:t xml:space="preserve">Table 12. C5 fast-mode benchmark: 8 enzymes and mismatch 1 on one full-depth sample.</w:t>
+      </w:r>
+    </w:p>
+    <w:tbl>
+      <w:tblPr>
+        <w:tblStyle w:val="Table"/>
+        <w:tblW w:type="pct" w:w="5000"/>
+        <w:tblLayout w:type="fixed"/>
+        <w:tblLook w:firstRow="1" w:lastRow="0" w:firstColumn="0" w:lastColumn="0" w:noHBand="0" w:noVBand="0" w:val="0020"/>
+      </w:tblPr>
+      <w:tblGrid>
+        <w:gridCol w:w="736"/>
+        <w:gridCol w:w="736"/>
+        <w:gridCol w:w="736"/>
+        <w:gridCol w:w="552"/>
+        <w:gridCol w:w="736"/>
+        <w:gridCol w:w="736"/>
+        <w:gridCol w:w="736"/>
+        <w:gridCol w:w="736"/>
+        <w:gridCol w:w="736"/>
+        <w:gridCol w:w="736"/>
+        <w:gridCol w:w="736"/>
+      </w:tblGrid>
+      <w:tr>
+        <w:trPr>
+          <w:tblHeader w:val="on"/>
+        </w:trPr>
+        <w:tc>
+          <w:tcPr/>
+          <w:p>
+            <w:pPr>
+              <w:pStyle w:val="Compact"/>
+              <w:jc w:val="left"/>
+            </w:pPr>
+            <w:r>
+              <w:t xml:space="preserve">arm</w:t>
+            </w:r>
+          </w:p>
+        </w:tc>
+        <w:tc>
+          <w:tcPr/>
+          <w:p>
+            <w:pPr>
+              <w:pStyle w:val="Compact"/>
+              <w:jc w:val="right"/>
+            </w:pPr>
+            <w:r>
+              <w:t xml:space="preserve">enzymes</w:t>
+            </w:r>
+          </w:p>
+        </w:tc>
+        <w:tc>
+          <w:tcPr/>
+          <w:p>
+            <w:pPr>
+              <w:pStyle w:val="Compact"/>
+              <w:jc w:val="right"/>
+            </w:pPr>
+            <w:r>
+              <w:t xml:space="preserve">mismatch</w:t>
+            </w:r>
+          </w:p>
+        </w:tc>
+        <w:tc>
+          <w:tcPr/>
+          <w:p>
+            <w:pPr>
+              <w:pStyle w:val="Compact"/>
+            </w:pPr>
+            <w:r>
+              <w:t xml:space="preserve">screen</w:t>
+            </w:r>
+          </w:p>
+        </w:tc>
+        <w:tc>
+          <w:tcPr/>
+          <w:p>
+            <w:pPr>
+              <w:pStyle w:val="Compact"/>
+              <w:jc w:val="right"/>
+            </w:pPr>
+            <w:r>
+              <w:t xml:space="preserve">threads</w:t>
+            </w:r>
+          </w:p>
+        </w:tc>
+        <w:tc>
+          <w:tcPr/>
+          <w:p>
+            <w:pPr>
+              <w:pStyle w:val="Compact"/>
+              <w:jc w:val="right"/>
+            </w:pPr>
+            <w:r>
+              <w:t xml:space="preserve">wall_s</w:t>
+            </w:r>
+          </w:p>
+        </w:tc>
+        <w:tc>
+          <w:tcPr/>
+          <w:p>
+            <w:pPr>
+              <w:pStyle w:val="Compact"/>
+              <w:jc w:val="right"/>
+            </w:pPr>
+            <w:r>
+              <w:t xml:space="preserve">wall_h</w:t>
+            </w:r>
+          </w:p>
+        </w:tc>
+        <w:tc>
+          <w:tcPr/>
+          <w:p>
+            <w:pPr>
+              <w:pStyle w:val="Compact"/>
+              <w:jc w:val="right"/>
+            </w:pPr>
+            <w:r>
+              <w:t xml:space="preserve">peak_rss_gb</w:t>
+            </w:r>
+          </w:p>
+        </w:tc>
+        <w:tc>
+          <w:tcPr/>
+          <w:p>
+            <w:pPr>
+              <w:pStyle w:val="Compact"/>
+              <w:jc w:val="right"/>
+            </w:pPr>
+            <w:r>
+              <w:t xml:space="preserve">n_finite_ptr</w:t>
+            </w:r>
+          </w:p>
+        </w:tc>
+        <w:tc>
+          <w:tcPr/>
+          <w:p>
+            <w:pPr>
+              <w:pStyle w:val="Compact"/>
+              <w:jc w:val="right"/>
+            </w:pPr>
+            <w:r>
+              <w:t xml:space="preserve">n_qc_pass</w:t>
+            </w:r>
+          </w:p>
+        </w:tc>
+        <w:tc>
+          <w:tcPr/>
+          <w:p>
+            <w:pPr>
+              <w:pStyle w:val="Compact"/>
+              <w:jc w:val="right"/>
+            </w:pPr>
+            <w:r>
+              <w:t xml:space="preserve">median_abs_log2ptr_common_qc</w:t>
+            </w:r>
+          </w:p>
+        </w:tc>
+      </w:tr>
+      <w:tr>
+        <w:tc>
+          <w:tcPr/>
+          <w:p>
+            <w:pPr>
+              <w:pStyle w:val="Compact"/>
+              <w:jc w:val="left"/>
+            </w:pPr>
+            <w:r>
+              <w:t xml:space="preserve">k16_mm2_current</w:t>
+            </w:r>
+          </w:p>
+        </w:tc>
+        <w:tc>
+          <w:tcPr/>
+          <w:p>
+            <w:pPr>
+              <w:pStyle w:val="Compact"/>
+              <w:jc w:val="right"/>
+            </w:pPr>
+            <w:r>
+              <w:t xml:space="preserve">16</w:t>
+            </w:r>
+          </w:p>
+        </w:tc>
+        <w:tc>
+          <w:tcPr/>
+          <w:p>
+            <w:pPr>
+              <w:pStyle w:val="Compact"/>
+              <w:jc w:val="right"/>
+            </w:pPr>
+            <w:r>
+              <w:t xml:space="preserve">2</w:t>
+            </w:r>
+          </w:p>
+        </w:tc>
+        <w:tc>
+          <w:tcPr/>
+          <w:p>
+            <w:pPr>
+              <w:pStyle w:val="Compact"/>
+            </w:pPr>
+            <w:r>
+              <w:t xml:space="preserve">no</w:t>
+            </w:r>
+          </w:p>
+        </w:tc>
+        <w:tc>
+          <w:tcPr/>
+          <w:p>
+            <w:pPr>
+              <w:pStyle w:val="Compact"/>
+              <w:jc w:val="right"/>
+            </w:pPr>
+            <w:r>
+              <w:t xml:space="preserve">8</w:t>
+            </w:r>
+          </w:p>
+        </w:tc>
+        <w:tc>
+          <w:tcPr/>
+          <w:p>
+            <w:pPr>
+              <w:pStyle w:val="Compact"/>
+              <w:jc w:val="right"/>
+            </w:pPr>
+            <w:r>
+              <w:t xml:space="preserve">76218.63</w:t>
+            </w:r>
+          </w:p>
+        </w:tc>
+        <w:tc>
+          <w:tcPr/>
+          <w:p>
+            <w:pPr>
+              <w:pStyle w:val="Compact"/>
+              <w:jc w:val="right"/>
+            </w:pPr>
+            <w:r>
+              <w:t xml:space="preserve">21.1718</w:t>
+            </w:r>
+          </w:p>
+        </w:tc>
+        <w:tc>
+          <w:tcPr/>
+          <w:p>
+            <w:pPr>
+              <w:pStyle w:val="Compact"/>
+              <w:jc w:val="right"/>
+            </w:pPr>
+            <w:r>
+              <w:t xml:space="preserve">15.3719</w:t>
+            </w:r>
+          </w:p>
+        </w:tc>
+        <w:tc>
+          <w:tcPr/>
+          <w:p>
+            <w:pPr>
+              <w:pStyle w:val="Compact"/>
+              <w:jc w:val="right"/>
+            </w:pPr>
+            <w:r>
+              <w:t xml:space="preserve">8</w:t>
+            </w:r>
+          </w:p>
+        </w:tc>
+        <w:tc>
+          <w:tcPr/>
+          <w:p>
+            <w:pPr>
+              <w:pStyle w:val="Compact"/>
+              <w:jc w:val="right"/>
+            </w:pPr>
+            <w:r>
+              <w:t xml:space="preserve">4</w:t>
+            </w:r>
+          </w:p>
+        </w:tc>
+        <w:tc>
+          <w:tcPr/>
+          <w:p>
+            <w:pPr>
+              <w:pStyle w:val="Compact"/>
+              <w:jc w:val="right"/>
+            </w:pPr>
+            <w:r>
+              <w:t xml:space="preserve">NA</w:t>
+            </w:r>
+          </w:p>
+        </w:tc>
+      </w:tr>
+      <w:tr>
+        <w:tc>
+          <w:tcPr/>
+          <w:p>
+            <w:pPr>
+              <w:pStyle w:val="Compact"/>
+              <w:jc w:val="left"/>
+            </w:pPr>
+            <w:r>
+              <w:t xml:space="preserve">k8_mm1_fast</w:t>
+            </w:r>
+          </w:p>
+        </w:tc>
+        <w:tc>
+          <w:tcPr/>
+          <w:p>
+            <w:pPr>
+              <w:pStyle w:val="Compact"/>
+              <w:jc w:val="right"/>
+            </w:pPr>
+            <w:r>
+              <w:t xml:space="preserve">8</w:t>
+            </w:r>
+          </w:p>
+        </w:tc>
+        <w:tc>
+          <w:tcPr/>
+          <w:p>
+            <w:pPr>
+              <w:pStyle w:val="Compact"/>
+              <w:jc w:val="right"/>
+            </w:pPr>
+            <w:r>
+              <w:t xml:space="preserve">1</w:t>
+            </w:r>
+          </w:p>
+        </w:tc>
+        <w:tc>
+          <w:tcPr/>
+          <w:p>
+            <w:pPr>
+              <w:pStyle w:val="Compact"/>
+            </w:pPr>
+            <w:r>
+              <w:t xml:space="preserve">no</w:t>
+            </w:r>
+          </w:p>
+        </w:tc>
+        <w:tc>
+          <w:tcPr/>
+          <w:p>
+            <w:pPr>
+              <w:pStyle w:val="Compact"/>
+              <w:jc w:val="right"/>
+            </w:pPr>
+            <w:r>
+              <w:t xml:space="preserve">8</w:t>
+            </w:r>
+          </w:p>
+        </w:tc>
+        <w:tc>
+          <w:tcPr/>
+          <w:p>
+            <w:pPr>
+              <w:pStyle w:val="Compact"/>
+              <w:jc w:val="right"/>
+            </w:pPr>
+            <w:r>
+              <w:t xml:space="preserve">4551.00</w:t>
+            </w:r>
+          </w:p>
+        </w:tc>
+        <w:tc>
+          <w:tcPr/>
+          <w:p>
+            <w:pPr>
+              <w:pStyle w:val="Compact"/>
+              <w:jc w:val="right"/>
+            </w:pPr>
+            <w:r>
+              <w:t xml:space="preserve">1.2642</w:t>
+            </w:r>
+          </w:p>
+        </w:tc>
+        <w:tc>
+          <w:tcPr/>
+          <w:p>
+            <w:pPr>
+              <w:pStyle w:val="Compact"/>
+              <w:jc w:val="right"/>
+            </w:pPr>
+            <w:r>
+              <w:t xml:space="preserve">10.3765</w:t>
+            </w:r>
+          </w:p>
+        </w:tc>
+        <w:tc>
+          <w:tcPr/>
+          <w:p>
+            <w:pPr>
+              <w:pStyle w:val="Compact"/>
+              <w:jc w:val="right"/>
+            </w:pPr>
+            <w:r>
+              <w:t xml:space="preserve">8</w:t>
+            </w:r>
+          </w:p>
+        </w:tc>
+        <w:tc>
+          <w:tcPr/>
+          <w:p>
+            <w:pPr>
+              <w:pStyle w:val="Compact"/>
+              <w:jc w:val="right"/>
+            </w:pPr>
+            <w:r>
+              <w:t xml:space="preserve">3</w:t>
+            </w:r>
+          </w:p>
+        </w:tc>
+        <w:tc>
+          <w:tcPr/>
+          <w:p>
+            <w:pPr>
+              <w:pStyle w:val="Compact"/>
+              <w:jc w:val="right"/>
+            </w:pPr>
+            <w:r>
+              <w:t xml:space="preserve">0.019429</w:t>
+            </w:r>
+          </w:p>
+        </w:tc>
+      </w:tr>
+    </w:tbl>
+    <w:p>
+      <w:pPr>
+        <w:pStyle w:val="BodyText"/>
+      </w:pPr>
+      <w:r>
+        <w:t xml:space="preserve">Current policy is the C5 refusion arm under the conservative fragmented-reference rule. The fast arm uses the top-8 ranked enzymes and mismatch 1 without a containment screen.</w:t>
+      </w:r>
+      <w:r>
+        <w:t xml:space="preserve"> </w:t>
+      </w:r>
+      <w:r>
+        <w:rPr>
+          <w:rStyle w:val="VerbatimChar"/>
+        </w:rPr>
+        <w:t xml:space="preserve">median_abs_log2ptr_common_qc</w:t>
+      </w:r>
+      <w:r>
+        <w:t xml:space="preserve"> </w:t>
+      </w:r>
+      <w:r>
+        <w:t xml:space="preserve">is the median absolute log2 PTR difference for the three genomes that pass QC in both arms. SLURM job 4095386; sample SRR28338156; 67,423,986 reads.</w:t>
+      </w:r>
+      <w:r>
+        <w:t xml:space="preserve"> </w:t>
+      </w:r>
+      <w:r>
+        <w:rPr>
+          <w:b/>
+          <w:bCs/>
+        </w:rPr>
+        <w:t xml:space="preserve">Table 12. C5 fast-mode benchmark: 8 enzymes and mismatch 1 on one full-depth sample.</w:t>
+      </w:r>
+    </w:p>
+    <w:tbl>
+      <w:tblPr>
+        <w:tblStyle w:val="Table"/>
+        <w:tblW w:type="pct" w:w="5000"/>
+        <w:tblLayout w:type="fixed"/>
+        <w:tblLook w:firstRow="1" w:lastRow="0" w:firstColumn="0" w:lastColumn="0" w:noHBand="0" w:noVBand="0" w:val="0020"/>
+      </w:tblPr>
+      <w:tblGrid>
+        <w:gridCol w:w="736"/>
+        <w:gridCol w:w="736"/>
+        <w:gridCol w:w="736"/>
+        <w:gridCol w:w="552"/>
+        <w:gridCol w:w="736"/>
+        <w:gridCol w:w="736"/>
+        <w:gridCol w:w="736"/>
+        <w:gridCol w:w="736"/>
+        <w:gridCol w:w="736"/>
+        <w:gridCol w:w="736"/>
+        <w:gridCol w:w="736"/>
+      </w:tblGrid>
+      <w:tr>
+        <w:trPr>
+          <w:tblHeader w:val="on"/>
+        </w:trPr>
+        <w:tc>
+          <w:tcPr/>
+          <w:p>
+            <w:pPr>
+              <w:pStyle w:val="Compact"/>
+              <w:jc w:val="left"/>
+            </w:pPr>
+            <w:r>
+              <w:t xml:space="preserve">arm</w:t>
+            </w:r>
+          </w:p>
+        </w:tc>
+        <w:tc>
+          <w:tcPr/>
+          <w:p>
+            <w:pPr>
+              <w:pStyle w:val="Compact"/>
+              <w:jc w:val="right"/>
+            </w:pPr>
+            <w:r>
+              <w:t xml:space="preserve">enzymes</w:t>
+            </w:r>
+          </w:p>
+        </w:tc>
+        <w:tc>
+          <w:tcPr/>
+          <w:p>
+            <w:pPr>
+              <w:pStyle w:val="Compact"/>
+              <w:jc w:val="right"/>
+            </w:pPr>
+            <w:r>
+              <w:t xml:space="preserve">mismatch</w:t>
+            </w:r>
+          </w:p>
+        </w:tc>
+        <w:tc>
+          <w:tcPr/>
+          <w:p>
+            <w:pPr>
+              <w:pStyle w:val="Compact"/>
+            </w:pPr>
+            <w:r>
+              <w:t xml:space="preserve">screen</w:t>
+            </w:r>
+          </w:p>
+        </w:tc>
+        <w:tc>
+          <w:tcPr/>
+          <w:p>
+            <w:pPr>
+              <w:pStyle w:val="Compact"/>
+              <w:jc w:val="right"/>
+            </w:pPr>
+            <w:r>
+              <w:t xml:space="preserve">threads</w:t>
+            </w:r>
+          </w:p>
+        </w:tc>
+        <w:tc>
+          <w:tcPr/>
+          <w:p>
+            <w:pPr>
+              <w:pStyle w:val="Compact"/>
+              <w:jc w:val="right"/>
+            </w:pPr>
+            <w:r>
+              <w:t xml:space="preserve">wall_s</w:t>
+            </w:r>
+          </w:p>
+        </w:tc>
+        <w:tc>
+          <w:tcPr/>
+          <w:p>
+            <w:pPr>
+              <w:pStyle w:val="Compact"/>
+              <w:jc w:val="right"/>
+            </w:pPr>
+            <w:r>
+              <w:t xml:space="preserve">wall_h</w:t>
+            </w:r>
+          </w:p>
+        </w:tc>
+        <w:tc>
+          <w:tcPr/>
+          <w:p>
+            <w:pPr>
+              <w:pStyle w:val="Compact"/>
+              <w:jc w:val="right"/>
+            </w:pPr>
+            <w:r>
+              <w:t xml:space="preserve">peak_rss_gb</w:t>
+            </w:r>
+          </w:p>
+        </w:tc>
+        <w:tc>
+          <w:tcPr/>
+          <w:p>
+            <w:pPr>
+              <w:pStyle w:val="Compact"/>
+              <w:jc w:val="right"/>
+            </w:pPr>
+            <w:r>
+              <w:t xml:space="preserve">n_finite_ptr</w:t>
+            </w:r>
+          </w:p>
+        </w:tc>
+        <w:tc>
+          <w:tcPr/>
+          <w:p>
+            <w:pPr>
+              <w:pStyle w:val="Compact"/>
+              <w:jc w:val="right"/>
+            </w:pPr>
+            <w:r>
+              <w:t xml:space="preserve">n_qc_pass</w:t>
+            </w:r>
+          </w:p>
+        </w:tc>
+        <w:tc>
+          <w:tcPr/>
+          <w:p>
+            <w:pPr>
+              <w:pStyle w:val="Compact"/>
+              <w:jc w:val="right"/>
+            </w:pPr>
+            <w:r>
+              <w:t xml:space="preserve">median_abs_log2ptr_common_qc</w:t>
+            </w:r>
+          </w:p>
+        </w:tc>
+      </w:tr>
+      <w:tr>
+        <w:tc>
+          <w:tcPr/>
+          <w:p>
+            <w:pPr>
+              <w:pStyle w:val="Compact"/>
+              <w:jc w:val="left"/>
+            </w:pPr>
+            <w:r>
+              <w:t xml:space="preserve">k16_mm2_current</w:t>
+            </w:r>
+          </w:p>
+        </w:tc>
+        <w:tc>
+          <w:tcPr/>
+          <w:p>
+            <w:pPr>
+              <w:pStyle w:val="Compact"/>
+              <w:jc w:val="right"/>
+            </w:pPr>
+            <w:r>
+              <w:t xml:space="preserve">16</w:t>
+            </w:r>
+          </w:p>
+        </w:tc>
+        <w:tc>
+          <w:tcPr/>
+          <w:p>
+            <w:pPr>
+              <w:pStyle w:val="Compact"/>
+              <w:jc w:val="right"/>
+            </w:pPr>
+            <w:r>
+              <w:t xml:space="preserve">2</w:t>
+            </w:r>
+          </w:p>
+        </w:tc>
+        <w:tc>
+          <w:tcPr/>
+          <w:p>
+            <w:pPr>
+              <w:pStyle w:val="Compact"/>
+            </w:pPr>
+            <w:r>
+              <w:t xml:space="preserve">no</w:t>
+            </w:r>
+          </w:p>
+        </w:tc>
+        <w:tc>
+          <w:tcPr/>
+          <w:p>
+            <w:pPr>
+              <w:pStyle w:val="Compact"/>
+              <w:jc w:val="right"/>
+            </w:pPr>
+            <w:r>
+              <w:t xml:space="preserve">8</w:t>
+            </w:r>
+          </w:p>
+        </w:tc>
+        <w:tc>
+          <w:tcPr/>
+          <w:p>
+            <w:pPr>
+              <w:pStyle w:val="Compact"/>
+              <w:jc w:val="right"/>
+            </w:pPr>
+            <w:r>
+              <w:t xml:space="preserve">76218.63</w:t>
+            </w:r>
+          </w:p>
+        </w:tc>
+        <w:tc>
+          <w:tcPr/>
+          <w:p>
+            <w:pPr>
+              <w:pStyle w:val="Compact"/>
+              <w:jc w:val="right"/>
+            </w:pPr>
+            <w:r>
+              <w:t xml:space="preserve">21.1718</w:t>
+            </w:r>
+          </w:p>
+        </w:tc>
+        <w:tc>
+          <w:tcPr/>
+          <w:p>
+            <w:pPr>
+              <w:pStyle w:val="Compact"/>
+              <w:jc w:val="right"/>
+            </w:pPr>
+            <w:r>
+              <w:t xml:space="preserve">15.3719</w:t>
+            </w:r>
+          </w:p>
+        </w:tc>
+        <w:tc>
+          <w:tcPr/>
+          <w:p>
+            <w:pPr>
+              <w:pStyle w:val="Compact"/>
+              <w:jc w:val="right"/>
+            </w:pPr>
+            <w:r>
+              <w:t xml:space="preserve">8</w:t>
+            </w:r>
+          </w:p>
+        </w:tc>
+        <w:tc>
+          <w:tcPr/>
+          <w:p>
+            <w:pPr>
+              <w:pStyle w:val="Compact"/>
+              <w:jc w:val="right"/>
+            </w:pPr>
+            <w:r>
+              <w:t xml:space="preserve">4</w:t>
+            </w:r>
+          </w:p>
+        </w:tc>
+        <w:tc>
+          <w:tcPr/>
+          <w:p>
+            <w:pPr>
+              <w:pStyle w:val="Compact"/>
+              <w:jc w:val="right"/>
+            </w:pPr>
+            <w:r>
+              <w:t xml:space="preserve">NA</w:t>
+            </w:r>
+          </w:p>
+        </w:tc>
+      </w:tr>
+      <w:tr>
+        <w:tc>
+          <w:tcPr/>
+          <w:p>
+            <w:pPr>
+              <w:pStyle w:val="Compact"/>
+              <w:jc w:val="left"/>
+            </w:pPr>
+            <w:r>
+              <w:t xml:space="preserve">k8_mm1_fast</w:t>
+            </w:r>
+          </w:p>
+        </w:tc>
+        <w:tc>
+          <w:tcPr/>
+          <w:p>
+            <w:pPr>
+              <w:pStyle w:val="Compact"/>
+              <w:jc w:val="right"/>
+            </w:pPr>
+            <w:r>
+              <w:t xml:space="preserve">8</w:t>
+            </w:r>
+          </w:p>
+        </w:tc>
+        <w:tc>
+          <w:tcPr/>
+          <w:p>
+            <w:pPr>
+              <w:pStyle w:val="Compact"/>
+              <w:jc w:val="right"/>
+            </w:pPr>
+            <w:r>
+              <w:t xml:space="preserve">1</w:t>
+            </w:r>
+          </w:p>
+        </w:tc>
+        <w:tc>
+          <w:tcPr/>
+          <w:p>
+            <w:pPr>
+              <w:pStyle w:val="Compact"/>
+            </w:pPr>
+            <w:r>
+              <w:t xml:space="preserve">no</w:t>
+            </w:r>
+          </w:p>
+        </w:tc>
+        <w:tc>
+          <w:tcPr/>
+          <w:p>
+            <w:pPr>
+              <w:pStyle w:val="Compact"/>
+              <w:jc w:val="right"/>
+            </w:pPr>
+            <w:r>
+              <w:t xml:space="preserve">8</w:t>
+            </w:r>
+          </w:p>
+        </w:tc>
+        <w:tc>
+          <w:tcPr/>
+          <w:p>
+            <w:pPr>
+              <w:pStyle w:val="Compact"/>
+              <w:jc w:val="right"/>
+            </w:pPr>
+            <w:r>
+              <w:t xml:space="preserve">4551.00</w:t>
+            </w:r>
+          </w:p>
+        </w:tc>
+        <w:tc>
+          <w:tcPr/>
+          <w:p>
+            <w:pPr>
+              <w:pStyle w:val="Compact"/>
+              <w:jc w:val="right"/>
+            </w:pPr>
+            <w:r>
+              <w:t xml:space="preserve">1.2642</w:t>
+            </w:r>
+          </w:p>
+        </w:tc>
+        <w:tc>
+          <w:tcPr/>
+          <w:p>
+            <w:pPr>
+              <w:pStyle w:val="Compact"/>
+              <w:jc w:val="right"/>
+            </w:pPr>
+            <w:r>
+              <w:t xml:space="preserve">10.3765</w:t>
+            </w:r>
+          </w:p>
+        </w:tc>
+        <w:tc>
+          <w:tcPr/>
+          <w:p>
+            <w:pPr>
+              <w:pStyle w:val="Compact"/>
+              <w:jc w:val="right"/>
+            </w:pPr>
+            <w:r>
+              <w:t xml:space="preserve">8</w:t>
+            </w:r>
+          </w:p>
+        </w:tc>
+        <w:tc>
+          <w:tcPr/>
+          <w:p>
+            <w:pPr>
+              <w:pStyle w:val="Compact"/>
+              <w:jc w:val="right"/>
+            </w:pPr>
+            <w:r>
+              <w:t xml:space="preserve">3</w:t>
+            </w:r>
+          </w:p>
+        </w:tc>
+        <w:tc>
+          <w:tcPr/>
+          <w:p>
+            <w:pPr>
+              <w:pStyle w:val="Compact"/>
+              <w:jc w:val="right"/>
+            </w:pPr>
+            <w:r>
+              <w:t xml:space="preserve">0.019429</w:t>
+            </w:r>
+          </w:p>
+        </w:tc>
+      </w:tr>
+    </w:tbl>
+    <w:p>
+      <w:pPr>
+        <w:pStyle w:val="BodyText"/>
+      </w:pPr>
+      <w:r>
+        <w:t xml:space="preserve">Current policy is the C5 refusion arm under the conservative fragmented-reference rule. The fast arm uses the top-8 ranked enzymes and mismatch 1 without a containment screen.</w:t>
+      </w:r>
+      <w:r>
+        <w:t xml:space="preserve"> </w:t>
+      </w:r>
+      <w:r>
+        <w:rPr>
+          <w:rStyle w:val="VerbatimChar"/>
+        </w:rPr>
+        <w:t xml:space="preserve">median_abs_log2ptr_common_qc</w:t>
+      </w:r>
+      <w:r>
+        <w:t xml:space="preserve"> </w:t>
+      </w:r>
+      <w:r>
+        <w:t xml:space="preserve">is the median absolute log2 PTR difference for the three genomes that pass QC in both arms. SLURM job 4095386; sample SRR28338156; 67,423,986 reads.</w:t>
+      </w:r>
+    </w:p>
+    <w:bookmarkEnd w:id="650"/>
+    <w:bookmarkEnd w:id="651"/>
     <w:sectPr>
       <w:footerReference r:id="rId9" w:type="default"/>
       <w:footnotePr>

</xml_diff>

<commit_message>
Add internal review and polish latest revisions
</commit_message>
<xml_diff>
--- a/manuscript/submission/sk2bGrow_Microbiome_submission_draft.docx
+++ b/manuscript/submission/sk2bGrow_Microbiome_submission_draft.docx
@@ -2,7 +2,7 @@
 <file path=word/document.xml><?xml version="1.0" encoding="utf-8"?>
 <w:document xmlns:w="http://schemas.openxmlformats.org/wordprocessingml/2006/main" xmlns:m="http://schemas.openxmlformats.org/officeDocument/2006/math" xmlns:r="http://schemas.openxmlformats.org/officeDocument/2006/relationships" xmlns:o="urn:schemas-microsoft-com:office:office" xmlns:v="urn:schemas-microsoft-com:vml" xmlns:w10="urn:schemas-microsoft-com:office:word" xmlns:a="http://schemas.openxmlformats.org/drawingml/2006/main" xmlns:pic="http://schemas.openxmlformats.org/drawingml/2006/picture" xmlns:wp="http://schemas.openxmlformats.org/drawingml/2006/wordprocessingDrawing">
   <w:body>
-    <w:bookmarkStart w:id="651" w:name="X35a67ffd771dc0eee37406016d31234a1046d16"/>
+    <w:bookmarkStart w:id="758" w:name="X35a67ffd771dc0eee37406016d31234a1046d16"/>
     <w:p>
       <w:pPr>
         <w:pStyle w:val="Heading1"/>
@@ -11,7 +11,7 @@
         <w:t xml:space="preserve">Coordinate-aware V-fitting enables shallow-depth PTR estimation from 2bRAD anchor panels</w:t>
       </w:r>
     </w:p>
-    <w:bookmarkStart w:id="548" w:name="title-page"/>
+    <w:bookmarkStart w:id="655" w:name="title-page"/>
     <w:p>
       <w:pPr>
         <w:pStyle w:val="Heading2"/>
@@ -129,11 +129,11 @@
         <w:t xml:space="preserve"> </w:t>
       </w:r>
       <w:r>
-        <w:t xml:space="preserve">Review revision 2026-09-18. The primary Zheng grid uses signed fixed-origin fitting and single-pass GC correction; residual two-pass GC correction is diagnostic only.</w:t>
+        <w:t xml:space="preserve">Internal review revision 2026-09-22. The primary Zheng grid uses signed fixed-origin fitting and single-pass GC correction; residual two-pass GC correction remains diagnostic only. This revision adds the count-level factorial analysis (F6) and the post-hoc C5 k8/mismatch-1 deployment benchmark.</w:t>
       </w:r>
     </w:p>
-    <w:bookmarkEnd w:id="548"/>
-    <w:bookmarkStart w:id="549" w:name="abstract"/>
+    <w:bookmarkEnd w:id="655"/>
+    <w:bookmarkStart w:id="656" w:name="abstract"/>
     <w:p>
       <w:pPr>
         <w:pStyle w:val="Heading2"/>
@@ -166,8 +166,8 @@
         <w:t xml:space="preserve">growth-rate panel, sk2bGrow returned usable PTR estimates at 1–2× sequencing depth, where Pilea’s shipped defaults return nothing, with r = 0.92 at 1× and 0.96 at 2× against measured growth rates (n = 16). The accuracy comes from the coordinate-aware estimator, not the landmark source — at matched density, the two landmark sources were not significantly different in the paired bootstrap at any depth — while the multi-enzyme panel contributes what a hash sketch cannot: a wet-lab-realizable landmark set and consistency strata whose heterogeneous biases exposed our own counting defect. A post-hoc count-level factorial further separates shallow-depth extraction from multi-reference assignment: coordinate fitting was accurate for private anchors, whereas shared-anchor ambiguity introduced a depth-amplified negative bias. The estimates are not unbiased — the fitted slope compresses the dynamic range at low coverage, and the compression mechanism remains unresolved. On three fecal metagenomes, sk2bGrow and Pilea agreed (bias +0.22–+0.25 log2; n = 58–78 species×sample pairs per sample). As a process-level finding, exact deduplication of 2bRAD libraries before counting destroys the PTR signal — a PCR copy-number artefact we localize per anchor. sk2bGrow is 89.5–240.8× slower than Pilea at MAG-panel scale; mismatch-1 counting narrows the gap to roughly one order of magnitude (measured end-to-end on all nine samples: 20.5–38.8× faster counting than the mismatch-2 baseline, no genome lost), and a containment pre-screen — measured to clear the absent-reference false-positive floor, and required at database scale where an unrestricted index would emit estimates for absent references — completes the fix.</w:t>
       </w:r>
     </w:p>
-    <w:bookmarkEnd w:id="549"/>
-    <w:bookmarkStart w:id="550" w:name="keywords"/>
+    <w:bookmarkEnd w:id="656"/>
+    <w:bookmarkStart w:id="657" w:name="keywords"/>
     <w:p>
       <w:pPr>
         <w:pStyle w:val="Heading2"/>
@@ -184,8 +184,8 @@
         <w:t xml:space="preserve">peak-to-trough ratio; microbial growth dynamics; 2bRAD; FracMinHash; metagenomics; shallow sequencing</w:t>
       </w:r>
     </w:p>
-    <w:bookmarkEnd w:id="550"/>
-    <w:bookmarkStart w:id="551" w:name="background"/>
+    <w:bookmarkEnd w:id="657"/>
+    <w:bookmarkStart w:id="658" w:name="background"/>
     <w:p>
       <w:pPr>
         <w:pStyle w:val="Heading2"/>
@@ -308,8 +308,8 @@
         <w:t xml:space="preserve">In short, this paper contributes (i) usable PTR estimates at 1–2× sequencing depth, with the low-coverage bias stated rather than hidden; (ii) a controlled 2 × 2 attribution localising the gain in the coordinate-aware estimator rather than in which landmarks are counted — the two landmark sources showed no significant paired-bootstrap difference once density was matched; and (iii) real-metagenome concordance with the incumbent and process-level findings — a deduplication recommendation and a per-anchor capture-efficiency measurement — that others can cite.</w:t>
       </w:r>
     </w:p>
-    <w:bookmarkEnd w:id="551"/>
-    <w:bookmarkStart w:id="580" w:name="methods"/>
+    <w:bookmarkEnd w:id="658"/>
+    <w:bookmarkStart w:id="687" w:name="methods"/>
     <w:p>
       <w:pPr>
         <w:pStyle w:val="Heading2"/>
@@ -334,7 +334,7 @@
       <w:r>
         <w:t xml:space="preserve"> </w:t>
       </w:r>
-      <w:hyperlink r:id="rId552">
+      <w:hyperlink r:id="rId659">
         <w:r>
           <w:rPr>
             <w:rStyle w:val="Hyperlink"/>
@@ -380,7 +380,7 @@
         </w:pict>
       </w:r>
     </w:p>
-    <w:bookmarkStart w:id="560" w:name="the-sk2bgrow-algorithm"/>
+    <w:bookmarkStart w:id="667" w:name="the-sk2bgrow-algorithm"/>
     <w:p>
       <w:pPr>
         <w:pStyle w:val="Heading3"/>
@@ -570,7 +570,7 @@
         <w:t xml:space="preserve">) has six stages.</w:t>
       </w:r>
     </w:p>
-    <w:bookmarkStart w:id="553" w:name="Xd9b3ed4dd252045d3e48557196049c0e39886bf"/>
+    <w:bookmarkStart w:id="660" w:name="Xd9b3ed4dd252045d3e48557196049c0e39886bf"/>
     <w:p>
       <w:pPr>
         <w:pStyle w:val="Heading4"/>
@@ -959,8 +959,8 @@
         <w:t xml:space="preserve">.</w:t>
       </w:r>
     </w:p>
-    <w:bookmarkEnd w:id="553"/>
-    <w:bookmarkStart w:id="554" w:name="read-counting-and-anchor-attribution"/>
+    <w:bookmarkEnd w:id="660"/>
+    <w:bookmarkStart w:id="661" w:name="read-counting-and-anchor-attribution"/>
     <w:p>
       <w:pPr>
         <w:pStyle w:val="Heading4"/>
@@ -1351,8 +1351,8 @@
         <w:t xml:space="preserve">iterations.</w:t>
       </w:r>
     </w:p>
-    <w:bookmarkEnd w:id="554"/>
-    <w:bookmarkStart w:id="555" w:name="windows-and-window-rates"/>
+    <w:bookmarkEnd w:id="661"/>
+    <w:bookmarkStart w:id="662" w:name="windows-and-window-rates"/>
     <w:p>
       <w:pPr>
         <w:pStyle w:val="Heading4"/>
@@ -1654,8 +1654,8 @@
         <w:t xml:space="preserve">~12 spurious log-likelihood units and BIC selects NB everywhere.</w:t>
       </w:r>
     </w:p>
-    <w:bookmarkEnd w:id="555"/>
-    <w:bookmarkStart w:id="556" w:name="gc-bias-correction"/>
+    <w:bookmarkEnd w:id="662"/>
+    <w:bookmarkStart w:id="663" w:name="gc-bias-correction"/>
     <w:p>
       <w:pPr>
         <w:pStyle w:val="Heading4"/>
@@ -1894,8 +1894,8 @@
         <w:t xml:space="preserve">).</w:t>
       </w:r>
     </w:p>
-    <w:bookmarkEnd w:id="556"/>
-    <w:bookmarkStart w:id="557" w:name="origin-placement-and-v-shape-fitting"/>
+    <w:bookmarkEnd w:id="663"/>
+    <w:bookmarkStart w:id="664" w:name="origin-placement-and-v-shape-fitting"/>
     <w:p>
       <w:pPr>
         <w:pStyle w:val="Heading4"/>
@@ -2465,8 +2465,8 @@
         <w:t xml:space="preserve">).</w:t>
       </w:r>
     </w:p>
-    <w:bookmarkEnd w:id="557"/>
-    <w:bookmarkStart w:id="558" w:name="cross-enzyme-fusion-and-quality-control"/>
+    <w:bookmarkEnd w:id="664"/>
+    <w:bookmarkStart w:id="665" w:name="cross-enzyme-fusion-and-quality-control"/>
     <w:p>
       <w:pPr>
         <w:pStyle w:val="Heading4"/>
@@ -2999,8 +2999,8 @@
         <w:t xml:space="preserve">rejection rate — the dependency is reported, not corrected (Discussion).</w:t>
       </w:r>
     </w:p>
-    <w:bookmarkEnd w:id="558"/>
-    <w:bookmarkStart w:id="559" w:name="implementation"/>
+    <w:bookmarkEnd w:id="665"/>
+    <w:bookmarkStart w:id="666" w:name="implementation"/>
     <w:p>
       <w:pPr>
         <w:pStyle w:val="Heading4"/>
@@ -3042,9 +3042,9 @@
         </w:pict>
       </w:r>
     </w:p>
-    <w:bookmarkEnd w:id="559"/>
-    <w:bookmarkEnd w:id="560"/>
-    <w:bookmarkStart w:id="561" w:name="enzyme-panel"/>
+    <w:bookmarkEnd w:id="666"/>
+    <w:bookmarkEnd w:id="667"/>
+    <w:bookmarkStart w:id="668" w:name="enzyme-panel"/>
     <w:p>
       <w:pPr>
         <w:pStyle w:val="Heading3"/>
@@ -3270,8 +3270,8 @@
         </w:pict>
       </w:r>
     </w:p>
-    <w:bookmarkEnd w:id="561"/>
-    <w:bookmarkStart w:id="569" w:name="benchmark-datasets"/>
+    <w:bookmarkEnd w:id="668"/>
+    <w:bookmarkStart w:id="676" w:name="benchmark-datasets"/>
     <w:p>
       <w:pPr>
         <w:pStyle w:val="Heading3"/>
@@ -3280,7 +3280,7 @@
         <w:t xml:space="preserve">3. Benchmark datasets</w:t>
       </w:r>
     </w:p>
-    <w:bookmarkStart w:id="562" w:name="X8558b042e1c4d57d5e6d341f0cb3e7790b4deb2"/>
+    <w:bookmarkStart w:id="669" w:name="X8558b042e1c4d57d5e6d341f0cb3e7790b4deb2"/>
     <w:p>
       <w:pPr>
         <w:pStyle w:val="Heading4"/>
@@ -3854,8 +3854,8 @@
         <w:t xml:space="preserve">establishes behaviour on a metagenome or a fragmented MAG.</w:t>
       </w:r>
     </w:p>
-    <w:bookmarkEnd w:id="562"/>
-    <w:bookmarkStart w:id="563" w:name="multi-strain-simulation"/>
+    <w:bookmarkEnd w:id="669"/>
+    <w:bookmarkStart w:id="670" w:name="multi-strain-simulation"/>
     <w:p>
       <w:pPr>
         <w:pStyle w:val="Heading4"/>
@@ -4134,8 +4134,8 @@
         <w:t xml:space="preserve">).</w:t>
       </w:r>
     </w:p>
-    <w:bookmarkEnd w:id="563"/>
-    <w:bookmarkStart w:id="564" w:name="reference-fragmentation"/>
+    <w:bookmarkEnd w:id="670"/>
+    <w:bookmarkStart w:id="671" w:name="reference-fragmentation"/>
     <w:p>
       <w:pPr>
         <w:pStyle w:val="Heading4"/>
@@ -4590,8 +4590,8 @@
         <w:t xml:space="preserve">scaffolding delivers.</w:t>
       </w:r>
     </w:p>
-    <w:bookmarkEnd w:id="564"/>
-    <w:bookmarkStart w:id="565" w:name="Xb780f84997d33bf0f401691b1288ff1538bcd72"/>
+    <w:bookmarkEnd w:id="671"/>
+    <w:bookmarkStart w:id="672" w:name="Xb780f84997d33bf0f401691b1288ff1538bcd72"/>
     <w:p>
       <w:pPr>
         <w:pStyle w:val="Heading4"/>
@@ -5049,8 +5049,8 @@
         <w:t xml:space="preserve">invariant to affine transformation.</w:t>
       </w:r>
     </w:p>
-    <w:bookmarkEnd w:id="565"/>
-    <w:bookmarkStart w:id="566" w:name="faecal-microbiome-sun-et-al."/>
+    <w:bookmarkEnd w:id="672"/>
+    <w:bookmarkStart w:id="673" w:name="faecal-microbiome-sun-et-al."/>
     <w:p>
       <w:pPr>
         <w:pStyle w:val="Heading4"/>
@@ -5618,8 +5618,8 @@
         <w:t xml:space="preserve">decomposition are defined in §5.</w:t>
       </w:r>
     </w:p>
-    <w:bookmarkEnd w:id="566"/>
-    <w:bookmarkStart w:id="567" w:name="Xbdb57a27110786c0a1921f07c423d99a2d691e0"/>
+    <w:bookmarkEnd w:id="673"/>
+    <w:bookmarkStart w:id="674" w:name="Xbdb57a27110786c0a1921f07c423d99a2d691e0"/>
     <w:p>
       <w:pPr>
         <w:pStyle w:val="Heading4"/>
@@ -6229,8 +6229,8 @@
         <w:t xml:space="preserve">counts, with per-anchor ratios ≈ 1).</w:t>
       </w:r>
     </w:p>
-    <w:bookmarkEnd w:id="567"/>
-    <w:bookmarkStart w:id="568" w:name="gc-spanning-genome-set"/>
+    <w:bookmarkEnd w:id="674"/>
+    <w:bookmarkStart w:id="675" w:name="gc-spanning-genome-set"/>
     <w:p>
       <w:pPr>
         <w:pStyle w:val="Heading4"/>
@@ -6340,9 +6340,9 @@
         </w:pict>
       </w:r>
     </w:p>
-    <w:bookmarkEnd w:id="568"/>
-    <w:bookmarkEnd w:id="569"/>
-    <w:bookmarkStart w:id="570" w:name="comparison-methods"/>
+    <w:bookmarkEnd w:id="675"/>
+    <w:bookmarkEnd w:id="676"/>
+    <w:bookmarkStart w:id="677" w:name="comparison-methods"/>
     <w:p>
       <w:pPr>
         <w:pStyle w:val="Heading3"/>
@@ -7070,8 +7070,8 @@
         </w:pict>
       </w:r>
     </w:p>
-    <w:bookmarkEnd w:id="570"/>
-    <w:bookmarkStart w:id="571" w:name="evaluation-metrics"/>
+    <w:bookmarkEnd w:id="677"/>
+    <w:bookmarkStart w:id="678" w:name="evaluation-metrics"/>
     <w:p>
       <w:pPr>
         <w:pStyle w:val="Heading3"/>
@@ -8473,8 +8473,8 @@
         </w:pict>
       </w:r>
     </w:p>
-    <w:bookmarkEnd w:id="571"/>
-    <w:bookmarkStart w:id="578" w:name="X85a115a26ce12f930c9dac210e8d891ae5a6b7c"/>
+    <w:bookmarkEnd w:id="678"/>
+    <w:bookmarkStart w:id="685" w:name="X85a115a26ce12f930c9dac210e8d891ae5a6b7c"/>
     <w:p>
       <w:pPr>
         <w:pStyle w:val="Heading3"/>
@@ -8597,7 +8597,7 @@
         <w:t xml:space="preserve">symmetric in effect.</w:t>
       </w:r>
     </w:p>
-    <w:bookmarkStart w:id="572" w:name="density-matching-on-the-zheng-grid-f1"/>
+    <w:bookmarkStart w:id="679" w:name="density-matching-on-the-zheng-grid-f1"/>
     <w:p>
       <w:pPr>
         <w:pStyle w:val="Heading4"/>
@@ -8738,8 +8738,8 @@
         <w:t xml:space="preserve">per-window landmark counts and detection fraction; per-cell failure cause.</w:t>
       </w:r>
     </w:p>
-    <w:bookmarkEnd w:id="572"/>
-    <w:bookmarkStart w:id="573" w:name="gc-sweep-f2"/>
+    <w:bookmarkEnd w:id="679"/>
+    <w:bookmarkStart w:id="680" w:name="gc-sweep-f2"/>
     <w:p>
       <w:pPr>
         <w:pStyle w:val="Heading4"/>
@@ -8967,8 +8967,8 @@
         <w:t xml:space="preserve">(landmarks/Mb).</w:t>
       </w:r>
     </w:p>
-    <w:bookmarkEnd w:id="573"/>
-    <w:bookmarkStart w:id="574" w:name="mismatch-tolerance-and-misassignment-f3"/>
+    <w:bookmarkEnd w:id="680"/>
+    <w:bookmarkStart w:id="681" w:name="mismatch-tolerance-and-misassignment-f3"/>
     <w:p>
       <w:pPr>
         <w:pStyle w:val="Heading4"/>
@@ -9273,8 +9273,8 @@
         <w:t xml:space="preserve">).</w:t>
       </w:r>
     </w:p>
-    <w:bookmarkEnd w:id="574"/>
-    <w:bookmarkStart w:id="575" w:name="fragmentation-sketch-f4"/>
+    <w:bookmarkEnd w:id="681"/>
+    <w:bookmarkStart w:id="682" w:name="fragmentation-sketch-f4"/>
     <w:p>
       <w:pPr>
         <w:pStyle w:val="Heading4"/>
@@ -9666,8 +9666,8 @@
         <w:t xml:space="preserve">rate, orientation accuracy and order Spearman; permutation null distributions.</w:t>
       </w:r>
     </w:p>
-    <w:bookmarkEnd w:id="575"/>
-    <w:bookmarkStart w:id="576" w:name="index-cost-at-gtdb-like-scale-f5"/>
+    <w:bookmarkEnd w:id="682"/>
+    <w:bookmarkStart w:id="683" w:name="index-cost-at-gtdb-like-scale-f5"/>
     <w:p>
       <w:pPr>
         <w:pStyle w:val="Heading4"/>
@@ -9969,8 +9969,8 @@
         <w:t xml:space="preserve">matched density.</w:t>
       </w:r>
     </w:p>
-    <w:bookmarkEnd w:id="576"/>
-    <w:bookmarkStart w:id="577" w:name="X84bfdf958829166d8b906dacf41027ff82eb47c"/>
+    <w:bookmarkEnd w:id="683"/>
+    <w:bookmarkStart w:id="684" w:name="X84bfdf958829166d8b906dacf41027ff82eb47c"/>
     <w:p>
       <w:pPr>
         <w:pStyle w:val="Heading4"/>
@@ -10238,9 +10238,9 @@
         </w:pict>
       </w:r>
     </w:p>
-    <w:bookmarkEnd w:id="577"/>
-    <w:bookmarkEnd w:id="578"/>
-    <w:bookmarkStart w:id="579" w:name="computational-environment"/>
+    <w:bookmarkEnd w:id="684"/>
+    <w:bookmarkEnd w:id="685"/>
+    <w:bookmarkStart w:id="686" w:name="computational-environment"/>
     <w:p>
       <w:pPr>
         <w:pStyle w:val="Heading3"/>
@@ -10331,9 +10331,9 @@
         </w:pict>
       </w:r>
     </w:p>
-    <w:bookmarkEnd w:id="579"/>
-    <w:bookmarkEnd w:id="580"/>
-    <w:bookmarkStart w:id="599" w:name="results"/>
+    <w:bookmarkEnd w:id="686"/>
+    <w:bookmarkEnd w:id="687"/>
+    <w:bookmarkStart w:id="706" w:name="results"/>
     <w:p>
       <w:pPr>
         <w:pStyle w:val="Heading2"/>
@@ -10342,7 +10342,7 @@
         <w:t xml:space="preserve">Results</w:t>
       </w:r>
     </w:p>
-    <w:bookmarkStart w:id="581" w:name="sk2bgrow-overview"/>
+    <w:bookmarkStart w:id="688" w:name="sk2bgrow-overview"/>
     <w:p>
       <w:pPr>
         <w:pStyle w:val="Heading3"/>
@@ -10401,8 +10401,8 @@
         <w:t xml:space="preserve">² for the same sample. Panels b–d are real output from one 2× sample; the figure shows the method working on real data, not a cartoon (Fig. 1).</w:t>
       </w:r>
     </w:p>
-    <w:bookmarkEnd w:id="581"/>
-    <w:bookmarkStart w:id="585" w:name="accuracy-on-bacterial-isolates"/>
+    <w:bookmarkEnd w:id="688"/>
+    <w:bookmarkStart w:id="692" w:name="accuracy-on-bacterial-isolates"/>
     <w:p>
       <w:pPr>
         <w:pStyle w:val="Heading3"/>
@@ -10411,7 +10411,7 @@
         <w:t xml:space="preserve">2. Accuracy on bacterial isolates</w:t>
       </w:r>
     </w:p>
-    <w:bookmarkStart w:id="582" w:name="accuracy-across-the-coverage-titration"/>
+    <w:bookmarkStart w:id="689" w:name="accuracy-across-the-coverage-titration"/>
     <w:p>
       <w:pPr>
         <w:pStyle w:val="Heading4"/>
@@ -10588,8 +10588,8 @@
         <w:t xml:space="preserve">(Methods §1.4).</w:t>
       </w:r>
     </w:p>
-    <w:bookmarkEnd w:id="582"/>
-    <w:bookmarkStart w:id="583" w:name="a-negative-control-that-pilea-excluded"/>
+    <w:bookmarkEnd w:id="689"/>
+    <w:bookmarkStart w:id="690" w:name="a-negative-control-that-pilea-excluded"/>
     <w:p>
       <w:pPr>
         <w:pStyle w:val="Heading4"/>
@@ -10627,8 +10627,8 @@
         <w:t xml:space="preserve">estimate, and in exactly the direction of reading noise as growth (Fig. 2d).</w:t>
       </w:r>
     </w:p>
-    <w:bookmarkEnd w:id="583"/>
-    <w:bookmarkStart w:id="584" w:name="Xce6b542434ed1814004dfb47fad411b14a7baa6"/>
+    <w:bookmarkEnd w:id="690"/>
+    <w:bookmarkStart w:id="691" w:name="Xce6b542434ed1814004dfb47fad411b14a7baa6"/>
     <w:p>
       <w:pPr>
         <w:pStyle w:val="Heading4"/>
@@ -10676,9 +10676,9 @@
         <w:t xml:space="preserve">estimates and 167 of 172 in the multi-strain simulation. Because a 150 bp read yields 120 31-mers, a threshold of 5 on k-mer coverage corresponds to ≈6.25× read coverage (5 × 150/120), so the gate fires at 5× nominal even where the estimator behind it is still informative. At 0.5× the gate is correctly refusing to report: Pilea’s gates-off output there is fully degenerate — measured coverage exactly 1.000 and log₂PTR exactly 0.000 in all 17 samples. Between 1× and 5×, however, the gates-off estimator is informative (r = 0.78, 0.85, 0.99 against λ) and is nevertheless suppressed. The honest claim is therefore not that Pilea is over-conservative, but that its gate is calibrated to the point where the FracMinHash estimator breaks — ≈6.25× read coverage — whereas sk2bGrow’s break point is below 1× (Fig. 2; Table 5).</w:t>
       </w:r>
     </w:p>
-    <w:bookmarkEnd w:id="584"/>
-    <w:bookmarkEnd w:id="585"/>
-    <w:bookmarkStart w:id="586" w:name="multi-strain-communities"/>
+    <w:bookmarkEnd w:id="691"/>
+    <w:bookmarkEnd w:id="692"/>
+    <w:bookmarkStart w:id="693" w:name="multi-strain-communities"/>
     <w:p>
       <w:pPr>
         <w:pStyle w:val="Heading3"/>
@@ -10773,8 +10773,8 @@
         <w:t xml:space="preserve">; Methods §6.3). Recall 1.000 therefore still describes an exact-match-favourable grid, but it is no longer supported only by the estimator’s own generative model.</w:t>
       </w:r>
     </w:p>
-    <w:bookmarkEnd w:id="586"/>
-    <w:bookmarkStart w:id="588" w:name="what-do-the-landmarks-contribute"/>
+    <w:bookmarkEnd w:id="693"/>
+    <w:bookmarkStart w:id="695" w:name="what-do-the-landmarks-contribute"/>
     <w:p>
       <w:pPr>
         <w:pStyle w:val="Heading3"/>
@@ -11720,7 +11720,7 @@
         <w:t xml:space="preserve">(Fig. 4)</w:t>
       </w:r>
     </w:p>
-    <w:bookmarkStart w:id="587" w:name="Xfc754f5fdbc1a952568615503bb8f3afaadf421"/>
+    <w:bookmarkStart w:id="694" w:name="Xfc754f5fdbc1a952568615503bb8f3afaadf421"/>
     <w:p>
       <w:pPr>
         <w:pStyle w:val="Heading4"/>
@@ -11927,9 +11927,9 @@
         <w:t xml:space="preserve">(Fig. 5; Table 11)</w:t>
       </w:r>
     </w:p>
-    <w:bookmarkEnd w:id="587"/>
-    <w:bookmarkEnd w:id="588"/>
-    <w:bookmarkStart w:id="589" w:name="X5aa37cfb64c4d815f4fee0e74b644b0546e0c08"/>
+    <w:bookmarkEnd w:id="694"/>
+    <w:bookmarkEnd w:id="695"/>
+    <w:bookmarkStart w:id="696" w:name="X5aa37cfb64c4d815f4fee0e74b644b0546e0c08"/>
     <w:p>
       <w:pPr>
         <w:pStyle w:val="Heading3"/>
@@ -12795,8 +12795,8 @@
         <w:t xml:space="preserve">(Fig. 6)</w:t>
       </w:r>
     </w:p>
-    <w:bookmarkEnd w:id="589"/>
-    <w:bookmarkStart w:id="593" w:name="fragmented-references-and-mags"/>
+    <w:bookmarkEnd w:id="696"/>
+    <w:bookmarkStart w:id="700" w:name="fragmented-references-and-mags"/>
     <w:p>
       <w:pPr>
         <w:pStyle w:val="Heading3"/>
@@ -12805,7 +12805,7 @@
         <w:t xml:space="preserve">6. Fragmented references and MAGs</w:t>
       </w:r>
     </w:p>
-    <w:bookmarkStart w:id="590" w:name="X023c9de081127f5a9ee34128d04d5cd51d91210"/>
+    <w:bookmarkStart w:id="697" w:name="X023c9de081127f5a9ee34128d04d5cd51d91210"/>
     <w:p>
       <w:pPr>
         <w:pStyle w:val="Heading4"/>
@@ -13539,8 +13539,8 @@
         </w:tc>
       </w:tr>
     </w:tbl>
-    <w:bookmarkEnd w:id="590"/>
-    <w:bookmarkStart w:id="591" w:name="X6e8375112356a1e59f6c25ab9a7ae77408f4219"/>
+    <w:bookmarkEnd w:id="697"/>
+    <w:bookmarkStart w:id="698" w:name="X6e8375112356a1e59f6c25ab9a7ae77408f4219"/>
     <w:p>
       <w:pPr>
         <w:pStyle w:val="Heading4"/>
@@ -13743,8 +13743,8 @@
         <w:t xml:space="preserve">sketch scaffolding is demonstrated, not shipped (Fig. 7).</w:t>
       </w:r>
     </w:p>
-    <w:bookmarkEnd w:id="591"/>
-    <w:bookmarkStart w:id="592" w:name="X72de53e76597c7041bc0c2cfdd503c5ddd9d60b"/>
+    <w:bookmarkEnd w:id="698"/>
+    <w:bookmarkStart w:id="699" w:name="X72de53e76597c7041bc0c2cfdd503c5ddd9d60b"/>
     <w:p>
       <w:pPr>
         <w:pStyle w:val="Heading4"/>
@@ -13872,9 +13872,9 @@
         <w:t xml:space="preserve">(Fig. 7; Table 8)</w:t>
       </w:r>
     </w:p>
-    <w:bookmarkEnd w:id="592"/>
-    <w:bookmarkEnd w:id="593"/>
-    <w:bookmarkStart w:id="597" w:name="real-metagenomes"/>
+    <w:bookmarkEnd w:id="699"/>
+    <w:bookmarkEnd w:id="700"/>
+    <w:bookmarkStart w:id="704" w:name="real-metagenomes"/>
     <w:p>
       <w:pPr>
         <w:pStyle w:val="Heading3"/>
@@ -13883,7 +13883,7 @@
         <w:t xml:space="preserve">7. Real metagenomes</w:t>
       </w:r>
     </w:p>
-    <w:bookmarkStart w:id="594" w:name="X1ac24289c0a6b34d66188d6319131a2e330c07c"/>
+    <w:bookmarkStart w:id="701" w:name="X1ac24289c0a6b34d66188d6319131a2e330c07c"/>
     <w:p>
       <w:pPr>
         <w:pStyle w:val="Heading4"/>
@@ -14076,8 +14076,8 @@
         <w:t xml:space="preserve">).</w:t>
       </w:r>
     </w:p>
-    <w:bookmarkEnd w:id="594"/>
-    <w:bookmarkStart w:id="595" w:name="Xc081266583f5878e429dba77e287ecfb4e84c13"/>
+    <w:bookmarkEnd w:id="701"/>
+    <w:bookmarkStart w:id="702" w:name="Xc081266583f5878e429dba77e287ecfb4e84c13"/>
     <w:p>
       <w:pPr>
         <w:pStyle w:val="Heading4"/>
@@ -14324,8 +14324,8 @@
         <w:t xml:space="preserve">preparation) (Fig. 8).</w:t>
       </w:r>
     </w:p>
-    <w:bookmarkEnd w:id="595"/>
-    <w:bookmarkStart w:id="596" w:name="X855dfea45c8027e3834f5e0c80b8fc9c7aa81b5"/>
+    <w:bookmarkEnd w:id="702"/>
+    <w:bookmarkStart w:id="703" w:name="X855dfea45c8027e3834f5e0c80b8fc9c7aa81b5"/>
     <w:p>
       <w:pPr>
         <w:pStyle w:val="Heading4"/>
@@ -14829,13 +14829,19 @@
         <w:t xml:space="preserve"> </w:t>
       </w:r>
       <w:r>
-        <w:t xml:space="preserve">but it supports k8/mismatch-1 as the default starting point for shotgun</w:t>
-      </w:r>
-      <w:r>
-        <w:t xml:space="preserve"> </w:t>
-      </w:r>
-      <w:r>
-        <w:t xml:space="preserve">MAG-scale runs. Real 2bRAD libraries should still use mismatch 0 unless a new</w:t>
+        <w:t xml:space="preserve">but it supports k8/mismatch-1 as a candidate default for shotgun MAG-scale runs;</w:t>
+      </w:r>
+      <w:r>
+        <w:t xml:space="preserve"> </w:t>
+      </w:r>
+      <w:r>
+        <w:t xml:space="preserve">confirmation across all nine C5 samples is still appropriate before changing the</w:t>
+      </w:r>
+      <w:r>
+        <w:t xml:space="preserve"> </w:t>
+      </w:r>
+      <w:r>
+        <w:t xml:space="preserve">shipped default. Real 2bRAD libraries should still use mismatch 0 unless a new</w:t>
       </w:r>
       <w:r>
         <w:t xml:space="preserve"> </w:t>
@@ -14853,12 +14859,12 @@
           <w:i/>
           <w:iCs/>
         </w:rPr>
-        <w:t xml:space="preserve">(Fig. 9; Table 10)</w:t>
+        <w:t xml:space="preserve">(Table 12; Fig. 9)</w:t>
       </w:r>
     </w:p>
-    <w:bookmarkEnd w:id="596"/>
-    <w:bookmarkEnd w:id="597"/>
-    <w:bookmarkStart w:id="598" w:name="computational-efficiency-and-scale"/>
+    <w:bookmarkEnd w:id="703"/>
+    <w:bookmarkEnd w:id="704"/>
+    <w:bookmarkStart w:id="705" w:name="computational-efficiency-and-scale"/>
     <w:p>
       <w:pPr>
         <w:pStyle w:val="Heading3"/>
@@ -15137,9 +15143,9 @@
         <w:t xml:space="preserve">(Fig. 9d)</w:t>
       </w:r>
     </w:p>
-    <w:bookmarkEnd w:id="598"/>
-    <w:bookmarkEnd w:id="599"/>
-    <w:bookmarkStart w:id="600" w:name="discussion"/>
+    <w:bookmarkEnd w:id="705"/>
+    <w:bookmarkEnd w:id="706"/>
+    <w:bookmarkStart w:id="707" w:name="discussion"/>
     <w:p>
       <w:pPr>
         <w:pStyle w:val="Heading2"/>
@@ -16776,8 +16782,8 @@
         <w:t xml:space="preserve">have no data in this study and must not be read as null results. The mismatch-tolerance row is asymmetric for a measured reason (F3): the enzyme mode’s exact-first counting rule suppresses the near-neighbor search that becomes the sketch mode’s rescue channel at scale ~100. Sketch-side scaffolding and sketch mismatch tolerance rest on a rule-based port/simulation respectively, not on shipped CLI modes (F3/F4 REVIEW caveats).</w:t>
       </w:r>
     </w:p>
-    <w:bookmarkEnd w:id="600"/>
-    <w:bookmarkStart w:id="601" w:name="conclusions"/>
+    <w:bookmarkEnd w:id="707"/>
+    <w:bookmarkStart w:id="708" w:name="conclusions"/>
     <w:p>
       <w:pPr>
         <w:pStyle w:val="Heading2"/>
@@ -16818,8 +16824,8 @@
         <w:t xml:space="preserve">The count-level factorial adds one further deployment principle: sequencing depth cannot repair ambiguous landmark assignment. Multi-strain applications should therefore report shared-anchor fractions and per-reference unique coverage alongside depth and recall, and should treat coordinate fitting, assignment of shared evidence, and computational cost as separately auditable steps rather than collapsing them into a single end-to-end accuracy number.</w:t>
       </w:r>
     </w:p>
-    <w:bookmarkEnd w:id="601"/>
-    <w:bookmarkStart w:id="602" w:name="list-of-abbreviations"/>
+    <w:bookmarkEnd w:id="708"/>
+    <w:bookmarkStart w:id="709" w:name="list-of-abbreviations"/>
     <w:p>
       <w:pPr>
         <w:pStyle w:val="Heading2"/>
@@ -16866,8 +16872,8 @@
         <w:t xml:space="preserve">V-fit: coordinate-aware windowed V-shaped regression fit</w:t>
       </w:r>
     </w:p>
-    <w:bookmarkEnd w:id="602"/>
-    <w:bookmarkStart w:id="612" w:name="declarations"/>
+    <w:bookmarkEnd w:id="709"/>
+    <w:bookmarkStart w:id="719" w:name="declarations"/>
     <w:p>
       <w:pPr>
         <w:pStyle w:val="Heading2"/>
@@ -16876,7 +16882,7 @@
         <w:t xml:space="preserve">Declarations</w:t>
       </w:r>
     </w:p>
-    <w:bookmarkStart w:id="603" w:name="Xd182db0490b2de20bd2b4e4cc8698599182035f"/>
+    <w:bookmarkStart w:id="710" w:name="Xd182db0490b2de20bd2b4e4cc8698599182035f"/>
     <w:p>
       <w:pPr>
         <w:pStyle w:val="Heading3"/>
@@ -16893,8 +16899,8 @@
         <w:t xml:space="preserve">Not applicable. This study analysed only publicly available sequencing data.</w:t>
       </w:r>
     </w:p>
-    <w:bookmarkEnd w:id="603"/>
-    <w:bookmarkStart w:id="604" w:name="consent-for-publication"/>
+    <w:bookmarkEnd w:id="710"/>
+    <w:bookmarkStart w:id="711" w:name="consent-for-publication"/>
     <w:p>
       <w:pPr>
         <w:pStyle w:val="Heading3"/>
@@ -16911,8 +16917,8 @@
         <w:t xml:space="preserve">Not applicable.</w:t>
       </w:r>
     </w:p>
-    <w:bookmarkEnd w:id="604"/>
-    <w:bookmarkStart w:id="606" w:name="availability-of-data-and-materials"/>
+    <w:bookmarkEnd w:id="711"/>
+    <w:bookmarkStart w:id="713" w:name="availability-of-data-and-materials"/>
     <w:p>
       <w:pPr>
         <w:pStyle w:val="Heading3"/>
@@ -16931,7 +16937,7 @@
       <w:r>
         <w:t xml:space="preserve"> </w:t>
       </w:r>
-      <w:hyperlink r:id="rId552">
+      <w:hyperlink r:id="rId659">
         <w:r>
           <w:rPr>
             <w:rStyle w:val="Hyperlink"/>
@@ -16951,7 +16957,7 @@
       <w:r>
         <w:t xml:space="preserve"> </w:t>
       </w:r>
-      <w:hyperlink r:id="rId605">
+      <w:hyperlink r:id="rId712">
         <w:r>
           <w:rPr>
             <w:rStyle w:val="Hyperlink"/>
@@ -17171,8 +17177,8 @@
         <w:t xml:space="preserve">study), PRJNA974210 (rotating biological contactor metagenome).</w:t>
       </w:r>
     </w:p>
-    <w:bookmarkEnd w:id="606"/>
-    <w:bookmarkStart w:id="607" w:name="competing-interests"/>
+    <w:bookmarkEnd w:id="713"/>
+    <w:bookmarkStart w:id="714" w:name="competing-interests"/>
     <w:p>
       <w:pPr>
         <w:pStyle w:val="Heading3"/>
@@ -17189,8 +17195,8 @@
         <w:t xml:space="preserve">The authors declare that they have no competing interests.</w:t>
       </w:r>
     </w:p>
-    <w:bookmarkEnd w:id="607"/>
-    <w:bookmarkStart w:id="608" w:name="funding"/>
+    <w:bookmarkEnd w:id="714"/>
+    <w:bookmarkStart w:id="715" w:name="funding"/>
     <w:p>
       <w:pPr>
         <w:pStyle w:val="Heading3"/>
@@ -17207,8 +17213,8 @@
         <w:t xml:space="preserve">[To be completed before submission.]</w:t>
       </w:r>
     </w:p>
-    <w:bookmarkEnd w:id="608"/>
-    <w:bookmarkStart w:id="609" w:name="authors-contributions"/>
+    <w:bookmarkEnd w:id="715"/>
+    <w:bookmarkStart w:id="716" w:name="authors-contributions"/>
     <w:p>
       <w:pPr>
         <w:pStyle w:val="Heading3"/>
@@ -17225,8 +17231,8 @@
         <w:t xml:space="preserve">[To be completed before submission using CRediT taxonomy and the final author initials.]</w:t>
       </w:r>
     </w:p>
-    <w:bookmarkEnd w:id="609"/>
-    <w:bookmarkStart w:id="610" w:name="acknowledgements"/>
+    <w:bookmarkEnd w:id="716"/>
+    <w:bookmarkStart w:id="717" w:name="acknowledgements"/>
     <w:p>
       <w:pPr>
         <w:pStyle w:val="Heading3"/>
@@ -17243,8 +17249,8 @@
         <w:t xml:space="preserve">[To be completed before submission or state “Not applicable.”]</w:t>
       </w:r>
     </w:p>
-    <w:bookmarkEnd w:id="610"/>
-    <w:bookmarkStart w:id="611" w:name="authors-information"/>
+    <w:bookmarkEnd w:id="717"/>
+    <w:bookmarkStart w:id="718" w:name="authors-information"/>
     <w:p>
       <w:pPr>
         <w:pStyle w:val="Heading3"/>
@@ -17261,9 +17267,9 @@
         <w:t xml:space="preserve">Not applicable.</w:t>
       </w:r>
     </w:p>
-    <w:bookmarkEnd w:id="611"/>
-    <w:bookmarkEnd w:id="612"/>
-    <w:bookmarkStart w:id="621" w:name="references"/>
+    <w:bookmarkEnd w:id="718"/>
+    <w:bookmarkEnd w:id="719"/>
+    <w:bookmarkStart w:id="728" w:name="references"/>
     <w:p>
       <w:pPr>
         <w:pStyle w:val="Heading2"/>
@@ -17296,7 +17302,7 @@
       <w:r>
         <w:t xml:space="preserve">. 2015;349(6252):1101–1106. doi:</w:t>
       </w:r>
-      <w:hyperlink r:id="rId613">
+      <w:hyperlink r:id="rId720">
         <w:r>
           <w:rPr>
             <w:rStyle w:val="Hyperlink"/>
@@ -17329,7 +17335,7 @@
       <w:r>
         <w:t xml:space="preserve">. 2016;34(12):1256–1263. doi:</w:t>
       </w:r>
-      <w:hyperlink r:id="rId614">
+      <w:hyperlink r:id="rId721">
         <w:r>
           <w:rPr>
             <w:rStyle w:val="Hyperlink"/>
@@ -17362,7 +17368,7 @@
       <w:r>
         <w:t xml:space="preserve">. 2022;32(3):558–568. doi:</w:t>
       </w:r>
-      <w:hyperlink r:id="rId615">
+      <w:hyperlink r:id="rId722">
         <w:r>
           <w:rPr>
             <w:rStyle w:val="Hyperlink"/>
@@ -17395,7 +17401,7 @@
       <w:r>
         <w:t xml:space="preserve">. 2026;14(1):128. doi:</w:t>
       </w:r>
-      <w:hyperlink r:id="rId616">
+      <w:hyperlink r:id="rId723">
         <w:r>
           <w:rPr>
             <w:rStyle w:val="Hyperlink"/>
@@ -17428,7 +17434,7 @@
       <w:r>
         <w:t xml:space="preserve">. 2012;9(8):808–810. doi:</w:t>
       </w:r>
-      <w:hyperlink r:id="rId617">
+      <w:hyperlink r:id="rId724">
         <w:r>
           <w:rPr>
             <w:rStyle w:val="Hyperlink"/>
@@ -17461,7 +17467,7 @@
       <w:r>
         <w:t xml:space="preserve">. 2020;15(4):e0219882. doi:</w:t>
       </w:r>
-      <w:hyperlink r:id="rId618">
+      <w:hyperlink r:id="rId725">
         <w:r>
           <w:rPr>
             <w:rStyle w:val="Hyperlink"/>
@@ -17494,7 +17500,7 @@
       <w:r>
         <w:t xml:space="preserve">. 2022;23:36. doi:</w:t>
       </w:r>
-      <w:hyperlink r:id="rId619">
+      <w:hyperlink r:id="rId726">
         <w:r>
           <w:rPr>
             <w:rStyle w:val="Hyperlink"/>
@@ -17527,7 +17533,7 @@
       <w:r>
         <w:t xml:space="preserve">. 2022. doi:</w:t>
       </w:r>
-      <w:hyperlink r:id="rId620">
+      <w:hyperlink r:id="rId727">
         <w:r>
           <w:rPr>
             <w:rStyle w:val="Hyperlink"/>
@@ -17536,8 +17542,8 @@
         </w:r>
       </w:hyperlink>
     </w:p>
-    <w:bookmarkEnd w:id="621"/>
-    <w:bookmarkStart w:id="649" w:name="figures"/>
+    <w:bookmarkEnd w:id="728"/>
+    <w:bookmarkStart w:id="756" w:name="figures"/>
     <w:p>
       <w:pPr>
         <w:pStyle w:val="Heading2"/>
@@ -17555,18 +17561,18 @@
           <wp:inline>
             <wp:extent cx="5943600" cy="4067536"/>
             <wp:effectExtent b="0" l="0" r="0" t="0"/>
-            <wp:docPr descr="Fig. 1. Overview and worked example" title="" id="623" name="Picture"/>
+            <wp:docPr descr="Fig. 1. Overview and worked example" title="" id="730" name="Picture"/>
             <a:graphic>
               <a:graphicData uri="http://schemas.openxmlformats.org/drawingml/2006/picture">
                 <pic:pic>
                   <pic:nvPicPr>
-                    <pic:cNvPr descr="../figures/out/fig1_overview.png" id="624" name="Picture"/>
+                    <pic:cNvPr descr="../figures/out/fig1_overview.png" id="731" name="Picture"/>
                     <pic:cNvPicPr>
                       <a:picLocks noChangeArrowheads="1" noChangeAspect="1"/>
                     </pic:cNvPicPr>
                   </pic:nvPicPr>
                   <pic:blipFill>
-                    <a:blip r:embed="rId622"/>
+                    <a:blip r:embed="rId729"/>
                     <a:stretch>
                       <a:fillRect/>
                     </a:stretch>
@@ -17620,18 +17626,18 @@
           <wp:inline>
             <wp:extent cx="5943600" cy="2123380"/>
             <wp:effectExtent b="0" l="0" r="0" t="0"/>
-            <wp:docPr descr="Fig. 2. Zheng isolate benchmark, accuracy versus coverage, and run-out control" title="" id="626" name="Picture"/>
+            <wp:docPr descr="Fig. 2. Zheng isolate benchmark, accuracy versus coverage, and run-out control" title="" id="733" name="Picture"/>
             <a:graphic>
               <a:graphicData uri="http://schemas.openxmlformats.org/drawingml/2006/picture">
                 <pic:pic>
                   <pic:nvPicPr>
-                    <pic:cNvPr descr="../figures/out/fig2_zheng_benchmark.png" id="627" name="Picture"/>
+                    <pic:cNvPr descr="../figures/out/fig2_zheng_benchmark.png" id="734" name="Picture"/>
                     <pic:cNvPicPr>
                       <a:picLocks noChangeArrowheads="1" noChangeAspect="1"/>
                     </pic:cNvPicPr>
                   </pic:nvPicPr>
                   <pic:blipFill>
-                    <a:blip r:embed="rId625"/>
+                    <a:blip r:embed="rId732"/>
                     <a:stretch>
                       <a:fillRect/>
                     </a:stretch>
@@ -17685,18 +17691,18 @@
           <wp:inline>
             <wp:extent cx="5943600" cy="2397967"/>
             <wp:effectExtent b="0" l="0" r="0" t="0"/>
-            <wp:docPr descr="Fig. 3. Multi-strain simulation" title="" id="629" name="Picture"/>
+            <wp:docPr descr="Fig. 3. Multi-strain simulation" title="" id="736" name="Picture"/>
             <a:graphic>
               <a:graphicData uri="http://schemas.openxmlformats.org/drawingml/2006/picture">
                 <pic:pic>
                   <pic:nvPicPr>
-                    <pic:cNvPr descr="../figures/out/fig3_simulation.png" id="630" name="Picture"/>
+                    <pic:cNvPr descr="../figures/out/fig3_simulation.png" id="737" name="Picture"/>
                     <pic:cNvPicPr>
                       <a:picLocks noChangeArrowheads="1" noChangeAspect="1"/>
                     </pic:cNvPicPr>
                   </pic:nvPicPr>
                   <pic:blipFill>
-                    <a:blip r:embed="rId628"/>
+                    <a:blip r:embed="rId735"/>
                     <a:stretch>
                       <a:fillRect/>
                     </a:stretch>
@@ -17750,18 +17756,18 @@
           <wp:inline>
             <wp:extent cx="5943600" cy="2011791"/>
             <wp:effectExtent b="0" l="0" r="0" t="0"/>
-            <wp:docPr descr="Fig. 4. Landmark-source attribution" title="" id="632" name="Picture"/>
+            <wp:docPr descr="Fig. 4. Landmark-source attribution" title="" id="739" name="Picture"/>
             <a:graphic>
               <a:graphicData uri="http://schemas.openxmlformats.org/drawingml/2006/picture">
                 <pic:pic>
                   <pic:nvPicPr>
-                    <pic:cNvPr descr="../figures/out/fig4_attribution.png" id="633" name="Picture"/>
+                    <pic:cNvPr descr="../figures/out/fig4_attribution.png" id="740" name="Picture"/>
                     <pic:cNvPicPr>
                       <a:picLocks noChangeArrowheads="1" noChangeAspect="1"/>
                     </pic:cNvPicPr>
                   </pic:nvPicPr>
                   <pic:blipFill>
-                    <a:blip r:embed="rId631"/>
+                    <a:blip r:embed="rId738"/>
                     <a:stretch>
                       <a:fillRect/>
                     </a:stretch>
@@ -17815,18 +17821,18 @@
           <wp:inline>
             <wp:extent cx="5943600" cy="1907620"/>
             <wp:effectExtent b="0" l="0" r="0" t="0"/>
-            <wp:docPr descr="Fig. 5. Count-level factorial decomposition of estimator, depth and shared-anchor ambiguity" title="" id="635" name="Picture"/>
+            <wp:docPr descr="Fig. 5. Count-level factorial decomposition of estimator, depth and shared-anchor ambiguity" title="" id="742" name="Picture"/>
             <a:graphic>
               <a:graphicData uri="http://schemas.openxmlformats.org/drawingml/2006/picture">
                 <pic:pic>
                   <pic:nvPicPr>
-                    <pic:cNvPr descr="../figures/out/fig5_factorial_mechanism.png" id="636" name="Picture"/>
+                    <pic:cNvPr descr="../figures/out/fig5_factorial_mechanism.png" id="743" name="Picture"/>
                     <pic:cNvPicPr>
                       <a:picLocks noChangeArrowheads="1" noChangeAspect="1"/>
                     </pic:cNvPicPr>
                   </pic:nvPicPr>
                   <pic:blipFill>
-                    <a:blip r:embed="rId634"/>
+                    <a:blip r:embed="rId741"/>
                     <a:stretch>
                       <a:fillRect/>
                     </a:stretch>
@@ -17880,18 +17886,18 @@
           <wp:inline>
             <wp:extent cx="5943600" cy="4181188"/>
             <wp:effectExtent b="0" l="0" r="0" t="0"/>
-            <wp:docPr descr="Fig. 6. Panel-size sweep and GC range" title="" id="638" name="Picture"/>
+            <wp:docPr descr="Fig. 6. Panel-size sweep and GC range" title="" id="745" name="Picture"/>
             <a:graphic>
               <a:graphicData uri="http://schemas.openxmlformats.org/drawingml/2006/picture">
                 <pic:pic>
                   <pic:nvPicPr>
-                    <pic:cNvPr descr="../figures/out/fig6_panel_design.png" id="639" name="Picture"/>
+                    <pic:cNvPr descr="../figures/out/fig6_panel_design.png" id="746" name="Picture"/>
                     <pic:cNvPicPr>
                       <a:picLocks noChangeArrowheads="1" noChangeAspect="1"/>
                     </pic:cNvPicPr>
                   </pic:nvPicPr>
                   <pic:blipFill>
-                    <a:blip r:embed="rId637"/>
+                    <a:blip r:embed="rId744"/>
                     <a:stretch>
                       <a:fillRect/>
                     </a:stretch>
@@ -17945,18 +17951,18 @@
           <wp:inline>
             <wp:extent cx="5943600" cy="4873369"/>
             <wp:effectExtent b="0" l="0" r="0" t="0"/>
-            <wp:docPr descr="Fig. 7. Fragmentation and scaffolding" title="" id="641" name="Picture"/>
+            <wp:docPr descr="Fig. 7. Fragmentation and scaffolding" title="" id="748" name="Picture"/>
             <a:graphic>
               <a:graphicData uri="http://schemas.openxmlformats.org/drawingml/2006/picture">
                 <pic:pic>
                   <pic:nvPicPr>
-                    <pic:cNvPr descr="../figures/out/fig7_fragmentation.png" id="642" name="Picture"/>
+                    <pic:cNvPr descr="../figures/out/fig7_fragmentation.png" id="749" name="Picture"/>
                     <pic:cNvPicPr>
                       <a:picLocks noChangeArrowheads="1" noChangeAspect="1"/>
                     </pic:cNvPicPr>
                   </pic:nvPicPr>
                   <pic:blipFill>
-                    <a:blip r:embed="rId640"/>
+                    <a:blip r:embed="rId747"/>
                     <a:stretch>
                       <a:fillRect/>
                     </a:stretch>
@@ -18010,18 +18016,18 @@
           <wp:inline>
             <wp:extent cx="5943600" cy="2396004"/>
             <wp:effectExtent b="0" l="0" r="0" t="0"/>
-            <wp:docPr descr="Fig. 8. Fecal-cohort concordance" title="" id="644" name="Picture"/>
+            <wp:docPr descr="Fig. 8. Fecal-cohort concordance" title="" id="751" name="Picture"/>
             <a:graphic>
               <a:graphicData uri="http://schemas.openxmlformats.org/drawingml/2006/picture">
                 <pic:pic>
                   <pic:nvPicPr>
-                    <pic:cNvPr descr="../figures/out/fig8_metagenome.png" id="645" name="Picture"/>
+                    <pic:cNvPr descr="../figures/out/fig8_metagenome.png" id="752" name="Picture"/>
                     <pic:cNvPicPr>
                       <a:picLocks noChangeArrowheads="1" noChangeAspect="1"/>
                     </pic:cNvPicPr>
                   </pic:nvPicPr>
                   <pic:blipFill>
-                    <a:blip r:embed="rId643"/>
+                    <a:blip r:embed="rId750"/>
                     <a:stretch>
                       <a:fillRect/>
                     </a:stretch>
@@ -18075,18 +18081,18 @@
           <wp:inline>
             <wp:extent cx="5943600" cy="2642374"/>
             <wp:effectExtent b="0" l="0" r="0" t="0"/>
-            <wp:docPr descr="Fig. 9. MAG-scale QC and cost" title="" id="647" name="Picture"/>
+            <wp:docPr descr="Fig. 9. MAG-scale QC and cost" title="" id="754" name="Picture"/>
             <a:graphic>
               <a:graphicData uri="http://schemas.openxmlformats.org/drawingml/2006/picture">
                 <pic:pic>
                   <pic:nvPicPr>
-                    <pic:cNvPr descr="../figures/out/fig9_mag_qc_cost.png" id="648" name="Picture"/>
+                    <pic:cNvPr descr="../figures/out/fig9_mag_qc_cost.png" id="755" name="Picture"/>
                     <pic:cNvPicPr>
                       <a:picLocks noChangeArrowheads="1" noChangeAspect="1"/>
                     </pic:cNvPicPr>
                   </pic:nvPicPr>
                   <pic:blipFill>
-                    <a:blip r:embed="rId646"/>
+                    <a:blip r:embed="rId753"/>
                     <a:stretch>
                       <a:fillRect/>
                     </a:stretch>
@@ -18131,8 +18137,8 @@
         <w:t xml:space="preserve">MAG-scale QC and cost</w:t>
       </w:r>
     </w:p>
-    <w:bookmarkEnd w:id="649"/>
-    <w:bookmarkStart w:id="650" w:name="tables"/>
+    <w:bookmarkEnd w:id="756"/>
+    <w:bookmarkStart w:id="757" w:name="tables"/>
     <w:p>
       <w:pPr>
         <w:pStyle w:val="Heading2"/>
@@ -42678,465 +42684,9 @@
       <w:r>
         <w:t xml:space="preserve">is the median absolute log2 PTR difference for the three genomes that pass QC in both arms. SLURM job 4095386; sample SRR28338156; 67,423,986 reads.</w:t>
       </w:r>
-      <w:r>
-        <w:t xml:space="preserve"> </w:t>
-      </w:r>
-      <w:r>
-        <w:rPr>
-          <w:b/>
-          <w:bCs/>
-        </w:rPr>
-        <w:t xml:space="preserve">Table 12. C5 fast-mode benchmark: 8 enzymes and mismatch 1 on one full-depth sample.</w:t>
-      </w:r>
     </w:p>
-    <w:tbl>
-      <w:tblPr>
-        <w:tblStyle w:val="Table"/>
-        <w:tblW w:type="pct" w:w="5000"/>
-        <w:tblLayout w:type="fixed"/>
-        <w:tblLook w:firstRow="1" w:lastRow="0" w:firstColumn="0" w:lastColumn="0" w:noHBand="0" w:noVBand="0" w:val="0020"/>
-      </w:tblPr>
-      <w:tblGrid>
-        <w:gridCol w:w="736"/>
-        <w:gridCol w:w="736"/>
-        <w:gridCol w:w="736"/>
-        <w:gridCol w:w="552"/>
-        <w:gridCol w:w="736"/>
-        <w:gridCol w:w="736"/>
-        <w:gridCol w:w="736"/>
-        <w:gridCol w:w="736"/>
-        <w:gridCol w:w="736"/>
-        <w:gridCol w:w="736"/>
-        <w:gridCol w:w="736"/>
-      </w:tblGrid>
-      <w:tr>
-        <w:trPr>
-          <w:tblHeader w:val="on"/>
-        </w:trPr>
-        <w:tc>
-          <w:tcPr/>
-          <w:p>
-            <w:pPr>
-              <w:pStyle w:val="Compact"/>
-              <w:jc w:val="left"/>
-            </w:pPr>
-            <w:r>
-              <w:t xml:space="preserve">arm</w:t>
-            </w:r>
-          </w:p>
-        </w:tc>
-        <w:tc>
-          <w:tcPr/>
-          <w:p>
-            <w:pPr>
-              <w:pStyle w:val="Compact"/>
-              <w:jc w:val="right"/>
-            </w:pPr>
-            <w:r>
-              <w:t xml:space="preserve">enzymes</w:t>
-            </w:r>
-          </w:p>
-        </w:tc>
-        <w:tc>
-          <w:tcPr/>
-          <w:p>
-            <w:pPr>
-              <w:pStyle w:val="Compact"/>
-              <w:jc w:val="right"/>
-            </w:pPr>
-            <w:r>
-              <w:t xml:space="preserve">mismatch</w:t>
-            </w:r>
-          </w:p>
-        </w:tc>
-        <w:tc>
-          <w:tcPr/>
-          <w:p>
-            <w:pPr>
-              <w:pStyle w:val="Compact"/>
-            </w:pPr>
-            <w:r>
-              <w:t xml:space="preserve">screen</w:t>
-            </w:r>
-          </w:p>
-        </w:tc>
-        <w:tc>
-          <w:tcPr/>
-          <w:p>
-            <w:pPr>
-              <w:pStyle w:val="Compact"/>
-              <w:jc w:val="right"/>
-            </w:pPr>
-            <w:r>
-              <w:t xml:space="preserve">threads</w:t>
-            </w:r>
-          </w:p>
-        </w:tc>
-        <w:tc>
-          <w:tcPr/>
-          <w:p>
-            <w:pPr>
-              <w:pStyle w:val="Compact"/>
-              <w:jc w:val="right"/>
-            </w:pPr>
-            <w:r>
-              <w:t xml:space="preserve">wall_s</w:t>
-            </w:r>
-          </w:p>
-        </w:tc>
-        <w:tc>
-          <w:tcPr/>
-          <w:p>
-            <w:pPr>
-              <w:pStyle w:val="Compact"/>
-              <w:jc w:val="right"/>
-            </w:pPr>
-            <w:r>
-              <w:t xml:space="preserve">wall_h</w:t>
-            </w:r>
-          </w:p>
-        </w:tc>
-        <w:tc>
-          <w:tcPr/>
-          <w:p>
-            <w:pPr>
-              <w:pStyle w:val="Compact"/>
-              <w:jc w:val="right"/>
-            </w:pPr>
-            <w:r>
-              <w:t xml:space="preserve">peak_rss_gb</w:t>
-            </w:r>
-          </w:p>
-        </w:tc>
-        <w:tc>
-          <w:tcPr/>
-          <w:p>
-            <w:pPr>
-              <w:pStyle w:val="Compact"/>
-              <w:jc w:val="right"/>
-            </w:pPr>
-            <w:r>
-              <w:t xml:space="preserve">n_finite_ptr</w:t>
-            </w:r>
-          </w:p>
-        </w:tc>
-        <w:tc>
-          <w:tcPr/>
-          <w:p>
-            <w:pPr>
-              <w:pStyle w:val="Compact"/>
-              <w:jc w:val="right"/>
-            </w:pPr>
-            <w:r>
-              <w:t xml:space="preserve">n_qc_pass</w:t>
-            </w:r>
-          </w:p>
-        </w:tc>
-        <w:tc>
-          <w:tcPr/>
-          <w:p>
-            <w:pPr>
-              <w:pStyle w:val="Compact"/>
-              <w:jc w:val="right"/>
-            </w:pPr>
-            <w:r>
-              <w:t xml:space="preserve">median_abs_log2ptr_common_qc</w:t>
-            </w:r>
-          </w:p>
-        </w:tc>
-      </w:tr>
-      <w:tr>
-        <w:tc>
-          <w:tcPr/>
-          <w:p>
-            <w:pPr>
-              <w:pStyle w:val="Compact"/>
-              <w:jc w:val="left"/>
-            </w:pPr>
-            <w:r>
-              <w:t xml:space="preserve">k16_mm2_current</w:t>
-            </w:r>
-          </w:p>
-        </w:tc>
-        <w:tc>
-          <w:tcPr/>
-          <w:p>
-            <w:pPr>
-              <w:pStyle w:val="Compact"/>
-              <w:jc w:val="right"/>
-            </w:pPr>
-            <w:r>
-              <w:t xml:space="preserve">16</w:t>
-            </w:r>
-          </w:p>
-        </w:tc>
-        <w:tc>
-          <w:tcPr/>
-          <w:p>
-            <w:pPr>
-              <w:pStyle w:val="Compact"/>
-              <w:jc w:val="right"/>
-            </w:pPr>
-            <w:r>
-              <w:t xml:space="preserve">2</w:t>
-            </w:r>
-          </w:p>
-        </w:tc>
-        <w:tc>
-          <w:tcPr/>
-          <w:p>
-            <w:pPr>
-              <w:pStyle w:val="Compact"/>
-            </w:pPr>
-            <w:r>
-              <w:t xml:space="preserve">no</w:t>
-            </w:r>
-          </w:p>
-        </w:tc>
-        <w:tc>
-          <w:tcPr/>
-          <w:p>
-            <w:pPr>
-              <w:pStyle w:val="Compact"/>
-              <w:jc w:val="right"/>
-            </w:pPr>
-            <w:r>
-              <w:t xml:space="preserve">8</w:t>
-            </w:r>
-          </w:p>
-        </w:tc>
-        <w:tc>
-          <w:tcPr/>
-          <w:p>
-            <w:pPr>
-              <w:pStyle w:val="Compact"/>
-              <w:jc w:val="right"/>
-            </w:pPr>
-            <w:r>
-              <w:t xml:space="preserve">76218.63</w:t>
-            </w:r>
-          </w:p>
-        </w:tc>
-        <w:tc>
-          <w:tcPr/>
-          <w:p>
-            <w:pPr>
-              <w:pStyle w:val="Compact"/>
-              <w:jc w:val="right"/>
-            </w:pPr>
-            <w:r>
-              <w:t xml:space="preserve">21.1718</w:t>
-            </w:r>
-          </w:p>
-        </w:tc>
-        <w:tc>
-          <w:tcPr/>
-          <w:p>
-            <w:pPr>
-              <w:pStyle w:val="Compact"/>
-              <w:jc w:val="right"/>
-            </w:pPr>
-            <w:r>
-              <w:t xml:space="preserve">15.3719</w:t>
-            </w:r>
-          </w:p>
-        </w:tc>
-        <w:tc>
-          <w:tcPr/>
-          <w:p>
-            <w:pPr>
-              <w:pStyle w:val="Compact"/>
-              <w:jc w:val="right"/>
-            </w:pPr>
-            <w:r>
-              <w:t xml:space="preserve">8</w:t>
-            </w:r>
-          </w:p>
-        </w:tc>
-        <w:tc>
-          <w:tcPr/>
-          <w:p>
-            <w:pPr>
-              <w:pStyle w:val="Compact"/>
-              <w:jc w:val="right"/>
-            </w:pPr>
-            <w:r>
-              <w:t xml:space="preserve">4</w:t>
-            </w:r>
-          </w:p>
-        </w:tc>
-        <w:tc>
-          <w:tcPr/>
-          <w:p>
-            <w:pPr>
-              <w:pStyle w:val="Compact"/>
-              <w:jc w:val="right"/>
-            </w:pPr>
-            <w:r>
-              <w:t xml:space="preserve">NA</w:t>
-            </w:r>
-          </w:p>
-        </w:tc>
-      </w:tr>
-      <w:tr>
-        <w:tc>
-          <w:tcPr/>
-          <w:p>
-            <w:pPr>
-              <w:pStyle w:val="Compact"/>
-              <w:jc w:val="left"/>
-            </w:pPr>
-            <w:r>
-              <w:t xml:space="preserve">k8_mm1_fast</w:t>
-            </w:r>
-          </w:p>
-        </w:tc>
-        <w:tc>
-          <w:tcPr/>
-          <w:p>
-            <w:pPr>
-              <w:pStyle w:val="Compact"/>
-              <w:jc w:val="right"/>
-            </w:pPr>
-            <w:r>
-              <w:t xml:space="preserve">8</w:t>
-            </w:r>
-          </w:p>
-        </w:tc>
-        <w:tc>
-          <w:tcPr/>
-          <w:p>
-            <w:pPr>
-              <w:pStyle w:val="Compact"/>
-              <w:jc w:val="right"/>
-            </w:pPr>
-            <w:r>
-              <w:t xml:space="preserve">1</w:t>
-            </w:r>
-          </w:p>
-        </w:tc>
-        <w:tc>
-          <w:tcPr/>
-          <w:p>
-            <w:pPr>
-              <w:pStyle w:val="Compact"/>
-            </w:pPr>
-            <w:r>
-              <w:t xml:space="preserve">no</w:t>
-            </w:r>
-          </w:p>
-        </w:tc>
-        <w:tc>
-          <w:tcPr/>
-          <w:p>
-            <w:pPr>
-              <w:pStyle w:val="Compact"/>
-              <w:jc w:val="right"/>
-            </w:pPr>
-            <w:r>
-              <w:t xml:space="preserve">8</w:t>
-            </w:r>
-          </w:p>
-        </w:tc>
-        <w:tc>
-          <w:tcPr/>
-          <w:p>
-            <w:pPr>
-              <w:pStyle w:val="Compact"/>
-              <w:jc w:val="right"/>
-            </w:pPr>
-            <w:r>
-              <w:t xml:space="preserve">4551.00</w:t>
-            </w:r>
-          </w:p>
-        </w:tc>
-        <w:tc>
-          <w:tcPr/>
-          <w:p>
-            <w:pPr>
-              <w:pStyle w:val="Compact"/>
-              <w:jc w:val="right"/>
-            </w:pPr>
-            <w:r>
-              <w:t xml:space="preserve">1.2642</w:t>
-            </w:r>
-          </w:p>
-        </w:tc>
-        <w:tc>
-          <w:tcPr/>
-          <w:p>
-            <w:pPr>
-              <w:pStyle w:val="Compact"/>
-              <w:jc w:val="right"/>
-            </w:pPr>
-            <w:r>
-              <w:t xml:space="preserve">10.3765</w:t>
-            </w:r>
-          </w:p>
-        </w:tc>
-        <w:tc>
-          <w:tcPr/>
-          <w:p>
-            <w:pPr>
-              <w:pStyle w:val="Compact"/>
-              <w:jc w:val="right"/>
-            </w:pPr>
-            <w:r>
-              <w:t xml:space="preserve">8</w:t>
-            </w:r>
-          </w:p>
-        </w:tc>
-        <w:tc>
-          <w:tcPr/>
-          <w:p>
-            <w:pPr>
-              <w:pStyle w:val="Compact"/>
-              <w:jc w:val="right"/>
-            </w:pPr>
-            <w:r>
-              <w:t xml:space="preserve">3</w:t>
-            </w:r>
-          </w:p>
-        </w:tc>
-        <w:tc>
-          <w:tcPr/>
-          <w:p>
-            <w:pPr>
-              <w:pStyle w:val="Compact"/>
-              <w:jc w:val="right"/>
-            </w:pPr>
-            <w:r>
-              <w:t xml:space="preserve">0.019429</w:t>
-            </w:r>
-          </w:p>
-        </w:tc>
-      </w:tr>
-    </w:tbl>
-    <w:p>
-      <w:pPr>
-        <w:pStyle w:val="BodyText"/>
-      </w:pPr>
-      <w:r>
-        <w:t xml:space="preserve">Current policy is the C5 refusion arm under the conservative fragmented-reference rule. The fast arm uses the top-8 ranked enzymes and mismatch 1 without a containment screen.</w:t>
-      </w:r>
-      <w:r>
-        <w:t xml:space="preserve"> </w:t>
-      </w:r>
-      <w:r>
-        <w:rPr>
-          <w:rStyle w:val="VerbatimChar"/>
-        </w:rPr>
-        <w:t xml:space="preserve">median_abs_log2ptr_common_qc</w:t>
-      </w:r>
-      <w:r>
-        <w:t xml:space="preserve"> </w:t>
-      </w:r>
-      <w:r>
-        <w:t xml:space="preserve">is the median absolute log2 PTR difference for the three genomes that pass QC in both arms. SLURM job 4095386; sample SRR28338156; 67,423,986 reads.</w:t>
-      </w:r>
-    </w:p>
-    <w:bookmarkEnd w:id="650"/>
-    <w:bookmarkEnd w:id="651"/>
+    <w:bookmarkEnd w:id="757"/>
+    <w:bookmarkEnd w:id="758"/>
     <w:sectPr>
       <w:footerReference r:id="rId9" w:type="default"/>
       <w:footnotePr>

</xml_diff>

<commit_message>
Apply nature-skills review and tighten benchmark reporting
</commit_message>
<xml_diff>
--- a/manuscript/submission/sk2bGrow_Microbiome_submission_draft.docx
+++ b/manuscript/submission/sk2bGrow_Microbiome_submission_draft.docx
@@ -2,7 +2,7 @@
 <file path=word/document.xml><?xml version="1.0" encoding="utf-8"?>
 <w:document xmlns:w="http://schemas.openxmlformats.org/wordprocessingml/2006/main" xmlns:m="http://schemas.openxmlformats.org/officeDocument/2006/math" xmlns:r="http://schemas.openxmlformats.org/officeDocument/2006/relationships" xmlns:o="urn:schemas-microsoft-com:office:office" xmlns:v="urn:schemas-microsoft-com:vml" xmlns:w10="urn:schemas-microsoft-com:office:word" xmlns:a="http://schemas.openxmlformats.org/drawingml/2006/main" xmlns:pic="http://schemas.openxmlformats.org/drawingml/2006/picture" xmlns:wp="http://schemas.openxmlformats.org/drawingml/2006/wordprocessingDrawing">
   <w:body>
-    <w:bookmarkStart w:id="758" w:name="X35a67ffd771dc0eee37406016d31234a1046d16"/>
+    <w:bookmarkStart w:id="865" w:name="X35a67ffd771dc0eee37406016d31234a1046d16"/>
     <w:p>
       <w:pPr>
         <w:pStyle w:val="Heading1"/>
@@ -11,7 +11,7 @@
         <w:t xml:space="preserve">Coordinate-aware V-fitting enables shallow-depth PTR estimation from 2bRAD anchor panels</w:t>
       </w:r>
     </w:p>
-    <w:bookmarkStart w:id="655" w:name="title-page"/>
+    <w:bookmarkStart w:id="762" w:name="title-page"/>
     <w:p>
       <w:pPr>
         <w:pStyle w:val="Heading2"/>
@@ -114,26 +114,8 @@
         <w:t xml:space="preserve">Microbiome</w:t>
       </w:r>
     </w:p>
-    <w:p>
-      <w:pPr>
-        <w:pStyle w:val="BodyText"/>
-      </w:pPr>
-      <w:r>
-        <w:rPr>
-          <w:b/>
-          <w:bCs/>
-        </w:rPr>
-        <w:t xml:space="preserve">Revision provenance:</w:t>
-      </w:r>
-      <w:r>
-        <w:t xml:space="preserve"> </w:t>
-      </w:r>
-      <w:r>
-        <w:t xml:space="preserve">Internal review revision 2026-09-22. The primary Zheng grid uses signed fixed-origin fitting and single-pass GC correction; residual two-pass GC correction remains diagnostic only. This revision adds the count-level factorial analysis (F6) and the post-hoc C5 k8/mismatch-1 deployment benchmark.</w:t>
-      </w:r>
-    </w:p>
-    <w:bookmarkEnd w:id="655"/>
-    <w:bookmarkStart w:id="656" w:name="abstract"/>
+    <w:bookmarkEnd w:id="762"/>
+    <w:bookmarkStart w:id="763" w:name="abstract"/>
     <w:p>
       <w:pPr>
         <w:pStyle w:val="Heading2"/>
@@ -147,7 +129,7 @@
         <w:pStyle w:val="FirstParagraph"/>
       </w:pPr>
       <w:r>
-        <w:t xml:space="preserve">Peak-to-trough ratio (PTR) inference from metagenomes is a culture-independent proxy for bacterial growth rates, but the current sketch-based estimator requires a depth that metagenomic per-strain coverage rarely reaches, and its shipped coverage gates return no estimate at all below ~10×. We present sk2bGrow, which counts Type IIB restriction-enzyme (2bRAD) anchors — motif-defined loci whose genome coordinates are known a priori and identical across samples — and fits the replication gradient with a coordinate-aware windowed V-fit. On the Zheng</w:t>
+        <w:t xml:space="preserve">Peak-to-trough ratio (PTR) inference from metagenomes is a culture-independent proxy for bacterial growth rates, but current sketch-based methods require a depth that per-strain metagenomic coverage rarely reaches, and shipped coverage gates return no estimate below approximately 10×. We present sk2bGrow, which counts Type IIB restriction-enzyme (2bRAD) anchors with known genomic coordinates and fits the replication gradient using a coordinate-aware windowed V-fit. On the Zheng</w:t>
       </w:r>
       <w:r>
         <w:t xml:space="preserve"> </w:t>
@@ -157,17 +139,17 @@
           <w:i/>
           <w:iCs/>
         </w:rPr>
-        <w:t xml:space="preserve">E. coli</w:t>
-      </w:r>
-      <w:r>
-        <w:t xml:space="preserve"> </w:t>
-      </w:r>
-      <w:r>
-        <w:t xml:space="preserve">growth-rate panel, sk2bGrow returned usable PTR estimates at 1–2× sequencing depth, where Pilea’s shipped defaults return nothing, with r = 0.92 at 1× and 0.96 at 2× against measured growth rates (n = 16). The accuracy comes from the coordinate-aware estimator, not the landmark source — at matched density, the two landmark sources were not significantly different in the paired bootstrap at any depth — while the multi-enzyme panel contributes what a hash sketch cannot: a wet-lab-realizable landmark set and consistency strata whose heterogeneous biases exposed our own counting defect. A post-hoc count-level factorial further separates shallow-depth extraction from multi-reference assignment: coordinate fitting was accurate for private anchors, whereas shared-anchor ambiguity introduced a depth-amplified negative bias. The estimates are not unbiased — the fitted slope compresses the dynamic range at low coverage, and the compression mechanism remains unresolved. On three fecal metagenomes, sk2bGrow and Pilea agreed (bias +0.22–+0.25 log2; n = 58–78 species×sample pairs per sample). As a process-level finding, exact deduplication of 2bRAD libraries before counting destroys the PTR signal — a PCR copy-number artefact we localize per anchor. sk2bGrow is 89.5–240.8× slower than Pilea at MAG-panel scale; mismatch-1 counting narrows the gap to roughly one order of magnitude (measured end-to-end on all nine samples: 20.5–38.8× faster counting than the mismatch-2 baseline, no genome lost), and a containment pre-screen — measured to clear the absent-reference false-positive floor, and required at database scale where an unrestricted index would emit estimates for absent references — completes the fix.</w:t>
+        <w:t xml:space="preserve">Escherichia coli</w:t>
+      </w:r>
+      <w:r>
+        <w:t xml:space="preserve"> </w:t>
+      </w:r>
+      <w:r>
+        <w:t xml:space="preserve">growth-rate panel, sk2bGrow returned estimates at 1–2× sequencing depth, where Pilea’s shipped defaults returned none, with r = 0.92 at 1× and 0.96 at 2× against measured growth rates. Controlled attribution showed that this shallow-depth gain came from coordinate-aware fitting rather than landmark source. A post-hoc count-level factorial further separated shallow-depth extraction from shared-anchor ambiguity, although it was mechanistic and did not model sequencing error, GC bias, or production mapping. PTR estimates were compressed at low depth, and the mechanism remains unresolved. In three fecal metagenomes, sk2bGrow and Pilea agreed (bias +0.22–+0.25 log2), while exact deduplication of real 2bRAD libraries destroyed the PTR signal. For MAG-scale shotgun data, a k8/mismatch-1 fast mode reduced one full-depth C5 sample from 21.17 h to 1.26 h (16.75×), with three versus four current-policy QC calls; confirmation across all nine samples is still needed. Pilea remained 13.25× faster on that sample. These results support coordinate-aware 2bRAD-style fitting for shallow-depth microbiome data while defining its validation limits.</w:t>
       </w:r>
     </w:p>
-    <w:bookmarkEnd w:id="656"/>
-    <w:bookmarkStart w:id="657" w:name="keywords"/>
+    <w:bookmarkEnd w:id="763"/>
+    <w:bookmarkStart w:id="764" w:name="keywords"/>
     <w:p>
       <w:pPr>
         <w:pStyle w:val="Heading2"/>
@@ -184,8 +166,8 @@
         <w:t xml:space="preserve">peak-to-trough ratio; microbial growth dynamics; 2bRAD; FracMinHash; metagenomics; shallow sequencing</w:t>
       </w:r>
     </w:p>
-    <w:bookmarkEnd w:id="657"/>
-    <w:bookmarkStart w:id="658" w:name="background"/>
+    <w:bookmarkEnd w:id="764"/>
+    <w:bookmarkStart w:id="765" w:name="background"/>
     <w:p>
       <w:pPr>
         <w:pStyle w:val="Heading2"/>
@@ -308,8 +290,8 @@
         <w:t xml:space="preserve">In short, this paper contributes (i) usable PTR estimates at 1–2× sequencing depth, with the low-coverage bias stated rather than hidden; (ii) a controlled 2 × 2 attribution localising the gain in the coordinate-aware estimator rather than in which landmarks are counted — the two landmark sources showed no significant paired-bootstrap difference once density was matched; and (iii) real-metagenome concordance with the incumbent and process-level findings — a deduplication recommendation and a per-anchor capture-efficiency measurement — that others can cite.</w:t>
       </w:r>
     </w:p>
-    <w:bookmarkEnd w:id="658"/>
-    <w:bookmarkStart w:id="687" w:name="methods"/>
+    <w:bookmarkEnd w:id="765"/>
+    <w:bookmarkStart w:id="794" w:name="methods"/>
     <w:p>
       <w:pPr>
         <w:pStyle w:val="Heading2"/>
@@ -334,7 +316,7 @@
       <w:r>
         <w:t xml:space="preserve"> </w:t>
       </w:r>
-      <w:hyperlink r:id="rId659">
+      <w:hyperlink r:id="rId766">
         <w:r>
           <w:rPr>
             <w:rStyle w:val="Hyperlink"/>
@@ -380,7 +362,7 @@
         </w:pict>
       </w:r>
     </w:p>
-    <w:bookmarkStart w:id="667" w:name="the-sk2bgrow-algorithm"/>
+    <w:bookmarkStart w:id="774" w:name="the-sk2bgrow-algorithm"/>
     <w:p>
       <w:pPr>
         <w:pStyle w:val="Heading3"/>
@@ -570,7 +552,7 @@
         <w:t xml:space="preserve">) has six stages.</w:t>
       </w:r>
     </w:p>
-    <w:bookmarkStart w:id="660" w:name="Xd9b3ed4dd252045d3e48557196049c0e39886bf"/>
+    <w:bookmarkStart w:id="767" w:name="Xd9b3ed4dd252045d3e48557196049c0e39886bf"/>
     <w:p>
       <w:pPr>
         <w:pStyle w:val="Heading4"/>
@@ -959,8 +941,8 @@
         <w:t xml:space="preserve">.</w:t>
       </w:r>
     </w:p>
-    <w:bookmarkEnd w:id="660"/>
-    <w:bookmarkStart w:id="661" w:name="read-counting-and-anchor-attribution"/>
+    <w:bookmarkEnd w:id="767"/>
+    <w:bookmarkStart w:id="768" w:name="read-counting-and-anchor-attribution"/>
     <w:p>
       <w:pPr>
         <w:pStyle w:val="Heading4"/>
@@ -1351,8 +1333,8 @@
         <w:t xml:space="preserve">iterations.</w:t>
       </w:r>
     </w:p>
-    <w:bookmarkEnd w:id="661"/>
-    <w:bookmarkStart w:id="662" w:name="windows-and-window-rates"/>
+    <w:bookmarkEnd w:id="768"/>
+    <w:bookmarkStart w:id="769" w:name="windows-and-window-rates"/>
     <w:p>
       <w:pPr>
         <w:pStyle w:val="Heading4"/>
@@ -1654,8 +1636,8 @@
         <w:t xml:space="preserve">~12 spurious log-likelihood units and BIC selects NB everywhere.</w:t>
       </w:r>
     </w:p>
-    <w:bookmarkEnd w:id="662"/>
-    <w:bookmarkStart w:id="663" w:name="gc-bias-correction"/>
+    <w:bookmarkEnd w:id="769"/>
+    <w:bookmarkStart w:id="770" w:name="gc-bias-correction"/>
     <w:p>
       <w:pPr>
         <w:pStyle w:val="Heading4"/>
@@ -1894,8 +1876,8 @@
         <w:t xml:space="preserve">).</w:t>
       </w:r>
     </w:p>
-    <w:bookmarkEnd w:id="663"/>
-    <w:bookmarkStart w:id="664" w:name="origin-placement-and-v-shape-fitting"/>
+    <w:bookmarkEnd w:id="770"/>
+    <w:bookmarkStart w:id="771" w:name="origin-placement-and-v-shape-fitting"/>
     <w:p>
       <w:pPr>
         <w:pStyle w:val="Heading4"/>
@@ -2465,8 +2447,8 @@
         <w:t xml:space="preserve">).</w:t>
       </w:r>
     </w:p>
-    <w:bookmarkEnd w:id="664"/>
-    <w:bookmarkStart w:id="665" w:name="cross-enzyme-fusion-and-quality-control"/>
+    <w:bookmarkEnd w:id="771"/>
+    <w:bookmarkStart w:id="772" w:name="cross-enzyme-fusion-and-quality-control"/>
     <w:p>
       <w:pPr>
         <w:pStyle w:val="Heading4"/>
@@ -2999,8 +2981,8 @@
         <w:t xml:space="preserve">rejection rate — the dependency is reported, not corrected (Discussion).</w:t>
       </w:r>
     </w:p>
-    <w:bookmarkEnd w:id="665"/>
-    <w:bookmarkStart w:id="666" w:name="implementation"/>
+    <w:bookmarkEnd w:id="772"/>
+    <w:bookmarkStart w:id="773" w:name="implementation"/>
     <w:p>
       <w:pPr>
         <w:pStyle w:val="Heading4"/>
@@ -3042,9 +3024,9 @@
         </w:pict>
       </w:r>
     </w:p>
-    <w:bookmarkEnd w:id="666"/>
-    <w:bookmarkEnd w:id="667"/>
-    <w:bookmarkStart w:id="668" w:name="enzyme-panel"/>
+    <w:bookmarkEnd w:id="773"/>
+    <w:bookmarkEnd w:id="774"/>
+    <w:bookmarkStart w:id="775" w:name="enzyme-panel"/>
     <w:p>
       <w:pPr>
         <w:pStyle w:val="Heading3"/>
@@ -3270,8 +3252,8 @@
         </w:pict>
       </w:r>
     </w:p>
-    <w:bookmarkEnd w:id="668"/>
-    <w:bookmarkStart w:id="676" w:name="benchmark-datasets"/>
+    <w:bookmarkEnd w:id="775"/>
+    <w:bookmarkStart w:id="783" w:name="benchmark-datasets"/>
     <w:p>
       <w:pPr>
         <w:pStyle w:val="Heading3"/>
@@ -3280,7 +3262,7 @@
         <w:t xml:space="preserve">3. Benchmark datasets</w:t>
       </w:r>
     </w:p>
-    <w:bookmarkStart w:id="669" w:name="X8558b042e1c4d57d5e6d341f0cb3e7790b4deb2"/>
+    <w:bookmarkStart w:id="776" w:name="X8558b042e1c4d57d5e6d341f0cb3e7790b4deb2"/>
     <w:p>
       <w:pPr>
         <w:pStyle w:val="Heading4"/>
@@ -3854,8 +3836,8 @@
         <w:t xml:space="preserve">establishes behaviour on a metagenome or a fragmented MAG.</w:t>
       </w:r>
     </w:p>
-    <w:bookmarkEnd w:id="669"/>
-    <w:bookmarkStart w:id="670" w:name="multi-strain-simulation"/>
+    <w:bookmarkEnd w:id="776"/>
+    <w:bookmarkStart w:id="777" w:name="multi-strain-simulation"/>
     <w:p>
       <w:pPr>
         <w:pStyle w:val="Heading4"/>
@@ -4134,8 +4116,8 @@
         <w:t xml:space="preserve">).</w:t>
       </w:r>
     </w:p>
-    <w:bookmarkEnd w:id="670"/>
-    <w:bookmarkStart w:id="671" w:name="reference-fragmentation"/>
+    <w:bookmarkEnd w:id="777"/>
+    <w:bookmarkStart w:id="778" w:name="reference-fragmentation"/>
     <w:p>
       <w:pPr>
         <w:pStyle w:val="Heading4"/>
@@ -4590,8 +4572,8 @@
         <w:t xml:space="preserve">scaffolding delivers.</w:t>
       </w:r>
     </w:p>
-    <w:bookmarkEnd w:id="671"/>
-    <w:bookmarkStart w:id="672" w:name="Xb780f84997d33bf0f401691b1288ff1538bcd72"/>
+    <w:bookmarkEnd w:id="778"/>
+    <w:bookmarkStart w:id="779" w:name="Xb780f84997d33bf0f401691b1288ff1538bcd72"/>
     <w:p>
       <w:pPr>
         <w:pStyle w:val="Heading4"/>
@@ -5049,8 +5031,8 @@
         <w:t xml:space="preserve">invariant to affine transformation.</w:t>
       </w:r>
     </w:p>
-    <w:bookmarkEnd w:id="672"/>
-    <w:bookmarkStart w:id="673" w:name="faecal-microbiome-sun-et-al."/>
+    <w:bookmarkEnd w:id="779"/>
+    <w:bookmarkStart w:id="780" w:name="faecal-microbiome-sun-et-al."/>
     <w:p>
       <w:pPr>
         <w:pStyle w:val="Heading4"/>
@@ -5618,8 +5600,8 @@
         <w:t xml:space="preserve">decomposition are defined in §5.</w:t>
       </w:r>
     </w:p>
-    <w:bookmarkEnd w:id="673"/>
-    <w:bookmarkStart w:id="674" w:name="Xbdb57a27110786c0a1921f07c423d99a2d691e0"/>
+    <w:bookmarkEnd w:id="780"/>
+    <w:bookmarkStart w:id="781" w:name="Xbdb57a27110786c0a1921f07c423d99a2d691e0"/>
     <w:p>
       <w:pPr>
         <w:pStyle w:val="Heading4"/>
@@ -6229,8 +6211,8 @@
         <w:t xml:space="preserve">counts, with per-anchor ratios ≈ 1).</w:t>
       </w:r>
     </w:p>
-    <w:bookmarkEnd w:id="674"/>
-    <w:bookmarkStart w:id="675" w:name="gc-spanning-genome-set"/>
+    <w:bookmarkEnd w:id="781"/>
+    <w:bookmarkStart w:id="782" w:name="gc-spanning-genome-set"/>
     <w:p>
       <w:pPr>
         <w:pStyle w:val="Heading4"/>
@@ -6340,9 +6322,9 @@
         </w:pict>
       </w:r>
     </w:p>
-    <w:bookmarkEnd w:id="675"/>
-    <w:bookmarkEnd w:id="676"/>
-    <w:bookmarkStart w:id="677" w:name="comparison-methods"/>
+    <w:bookmarkEnd w:id="782"/>
+    <w:bookmarkEnd w:id="783"/>
+    <w:bookmarkStart w:id="784" w:name="comparison-methods"/>
     <w:p>
       <w:pPr>
         <w:pStyle w:val="Heading3"/>
@@ -7070,8 +7052,8 @@
         </w:pict>
       </w:r>
     </w:p>
-    <w:bookmarkEnd w:id="677"/>
-    <w:bookmarkStart w:id="678" w:name="evaluation-metrics"/>
+    <w:bookmarkEnd w:id="784"/>
+    <w:bookmarkStart w:id="785" w:name="evaluation-metrics"/>
     <w:p>
       <w:pPr>
         <w:pStyle w:val="Heading3"/>
@@ -8473,8 +8455,8 @@
         </w:pict>
       </w:r>
     </w:p>
-    <w:bookmarkEnd w:id="678"/>
-    <w:bookmarkStart w:id="685" w:name="X85a115a26ce12f930c9dac210e8d891ae5a6b7c"/>
+    <w:bookmarkEnd w:id="785"/>
+    <w:bookmarkStart w:id="792" w:name="X85a115a26ce12f930c9dac210e8d891ae5a6b7c"/>
     <w:p>
       <w:pPr>
         <w:pStyle w:val="Heading3"/>
@@ -8597,7 +8579,7 @@
         <w:t xml:space="preserve">symmetric in effect.</w:t>
       </w:r>
     </w:p>
-    <w:bookmarkStart w:id="679" w:name="density-matching-on-the-zheng-grid-f1"/>
+    <w:bookmarkStart w:id="786" w:name="density-matching-on-the-zheng-grid-f1"/>
     <w:p>
       <w:pPr>
         <w:pStyle w:val="Heading4"/>
@@ -8738,8 +8720,8 @@
         <w:t xml:space="preserve">per-window landmark counts and detection fraction; per-cell failure cause.</w:t>
       </w:r>
     </w:p>
-    <w:bookmarkEnd w:id="679"/>
-    <w:bookmarkStart w:id="680" w:name="gc-sweep-f2"/>
+    <w:bookmarkEnd w:id="786"/>
+    <w:bookmarkStart w:id="787" w:name="gc-sweep-f2"/>
     <w:p>
       <w:pPr>
         <w:pStyle w:val="Heading4"/>
@@ -8967,8 +8949,8 @@
         <w:t xml:space="preserve">(landmarks/Mb).</w:t>
       </w:r>
     </w:p>
-    <w:bookmarkEnd w:id="680"/>
-    <w:bookmarkStart w:id="681" w:name="mismatch-tolerance-and-misassignment-f3"/>
+    <w:bookmarkEnd w:id="787"/>
+    <w:bookmarkStart w:id="788" w:name="mismatch-tolerance-and-misassignment-f3"/>
     <w:p>
       <w:pPr>
         <w:pStyle w:val="Heading4"/>
@@ -9273,8 +9255,8 @@
         <w:t xml:space="preserve">).</w:t>
       </w:r>
     </w:p>
-    <w:bookmarkEnd w:id="681"/>
-    <w:bookmarkStart w:id="682" w:name="fragmentation-sketch-f4"/>
+    <w:bookmarkEnd w:id="788"/>
+    <w:bookmarkStart w:id="789" w:name="fragmentation-sketch-f4"/>
     <w:p>
       <w:pPr>
         <w:pStyle w:val="Heading4"/>
@@ -9666,8 +9648,8 @@
         <w:t xml:space="preserve">rate, orientation accuracy and order Spearman; permutation null distributions.</w:t>
       </w:r>
     </w:p>
-    <w:bookmarkEnd w:id="682"/>
-    <w:bookmarkStart w:id="683" w:name="index-cost-at-gtdb-like-scale-f5"/>
+    <w:bookmarkEnd w:id="789"/>
+    <w:bookmarkStart w:id="790" w:name="index-cost-at-gtdb-like-scale-f5"/>
     <w:p>
       <w:pPr>
         <w:pStyle w:val="Heading4"/>
@@ -9969,8 +9951,8 @@
         <w:t xml:space="preserve">matched density.</w:t>
       </w:r>
     </w:p>
-    <w:bookmarkEnd w:id="683"/>
-    <w:bookmarkStart w:id="684" w:name="X84bfdf958829166d8b906dacf41027ff82eb47c"/>
+    <w:bookmarkEnd w:id="790"/>
+    <w:bookmarkStart w:id="791" w:name="X84bfdf958829166d8b906dacf41027ff82eb47c"/>
     <w:p>
       <w:pPr>
         <w:pStyle w:val="Heading4"/>
@@ -10230,6 +10212,30 @@
       <w:r>
         <w:t xml:space="preserve">.</w:t>
       </w:r>
+      <w:r>
+        <w:t xml:space="preserve"> </w:t>
+      </w:r>
+      <w:r>
+        <w:t xml:space="preserve">Factorial summaries in the text are weighted by the number of genome-level</w:t>
+      </w:r>
+      <w:r>
+        <w:t xml:space="preserve"> </w:t>
+      </w:r>
+      <w:r>
+        <w:t xml:space="preserve">estimates in each cell. We also report 95% intervals from 10,000 cell-level</w:t>
+      </w:r>
+      <w:r>
+        <w:t xml:space="preserve"> </w:t>
+      </w:r>
+      <w:r>
+        <w:t xml:space="preserve">bootstrap resamples; these quantify variability across factorial cells and do</w:t>
+      </w:r>
+      <w:r>
+        <w:t xml:space="preserve"> </w:t>
+      </w:r>
+      <w:r>
+        <w:t xml:space="preserve">not substitute for read-level validation.</w:t>
+      </w:r>
     </w:p>
     <w:p>
       <w:r>
@@ -10238,9 +10244,9 @@
         </w:pict>
       </w:r>
     </w:p>
-    <w:bookmarkEnd w:id="684"/>
-    <w:bookmarkEnd w:id="685"/>
-    <w:bookmarkStart w:id="686" w:name="computational-environment"/>
+    <w:bookmarkEnd w:id="791"/>
+    <w:bookmarkEnd w:id="792"/>
+    <w:bookmarkStart w:id="793" w:name="computational-environment"/>
     <w:p>
       <w:pPr>
         <w:pStyle w:val="Heading3"/>
@@ -10331,9 +10337,9 @@
         </w:pict>
       </w:r>
     </w:p>
-    <w:bookmarkEnd w:id="686"/>
-    <w:bookmarkEnd w:id="687"/>
-    <w:bookmarkStart w:id="706" w:name="results"/>
+    <w:bookmarkEnd w:id="793"/>
+    <w:bookmarkEnd w:id="794"/>
+    <w:bookmarkStart w:id="813" w:name="results"/>
     <w:p>
       <w:pPr>
         <w:pStyle w:val="Heading2"/>
@@ -10342,7 +10348,7 @@
         <w:t xml:space="preserve">Results</w:t>
       </w:r>
     </w:p>
-    <w:bookmarkStart w:id="688" w:name="sk2bgrow-overview"/>
+    <w:bookmarkStart w:id="795" w:name="sk2bgrow-overview"/>
     <w:p>
       <w:pPr>
         <w:pStyle w:val="Heading3"/>
@@ -10401,8 +10407,8 @@
         <w:t xml:space="preserve">² for the same sample. Panels b–d are real output from one 2× sample; the figure shows the method working on real data, not a cartoon (Fig. 1).</w:t>
       </w:r>
     </w:p>
-    <w:bookmarkEnd w:id="688"/>
-    <w:bookmarkStart w:id="692" w:name="accuracy-on-bacterial-isolates"/>
+    <w:bookmarkEnd w:id="795"/>
+    <w:bookmarkStart w:id="799" w:name="accuracy-on-bacterial-isolates"/>
     <w:p>
       <w:pPr>
         <w:pStyle w:val="Heading3"/>
@@ -10411,7 +10417,7 @@
         <w:t xml:space="preserve">2. Accuracy on bacterial isolates</w:t>
       </w:r>
     </w:p>
-    <w:bookmarkStart w:id="689" w:name="accuracy-across-the-coverage-titration"/>
+    <w:bookmarkStart w:id="796" w:name="accuracy-across-the-coverage-titration"/>
     <w:p>
       <w:pPr>
         <w:pStyle w:val="Heading4"/>
@@ -10588,8 +10594,8 @@
         <w:t xml:space="preserve">(Methods §1.4).</w:t>
       </w:r>
     </w:p>
-    <w:bookmarkEnd w:id="689"/>
-    <w:bookmarkStart w:id="690" w:name="a-negative-control-that-pilea-excluded"/>
+    <w:bookmarkEnd w:id="796"/>
+    <w:bookmarkStart w:id="797" w:name="a-negative-control-that-pilea-excluded"/>
     <w:p>
       <w:pPr>
         <w:pStyle w:val="Heading4"/>
@@ -10627,8 +10633,8 @@
         <w:t xml:space="preserve">estimate, and in exactly the direction of reading noise as growth (Fig. 2d).</w:t>
       </w:r>
     </w:p>
-    <w:bookmarkEnd w:id="690"/>
-    <w:bookmarkStart w:id="691" w:name="Xce6b542434ed1814004dfb47fad411b14a7baa6"/>
+    <w:bookmarkEnd w:id="797"/>
+    <w:bookmarkStart w:id="798" w:name="Xce6b542434ed1814004dfb47fad411b14a7baa6"/>
     <w:p>
       <w:pPr>
         <w:pStyle w:val="Heading4"/>
@@ -10676,9 +10682,9 @@
         <w:t xml:space="preserve">estimates and 167 of 172 in the multi-strain simulation. Because a 150 bp read yields 120 31-mers, a threshold of 5 on k-mer coverage corresponds to ≈6.25× read coverage (5 × 150/120), so the gate fires at 5× nominal even where the estimator behind it is still informative. At 0.5× the gate is correctly refusing to report: Pilea’s gates-off output there is fully degenerate — measured coverage exactly 1.000 and log₂PTR exactly 0.000 in all 17 samples. Between 1× and 5×, however, the gates-off estimator is informative (r = 0.78, 0.85, 0.99 against λ) and is nevertheless suppressed. The honest claim is therefore not that Pilea is over-conservative, but that its gate is calibrated to the point where the FracMinHash estimator breaks — ≈6.25× read coverage — whereas sk2bGrow’s break point is below 1× (Fig. 2; Table 5).</w:t>
       </w:r>
     </w:p>
-    <w:bookmarkEnd w:id="691"/>
-    <w:bookmarkEnd w:id="692"/>
-    <w:bookmarkStart w:id="693" w:name="multi-strain-communities"/>
+    <w:bookmarkEnd w:id="798"/>
+    <w:bookmarkEnd w:id="799"/>
+    <w:bookmarkStart w:id="800" w:name="multi-strain-communities"/>
     <w:p>
       <w:pPr>
         <w:pStyle w:val="Heading3"/>
@@ -10773,8 +10779,8 @@
         <w:t xml:space="preserve">; Methods §6.3). Recall 1.000 therefore still describes an exact-match-favourable grid, but it is no longer supported only by the estimator’s own generative model.</w:t>
       </w:r>
     </w:p>
-    <w:bookmarkEnd w:id="693"/>
-    <w:bookmarkStart w:id="695" w:name="what-do-the-landmarks-contribute"/>
+    <w:bookmarkEnd w:id="800"/>
+    <w:bookmarkStart w:id="802" w:name="what-do-the-landmarks-contribute"/>
     <w:p>
       <w:pPr>
         <w:pStyle w:val="Heading3"/>
@@ -11720,7 +11726,7 @@
         <w:t xml:space="preserve">(Fig. 4)</w:t>
       </w:r>
     </w:p>
-    <w:bookmarkStart w:id="694" w:name="Xfc754f5fdbc1a952568615503bb8f3afaadf421"/>
+    <w:bookmarkStart w:id="801" w:name="Xfc754f5fdbc1a952568615503bb8f3afaadf421"/>
     <w:p>
       <w:pPr>
         <w:pStyle w:val="Heading4"/>
@@ -11746,37 +11752,37 @@
         <w:t xml:space="preserve"> </w:t>
       </w:r>
       <w:r>
-        <w:t xml:space="preserve">anchor control, the coordinate fit was the dominant explanation for accuracy:</w:t>
-      </w:r>
-      <w:r>
-        <w:t xml:space="preserve"> </w:t>
-      </w:r>
-      <w:r>
-        <w:t xml:space="preserve">pooling both landmark arms, its mean RMSE at 0.5× was 0.115 log₂ units, compared</w:t>
-      </w:r>
-      <w:r>
-        <w:t xml:space="preserve"> </w:t>
-      </w:r>
-      <w:r>
-        <w:t xml:space="preserve">with 0.641 for sorted-rank regression, and increasing depth to 8× reduced the</w:t>
-      </w:r>
-      <w:r>
-        <w:t xml:space="preserve"> </w:t>
-      </w:r>
-      <w:r>
-        <w:t xml:space="preserve">coordinate-fit RMSE to 0.018. This is the same direction as the read-level</w:t>
-      </w:r>
-      <w:r>
-        <w:t xml:space="preserve"> </w:t>
-      </w:r>
-      <w:r>
-        <w:t xml:space="preserve">attribution experiment, but under a grid that extends to 32 strains and a</w:t>
-      </w:r>
-      <w:r>
-        <w:t xml:space="preserve"> </w:t>
-      </w:r>
-      <w:r>
-        <w:t xml:space="preserve">100:1 abundance ratio.</w:t>
+        <w:t xml:space="preserve">anchor control, the coordinate fit was the dominant explanation for accuracy.</w:t>
+      </w:r>
+      <w:r>
+        <w:t xml:space="preserve"> </w:t>
+      </w:r>
+      <w:r>
+        <w:t xml:space="preserve">Pooling both landmark arms and weighting by the number of genome-level</w:t>
+      </w:r>
+      <w:r>
+        <w:t xml:space="preserve"> </w:t>
+      </w:r>
+      <w:r>
+        <w:t xml:space="preserve">estimates, its mean RMSE at 0.5× was 0.122 log₂ units, compared with 0.622 for</w:t>
+      </w:r>
+      <w:r>
+        <w:t xml:space="preserve"> </w:t>
+      </w:r>
+      <w:r>
+        <w:t xml:space="preserve">sorted-rank regression; at 8× the corresponding RMSE values were 0.018 and</w:t>
+      </w:r>
+      <w:r>
+        <w:t xml:space="preserve"> </w:t>
+      </w:r>
+      <w:r>
+        <w:t xml:space="preserve">0.138. This is the same direction as the read-level attribution experiment, but</w:t>
+      </w:r>
+      <w:r>
+        <w:t xml:space="preserve"> </w:t>
+      </w:r>
+      <w:r>
+        <w:t xml:space="preserve">under a grid that extends to 32 strains and a 100:1 abundance ratio.</w:t>
       </w:r>
     </w:p>
     <w:p>
@@ -11790,49 +11796,61 @@
         <w:t xml:space="preserve"> </w:t>
       </w:r>
       <w:r>
-        <w:t xml:space="preserve">coordinate V-fit was already biased by −0.741 log₂ units at 0.5×, and the bias</w:t>
-      </w:r>
-      <w:r>
-        <w:t xml:space="preserve"> </w:t>
-      </w:r>
-      <w:r>
-        <w:t xml:space="preserve">deepened to −1.315 at 8× (RMSE 0.821 and 1.406). Thus increasing depth reduced</w:t>
-      </w:r>
-      <w:r>
-        <w:t xml:space="preserve"> </w:t>
-      </w:r>
-      <w:r>
-        <w:t xml:space="preserve">counting noise in the private-anchor control but did not remove — and in this</w:t>
-      </w:r>
-      <w:r>
-        <w:t xml:space="preserve"> </w:t>
-      </w:r>
-      <w:r>
-        <w:t xml:space="preserve">ambiguity model amplified — assignment error. Abundance imbalance affected the</w:t>
-      </w:r>
-      <w:r>
-        <w:t xml:space="preserve"> </w:t>
-      </w:r>
-      <w:r>
-        <w:t xml:space="preserve">two estimators differently: coordinate V-fit’s mean RMSE rose from 0.504 to 0.593</w:t>
-      </w:r>
-      <w:r>
-        <w:t xml:space="preserve"> </w:t>
-      </w:r>
-      <w:r>
-        <w:t xml:space="preserve">log₂ units from even to 100:1, while sorted-rank regression rose from 0.304 to</w:t>
-      </w:r>
-      <w:r>
-        <w:t xml:space="preserve"> </w:t>
-      </w:r>
-      <w:r>
-        <w:t xml:space="preserve">0.624. The factorial therefore treats depth and ambiguity as distinct axes</w:t>
-      </w:r>
-      <w:r>
-        <w:t xml:space="preserve"> </w:t>
-      </w:r>
-      <w:r>
-        <w:t xml:space="preserve">rather than collapsing both into a generic</w:t>
+        <w:t xml:space="preserve">coordinate V-fit was biased by −0.963 log₂ units at 0.5× (bootstrap cell-level</w:t>
+      </w:r>
+      <w:r>
+        <w:t xml:space="preserve"> </w:t>
+      </w:r>
+      <w:r>
+        <w:t xml:space="preserve">95% interval −1.489 to −0.404), and the bias deepened to −1.723 at 8×</w:t>
+      </w:r>
+      <w:r>
+        <w:t xml:space="preserve"> </w:t>
+      </w:r>
+      <w:r>
+        <w:t xml:space="preserve">(−2.680 to −0.743); RMSE increased from 1.431 to 2.571 log₂ units. These are</w:t>
+      </w:r>
+      <w:r>
+        <w:t xml:space="preserve"> </w:t>
+      </w:r>
+      <w:r>
+        <w:t xml:space="preserve">n-weighted pooled summaries, not production-pipeline predictions. Thus</w:t>
+      </w:r>
+      <w:r>
+        <w:t xml:space="preserve"> </w:t>
+      </w:r>
+      <w:r>
+        <w:t xml:space="preserve">increasing depth reduced counting noise in the private-anchor control but did</w:t>
+      </w:r>
+      <w:r>
+        <w:t xml:space="preserve"> </w:t>
+      </w:r>
+      <w:r>
+        <w:t xml:space="preserve">not remove — and in this ambiguity model amplified — assignment error.</w:t>
+      </w:r>
+      <w:r>
+        <w:t xml:space="preserve"> </w:t>
+      </w:r>
+      <w:r>
+        <w:t xml:space="preserve">Abundance imbalance affected the two estimators differently: coordinate V-fit’s</w:t>
+      </w:r>
+      <w:r>
+        <w:t xml:space="preserve"> </w:t>
+      </w:r>
+      <w:r>
+        <w:t xml:space="preserve">mean RMSE rose from 0.504 to 0.593 log₂ units from even to 100:1, while</w:t>
+      </w:r>
+      <w:r>
+        <w:t xml:space="preserve"> </w:t>
+      </w:r>
+      <w:r>
+        <w:t xml:space="preserve">sorted-rank regression rose from 0.304 to 0.624. The factorial therefore treats</w:t>
+      </w:r>
+      <w:r>
+        <w:t xml:space="preserve"> </w:t>
+      </w:r>
+      <w:r>
+        <w:t xml:space="preserve">depth and ambiguity as distinct axes rather than collapsing both into a generic</w:t>
       </w:r>
       <w:r>
         <w:t xml:space="preserve"> </w:t>
@@ -11864,25 +11882,25 @@
         <w:t xml:space="preserve"> </w:t>
       </w:r>
       <w:r>
-        <w:t xml:space="preserve">equivalent (paired RMSE differences: +0.002 for coordinate V-fit and −0.014 for</w:t>
-      </w:r>
-      <w:r>
-        <w:t xml:space="preserve"> </w:t>
-      </w:r>
-      <w:r>
-        <w:t xml:space="preserve">sorted rank). At 8× and 15 % shared anchors, however, coordinate V-fit had mean</w:t>
-      </w:r>
-      <w:r>
-        <w:t xml:space="preserve"> </w:t>
-      </w:r>
-      <w:r>
-        <w:t xml:space="preserve">RMSE 0.063 on the regular arm but 2.748 on the random arm, whereas sorted rank</w:t>
-      </w:r>
-      <w:r>
-        <w:t xml:space="preserve"> </w:t>
-      </w:r>
-      <w:r>
-        <w:t xml:space="preserve">was comparatively insensitive (0.278 versus 0.228). We interpret this as a</w:t>
+        <w:t xml:space="preserve">equivalent (n-weighted paired RMSE differences: +0.001 for coordinate V-fit and</w:t>
+      </w:r>
+      <w:r>
+        <w:t xml:space="preserve"> </w:t>
+      </w:r>
+      <w:r>
+        <w:t xml:space="preserve">−0.018 for sorted rank). At 8× and 15 % shared anchors, however, coordinate</w:t>
+      </w:r>
+      <w:r>
+        <w:t xml:space="preserve"> </w:t>
+      </w:r>
+      <w:r>
+        <w:t xml:space="preserve">V-fit had mean RMSE 0.068 on the regular arm but 3.636 on the random arm, whereas</w:t>
+      </w:r>
+      <w:r>
+        <w:t xml:space="preserve"> </w:t>
+      </w:r>
+      <w:r>
+        <w:t xml:space="preserve">sorted rank was comparatively insensitive (0.240 versus 0.232). We interpret this as a</w:t>
       </w:r>
       <w:r>
         <w:t xml:space="preserve"> </w:t>
@@ -11927,9 +11945,9 @@
         <w:t xml:space="preserve">(Fig. 5; Table 11)</w:t>
       </w:r>
     </w:p>
-    <w:bookmarkEnd w:id="694"/>
-    <w:bookmarkEnd w:id="695"/>
-    <w:bookmarkStart w:id="696" w:name="X5aa37cfb64c4d815f4fee0e74b644b0546e0c08"/>
+    <w:bookmarkEnd w:id="801"/>
+    <w:bookmarkEnd w:id="802"/>
+    <w:bookmarkStart w:id="803" w:name="X5aa37cfb64c4d815f4fee0e74b644b0546e0c08"/>
     <w:p>
       <w:pPr>
         <w:pStyle w:val="Heading3"/>
@@ -12795,8 +12813,8 @@
         <w:t xml:space="preserve">(Fig. 6)</w:t>
       </w:r>
     </w:p>
-    <w:bookmarkEnd w:id="696"/>
-    <w:bookmarkStart w:id="700" w:name="fragmented-references-and-mags"/>
+    <w:bookmarkEnd w:id="803"/>
+    <w:bookmarkStart w:id="807" w:name="fragmented-references-and-mags"/>
     <w:p>
       <w:pPr>
         <w:pStyle w:val="Heading3"/>
@@ -12805,7 +12823,7 @@
         <w:t xml:space="preserve">6. Fragmented references and MAGs</w:t>
       </w:r>
     </w:p>
-    <w:bookmarkStart w:id="697" w:name="X023c9de081127f5a9ee34128d04d5cd51d91210"/>
+    <w:bookmarkStart w:id="804" w:name="X023c9de081127f5a9ee34128d04d5cd51d91210"/>
     <w:p>
       <w:pPr>
         <w:pStyle w:val="Heading4"/>
@@ -13539,8 +13557,8 @@
         </w:tc>
       </w:tr>
     </w:tbl>
-    <w:bookmarkEnd w:id="697"/>
-    <w:bookmarkStart w:id="698" w:name="X6e8375112356a1e59f6c25ab9a7ae77408f4219"/>
+    <w:bookmarkEnd w:id="804"/>
+    <w:bookmarkStart w:id="805" w:name="X6e8375112356a1e59f6c25ab9a7ae77408f4219"/>
     <w:p>
       <w:pPr>
         <w:pStyle w:val="Heading4"/>
@@ -13743,8 +13761,8 @@
         <w:t xml:space="preserve">sketch scaffolding is demonstrated, not shipped (Fig. 7).</w:t>
       </w:r>
     </w:p>
-    <w:bookmarkEnd w:id="698"/>
-    <w:bookmarkStart w:id="699" w:name="X72de53e76597c7041bc0c2cfdd503c5ddd9d60b"/>
+    <w:bookmarkEnd w:id="805"/>
+    <w:bookmarkStart w:id="806" w:name="X72de53e76597c7041bc0c2cfdd503c5ddd9d60b"/>
     <w:p>
       <w:pPr>
         <w:pStyle w:val="Heading4"/>
@@ -13872,9 +13890,9 @@
         <w:t xml:space="preserve">(Fig. 7; Table 8)</w:t>
       </w:r>
     </w:p>
-    <w:bookmarkEnd w:id="699"/>
-    <w:bookmarkEnd w:id="700"/>
-    <w:bookmarkStart w:id="704" w:name="real-metagenomes"/>
+    <w:bookmarkEnd w:id="806"/>
+    <w:bookmarkEnd w:id="807"/>
+    <w:bookmarkStart w:id="811" w:name="real-metagenomes"/>
     <w:p>
       <w:pPr>
         <w:pStyle w:val="Heading3"/>
@@ -13883,7 +13901,7 @@
         <w:t xml:space="preserve">7. Real metagenomes</w:t>
       </w:r>
     </w:p>
-    <w:bookmarkStart w:id="701" w:name="X1ac24289c0a6b34d66188d6319131a2e330c07c"/>
+    <w:bookmarkStart w:id="808" w:name="X1ac24289c0a6b34d66188d6319131a2e330c07c"/>
     <w:p>
       <w:pPr>
         <w:pStyle w:val="Heading4"/>
@@ -14076,8 +14094,8 @@
         <w:t xml:space="preserve">).</w:t>
       </w:r>
     </w:p>
-    <w:bookmarkEnd w:id="701"/>
-    <w:bookmarkStart w:id="702" w:name="Xc081266583f5878e429dba77e287ecfb4e84c13"/>
+    <w:bookmarkEnd w:id="808"/>
+    <w:bookmarkStart w:id="809" w:name="Xc081266583f5878e429dba77e287ecfb4e84c13"/>
     <w:p>
       <w:pPr>
         <w:pStyle w:val="Heading4"/>
@@ -14324,8 +14342,8 @@
         <w:t xml:space="preserve">preparation) (Fig. 8).</w:t>
       </w:r>
     </w:p>
-    <w:bookmarkEnd w:id="702"/>
-    <w:bookmarkStart w:id="703" w:name="X855dfea45c8027e3834f5e0c80b8fc9c7aa81b5"/>
+    <w:bookmarkEnd w:id="809"/>
+    <w:bookmarkStart w:id="810" w:name="X855dfea45c8027e3834f5e0c80b8fc9c7aa81b5"/>
     <w:p>
       <w:pPr>
         <w:pStyle w:val="Heading4"/>
@@ -14741,6 +14759,48 @@
       <w:r>
         <w:t xml:space="preserve">false-positive side only.</w:t>
       </w:r>
+      <w:r>
+        <w:t xml:space="preserve"> </w:t>
+      </w:r>
+      <w:r>
+        <w:t xml:space="preserve">A direct C5 screen-equivalence audit shows why the screen cannot yet be treated</w:t>
+      </w:r>
+      <w:r>
+        <w:t xml:space="preserve"> </w:t>
+      </w:r>
+      <w:r>
+        <w:t xml:space="preserve">as per-anchor neutral. On a matched 1M-pair subset it retained 99.44% of nonzero</w:t>
+      </w:r>
+      <w:r>
+        <w:t xml:space="preserve"> </w:t>
+      </w:r>
+      <w:r>
+        <w:t xml:space="preserve">anchors and 99.35% of total count mass, but it lost 14,182 nonzero anchors,</w:t>
+      </w:r>
+      <w:r>
+        <w:t xml:space="preserve"> </w:t>
+      </w:r>
+      <w:r>
+        <w:t xml:space="preserve">gained 4,096, and changed counts for 412 of 522 genomes; the median nonzero-anchor</w:t>
+      </w:r>
+      <w:r>
+        <w:t xml:space="preserve"> </w:t>
+      </w:r>
+      <w:r>
+        <w:t xml:space="preserve">count ratio was 1, while the minimum was 0.2. It also dropped 65 low-abundance</w:t>
+      </w:r>
+      <w:r>
+        <w:t xml:space="preserve"> </w:t>
+      </w:r>
+      <w:r>
+        <w:t xml:space="preserve">real MAGs. The screen therefore remains a database-scale false-positive control,</w:t>
+      </w:r>
+      <w:r>
+        <w:t xml:space="preserve"> </w:t>
+      </w:r>
+      <w:r>
+        <w:t xml:space="preserve">not a default for this 522-MAG benchmark.</w:t>
+      </w:r>
     </w:p>
     <w:p>
       <w:pPr>
@@ -14811,43 +14871,79 @@
         <w:t xml:space="preserve"> </w:t>
       </w:r>
       <w:r>
-        <w:t xml:space="preserve">0.0194. On a matched 1M-pair subset, the k8 panel retained 76.6% of assigned</w:t>
-      </w:r>
-      <w:r>
-        <w:t xml:space="preserve"> </w:t>
-      </w:r>
-      <w:r>
-        <w:t xml:space="preserve">anchor mass, with no detectable genome lost and log₁₀ count-total correlation</w:t>
-      </w:r>
-      <w:r>
-        <w:t xml:space="preserve"> </w:t>
-      </w:r>
-      <w:r>
-        <w:t xml:space="preserve">0.997. This is a one-sample deployment benchmark rather than a new primary grid,</w:t>
-      </w:r>
-      <w:r>
-        <w:t xml:space="preserve"> </w:t>
-      </w:r>
-      <w:r>
-        <w:t xml:space="preserve">but it supports k8/mismatch-1 as a candidate default for shotgun MAG-scale runs;</w:t>
-      </w:r>
-      <w:r>
-        <w:t xml:space="preserve"> </w:t>
-      </w:r>
-      <w:r>
-        <w:t xml:space="preserve">confirmation across all nine C5 samples is still appropriate before changing the</w:t>
-      </w:r>
-      <w:r>
-        <w:t xml:space="preserve"> </w:t>
-      </w:r>
-      <w:r>
-        <w:t xml:space="preserve">shipped default. Real 2bRAD libraries should still use mismatch 0 unless a new</w:t>
-      </w:r>
-      <w:r>
-        <w:t xml:space="preserve"> </w:t>
-      </w:r>
-      <w:r>
-        <w:t xml:space="preserve">mismatch sensitivity analysis is performed on route-B reads.</w:t>
+        <w:t xml:space="preserve">0.0194; across all eight finite calls it was 0.0924 and the Pearson correlation</w:t>
+      </w:r>
+      <w:r>
+        <w:t xml:space="preserve"> </w:t>
+      </w:r>
+      <w:r>
+        <w:t xml:space="preserve">was 0.291. The 21.17-h current-policy runtime comprises the original</w:t>
+      </w:r>
+      <w:r>
+        <w:t xml:space="preserve"> </w:t>
+      </w:r>
+      <w:r>
+        <w:t xml:space="preserve">k16/mismatch-2 count stage (20.63 h) plus the retained-window refit (0.54 h);</w:t>
+      </w:r>
+      <w:r>
+        <w:t xml:space="preserve"> </w:t>
+      </w:r>
+      <w:r>
+        <w:t xml:space="preserve">the 1.26-h fast runtime is end-to-end. On a matched 1M-pair subset,</w:t>
+      </w:r>
+      <w:r>
+        <w:t xml:space="preserve"> </w:t>
+      </w:r>
+      <w:r>
+        <w:t xml:space="preserve">k8/mismatch-1 reduced count time from 111.25 s to 45.14 s, but statistics took</w:t>
+      </w:r>
+      <w:r>
+        <w:t xml:space="preserve"> </w:t>
+      </w:r>
+      <w:r>
+        <w:t xml:space="preserve">longer (721.57 s versus 683.01 s), so end-to-end time was similar (766.71 s</w:t>
+      </w:r>
+      <w:r>
+        <w:t xml:space="preserve"> </w:t>
+      </w:r>
+      <w:r>
+        <w:t xml:space="preserve">versus 794.26 s). The k8 panel retained 76.6% of assigned anchor mass, with no</w:t>
+      </w:r>
+      <w:r>
+        <w:t xml:space="preserve"> </w:t>
+      </w:r>
+      <w:r>
+        <w:t xml:space="preserve">detectable genome lost and log₁₀ count-total correlation 0.997. This is a</w:t>
+      </w:r>
+      <w:r>
+        <w:t xml:space="preserve"> </w:t>
+      </w:r>
+      <w:r>
+        <w:t xml:space="preserve">one-sample deployment case study rather than a new primary grid; it supports</w:t>
+      </w:r>
+      <w:r>
+        <w:t xml:space="preserve"> </w:t>
+      </w:r>
+      <w:r>
+        <w:t xml:space="preserve">k8/mismatch-1 as a candidate fast configuration, but confirmation across all</w:t>
+      </w:r>
+      <w:r>
+        <w:t xml:space="preserve"> </w:t>
+      </w:r>
+      <w:r>
+        <w:t xml:space="preserve">nine C5 samples is required before changing the shipped default. Real 2bRAD</w:t>
+      </w:r>
+      <w:r>
+        <w:t xml:space="preserve"> </w:t>
+      </w:r>
+      <w:r>
+        <w:t xml:space="preserve">libraries should still use mismatch 0 unless a new mismatch sensitivity analysis</w:t>
+      </w:r>
+      <w:r>
+        <w:t xml:space="preserve"> </w:t>
+      </w:r>
+      <w:r>
+        <w:t xml:space="preserve">is performed on route-B reads.</w:t>
       </w:r>
     </w:p>
     <w:p>
@@ -14859,12 +14955,34 @@
           <w:i/>
           <w:iCs/>
         </w:rPr>
-        <w:t xml:space="preserve">(Table 12; Fig. 9)</w:t>
+        <w:t xml:space="preserve">(Table 12; Fig. 9;</w:t>
+      </w:r>
+      <w:r>
+        <w:rPr>
+          <w:i/>
+          <w:iCs/>
+        </w:rPr>
+        <w:t xml:space="preserve"> </w:t>
+      </w:r>
+      <w:r>
+        <w:rPr>
+          <w:rStyle w:val="VerbatimChar"/>
+          <w:i/>
+          <w:iCs/>
+        </w:rPr>
+        <w:t xml:space="preserve">data/mm1_e2e/mm1_full_sample_cost.tsv</w:t>
+      </w:r>
+      <w:r>
+        <w:rPr>
+          <w:i/>
+          <w:iCs/>
+        </w:rPr>
+        <w:t xml:space="preserve">)</w:t>
       </w:r>
     </w:p>
-    <w:bookmarkEnd w:id="703"/>
-    <w:bookmarkEnd w:id="704"/>
-    <w:bookmarkStart w:id="705" w:name="computational-efficiency-and-scale"/>
+    <w:bookmarkEnd w:id="810"/>
+    <w:bookmarkEnd w:id="811"/>
+    <w:bookmarkStart w:id="812" w:name="computational-efficiency-and-scale"/>
     <w:p>
       <w:pPr>
         <w:pStyle w:val="Heading3"/>
@@ -15143,9 +15261,9 @@
         <w:t xml:space="preserve">(Fig. 9d)</w:t>
       </w:r>
     </w:p>
-    <w:bookmarkEnd w:id="705"/>
-    <w:bookmarkEnd w:id="706"/>
-    <w:bookmarkStart w:id="707" w:name="discussion"/>
+    <w:bookmarkEnd w:id="812"/>
+    <w:bookmarkEnd w:id="813"/>
+    <w:bookmarkStart w:id="814" w:name="discussion"/>
     <w:p>
       <w:pPr>
         <w:pStyle w:val="Heading2"/>
@@ -16782,8 +16900,8 @@
         <w:t xml:space="preserve">have no data in this study and must not be read as null results. The mismatch-tolerance row is asymmetric for a measured reason (F3): the enzyme mode’s exact-first counting rule suppresses the near-neighbor search that becomes the sketch mode’s rescue channel at scale ~100. Sketch-side scaffolding and sketch mismatch tolerance rest on a rule-based port/simulation respectively, not on shipped CLI modes (F3/F4 REVIEW caveats).</w:t>
       </w:r>
     </w:p>
-    <w:bookmarkEnd w:id="707"/>
-    <w:bookmarkStart w:id="708" w:name="conclusions"/>
+    <w:bookmarkEnd w:id="814"/>
+    <w:bookmarkStart w:id="815" w:name="conclusions"/>
     <w:p>
       <w:pPr>
         <w:pStyle w:val="Heading2"/>
@@ -16824,8 +16942,8 @@
         <w:t xml:space="preserve">The count-level factorial adds one further deployment principle: sequencing depth cannot repair ambiguous landmark assignment. Multi-strain applications should therefore report shared-anchor fractions and per-reference unique coverage alongside depth and recall, and should treat coordinate fitting, assignment of shared evidence, and computational cost as separately auditable steps rather than collapsing them into a single end-to-end accuracy number.</w:t>
       </w:r>
     </w:p>
-    <w:bookmarkEnd w:id="708"/>
-    <w:bookmarkStart w:id="709" w:name="list-of-abbreviations"/>
+    <w:bookmarkEnd w:id="815"/>
+    <w:bookmarkStart w:id="816" w:name="list-of-abbreviations"/>
     <w:p>
       <w:pPr>
         <w:pStyle w:val="Heading2"/>
@@ -16872,8 +16990,8 @@
         <w:t xml:space="preserve">V-fit: coordinate-aware windowed V-shaped regression fit</w:t>
       </w:r>
     </w:p>
-    <w:bookmarkEnd w:id="709"/>
-    <w:bookmarkStart w:id="719" w:name="declarations"/>
+    <w:bookmarkEnd w:id="816"/>
+    <w:bookmarkStart w:id="826" w:name="declarations"/>
     <w:p>
       <w:pPr>
         <w:pStyle w:val="Heading2"/>
@@ -16882,7 +17000,7 @@
         <w:t xml:space="preserve">Declarations</w:t>
       </w:r>
     </w:p>
-    <w:bookmarkStart w:id="710" w:name="Xd182db0490b2de20bd2b4e4cc8698599182035f"/>
+    <w:bookmarkStart w:id="817" w:name="Xd182db0490b2de20bd2b4e4cc8698599182035f"/>
     <w:p>
       <w:pPr>
         <w:pStyle w:val="Heading3"/>
@@ -16899,8 +17017,8 @@
         <w:t xml:space="preserve">Not applicable. This study analysed only publicly available sequencing data.</w:t>
       </w:r>
     </w:p>
-    <w:bookmarkEnd w:id="710"/>
-    <w:bookmarkStart w:id="711" w:name="consent-for-publication"/>
+    <w:bookmarkEnd w:id="817"/>
+    <w:bookmarkStart w:id="818" w:name="consent-for-publication"/>
     <w:p>
       <w:pPr>
         <w:pStyle w:val="Heading3"/>
@@ -16917,8 +17035,8 @@
         <w:t xml:space="preserve">Not applicable.</w:t>
       </w:r>
     </w:p>
-    <w:bookmarkEnd w:id="711"/>
-    <w:bookmarkStart w:id="713" w:name="availability-of-data-and-materials"/>
+    <w:bookmarkEnd w:id="818"/>
+    <w:bookmarkStart w:id="820" w:name="availability-of-data-and-materials"/>
     <w:p>
       <w:pPr>
         <w:pStyle w:val="Heading3"/>
@@ -16937,7 +17055,7 @@
       <w:r>
         <w:t xml:space="preserve"> </w:t>
       </w:r>
-      <w:hyperlink r:id="rId659">
+      <w:hyperlink r:id="rId766">
         <w:r>
           <w:rPr>
             <w:rStyle w:val="Hyperlink"/>
@@ -16957,7 +17075,7 @@
       <w:r>
         <w:t xml:space="preserve"> </w:t>
       </w:r>
-      <w:hyperlink r:id="rId712">
+      <w:hyperlink r:id="rId819">
         <w:r>
           <w:rPr>
             <w:rStyle w:val="Hyperlink"/>
@@ -17177,8 +17295,8 @@
         <w:t xml:space="preserve">study), PRJNA974210 (rotating biological contactor metagenome).</w:t>
       </w:r>
     </w:p>
-    <w:bookmarkEnd w:id="713"/>
-    <w:bookmarkStart w:id="714" w:name="competing-interests"/>
+    <w:bookmarkEnd w:id="820"/>
+    <w:bookmarkStart w:id="821" w:name="competing-interests"/>
     <w:p>
       <w:pPr>
         <w:pStyle w:val="Heading3"/>
@@ -17195,8 +17313,8 @@
         <w:t xml:space="preserve">The authors declare that they have no competing interests.</w:t>
       </w:r>
     </w:p>
-    <w:bookmarkEnd w:id="714"/>
-    <w:bookmarkStart w:id="715" w:name="funding"/>
+    <w:bookmarkEnd w:id="821"/>
+    <w:bookmarkStart w:id="822" w:name="funding"/>
     <w:p>
       <w:pPr>
         <w:pStyle w:val="Heading3"/>
@@ -17213,8 +17331,8 @@
         <w:t xml:space="preserve">[To be completed before submission.]</w:t>
       </w:r>
     </w:p>
-    <w:bookmarkEnd w:id="715"/>
-    <w:bookmarkStart w:id="716" w:name="authors-contributions"/>
+    <w:bookmarkEnd w:id="822"/>
+    <w:bookmarkStart w:id="823" w:name="authors-contributions"/>
     <w:p>
       <w:pPr>
         <w:pStyle w:val="Heading3"/>
@@ -17231,8 +17349,8 @@
         <w:t xml:space="preserve">[To be completed before submission using CRediT taxonomy and the final author initials.]</w:t>
       </w:r>
     </w:p>
-    <w:bookmarkEnd w:id="716"/>
-    <w:bookmarkStart w:id="717" w:name="acknowledgements"/>
+    <w:bookmarkEnd w:id="823"/>
+    <w:bookmarkStart w:id="824" w:name="acknowledgements"/>
     <w:p>
       <w:pPr>
         <w:pStyle w:val="Heading3"/>
@@ -17249,8 +17367,8 @@
         <w:t xml:space="preserve">[To be completed before submission or state “Not applicable.”]</w:t>
       </w:r>
     </w:p>
-    <w:bookmarkEnd w:id="717"/>
-    <w:bookmarkStart w:id="718" w:name="authors-information"/>
+    <w:bookmarkEnd w:id="824"/>
+    <w:bookmarkStart w:id="825" w:name="authors-information"/>
     <w:p>
       <w:pPr>
         <w:pStyle w:val="Heading3"/>
@@ -17267,9 +17385,9 @@
         <w:t xml:space="preserve">Not applicable.</w:t>
       </w:r>
     </w:p>
-    <w:bookmarkEnd w:id="718"/>
-    <w:bookmarkEnd w:id="719"/>
-    <w:bookmarkStart w:id="728" w:name="references"/>
+    <w:bookmarkEnd w:id="825"/>
+    <w:bookmarkEnd w:id="826"/>
+    <w:bookmarkStart w:id="835" w:name="references"/>
     <w:p>
       <w:pPr>
         <w:pStyle w:val="Heading2"/>
@@ -17302,7 +17420,7 @@
       <w:r>
         <w:t xml:space="preserve">. 2015;349(6252):1101–1106. doi:</w:t>
       </w:r>
-      <w:hyperlink r:id="rId720">
+      <w:hyperlink r:id="rId827">
         <w:r>
           <w:rPr>
             <w:rStyle w:val="Hyperlink"/>
@@ -17335,7 +17453,7 @@
       <w:r>
         <w:t xml:space="preserve">. 2016;34(12):1256–1263. doi:</w:t>
       </w:r>
-      <w:hyperlink r:id="rId721">
+      <w:hyperlink r:id="rId828">
         <w:r>
           <w:rPr>
             <w:rStyle w:val="Hyperlink"/>
@@ -17368,7 +17486,7 @@
       <w:r>
         <w:t xml:space="preserve">. 2022;32(3):558–568. doi:</w:t>
       </w:r>
-      <w:hyperlink r:id="rId722">
+      <w:hyperlink r:id="rId829">
         <w:r>
           <w:rPr>
             <w:rStyle w:val="Hyperlink"/>
@@ -17401,7 +17519,7 @@
       <w:r>
         <w:t xml:space="preserve">. 2026;14(1):128. doi:</w:t>
       </w:r>
-      <w:hyperlink r:id="rId723">
+      <w:hyperlink r:id="rId830">
         <w:r>
           <w:rPr>
             <w:rStyle w:val="Hyperlink"/>
@@ -17434,7 +17552,7 @@
       <w:r>
         <w:t xml:space="preserve">. 2012;9(8):808–810. doi:</w:t>
       </w:r>
-      <w:hyperlink r:id="rId724">
+      <w:hyperlink r:id="rId831">
         <w:r>
           <w:rPr>
             <w:rStyle w:val="Hyperlink"/>
@@ -17467,7 +17585,7 @@
       <w:r>
         <w:t xml:space="preserve">. 2020;15(4):e0219882. doi:</w:t>
       </w:r>
-      <w:hyperlink r:id="rId725">
+      <w:hyperlink r:id="rId832">
         <w:r>
           <w:rPr>
             <w:rStyle w:val="Hyperlink"/>
@@ -17500,7 +17618,7 @@
       <w:r>
         <w:t xml:space="preserve">. 2022;23:36. doi:</w:t>
       </w:r>
-      <w:hyperlink r:id="rId726">
+      <w:hyperlink r:id="rId833">
         <w:r>
           <w:rPr>
             <w:rStyle w:val="Hyperlink"/>
@@ -17533,7 +17651,7 @@
       <w:r>
         <w:t xml:space="preserve">. 2022. doi:</w:t>
       </w:r>
-      <w:hyperlink r:id="rId727">
+      <w:hyperlink r:id="rId834">
         <w:r>
           <w:rPr>
             <w:rStyle w:val="Hyperlink"/>
@@ -17542,8 +17660,8 @@
         </w:r>
       </w:hyperlink>
     </w:p>
-    <w:bookmarkEnd w:id="728"/>
-    <w:bookmarkStart w:id="756" w:name="figures"/>
+    <w:bookmarkEnd w:id="835"/>
+    <w:bookmarkStart w:id="863" w:name="figures"/>
     <w:p>
       <w:pPr>
         <w:pStyle w:val="Heading2"/>
@@ -17561,18 +17679,18 @@
           <wp:inline>
             <wp:extent cx="5943600" cy="4067536"/>
             <wp:effectExtent b="0" l="0" r="0" t="0"/>
-            <wp:docPr descr="Fig. 1. Overview and worked example" title="" id="730" name="Picture"/>
+            <wp:docPr descr="Fig. 1. Overview and worked example" title="" id="837" name="Picture"/>
             <a:graphic>
               <a:graphicData uri="http://schemas.openxmlformats.org/drawingml/2006/picture">
                 <pic:pic>
                   <pic:nvPicPr>
-                    <pic:cNvPr descr="../figures/out/fig1_overview.png" id="731" name="Picture"/>
+                    <pic:cNvPr descr="../figures/out/fig1_overview.png" id="838" name="Picture"/>
                     <pic:cNvPicPr>
                       <a:picLocks noChangeArrowheads="1" noChangeAspect="1"/>
                     </pic:cNvPicPr>
                   </pic:nvPicPr>
                   <pic:blipFill>
-                    <a:blip r:embed="rId729"/>
+                    <a:blip r:embed="rId836"/>
                     <a:stretch>
                       <a:fillRect/>
                     </a:stretch>
@@ -17626,18 +17744,18 @@
           <wp:inline>
             <wp:extent cx="5943600" cy="2123380"/>
             <wp:effectExtent b="0" l="0" r="0" t="0"/>
-            <wp:docPr descr="Fig. 2. Zheng isolate benchmark, accuracy versus coverage, and run-out control" title="" id="733" name="Picture"/>
+            <wp:docPr descr="Fig. 2. Zheng isolate benchmark, accuracy versus coverage, and run-out control" title="" id="840" name="Picture"/>
             <a:graphic>
               <a:graphicData uri="http://schemas.openxmlformats.org/drawingml/2006/picture">
                 <pic:pic>
                   <pic:nvPicPr>
-                    <pic:cNvPr descr="../figures/out/fig2_zheng_benchmark.png" id="734" name="Picture"/>
+                    <pic:cNvPr descr="../figures/out/fig2_zheng_benchmark.png" id="841" name="Picture"/>
                     <pic:cNvPicPr>
                       <a:picLocks noChangeArrowheads="1" noChangeAspect="1"/>
                     </pic:cNvPicPr>
                   </pic:nvPicPr>
                   <pic:blipFill>
-                    <a:blip r:embed="rId732"/>
+                    <a:blip r:embed="rId839"/>
                     <a:stretch>
                       <a:fillRect/>
                     </a:stretch>
@@ -17691,18 +17809,18 @@
           <wp:inline>
             <wp:extent cx="5943600" cy="2397967"/>
             <wp:effectExtent b="0" l="0" r="0" t="0"/>
-            <wp:docPr descr="Fig. 3. Multi-strain simulation" title="" id="736" name="Picture"/>
+            <wp:docPr descr="Fig. 3. Multi-strain simulation" title="" id="843" name="Picture"/>
             <a:graphic>
               <a:graphicData uri="http://schemas.openxmlformats.org/drawingml/2006/picture">
                 <pic:pic>
                   <pic:nvPicPr>
-                    <pic:cNvPr descr="../figures/out/fig3_simulation.png" id="737" name="Picture"/>
+                    <pic:cNvPr descr="../figures/out/fig3_simulation.png" id="844" name="Picture"/>
                     <pic:cNvPicPr>
                       <a:picLocks noChangeArrowheads="1" noChangeAspect="1"/>
                     </pic:cNvPicPr>
                   </pic:nvPicPr>
                   <pic:blipFill>
-                    <a:blip r:embed="rId735"/>
+                    <a:blip r:embed="rId842"/>
                     <a:stretch>
                       <a:fillRect/>
                     </a:stretch>
@@ -17756,18 +17874,18 @@
           <wp:inline>
             <wp:extent cx="5943600" cy="2011791"/>
             <wp:effectExtent b="0" l="0" r="0" t="0"/>
-            <wp:docPr descr="Fig. 4. Landmark-source attribution" title="" id="739" name="Picture"/>
+            <wp:docPr descr="Fig. 4. Landmark-source attribution" title="" id="846" name="Picture"/>
             <a:graphic>
               <a:graphicData uri="http://schemas.openxmlformats.org/drawingml/2006/picture">
                 <pic:pic>
                   <pic:nvPicPr>
-                    <pic:cNvPr descr="../figures/out/fig4_attribution.png" id="740" name="Picture"/>
+                    <pic:cNvPr descr="../figures/out/fig4_attribution.png" id="847" name="Picture"/>
                     <pic:cNvPicPr>
                       <a:picLocks noChangeArrowheads="1" noChangeAspect="1"/>
                     </pic:cNvPicPr>
                   </pic:nvPicPr>
                   <pic:blipFill>
-                    <a:blip r:embed="rId738"/>
+                    <a:blip r:embed="rId845"/>
                     <a:stretch>
                       <a:fillRect/>
                     </a:stretch>
@@ -17821,18 +17939,18 @@
           <wp:inline>
             <wp:extent cx="5943600" cy="1907620"/>
             <wp:effectExtent b="0" l="0" r="0" t="0"/>
-            <wp:docPr descr="Fig. 5. Count-level factorial decomposition of estimator, depth and shared-anchor ambiguity" title="" id="742" name="Picture"/>
+            <wp:docPr descr="Fig. 5. Count-level factorial decomposition of estimator, depth and shared-anchor ambiguity" title="" id="849" name="Picture"/>
             <a:graphic>
               <a:graphicData uri="http://schemas.openxmlformats.org/drawingml/2006/picture">
                 <pic:pic>
                   <pic:nvPicPr>
-                    <pic:cNvPr descr="../figures/out/fig5_factorial_mechanism.png" id="743" name="Picture"/>
+                    <pic:cNvPr descr="../figures/out/fig5_factorial_mechanism.png" id="850" name="Picture"/>
                     <pic:cNvPicPr>
                       <a:picLocks noChangeArrowheads="1" noChangeAspect="1"/>
                     </pic:cNvPicPr>
                   </pic:nvPicPr>
                   <pic:blipFill>
-                    <a:blip r:embed="rId741"/>
+                    <a:blip r:embed="rId848"/>
                     <a:stretch>
                       <a:fillRect/>
                     </a:stretch>
@@ -17886,18 +18004,18 @@
           <wp:inline>
             <wp:extent cx="5943600" cy="4181188"/>
             <wp:effectExtent b="0" l="0" r="0" t="0"/>
-            <wp:docPr descr="Fig. 6. Panel-size sweep and GC range" title="" id="745" name="Picture"/>
+            <wp:docPr descr="Fig. 6. Panel-size sweep and GC range" title="" id="852" name="Picture"/>
             <a:graphic>
               <a:graphicData uri="http://schemas.openxmlformats.org/drawingml/2006/picture">
                 <pic:pic>
                   <pic:nvPicPr>
-                    <pic:cNvPr descr="../figures/out/fig6_panel_design.png" id="746" name="Picture"/>
+                    <pic:cNvPr descr="../figures/out/fig6_panel_design.png" id="853" name="Picture"/>
                     <pic:cNvPicPr>
                       <a:picLocks noChangeArrowheads="1" noChangeAspect="1"/>
                     </pic:cNvPicPr>
                   </pic:nvPicPr>
                   <pic:blipFill>
-                    <a:blip r:embed="rId744"/>
+                    <a:blip r:embed="rId851"/>
                     <a:stretch>
                       <a:fillRect/>
                     </a:stretch>
@@ -17951,18 +18069,18 @@
           <wp:inline>
             <wp:extent cx="5943600" cy="4873369"/>
             <wp:effectExtent b="0" l="0" r="0" t="0"/>
-            <wp:docPr descr="Fig. 7. Fragmentation and scaffolding" title="" id="748" name="Picture"/>
+            <wp:docPr descr="Fig. 7. Fragmentation and scaffolding" title="" id="855" name="Picture"/>
             <a:graphic>
               <a:graphicData uri="http://schemas.openxmlformats.org/drawingml/2006/picture">
                 <pic:pic>
                   <pic:nvPicPr>
-                    <pic:cNvPr descr="../figures/out/fig7_fragmentation.png" id="749" name="Picture"/>
+                    <pic:cNvPr descr="../figures/out/fig7_fragmentation.png" id="856" name="Picture"/>
                     <pic:cNvPicPr>
                       <a:picLocks noChangeArrowheads="1" noChangeAspect="1"/>
                     </pic:cNvPicPr>
                   </pic:nvPicPr>
                   <pic:blipFill>
-                    <a:blip r:embed="rId747"/>
+                    <a:blip r:embed="rId854"/>
                     <a:stretch>
                       <a:fillRect/>
                     </a:stretch>
@@ -18016,18 +18134,18 @@
           <wp:inline>
             <wp:extent cx="5943600" cy="2396004"/>
             <wp:effectExtent b="0" l="0" r="0" t="0"/>
-            <wp:docPr descr="Fig. 8. Fecal-cohort concordance" title="" id="751" name="Picture"/>
+            <wp:docPr descr="Fig. 8. Fecal-cohort concordance" title="" id="858" name="Picture"/>
             <a:graphic>
               <a:graphicData uri="http://schemas.openxmlformats.org/drawingml/2006/picture">
                 <pic:pic>
                   <pic:nvPicPr>
-                    <pic:cNvPr descr="../figures/out/fig8_metagenome.png" id="752" name="Picture"/>
+                    <pic:cNvPr descr="../figures/out/fig8_metagenome.png" id="859" name="Picture"/>
                     <pic:cNvPicPr>
                       <a:picLocks noChangeArrowheads="1" noChangeAspect="1"/>
                     </pic:cNvPicPr>
                   </pic:nvPicPr>
                   <pic:blipFill>
-                    <a:blip r:embed="rId750"/>
+                    <a:blip r:embed="rId857"/>
                     <a:stretch>
                       <a:fillRect/>
                     </a:stretch>
@@ -18081,18 +18199,18 @@
           <wp:inline>
             <wp:extent cx="5943600" cy="2642374"/>
             <wp:effectExtent b="0" l="0" r="0" t="0"/>
-            <wp:docPr descr="Fig. 9. MAG-scale QC and cost" title="" id="754" name="Picture"/>
+            <wp:docPr descr="Fig. 9. MAG-scale QC and cost" title="" id="861" name="Picture"/>
             <a:graphic>
               <a:graphicData uri="http://schemas.openxmlformats.org/drawingml/2006/picture">
                 <pic:pic>
                   <pic:nvPicPr>
-                    <pic:cNvPr descr="../figures/out/fig9_mag_qc_cost.png" id="755" name="Picture"/>
+                    <pic:cNvPr descr="../figures/out/fig9_mag_qc_cost.png" id="862" name="Picture"/>
                     <pic:cNvPicPr>
                       <a:picLocks noChangeArrowheads="1" noChangeAspect="1"/>
                     </pic:cNvPicPr>
                   </pic:nvPicPr>
                   <pic:blipFill>
-                    <a:blip r:embed="rId753"/>
+                    <a:blip r:embed="rId860"/>
                     <a:stretch>
                       <a:fillRect/>
                     </a:stretch>
@@ -18137,8 +18255,8 @@
         <w:t xml:space="preserve">MAG-scale QC and cost</w:t>
       </w:r>
     </w:p>
-    <w:bookmarkEnd w:id="756"/>
-    <w:bookmarkStart w:id="757" w:name="tables"/>
+    <w:bookmarkEnd w:id="863"/>
+    <w:bookmarkStart w:id="864" w:name="tables"/>
     <w:p>
       <w:pPr>
         <w:pStyle w:val="Heading2"/>
@@ -40772,7 +40890,7 @@
         <w:pStyle w:val="BodyText"/>
       </w:pPr>
       <w:r>
-        <w:t xml:space="preserve">Values are means over 4/8/16/32-strain communities, even/10:1/100:1 abundance ratios and 10 replicates, shown for the regular coordinate arm. The random FracMinHash-like arm and paired source contrasts are in</w:t>
+        <w:t xml:space="preserve">Values are n-weighted means over 4/8/16/32-strain communities, even/10:1/100:1 abundance ratios and 10 replicates, shown for the regular coordinate arm. The random FracMinHash-like arm, paired source contrasts and bootstrap intervals are in</w:t>
       </w:r>
       <w:r>
         <w:t xml:space="preserve"> </w:t>
@@ -40784,6 +40902,18 @@
         <w:t xml:space="preserve">factorial_benchmark/factorial_long.tsv</w:t>
       </w:r>
       <w:r>
+        <w:t xml:space="preserve">,</w:t>
+      </w:r>
+      <w:r>
+        <w:t xml:space="preserve"> </w:t>
+      </w:r>
+      <w:r>
+        <w:rPr>
+          <w:rStyle w:val="VerbatimChar"/>
+        </w:rPr>
+        <w:t xml:space="preserve">tables/table11_pooled_sources_summary_ci.tsv</w:t>
+      </w:r>
+      <w:r>
         <w:t xml:space="preserve"> </w:t>
       </w:r>
       <w:r>
@@ -40796,7 +40926,7 @@
         <w:rPr>
           <w:rStyle w:val="VerbatimChar"/>
         </w:rPr>
-        <w:t xml:space="preserve">factorial_benchmark/factorial_source_contrasts.tsv</w:t>
+        <w:t xml:space="preserve">tables/table11_by_source_summary_ci.tsv</w:t>
       </w:r>
       <w:r>
         <w:t xml:space="preserve">. Bias and RMSE are in log2(PTR) units.</w:t>
@@ -42236,7 +42366,7 @@
           <w:b/>
           <w:bCs/>
         </w:rPr>
-        <w:t xml:space="preserve">Table 12. C5 fast-mode benchmark: 8 enzymes and mismatch 1 on one full-depth sample.</w:t>
+        <w:t xml:space="preserve">Table 12. C5 deployment benchmark: current 16-enzyme/mismatch-2 policy versus 8-enzyme/mismatch-1 fast mode.</w:t>
       </w:r>
     </w:p>
     <w:tbl>
@@ -42247,17 +42377,18 @@
         <w:tblLook w:firstRow="1" w:lastRow="0" w:firstColumn="0" w:lastColumn="0" w:noHBand="0" w:noVBand="0" w:val="0020"/>
       </w:tblPr>
       <w:tblGrid>
-        <w:gridCol w:w="736"/>
-        <w:gridCol w:w="736"/>
-        <w:gridCol w:w="736"/>
-        <w:gridCol w:w="552"/>
-        <w:gridCol w:w="736"/>
-        <w:gridCol w:w="736"/>
-        <w:gridCol w:w="736"/>
-        <w:gridCol w:w="736"/>
-        <w:gridCol w:w="736"/>
-        <w:gridCol w:w="736"/>
-        <w:gridCol w:w="736"/>
+        <w:gridCol w:w="674"/>
+        <w:gridCol w:w="674"/>
+        <w:gridCol w:w="674"/>
+        <w:gridCol w:w="505"/>
+        <w:gridCol w:w="674"/>
+        <w:gridCol w:w="674"/>
+        <w:gridCol w:w="674"/>
+        <w:gridCol w:w="674"/>
+        <w:gridCol w:w="674"/>
+        <w:gridCol w:w="674"/>
+        <w:gridCol w:w="674"/>
+        <w:gridCol w:w="674"/>
       </w:tblGrid>
       <w:tr>
         <w:trPr>
@@ -42390,6 +42521,18 @@
               <w:jc w:val="right"/>
             </w:pPr>
             <w:r>
+              <w:t xml:space="preserve">median_log2ptr_qc</w:t>
+            </w:r>
+          </w:p>
+        </w:tc>
+        <w:tc>
+          <w:tcPr/>
+          <w:p>
+            <w:pPr>
+              <w:pStyle w:val="Compact"/>
+              <w:jc w:val="right"/>
+            </w:pPr>
+            <w:r>
               <w:t xml:space="preserve">median_abs_log2ptr_common_qc</w:t>
             </w:r>
           </w:p>
@@ -42523,6 +42666,18 @@
               <w:jc w:val="right"/>
             </w:pPr>
             <w:r>
+              <w:t xml:space="preserve">0.126238</w:t>
+            </w:r>
+          </w:p>
+        </w:tc>
+        <w:tc>
+          <w:tcPr/>
+          <w:p>
+            <w:pPr>
+              <w:pStyle w:val="Compact"/>
+              <w:jc w:val="right"/>
+            </w:pPr>
+            <w:r>
               <w:t xml:space="preserve">NA</w:t>
             </w:r>
           </w:p>
@@ -42645,6 +42800,18 @@
             </w:pPr>
             <w:r>
               <w:t xml:space="preserve">3</w:t>
+            </w:r>
+          </w:p>
+        </w:tc>
+        <w:tc>
+          <w:tcPr/>
+          <w:p>
+            <w:pPr>
+              <w:pStyle w:val="Compact"/>
+              <w:jc w:val="right"/>
+            </w:pPr>
+            <w:r>
+              <w:t xml:space="preserve">0.148049</w:t>
             </w:r>
           </w:p>
         </w:tc>
@@ -42667,7 +42834,7 @@
         <w:pStyle w:val="BodyText"/>
       </w:pPr>
       <w:r>
-        <w:t xml:space="preserve">Current policy is the C5 refusion arm under the conservative fragmented-reference rule. The fast arm uses the top-8 ranked enzymes and mismatch 1 without a containment screen.</w:t>
+        <w:t xml:space="preserve">Current policy is the C5 refusion arm under the conservative fragmented-reference rule; its runtime combines the original k16/mismatch-2 count stage with the retained-window refit. The fast arm is end-to-end and uses the top-8 ranked enzymes and mismatch 1 without a containment screen.</w:t>
       </w:r>
       <w:r>
         <w:t xml:space="preserve"> </w:t>
@@ -42682,11 +42849,11 @@
         <w:t xml:space="preserve"> </w:t>
       </w:r>
       <w:r>
-        <w:t xml:space="preserve">is the median absolute log2 PTR difference for the three genomes that pass QC in both arms. SLURM job 4095386; sample SRR28338156; 67,423,986 reads.</w:t>
+        <w:t xml:space="preserve">is the median absolute log2 PTR difference for the three genomes that pass QC in both arms. Across all eight finite calls, Pearson r was 0.291 and median absolute difference was 0.0924. SLURM job 4095386; sample SRR28338156; 67,423,986 reads.</w:t>
       </w:r>
     </w:p>
-    <w:bookmarkEnd w:id="757"/>
-    <w:bookmarkEnd w:id="758"/>
+    <w:bookmarkEnd w:id="864"/>
+    <w:bookmarkEnd w:id="865"/>
     <w:sectPr>
       <w:footerReference r:id="rId9" w:type="default"/>
       <w:footnotePr>

</xml_diff>